<commit_message>
feat: frame listings with a one-cell table
A listing now sits in a one-cell table instead of standing bare on the
page. Paragraph borders were the other option and Word draws them as one
box, but the previewers this document gets opened in draw a rule under
every line; a table is a box everywhere and keeps its sides across a
page break.

The frame is defined once, by the SourceCodeTable style, and written
into every table as well, because a table style is another thing those
previewers skip. Padding is 0.2 cm, which leaves 87 characters of
Courier New 9pt in the column — verify:examples now reports lines wider
than 86, and the fourteen that were is rewrapped.

Co-Authored-By: Claude Opus 5 <noreply@anthropic.com>
</commit_message>
<xml_diff>
--- a/public/labs/os/kmp-23/ЛР1_ОС_Файли_та_каталоги_в_командному_рядку_Windows.docx
+++ b/public/labs/os/kmp-23/ЛР1_ОС_Файли_та_каталоги_в_командному_рядку_Windows.docx
@@ -170,66 +170,115 @@
     </w:p>
     <w:p>
       <w:pPr>
-        <w:pStyle w:val="SourceCode"/>
-        <w:spacing w:before="120" w:after="0" w:line="200" w:lineRule="auto"/>
-      </w:pPr>
-      <w:r>
-        <w:t xml:space="preserve">cd Desktop            :: у підкаталог поточного каталогу</w:t>
-      </w:r>
-    </w:p>
-    <w:p>
-      <w:pPr>
-        <w:pStyle w:val="SourceCode"/>
-        <w:spacing w:before="0" w:after="0" w:line="200" w:lineRule="auto"/>
-      </w:pPr>
-      <w:r>
-        <w:t xml:space="preserve">cd ..                 :: на рівень вище</w:t>
-      </w:r>
-    </w:p>
-    <w:p>
-      <w:pPr>
-        <w:pStyle w:val="SourceCode"/>
-        <w:spacing w:before="0" w:after="0" w:line="200" w:lineRule="auto"/>
-      </w:pPr>
-      <w:r>
-        <w:t xml:space="preserve">cd \                  :: до кореня поточного диска</w:t>
-      </w:r>
-    </w:p>
-    <w:p>
-      <w:pPr>
-        <w:pStyle w:val="SourceCode"/>
-        <w:spacing w:before="0" w:after="0" w:line="200" w:lineRule="auto"/>
-      </w:pPr>
-      <w:r>
-        <w:t xml:space="preserve">D:                    :: змінити диск без зміни каталогу</w:t>
-      </w:r>
-    </w:p>
-    <w:p>
-      <w:pPr>
-        <w:pStyle w:val="SourceCode"/>
-        <w:spacing w:before="0" w:after="0" w:line="200" w:lineRule="auto"/>
-      </w:pPr>
-      <w:r>
-        <w:t xml:space="preserve">cd /d D:\Data         :: змінити диск і каталог одночасно</w:t>
-      </w:r>
-    </w:p>
-    <w:p>
-      <w:pPr>
-        <w:pStyle w:val="SourceCode"/>
-        <w:spacing w:before="0" w:after="0" w:line="200" w:lineRule="auto"/>
-      </w:pPr>
-      <w:r>
-        <w:t xml:space="preserve">pushd %SystemRoot%    :: перейти, запам’ятавши поточний каталог</w:t>
-      </w:r>
-    </w:p>
-    <w:p>
-      <w:pPr>
-        <w:pStyle w:val="SourceCode"/>
-        <w:spacing w:before="0" w:after="120" w:line="200" w:lineRule="auto"/>
-      </w:pPr>
-      <w:r>
-        <w:t xml:space="preserve">popd                  :: повернутися туди, звідки викликали pushd</w:t>
-      </w:r>
+        <w:spacing w:before="0" w:after="0" w:line="120" w:lineRule="exact"/>
+        <w:rPr>
+          <w:sz w:val="4"/>
+          <w:szCs w:val="4"/>
+        </w:rPr>
+      </w:pPr>
+    </w:p>
+    <w:tbl>
+      <w:tblPr>
+        <w:tblStyle w:val="SourceCodeTable"/>
+        <w:tblW w:type="dxa" w:w="9637"/>
+        <w:tblInd w:w="0" w:type="dxa"/>
+        <w:tblBorders>
+          <w:top w:color="BFBFBF" w:space="0" w:sz="4" w:val="single"/>
+          <w:left w:color="BFBFBF" w:space="0" w:sz="4" w:val="single"/>
+          <w:bottom w:color="BFBFBF" w:space="0" w:sz="4" w:val="single"/>
+          <w:right w:color="BFBFBF" w:space="0" w:sz="4" w:val="single"/>
+        </w:tblBorders>
+        <w:tblLayout w:type="fixed"/>
+        <w:tblCellMar>
+          <w:top w:type="dxa" w:w="113"/>
+          <w:left w:type="dxa" w:w="113"/>
+          <w:bottom w:type="dxa" w:w="113"/>
+          <w:right w:type="dxa" w:w="113"/>
+        </w:tblCellMar>
+        <w:tblLook w:val="0000" w:firstRow="0" w:lastRow="0" w:firstColumn="0" w:lastColumn="0" w:noHBand="1" w:noVBand="1"/>
+      </w:tblPr>
+      <w:tblGrid>
+        <w:gridCol w:w="9637"/>
+      </w:tblGrid>
+      <w:tr>
+        <w:tc>
+          <w:tcPr>
+            <w:tcW w:type="dxa" w:w="9637"/>
+          </w:tcPr>
+          <w:p>
+            <w:pPr>
+              <w:pStyle w:val="SourceCode"/>
+              <w:spacing w:before="0" w:after="0" w:line="200" w:lineRule="auto"/>
+            </w:pPr>
+            <w:r>
+              <w:t xml:space="preserve">cd Desktop            :: у підкаталог поточного каталогу</w:t>
+            </w:r>
+          </w:p>
+          <w:p>
+            <w:pPr>
+              <w:pStyle w:val="SourceCode"/>
+              <w:spacing w:before="0" w:after="0" w:line="200" w:lineRule="auto"/>
+            </w:pPr>
+            <w:r>
+              <w:t xml:space="preserve">cd ..                 :: на рівень вище</w:t>
+            </w:r>
+          </w:p>
+          <w:p>
+            <w:pPr>
+              <w:pStyle w:val="SourceCode"/>
+              <w:spacing w:before="0" w:after="0" w:line="200" w:lineRule="auto"/>
+            </w:pPr>
+            <w:r>
+              <w:t xml:space="preserve">cd \                  :: до кореня поточного диска</w:t>
+            </w:r>
+          </w:p>
+          <w:p>
+            <w:pPr>
+              <w:pStyle w:val="SourceCode"/>
+              <w:spacing w:before="0" w:after="0" w:line="200" w:lineRule="auto"/>
+            </w:pPr>
+            <w:r>
+              <w:t xml:space="preserve">D:                    :: змінити диск без зміни каталогу</w:t>
+            </w:r>
+          </w:p>
+          <w:p>
+            <w:pPr>
+              <w:pStyle w:val="SourceCode"/>
+              <w:spacing w:before="0" w:after="0" w:line="200" w:lineRule="auto"/>
+            </w:pPr>
+            <w:r>
+              <w:t xml:space="preserve">cd /d D:\Data         :: змінити диск і каталог одночасно</w:t>
+            </w:r>
+          </w:p>
+          <w:p>
+            <w:pPr>
+              <w:pStyle w:val="SourceCode"/>
+              <w:spacing w:before="0" w:after="0" w:line="200" w:lineRule="auto"/>
+            </w:pPr>
+            <w:r>
+              <w:t xml:space="preserve">pushd %SystemRoot%    :: перейти, запам’ятавши поточний каталог</w:t>
+            </w:r>
+          </w:p>
+          <w:p>
+            <w:pPr>
+              <w:pStyle w:val="SourceCode"/>
+              <w:spacing w:before="0" w:after="0" w:line="200" w:lineRule="auto"/>
+            </w:pPr>
+            <w:r>
+              <w:t xml:space="preserve">popd                  :: повернутися туди, звідки викликали pushd</w:t>
+            </w:r>
+          </w:p>
+        </w:tc>
+      </w:tr>
+    </w:tbl>
+    <w:p>
+      <w:pPr>
+        <w:spacing w:before="0" w:after="0" w:line="120" w:lineRule="exact"/>
+        <w:rPr>
+          <w:sz w:val="4"/>
+          <w:szCs w:val="4"/>
+        </w:rPr>
+      </w:pPr>
     </w:p>
     <w:p>
       <w:pPr>
@@ -259,57 +308,106 @@
     </w:p>
     <w:p>
       <w:pPr>
-        <w:pStyle w:val="SourceCode"/>
-        <w:spacing w:before="120" w:after="0" w:line="200" w:lineRule="auto"/>
-      </w:pPr>
-      <w:r>
-        <w:t xml:space="preserve">*.txt        усі файли з розширенням txt</w:t>
-      </w:r>
-    </w:p>
-    <w:p>
-      <w:pPr>
-        <w:pStyle w:val="SourceCode"/>
-        <w:spacing w:before="0" w:after="0" w:line="200" w:lineRule="auto"/>
-      </w:pPr>
-      <w:r>
-        <w:t xml:space="preserve">report.*     усі файли з іменем report і будь-яким розширенням</w:t>
-      </w:r>
-    </w:p>
-    <w:p>
-      <w:pPr>
-        <w:pStyle w:val="SourceCode"/>
-        <w:spacing w:before="0" w:after="0" w:line="200" w:lineRule="auto"/>
-      </w:pPr>
-      <w:r>
-        <w:t xml:space="preserve">*.*          усі файли, що мають розширення</w:t>
-      </w:r>
-    </w:p>
-    <w:p>
-      <w:pPr>
-        <w:pStyle w:val="SourceCode"/>
-        <w:spacing w:before="0" w:after="0" w:line="200" w:lineRule="auto"/>
-      </w:pPr>
-      <w:r>
-        <w:t xml:space="preserve">*            усі файли взагалі</w:t>
-      </w:r>
-    </w:p>
-    <w:p>
-      <w:pPr>
-        <w:pStyle w:val="SourceCode"/>
-        <w:spacing w:before="0" w:after="0" w:line="200" w:lineRule="auto"/>
-      </w:pPr>
-      <w:r>
-        <w:t xml:space="preserve">data?.txt    data1.txt, data2.txt, dataA.txt, але не data10.txt</w:t>
-      </w:r>
-    </w:p>
-    <w:p>
-      <w:pPr>
-        <w:pStyle w:val="SourceCode"/>
-        <w:spacing w:before="0" w:after="120" w:line="200" w:lineRule="auto"/>
-      </w:pPr>
-      <w:r>
-        <w:t xml:space="preserve">??.log       файли, ім’я яких складається рівно з двох символів</w:t>
-      </w:r>
+        <w:spacing w:before="0" w:after="0" w:line="120" w:lineRule="exact"/>
+        <w:rPr>
+          <w:sz w:val="4"/>
+          <w:szCs w:val="4"/>
+        </w:rPr>
+      </w:pPr>
+    </w:p>
+    <w:tbl>
+      <w:tblPr>
+        <w:tblStyle w:val="SourceCodeTable"/>
+        <w:tblW w:type="dxa" w:w="9637"/>
+        <w:tblInd w:w="0" w:type="dxa"/>
+        <w:tblBorders>
+          <w:top w:color="BFBFBF" w:space="0" w:sz="4" w:val="single"/>
+          <w:left w:color="BFBFBF" w:space="0" w:sz="4" w:val="single"/>
+          <w:bottom w:color="BFBFBF" w:space="0" w:sz="4" w:val="single"/>
+          <w:right w:color="BFBFBF" w:space="0" w:sz="4" w:val="single"/>
+        </w:tblBorders>
+        <w:tblLayout w:type="fixed"/>
+        <w:tblCellMar>
+          <w:top w:type="dxa" w:w="113"/>
+          <w:left w:type="dxa" w:w="113"/>
+          <w:bottom w:type="dxa" w:w="113"/>
+          <w:right w:type="dxa" w:w="113"/>
+        </w:tblCellMar>
+        <w:tblLook w:val="0000" w:firstRow="0" w:lastRow="0" w:firstColumn="0" w:lastColumn="0" w:noHBand="1" w:noVBand="1"/>
+      </w:tblPr>
+      <w:tblGrid>
+        <w:gridCol w:w="9637"/>
+      </w:tblGrid>
+      <w:tr>
+        <w:tc>
+          <w:tcPr>
+            <w:tcW w:type="dxa" w:w="9637"/>
+          </w:tcPr>
+          <w:p>
+            <w:pPr>
+              <w:pStyle w:val="SourceCode"/>
+              <w:spacing w:before="0" w:after="0" w:line="200" w:lineRule="auto"/>
+            </w:pPr>
+            <w:r>
+              <w:t xml:space="preserve">*.txt        усі файли з розширенням txt</w:t>
+            </w:r>
+          </w:p>
+          <w:p>
+            <w:pPr>
+              <w:pStyle w:val="SourceCode"/>
+              <w:spacing w:before="0" w:after="0" w:line="200" w:lineRule="auto"/>
+            </w:pPr>
+            <w:r>
+              <w:t xml:space="preserve">report.*     усі файли з іменем report і будь-яким розширенням</w:t>
+            </w:r>
+          </w:p>
+          <w:p>
+            <w:pPr>
+              <w:pStyle w:val="SourceCode"/>
+              <w:spacing w:before="0" w:after="0" w:line="200" w:lineRule="auto"/>
+            </w:pPr>
+            <w:r>
+              <w:t xml:space="preserve">*.*          усі файли, що мають розширення</w:t>
+            </w:r>
+          </w:p>
+          <w:p>
+            <w:pPr>
+              <w:pStyle w:val="SourceCode"/>
+              <w:spacing w:before="0" w:after="0" w:line="200" w:lineRule="auto"/>
+            </w:pPr>
+            <w:r>
+              <w:t xml:space="preserve">*            усі файли взагалі</w:t>
+            </w:r>
+          </w:p>
+          <w:p>
+            <w:pPr>
+              <w:pStyle w:val="SourceCode"/>
+              <w:spacing w:before="0" w:after="0" w:line="200" w:lineRule="auto"/>
+            </w:pPr>
+            <w:r>
+              <w:t xml:space="preserve">data?.txt    data1.txt, data2.txt, dataA.txt, але не data10.txt</w:t>
+            </w:r>
+          </w:p>
+          <w:p>
+            <w:pPr>
+              <w:pStyle w:val="SourceCode"/>
+              <w:spacing w:before="0" w:after="0" w:line="200" w:lineRule="auto"/>
+            </w:pPr>
+            <w:r>
+              <w:t xml:space="preserve">??.log       файли, ім’я яких складається рівно з двох символів</w:t>
+            </w:r>
+          </w:p>
+        </w:tc>
+      </w:tr>
+    </w:tbl>
+    <w:p>
+      <w:pPr>
+        <w:spacing w:before="0" w:after="0" w:line="120" w:lineRule="exact"/>
+        <w:rPr>
+          <w:sz w:val="4"/>
+          <w:szCs w:val="4"/>
+        </w:rPr>
+      </w:pPr>
     </w:p>
     <w:p>
       <w:pPr>
@@ -1003,84 +1101,231 @@
     </w:tbl>
     <w:p>
       <w:pPr>
-        <w:pStyle w:val="SourceCode"/>
-        <w:spacing w:before="120" w:after="0" w:line="200" w:lineRule="auto"/>
-      </w:pPr>
-      <w:r>
-        <w:t xml:space="preserve">copy file.txt backup.txt           :: копія одного файлу</w:t>
-      </w:r>
-    </w:p>
-    <w:p>
-      <w:pPr>
-        <w:pStyle w:val="SourceCode"/>
-        <w:spacing w:before="0" w:after="0" w:line="200" w:lineRule="auto"/>
-      </w:pPr>
-      <w:r>
-        <w:t xml:space="preserve">copy *.wav audio\                  :: усі wav в підкаталог audio</w:t>
-      </w:r>
-    </w:p>
-    <w:p>
-      <w:pPr>
-        <w:pStyle w:val="SourceCode"/>
-        <w:spacing w:before="0" w:after="120" w:line="200" w:lineRule="auto"/>
-      </w:pPr>
-      <w:r>
-        <w:t xml:space="preserve">copy part1.txt+part2.txt all.txt   :: об’єднання файлів</w:t>
-      </w:r>
-    </w:p>
-    <w:p>
-      <w:pPr>
-        <w:pStyle w:val="SourceCode"/>
-        <w:spacing w:before="120" w:after="0" w:line="200" w:lineRule="auto"/>
-      </w:pPr>
-      <w:r>
-        <w:t xml:space="preserve">xcopy /s /i src dest               :: з підкаталогами (/i — dest це каталог)</w:t>
-      </w:r>
-    </w:p>
-    <w:p>
-      <w:pPr>
-        <w:pStyle w:val="SourceCode"/>
-        <w:spacing w:before="0" w:after="120" w:line="200" w:lineRule="auto"/>
-      </w:pPr>
-      <w:r>
-        <w:t xml:space="preserve">xcopy /s /e /h /y src dest         :: + порожні каталоги, приховані, без запитів</w:t>
-      </w:r>
-    </w:p>
-    <w:p>
-      <w:pPr>
-        <w:pStyle w:val="SourceCode"/>
-        <w:spacing w:before="120" w:after="0" w:line="200" w:lineRule="auto"/>
-      </w:pPr>
-      <w:r>
-        <w:t xml:space="preserve">robocopy src dest /e               :: дерево разом з порожніми каталогами</w:t>
-      </w:r>
-    </w:p>
-    <w:p>
-      <w:pPr>
-        <w:pStyle w:val="SourceCode"/>
-        <w:spacing w:before="0" w:after="0" w:line="200" w:lineRule="auto"/>
-      </w:pPr>
-      <w:r>
-        <w:t xml:space="preserve">robocopy src dest /e /mt:8         :: у вісім потоків</w:t>
-      </w:r>
-    </w:p>
-    <w:p>
-      <w:pPr>
-        <w:pStyle w:val="SourceCode"/>
-        <w:spacing w:before="0" w:after="0" w:line="200" w:lineRule="auto"/>
-      </w:pPr>
-      <w:r>
-        <w:t xml:space="preserve">robocopy src dest /e /log:copy.log :: із журналом</w:t>
-      </w:r>
-    </w:p>
-    <w:p>
-      <w:pPr>
-        <w:pStyle w:val="SourceCode"/>
-        <w:spacing w:before="0" w:after="120" w:line="200" w:lineRule="auto"/>
-      </w:pPr>
-      <w:r>
-        <w:t xml:space="preserve">robocopy src dest /e /l            :: лише показати, що було б скопійовано</w:t>
-      </w:r>
+        <w:spacing w:before="0" w:after="0" w:line="120" w:lineRule="exact"/>
+        <w:rPr>
+          <w:sz w:val="4"/>
+          <w:szCs w:val="4"/>
+        </w:rPr>
+      </w:pPr>
+    </w:p>
+    <w:tbl>
+      <w:tblPr>
+        <w:tblStyle w:val="SourceCodeTable"/>
+        <w:tblW w:type="dxa" w:w="9637"/>
+        <w:tblInd w:w="0" w:type="dxa"/>
+        <w:tblBorders>
+          <w:top w:color="BFBFBF" w:space="0" w:sz="4" w:val="single"/>
+          <w:left w:color="BFBFBF" w:space="0" w:sz="4" w:val="single"/>
+          <w:bottom w:color="BFBFBF" w:space="0" w:sz="4" w:val="single"/>
+          <w:right w:color="BFBFBF" w:space="0" w:sz="4" w:val="single"/>
+        </w:tblBorders>
+        <w:tblLayout w:type="fixed"/>
+        <w:tblCellMar>
+          <w:top w:type="dxa" w:w="113"/>
+          <w:left w:type="dxa" w:w="113"/>
+          <w:bottom w:type="dxa" w:w="113"/>
+          <w:right w:type="dxa" w:w="113"/>
+        </w:tblCellMar>
+        <w:tblLook w:val="0000" w:firstRow="0" w:lastRow="0" w:firstColumn="0" w:lastColumn="0" w:noHBand="1" w:noVBand="1"/>
+      </w:tblPr>
+      <w:tblGrid>
+        <w:gridCol w:w="9637"/>
+      </w:tblGrid>
+      <w:tr>
+        <w:tc>
+          <w:tcPr>
+            <w:tcW w:type="dxa" w:w="9637"/>
+          </w:tcPr>
+          <w:p>
+            <w:pPr>
+              <w:pStyle w:val="SourceCode"/>
+              <w:spacing w:before="0" w:after="0" w:line="200" w:lineRule="auto"/>
+            </w:pPr>
+            <w:r>
+              <w:t xml:space="preserve">copy file.txt backup.txt           :: копія одного файлу</w:t>
+            </w:r>
+          </w:p>
+          <w:p>
+            <w:pPr>
+              <w:pStyle w:val="SourceCode"/>
+              <w:spacing w:before="0" w:after="0" w:line="200" w:lineRule="auto"/>
+            </w:pPr>
+            <w:r>
+              <w:t xml:space="preserve">copy *.wav audio\                  :: усі wav в підкаталог audio</w:t>
+            </w:r>
+          </w:p>
+          <w:p>
+            <w:pPr>
+              <w:pStyle w:val="SourceCode"/>
+              <w:spacing w:before="0" w:after="0" w:line="200" w:lineRule="auto"/>
+            </w:pPr>
+            <w:r>
+              <w:t xml:space="preserve">copy part1.txt+part2.txt all.txt   :: об’єднання файлів</w:t>
+            </w:r>
+          </w:p>
+        </w:tc>
+      </w:tr>
+    </w:tbl>
+    <w:p>
+      <w:pPr>
+        <w:spacing w:before="0" w:after="0" w:line="120" w:lineRule="exact"/>
+        <w:rPr>
+          <w:sz w:val="4"/>
+          <w:szCs w:val="4"/>
+        </w:rPr>
+      </w:pPr>
+    </w:p>
+    <w:p>
+      <w:pPr>
+        <w:spacing w:before="0" w:after="0" w:line="120" w:lineRule="exact"/>
+        <w:rPr>
+          <w:sz w:val="4"/>
+          <w:szCs w:val="4"/>
+        </w:rPr>
+      </w:pPr>
+    </w:p>
+    <w:tbl>
+      <w:tblPr>
+        <w:tblStyle w:val="SourceCodeTable"/>
+        <w:tblW w:type="dxa" w:w="9637"/>
+        <w:tblInd w:w="0" w:type="dxa"/>
+        <w:tblBorders>
+          <w:top w:color="BFBFBF" w:space="0" w:sz="4" w:val="single"/>
+          <w:left w:color="BFBFBF" w:space="0" w:sz="4" w:val="single"/>
+          <w:bottom w:color="BFBFBF" w:space="0" w:sz="4" w:val="single"/>
+          <w:right w:color="BFBFBF" w:space="0" w:sz="4" w:val="single"/>
+        </w:tblBorders>
+        <w:tblLayout w:type="fixed"/>
+        <w:tblCellMar>
+          <w:top w:type="dxa" w:w="113"/>
+          <w:left w:type="dxa" w:w="113"/>
+          <w:bottom w:type="dxa" w:w="113"/>
+          <w:right w:type="dxa" w:w="113"/>
+        </w:tblCellMar>
+        <w:tblLook w:val="0000" w:firstRow="0" w:lastRow="0" w:firstColumn="0" w:lastColumn="0" w:noHBand="1" w:noVBand="1"/>
+      </w:tblPr>
+      <w:tblGrid>
+        <w:gridCol w:w="9637"/>
+      </w:tblGrid>
+      <w:tr>
+        <w:tc>
+          <w:tcPr>
+            <w:tcW w:type="dxa" w:w="9637"/>
+          </w:tcPr>
+          <w:p>
+            <w:pPr>
+              <w:pStyle w:val="SourceCode"/>
+              <w:spacing w:before="0" w:after="0" w:line="200" w:lineRule="auto"/>
+            </w:pPr>
+            <w:r>
+              <w:t xml:space="preserve">xcopy /s /i src dest               :: з підкаталогами (/i — dest це каталог)</w:t>
+            </w:r>
+          </w:p>
+          <w:p>
+            <w:pPr>
+              <w:pStyle w:val="SourceCode"/>
+              <w:spacing w:before="0" w:after="0" w:line="200" w:lineRule="auto"/>
+            </w:pPr>
+            <w:r>
+              <w:t xml:space="preserve">xcopy /s /e /h /y src dest         :: + порожні каталоги, приховані, без запитів</w:t>
+            </w:r>
+          </w:p>
+        </w:tc>
+      </w:tr>
+    </w:tbl>
+    <w:p>
+      <w:pPr>
+        <w:spacing w:before="0" w:after="0" w:line="120" w:lineRule="exact"/>
+        <w:rPr>
+          <w:sz w:val="4"/>
+          <w:szCs w:val="4"/>
+        </w:rPr>
+      </w:pPr>
+    </w:p>
+    <w:p>
+      <w:pPr>
+        <w:spacing w:before="0" w:after="0" w:line="120" w:lineRule="exact"/>
+        <w:rPr>
+          <w:sz w:val="4"/>
+          <w:szCs w:val="4"/>
+        </w:rPr>
+      </w:pPr>
+    </w:p>
+    <w:tbl>
+      <w:tblPr>
+        <w:tblStyle w:val="SourceCodeTable"/>
+        <w:tblW w:type="dxa" w:w="9637"/>
+        <w:tblInd w:w="0" w:type="dxa"/>
+        <w:tblBorders>
+          <w:top w:color="BFBFBF" w:space="0" w:sz="4" w:val="single"/>
+          <w:left w:color="BFBFBF" w:space="0" w:sz="4" w:val="single"/>
+          <w:bottom w:color="BFBFBF" w:space="0" w:sz="4" w:val="single"/>
+          <w:right w:color="BFBFBF" w:space="0" w:sz="4" w:val="single"/>
+        </w:tblBorders>
+        <w:tblLayout w:type="fixed"/>
+        <w:tblCellMar>
+          <w:top w:type="dxa" w:w="113"/>
+          <w:left w:type="dxa" w:w="113"/>
+          <w:bottom w:type="dxa" w:w="113"/>
+          <w:right w:type="dxa" w:w="113"/>
+        </w:tblCellMar>
+        <w:tblLook w:val="0000" w:firstRow="0" w:lastRow="0" w:firstColumn="0" w:lastColumn="0" w:noHBand="1" w:noVBand="1"/>
+      </w:tblPr>
+      <w:tblGrid>
+        <w:gridCol w:w="9637"/>
+      </w:tblGrid>
+      <w:tr>
+        <w:tc>
+          <w:tcPr>
+            <w:tcW w:type="dxa" w:w="9637"/>
+          </w:tcPr>
+          <w:p>
+            <w:pPr>
+              <w:pStyle w:val="SourceCode"/>
+              <w:spacing w:before="0" w:after="0" w:line="200" w:lineRule="auto"/>
+            </w:pPr>
+            <w:r>
+              <w:t xml:space="preserve">robocopy src dest /e               :: дерево разом з порожніми каталогами</w:t>
+            </w:r>
+          </w:p>
+          <w:p>
+            <w:pPr>
+              <w:pStyle w:val="SourceCode"/>
+              <w:spacing w:before="0" w:after="0" w:line="200" w:lineRule="auto"/>
+            </w:pPr>
+            <w:r>
+              <w:t xml:space="preserve">robocopy src dest /e /mt:8         :: у вісім потоків</w:t>
+            </w:r>
+          </w:p>
+          <w:p>
+            <w:pPr>
+              <w:pStyle w:val="SourceCode"/>
+              <w:spacing w:before="0" w:after="0" w:line="200" w:lineRule="auto"/>
+            </w:pPr>
+            <w:r>
+              <w:t xml:space="preserve">robocopy src dest /e /log:copy.log :: із журналом</w:t>
+            </w:r>
+          </w:p>
+          <w:p>
+            <w:pPr>
+              <w:pStyle w:val="SourceCode"/>
+              <w:spacing w:before="0" w:after="0" w:line="200" w:lineRule="auto"/>
+            </w:pPr>
+            <w:r>
+              <w:t xml:space="preserve">robocopy src dest /e /l            :: лише показати, що було б скопійовано</w:t>
+            </w:r>
+          </w:p>
+        </w:tc>
+      </w:tr>
+    </w:tbl>
+    <w:p>
+      <w:pPr>
+        <w:spacing w:before="0" w:after="0" w:line="120" w:lineRule="exact"/>
+        <w:rPr>
+          <w:sz w:val="4"/>
+          <w:szCs w:val="4"/>
+        </w:rPr>
+      </w:pPr>
     </w:p>
     <w:p>
       <w:pPr>
@@ -1112,111 +1357,258 @@
     </w:p>
     <w:p>
       <w:pPr>
-        <w:pStyle w:val="SourceCode"/>
-        <w:spacing w:before="120" w:after="0" w:line="200" w:lineRule="auto"/>
-      </w:pPr>
-      <w:r>
-        <w:t xml:space="preserve">move old.txt D:\arch\              :: перемістити файл</w:t>
-      </w:r>
-    </w:p>
-    <w:p>
-      <w:pPr>
-        <w:pStyle w:val="SourceCode"/>
-        <w:spacing w:before="0" w:after="0" w:line="200" w:lineRule="auto"/>
-      </w:pPr>
-      <w:r>
-        <w:t xml:space="preserve">move old.txt new.txt               :: перемістити = перейменувати</w:t>
-      </w:r>
-    </w:p>
-    <w:p>
-      <w:pPr>
-        <w:pStyle w:val="SourceCode"/>
-        <w:spacing w:before="0" w:after="0" w:line="200" w:lineRule="auto"/>
-      </w:pPr>
-      <w:r>
-        <w:t xml:space="preserve">ren report.txt report_2026.txt     :: перейменувати</w:t>
-      </w:r>
-    </w:p>
-    <w:p>
-      <w:pPr>
-        <w:pStyle w:val="SourceCode"/>
-        <w:spacing w:before="0" w:after="120" w:line="200" w:lineRule="auto"/>
-      </w:pPr>
-      <w:r>
-        <w:t xml:space="preserve">ren *.txt *.bak                    :: масове перейменування за маскою</w:t>
-      </w:r>
-    </w:p>
-    <w:p>
-      <w:pPr>
-        <w:pStyle w:val="SourceCode"/>
-        <w:spacing w:before="120" w:after="0" w:line="200" w:lineRule="auto"/>
-      </w:pPr>
-      <w:r>
-        <w:t xml:space="preserve">del file.txt                       :: видалити файл</w:t>
-      </w:r>
-    </w:p>
-    <w:p>
-      <w:pPr>
-        <w:pStyle w:val="SourceCode"/>
-        <w:spacing w:before="0" w:after="0" w:line="200" w:lineRule="auto"/>
-      </w:pPr>
-      <w:r>
-        <w:t xml:space="preserve">del /q *.tmp                       :: без підтвердження</w:t>
-      </w:r>
-    </w:p>
-    <w:p>
-      <w:pPr>
-        <w:pStyle w:val="SourceCode"/>
-        <w:spacing w:before="0" w:after="0" w:line="200" w:lineRule="auto"/>
-      </w:pPr>
-      <w:r>
-        <w:t xml:space="preserve">del /s *.tmp                       :: рекурсивно в усіх підкаталогах</w:t>
-      </w:r>
-    </w:p>
-    <w:p>
-      <w:pPr>
-        <w:pStyle w:val="SourceCode"/>
-        <w:spacing w:before="0" w:after="0" w:line="200" w:lineRule="auto"/>
-      </w:pPr>
-      <w:r>
-        <w:t xml:space="preserve">del /f readonly.txt                :: примусово, попри атрибут «лише читання»</w:t>
-      </w:r>
-    </w:p>
-    <w:p>
-      <w:pPr>
-        <w:pStyle w:val="SourceCode"/>
-        <w:spacing w:before="0" w:after="120" w:line="200" w:lineRule="auto"/>
-      </w:pPr>
-      <w:r>
-        <w:t xml:space="preserve">del /a:h *.txt                     :: приховані файли</w:t>
-      </w:r>
-    </w:p>
-    <w:p>
-      <w:pPr>
-        <w:pStyle w:val="SourceCode"/>
-        <w:spacing w:before="120" w:after="0" w:line="200" w:lineRule="auto"/>
-      </w:pPr>
-      <w:r>
-        <w:t xml:space="preserve">rd empty                           :: видалити порожній каталог</w:t>
-      </w:r>
-    </w:p>
-    <w:p>
-      <w:pPr>
-        <w:pStyle w:val="SourceCode"/>
-        <w:spacing w:before="0" w:after="0" w:line="200" w:lineRule="auto"/>
-      </w:pPr>
-      <w:r>
-        <w:t xml:space="preserve">rd /s folder                       :: разом із вмістом, із підтвердженням</w:t>
-      </w:r>
-    </w:p>
-    <w:p>
-      <w:pPr>
-        <w:pStyle w:val="SourceCode"/>
-        <w:spacing w:before="0" w:after="120" w:line="200" w:lineRule="auto"/>
-      </w:pPr>
-      <w:r>
-        <w:t xml:space="preserve">rd /s /q folder                    :: разом із вмістом, без підтвердження</w:t>
-      </w:r>
+        <w:spacing w:before="0" w:after="0" w:line="120" w:lineRule="exact"/>
+        <w:rPr>
+          <w:sz w:val="4"/>
+          <w:szCs w:val="4"/>
+        </w:rPr>
+      </w:pPr>
+    </w:p>
+    <w:tbl>
+      <w:tblPr>
+        <w:tblStyle w:val="SourceCodeTable"/>
+        <w:tblW w:type="dxa" w:w="9637"/>
+        <w:tblInd w:w="0" w:type="dxa"/>
+        <w:tblBorders>
+          <w:top w:color="BFBFBF" w:space="0" w:sz="4" w:val="single"/>
+          <w:left w:color="BFBFBF" w:space="0" w:sz="4" w:val="single"/>
+          <w:bottom w:color="BFBFBF" w:space="0" w:sz="4" w:val="single"/>
+          <w:right w:color="BFBFBF" w:space="0" w:sz="4" w:val="single"/>
+        </w:tblBorders>
+        <w:tblLayout w:type="fixed"/>
+        <w:tblCellMar>
+          <w:top w:type="dxa" w:w="113"/>
+          <w:left w:type="dxa" w:w="113"/>
+          <w:bottom w:type="dxa" w:w="113"/>
+          <w:right w:type="dxa" w:w="113"/>
+        </w:tblCellMar>
+        <w:tblLook w:val="0000" w:firstRow="0" w:lastRow="0" w:firstColumn="0" w:lastColumn="0" w:noHBand="1" w:noVBand="1"/>
+      </w:tblPr>
+      <w:tblGrid>
+        <w:gridCol w:w="9637"/>
+      </w:tblGrid>
+      <w:tr>
+        <w:tc>
+          <w:tcPr>
+            <w:tcW w:type="dxa" w:w="9637"/>
+          </w:tcPr>
+          <w:p>
+            <w:pPr>
+              <w:pStyle w:val="SourceCode"/>
+              <w:spacing w:before="0" w:after="0" w:line="200" w:lineRule="auto"/>
+            </w:pPr>
+            <w:r>
+              <w:t xml:space="preserve">move old.txt D:\arch\              :: перемістити файл</w:t>
+            </w:r>
+          </w:p>
+          <w:p>
+            <w:pPr>
+              <w:pStyle w:val="SourceCode"/>
+              <w:spacing w:before="0" w:after="0" w:line="200" w:lineRule="auto"/>
+            </w:pPr>
+            <w:r>
+              <w:t xml:space="preserve">move old.txt new.txt               :: перемістити = перейменувати</w:t>
+            </w:r>
+          </w:p>
+          <w:p>
+            <w:pPr>
+              <w:pStyle w:val="SourceCode"/>
+              <w:spacing w:before="0" w:after="0" w:line="200" w:lineRule="auto"/>
+            </w:pPr>
+            <w:r>
+              <w:t xml:space="preserve">ren report.txt report_2026.txt     :: перейменувати</w:t>
+            </w:r>
+          </w:p>
+          <w:p>
+            <w:pPr>
+              <w:pStyle w:val="SourceCode"/>
+              <w:spacing w:before="0" w:after="0" w:line="200" w:lineRule="auto"/>
+            </w:pPr>
+            <w:r>
+              <w:t xml:space="preserve">ren *.txt *.bak                    :: масове перейменування за маскою</w:t>
+            </w:r>
+          </w:p>
+        </w:tc>
+      </w:tr>
+    </w:tbl>
+    <w:p>
+      <w:pPr>
+        <w:spacing w:before="0" w:after="0" w:line="120" w:lineRule="exact"/>
+        <w:rPr>
+          <w:sz w:val="4"/>
+          <w:szCs w:val="4"/>
+        </w:rPr>
+      </w:pPr>
+    </w:p>
+    <w:p>
+      <w:pPr>
+        <w:spacing w:before="0" w:after="0" w:line="120" w:lineRule="exact"/>
+        <w:rPr>
+          <w:sz w:val="4"/>
+          <w:szCs w:val="4"/>
+        </w:rPr>
+      </w:pPr>
+    </w:p>
+    <w:tbl>
+      <w:tblPr>
+        <w:tblStyle w:val="SourceCodeTable"/>
+        <w:tblW w:type="dxa" w:w="9637"/>
+        <w:tblInd w:w="0" w:type="dxa"/>
+        <w:tblBorders>
+          <w:top w:color="BFBFBF" w:space="0" w:sz="4" w:val="single"/>
+          <w:left w:color="BFBFBF" w:space="0" w:sz="4" w:val="single"/>
+          <w:bottom w:color="BFBFBF" w:space="0" w:sz="4" w:val="single"/>
+          <w:right w:color="BFBFBF" w:space="0" w:sz="4" w:val="single"/>
+        </w:tblBorders>
+        <w:tblLayout w:type="fixed"/>
+        <w:tblCellMar>
+          <w:top w:type="dxa" w:w="113"/>
+          <w:left w:type="dxa" w:w="113"/>
+          <w:bottom w:type="dxa" w:w="113"/>
+          <w:right w:type="dxa" w:w="113"/>
+        </w:tblCellMar>
+        <w:tblLook w:val="0000" w:firstRow="0" w:lastRow="0" w:firstColumn="0" w:lastColumn="0" w:noHBand="1" w:noVBand="1"/>
+      </w:tblPr>
+      <w:tblGrid>
+        <w:gridCol w:w="9637"/>
+      </w:tblGrid>
+      <w:tr>
+        <w:tc>
+          <w:tcPr>
+            <w:tcW w:type="dxa" w:w="9637"/>
+          </w:tcPr>
+          <w:p>
+            <w:pPr>
+              <w:pStyle w:val="SourceCode"/>
+              <w:spacing w:before="0" w:after="0" w:line="200" w:lineRule="auto"/>
+            </w:pPr>
+            <w:r>
+              <w:t xml:space="preserve">del file.txt                       :: видалити файл</w:t>
+            </w:r>
+          </w:p>
+          <w:p>
+            <w:pPr>
+              <w:pStyle w:val="SourceCode"/>
+              <w:spacing w:before="0" w:after="0" w:line="200" w:lineRule="auto"/>
+            </w:pPr>
+            <w:r>
+              <w:t xml:space="preserve">del /q *.tmp                       :: без підтвердження</w:t>
+            </w:r>
+          </w:p>
+          <w:p>
+            <w:pPr>
+              <w:pStyle w:val="SourceCode"/>
+              <w:spacing w:before="0" w:after="0" w:line="200" w:lineRule="auto"/>
+            </w:pPr>
+            <w:r>
+              <w:t xml:space="preserve">del /s *.tmp                       :: рекурсивно в усіх підкаталогах</w:t>
+            </w:r>
+          </w:p>
+          <w:p>
+            <w:pPr>
+              <w:pStyle w:val="SourceCode"/>
+              <w:spacing w:before="0" w:after="0" w:line="200" w:lineRule="auto"/>
+            </w:pPr>
+            <w:r>
+              <w:t xml:space="preserve">del /f readonly.txt                :: примусово, попри атрибут «лише читання»</w:t>
+            </w:r>
+          </w:p>
+          <w:p>
+            <w:pPr>
+              <w:pStyle w:val="SourceCode"/>
+              <w:spacing w:before="0" w:after="0" w:line="200" w:lineRule="auto"/>
+            </w:pPr>
+            <w:r>
+              <w:t xml:space="preserve">del /a:h *.txt                     :: приховані файли</w:t>
+            </w:r>
+          </w:p>
+        </w:tc>
+      </w:tr>
+    </w:tbl>
+    <w:p>
+      <w:pPr>
+        <w:spacing w:before="0" w:after="0" w:line="120" w:lineRule="exact"/>
+        <w:rPr>
+          <w:sz w:val="4"/>
+          <w:szCs w:val="4"/>
+        </w:rPr>
+      </w:pPr>
+    </w:p>
+    <w:p>
+      <w:pPr>
+        <w:spacing w:before="0" w:after="0" w:line="120" w:lineRule="exact"/>
+        <w:rPr>
+          <w:sz w:val="4"/>
+          <w:szCs w:val="4"/>
+        </w:rPr>
+      </w:pPr>
+    </w:p>
+    <w:tbl>
+      <w:tblPr>
+        <w:tblStyle w:val="SourceCodeTable"/>
+        <w:tblW w:type="dxa" w:w="9637"/>
+        <w:tblInd w:w="0" w:type="dxa"/>
+        <w:tblBorders>
+          <w:top w:color="BFBFBF" w:space="0" w:sz="4" w:val="single"/>
+          <w:left w:color="BFBFBF" w:space="0" w:sz="4" w:val="single"/>
+          <w:bottom w:color="BFBFBF" w:space="0" w:sz="4" w:val="single"/>
+          <w:right w:color="BFBFBF" w:space="0" w:sz="4" w:val="single"/>
+        </w:tblBorders>
+        <w:tblLayout w:type="fixed"/>
+        <w:tblCellMar>
+          <w:top w:type="dxa" w:w="113"/>
+          <w:left w:type="dxa" w:w="113"/>
+          <w:bottom w:type="dxa" w:w="113"/>
+          <w:right w:type="dxa" w:w="113"/>
+        </w:tblCellMar>
+        <w:tblLook w:val="0000" w:firstRow="0" w:lastRow="0" w:firstColumn="0" w:lastColumn="0" w:noHBand="1" w:noVBand="1"/>
+      </w:tblPr>
+      <w:tblGrid>
+        <w:gridCol w:w="9637"/>
+      </w:tblGrid>
+      <w:tr>
+        <w:tc>
+          <w:tcPr>
+            <w:tcW w:type="dxa" w:w="9637"/>
+          </w:tcPr>
+          <w:p>
+            <w:pPr>
+              <w:pStyle w:val="SourceCode"/>
+              <w:spacing w:before="0" w:after="0" w:line="200" w:lineRule="auto"/>
+            </w:pPr>
+            <w:r>
+              <w:t xml:space="preserve">rd empty                           :: видалити порожній каталог</w:t>
+            </w:r>
+          </w:p>
+          <w:p>
+            <w:pPr>
+              <w:pStyle w:val="SourceCode"/>
+              <w:spacing w:before="0" w:after="0" w:line="200" w:lineRule="auto"/>
+            </w:pPr>
+            <w:r>
+              <w:t xml:space="preserve">rd /s folder                       :: разом із вмістом, із підтвердженням</w:t>
+            </w:r>
+          </w:p>
+          <w:p>
+            <w:pPr>
+              <w:pStyle w:val="SourceCode"/>
+              <w:spacing w:before="0" w:after="0" w:line="200" w:lineRule="auto"/>
+            </w:pPr>
+            <w:r>
+              <w:t xml:space="preserve">rd /s /q folder                    :: разом із вмістом, без підтвердження</w:t>
+            </w:r>
+          </w:p>
+        </w:tc>
+      </w:tr>
+    </w:tbl>
+    <w:p>
+      <w:pPr>
+        <w:spacing w:before="0" w:after="0" w:line="120" w:lineRule="exact"/>
+        <w:rPr>
+          <w:sz w:val="4"/>
+          <w:szCs w:val="4"/>
+        </w:rPr>
+      </w:pPr>
     </w:p>
     <w:p>
       <w:pPr>
@@ -1266,48 +1658,97 @@
     </w:p>
     <w:p>
       <w:pPr>
-        <w:pStyle w:val="SourceCode"/>
-        <w:spacing w:before="120" w:after="0" w:line="200" w:lineRule="auto"/>
-      </w:pPr>
-      <w:r>
-        <w:t xml:space="preserve">attrib file.txt          :: показати атрибути</w:t>
-      </w:r>
-    </w:p>
-    <w:p>
-      <w:pPr>
-        <w:pStyle w:val="SourceCode"/>
-        <w:spacing w:before="0" w:after="0" w:line="200" w:lineRule="auto"/>
-      </w:pPr>
-      <w:r>
-        <w:t xml:space="preserve">attrib +r file.txt       :: захистити від зміни й видалення</w:t>
-      </w:r>
-    </w:p>
-    <w:p>
-      <w:pPr>
-        <w:pStyle w:val="SourceCode"/>
-        <w:spacing w:before="0" w:after="0" w:line="200" w:lineRule="auto"/>
-      </w:pPr>
-      <w:r>
-        <w:t xml:space="preserve">attrib -r file.txt       :: зняти захист</w:t>
-      </w:r>
-    </w:p>
-    <w:p>
-      <w:pPr>
-        <w:pStyle w:val="SourceCode"/>
-        <w:spacing w:before="0" w:after="0" w:line="200" w:lineRule="auto"/>
-      </w:pPr>
-      <w:r>
-        <w:t xml:space="preserve">attrib +h +s file.txt    :: прихований і системний</w:t>
-      </w:r>
-    </w:p>
-    <w:p>
-      <w:pPr>
-        <w:pStyle w:val="SourceCode"/>
-        <w:spacing w:before="0" w:after="120" w:line="200" w:lineRule="auto"/>
-      </w:pPr>
-      <w:r>
-        <w:t xml:space="preserve">attrib /s /d *.txt       :: рекурсивно, включно з каталогами</w:t>
-      </w:r>
+        <w:spacing w:before="0" w:after="0" w:line="120" w:lineRule="exact"/>
+        <w:rPr>
+          <w:sz w:val="4"/>
+          <w:szCs w:val="4"/>
+        </w:rPr>
+      </w:pPr>
+    </w:p>
+    <w:tbl>
+      <w:tblPr>
+        <w:tblStyle w:val="SourceCodeTable"/>
+        <w:tblW w:type="dxa" w:w="9637"/>
+        <w:tblInd w:w="0" w:type="dxa"/>
+        <w:tblBorders>
+          <w:top w:color="BFBFBF" w:space="0" w:sz="4" w:val="single"/>
+          <w:left w:color="BFBFBF" w:space="0" w:sz="4" w:val="single"/>
+          <w:bottom w:color="BFBFBF" w:space="0" w:sz="4" w:val="single"/>
+          <w:right w:color="BFBFBF" w:space="0" w:sz="4" w:val="single"/>
+        </w:tblBorders>
+        <w:tblLayout w:type="fixed"/>
+        <w:tblCellMar>
+          <w:top w:type="dxa" w:w="113"/>
+          <w:left w:type="dxa" w:w="113"/>
+          <w:bottom w:type="dxa" w:w="113"/>
+          <w:right w:type="dxa" w:w="113"/>
+        </w:tblCellMar>
+        <w:tblLook w:val="0000" w:firstRow="0" w:lastRow="0" w:firstColumn="0" w:lastColumn="0" w:noHBand="1" w:noVBand="1"/>
+      </w:tblPr>
+      <w:tblGrid>
+        <w:gridCol w:w="9637"/>
+      </w:tblGrid>
+      <w:tr>
+        <w:tc>
+          <w:tcPr>
+            <w:tcW w:type="dxa" w:w="9637"/>
+          </w:tcPr>
+          <w:p>
+            <w:pPr>
+              <w:pStyle w:val="SourceCode"/>
+              <w:spacing w:before="0" w:after="0" w:line="200" w:lineRule="auto"/>
+            </w:pPr>
+            <w:r>
+              <w:t xml:space="preserve">attrib file.txt          :: показати атрибути</w:t>
+            </w:r>
+          </w:p>
+          <w:p>
+            <w:pPr>
+              <w:pStyle w:val="SourceCode"/>
+              <w:spacing w:before="0" w:after="0" w:line="200" w:lineRule="auto"/>
+            </w:pPr>
+            <w:r>
+              <w:t xml:space="preserve">attrib +r file.txt       :: захистити від зміни й видалення</w:t>
+            </w:r>
+          </w:p>
+          <w:p>
+            <w:pPr>
+              <w:pStyle w:val="SourceCode"/>
+              <w:spacing w:before="0" w:after="0" w:line="200" w:lineRule="auto"/>
+            </w:pPr>
+            <w:r>
+              <w:t xml:space="preserve">attrib -r file.txt       :: зняти захист</w:t>
+            </w:r>
+          </w:p>
+          <w:p>
+            <w:pPr>
+              <w:pStyle w:val="SourceCode"/>
+              <w:spacing w:before="0" w:after="0" w:line="200" w:lineRule="auto"/>
+            </w:pPr>
+            <w:r>
+              <w:t xml:space="preserve">attrib +h +s file.txt    :: прихований і системний</w:t>
+            </w:r>
+          </w:p>
+          <w:p>
+            <w:pPr>
+              <w:pStyle w:val="SourceCode"/>
+              <w:spacing w:before="0" w:after="0" w:line="200" w:lineRule="auto"/>
+            </w:pPr>
+            <w:r>
+              <w:t xml:space="preserve">attrib /s /d *.txt       :: рекурсивно, включно з каталогами</w:t>
+            </w:r>
+          </w:p>
+        </w:tc>
+      </w:tr>
+    </w:tbl>
+    <w:p>
+      <w:pPr>
+        <w:spacing w:before="0" w:after="0" w:line="120" w:lineRule="exact"/>
+        <w:rPr>
+          <w:sz w:val="4"/>
+          <w:szCs w:val="4"/>
+        </w:rPr>
+      </w:pPr>
     </w:p>
     <w:p>
       <w:pPr>
@@ -1660,75 +2101,173 @@
     </w:p>
     <w:p>
       <w:pPr>
-        <w:pStyle w:val="SourceCode"/>
-        <w:spacing w:before="120" w:after="0" w:line="200" w:lineRule="auto"/>
-      </w:pPr>
-      <w:r>
-        <w:t xml:space="preserve">find "error" log.txt         :: рядки, що містять error</w:t>
-      </w:r>
-    </w:p>
-    <w:p>
-      <w:pPr>
-        <w:pStyle w:val="SourceCode"/>
-        <w:spacing w:before="0" w:after="0" w:line="200" w:lineRule="auto"/>
-      </w:pPr>
-      <w:r>
-        <w:t xml:space="preserve">find /i "error" log.txt      :: без урахування регістру</w:t>
-      </w:r>
-    </w:p>
-    <w:p>
-      <w:pPr>
-        <w:pStyle w:val="SourceCode"/>
-        <w:spacing w:before="0" w:after="0" w:line="200" w:lineRule="auto"/>
-      </w:pPr>
-      <w:r>
-        <w:t xml:space="preserve">find /c "error" log.txt      :: тільки кількість таких рядків</w:t>
-      </w:r>
-    </w:p>
-    <w:p>
-      <w:pPr>
-        <w:pStyle w:val="SourceCode"/>
-        <w:spacing w:before="0" w:after="120" w:line="200" w:lineRule="auto"/>
-      </w:pPr>
-      <w:r>
-        <w:t xml:space="preserve">find /v "error" log.txt      :: рядки, які НЕ містять error</w:t>
-      </w:r>
-    </w:p>
-    <w:p>
-      <w:pPr>
-        <w:pStyle w:val="SourceCode"/>
-        <w:spacing w:before="120" w:after="0" w:line="200" w:lineRule="auto"/>
-      </w:pPr>
-      <w:r>
-        <w:t xml:space="preserve">findstr /i "error" *.log     :: у всіх файлах поточного каталогу</w:t>
-      </w:r>
-    </w:p>
-    <w:p>
-      <w:pPr>
-        <w:pStyle w:val="SourceCode"/>
-        <w:spacing w:before="0" w:after="0" w:line="200" w:lineRule="auto"/>
-      </w:pPr>
-      <w:r>
-        <w:t xml:space="preserve">findstr /s /i "error" *.log  :: рекурсивно по дереву</w:t>
-      </w:r>
-    </w:p>
-    <w:p>
-      <w:pPr>
-        <w:pStyle w:val="SourceCode"/>
-        <w:spacing w:before="0" w:after="0" w:line="200" w:lineRule="auto"/>
-      </w:pPr>
-      <w:r>
-        <w:t xml:space="preserve">findstr /n "error" log.txt   :: з номерами рядків</w:t>
-      </w:r>
-    </w:p>
-    <w:p>
-      <w:pPr>
-        <w:pStyle w:val="SourceCode"/>
-        <w:spacing w:before="0" w:after="120" w:line="200" w:lineRule="auto"/>
-      </w:pPr>
-      <w:r>
-        <w:t xml:space="preserve">findstr /r "^[0-9]" log.txt  :: регулярний вираз: рядки, що починаються з цифри</w:t>
-      </w:r>
+        <w:spacing w:before="0" w:after="0" w:line="120" w:lineRule="exact"/>
+        <w:rPr>
+          <w:sz w:val="4"/>
+          <w:szCs w:val="4"/>
+        </w:rPr>
+      </w:pPr>
+    </w:p>
+    <w:tbl>
+      <w:tblPr>
+        <w:tblStyle w:val="SourceCodeTable"/>
+        <w:tblW w:type="dxa" w:w="9637"/>
+        <w:tblInd w:w="0" w:type="dxa"/>
+        <w:tblBorders>
+          <w:top w:color="BFBFBF" w:space="0" w:sz="4" w:val="single"/>
+          <w:left w:color="BFBFBF" w:space="0" w:sz="4" w:val="single"/>
+          <w:bottom w:color="BFBFBF" w:space="0" w:sz="4" w:val="single"/>
+          <w:right w:color="BFBFBF" w:space="0" w:sz="4" w:val="single"/>
+        </w:tblBorders>
+        <w:tblLayout w:type="fixed"/>
+        <w:tblCellMar>
+          <w:top w:type="dxa" w:w="113"/>
+          <w:left w:type="dxa" w:w="113"/>
+          <w:bottom w:type="dxa" w:w="113"/>
+          <w:right w:type="dxa" w:w="113"/>
+        </w:tblCellMar>
+        <w:tblLook w:val="0000" w:firstRow="0" w:lastRow="0" w:firstColumn="0" w:lastColumn="0" w:noHBand="1" w:noVBand="1"/>
+      </w:tblPr>
+      <w:tblGrid>
+        <w:gridCol w:w="9637"/>
+      </w:tblGrid>
+      <w:tr>
+        <w:tc>
+          <w:tcPr>
+            <w:tcW w:type="dxa" w:w="9637"/>
+          </w:tcPr>
+          <w:p>
+            <w:pPr>
+              <w:pStyle w:val="SourceCode"/>
+              <w:spacing w:before="0" w:after="0" w:line="200" w:lineRule="auto"/>
+            </w:pPr>
+            <w:r>
+              <w:t xml:space="preserve">find "error" log.txt         :: рядки, що містять error</w:t>
+            </w:r>
+          </w:p>
+          <w:p>
+            <w:pPr>
+              <w:pStyle w:val="SourceCode"/>
+              <w:spacing w:before="0" w:after="0" w:line="200" w:lineRule="auto"/>
+            </w:pPr>
+            <w:r>
+              <w:t xml:space="preserve">find /i "error" log.txt      :: без урахування регістру</w:t>
+            </w:r>
+          </w:p>
+          <w:p>
+            <w:pPr>
+              <w:pStyle w:val="SourceCode"/>
+              <w:spacing w:before="0" w:after="0" w:line="200" w:lineRule="auto"/>
+            </w:pPr>
+            <w:r>
+              <w:t xml:space="preserve">find /c "error" log.txt      :: тільки кількість таких рядків</w:t>
+            </w:r>
+          </w:p>
+          <w:p>
+            <w:pPr>
+              <w:pStyle w:val="SourceCode"/>
+              <w:spacing w:before="0" w:after="0" w:line="200" w:lineRule="auto"/>
+            </w:pPr>
+            <w:r>
+              <w:t xml:space="preserve">find /v "error" log.txt      :: рядки, які НЕ містять error</w:t>
+            </w:r>
+          </w:p>
+        </w:tc>
+      </w:tr>
+    </w:tbl>
+    <w:p>
+      <w:pPr>
+        <w:spacing w:before="0" w:after="0" w:line="120" w:lineRule="exact"/>
+        <w:rPr>
+          <w:sz w:val="4"/>
+          <w:szCs w:val="4"/>
+        </w:rPr>
+      </w:pPr>
+    </w:p>
+    <w:p>
+      <w:pPr>
+        <w:spacing w:before="0" w:after="0" w:line="120" w:lineRule="exact"/>
+        <w:rPr>
+          <w:sz w:val="4"/>
+          <w:szCs w:val="4"/>
+        </w:rPr>
+      </w:pPr>
+    </w:p>
+    <w:tbl>
+      <w:tblPr>
+        <w:tblStyle w:val="SourceCodeTable"/>
+        <w:tblW w:type="dxa" w:w="9637"/>
+        <w:tblInd w:w="0" w:type="dxa"/>
+        <w:tblBorders>
+          <w:top w:color="BFBFBF" w:space="0" w:sz="4" w:val="single"/>
+          <w:left w:color="BFBFBF" w:space="0" w:sz="4" w:val="single"/>
+          <w:bottom w:color="BFBFBF" w:space="0" w:sz="4" w:val="single"/>
+          <w:right w:color="BFBFBF" w:space="0" w:sz="4" w:val="single"/>
+        </w:tblBorders>
+        <w:tblLayout w:type="fixed"/>
+        <w:tblCellMar>
+          <w:top w:type="dxa" w:w="113"/>
+          <w:left w:type="dxa" w:w="113"/>
+          <w:bottom w:type="dxa" w:w="113"/>
+          <w:right w:type="dxa" w:w="113"/>
+        </w:tblCellMar>
+        <w:tblLook w:val="0000" w:firstRow="0" w:lastRow="0" w:firstColumn="0" w:lastColumn="0" w:noHBand="1" w:noVBand="1"/>
+      </w:tblPr>
+      <w:tblGrid>
+        <w:gridCol w:w="9637"/>
+      </w:tblGrid>
+      <w:tr>
+        <w:tc>
+          <w:tcPr>
+            <w:tcW w:type="dxa" w:w="9637"/>
+          </w:tcPr>
+          <w:p>
+            <w:pPr>
+              <w:pStyle w:val="SourceCode"/>
+              <w:spacing w:before="0" w:after="0" w:line="200" w:lineRule="auto"/>
+            </w:pPr>
+            <w:r>
+              <w:t xml:space="preserve">findstr /i "error" *.log     :: у всіх файлах поточного каталогу</w:t>
+            </w:r>
+          </w:p>
+          <w:p>
+            <w:pPr>
+              <w:pStyle w:val="SourceCode"/>
+              <w:spacing w:before="0" w:after="0" w:line="200" w:lineRule="auto"/>
+            </w:pPr>
+            <w:r>
+              <w:t xml:space="preserve">findstr /s /i "error" *.log  :: рекурсивно по дереву</w:t>
+            </w:r>
+          </w:p>
+          <w:p>
+            <w:pPr>
+              <w:pStyle w:val="SourceCode"/>
+              <w:spacing w:before="0" w:after="0" w:line="200" w:lineRule="auto"/>
+            </w:pPr>
+            <w:r>
+              <w:t xml:space="preserve">findstr /n "error" log.txt   :: з номерами рядків</w:t>
+            </w:r>
+          </w:p>
+          <w:p>
+            <w:pPr>
+              <w:pStyle w:val="SourceCode"/>
+              <w:spacing w:before="0" w:after="0" w:line="200" w:lineRule="auto"/>
+            </w:pPr>
+            <w:r>
+              <w:t xml:space="preserve">findstr /r "^[0-9]" log.txt  :: регулярний вираз: рядки, що починаються з цифри</w:t>
+            </w:r>
+          </w:p>
+        </w:tc>
+      </w:tr>
+    </w:tbl>
+    <w:p>
+      <w:pPr>
+        <w:spacing w:before="0" w:after="0" w:line="120" w:lineRule="exact"/>
+        <w:rPr>
+          <w:sz w:val="4"/>
+          <w:szCs w:val="4"/>
+        </w:rPr>
+      </w:pPr>
     </w:p>
     <w:bookmarkEnd w:id="17"/>
     <w:bookmarkStart w:id="18" w:name="ті-самі-задачі-мовою-powershell"/>
@@ -2035,165 +2574,312 @@
     </w:p>
     <w:p>
       <w:pPr>
-        <w:pStyle w:val="SourceCode"/>
-        <w:spacing w:before="120" w:after="0" w:line="200" w:lineRule="auto"/>
-      </w:pPr>
-      <w:r>
-        <w:t xml:space="preserve">C:\Users\Student&gt; cd %USERPROFILE%\Desktop</w:t>
-      </w:r>
-    </w:p>
-    <w:p>
-      <w:pPr>
-        <w:pStyle w:val="SourceCode"/>
-        <w:spacing w:before="0" w:after="0" w:line="200" w:lineRule="auto"/>
-      </w:pPr>
-      <w:r>
-        <w:t xml:space="preserve">C:\Users\Student\Desktop&gt; md LAB2</w:t>
-      </w:r>
-    </w:p>
-    <w:p>
-      <w:pPr>
-        <w:pStyle w:val="SourceCode"/>
-        <w:spacing w:before="0" w:after="0" w:line="200" w:lineRule="auto"/>
-      </w:pPr>
-      <w:r>
-        <w:t xml:space="preserve">C:\Users\Student\Desktop&gt; cd LAB2</w:t>
-      </w:r>
-    </w:p>
-    <w:p>
-      <w:pPr>
-        <w:pStyle w:val="SourceCode"/>
-        <w:spacing w:before="0" w:after="0" w:line="200" w:lineRule="auto"/>
-      </w:pPr>
-      <w:r>
-        <w:t xml:space="preserve">C:\...\LAB2&gt; md src docs bak "test folder"</w:t>
-      </w:r>
-    </w:p>
-    <w:p>
-      <w:pPr>
-        <w:pStyle w:val="SourceCode"/>
-        <w:spacing w:before="0" w:after="0" w:line="200" w:lineRule="auto"/>
-      </w:pPr>
-      <w:r>
-        <w:t xml:space="preserve">C:\...\LAB2&gt; dir /a:d /b</w:t>
-      </w:r>
-    </w:p>
-    <w:p>
-      <w:pPr>
-        <w:pStyle w:val="SourceCode"/>
-        <w:spacing w:before="0" w:after="0" w:line="200" w:lineRule="auto"/>
-      </w:pPr>
-      <w:r>
-        <w:t xml:space="preserve">bak</w:t>
-      </w:r>
-    </w:p>
-    <w:p>
-      <w:pPr>
-        <w:pStyle w:val="SourceCode"/>
-        <w:spacing w:before="0" w:after="0" w:line="200" w:lineRule="auto"/>
-      </w:pPr>
-      <w:r>
-        <w:t xml:space="preserve">docs</w:t>
-      </w:r>
-    </w:p>
-    <w:p>
-      <w:pPr>
-        <w:pStyle w:val="SourceCode"/>
-        <w:spacing w:before="0" w:after="0" w:line="200" w:lineRule="auto"/>
-      </w:pPr>
-      <w:r>
-        <w:t xml:space="preserve">src</w:t>
-      </w:r>
-    </w:p>
-    <w:p>
-      <w:pPr>
-        <w:pStyle w:val="SourceCode"/>
-        <w:spacing w:before="0" w:after="120" w:line="200" w:lineRule="auto"/>
-      </w:pPr>
-      <w:r>
-        <w:t xml:space="preserve">test folder</w:t>
-      </w:r>
-    </w:p>
-    <w:p>
-      <w:pPr>
-        <w:pStyle w:val="SourceCode"/>
-        <w:spacing w:before="120" w:after="0" w:line="200" w:lineRule="auto"/>
-      </w:pPr>
-      <w:r>
-        <w:t xml:space="preserve">C:\...\LAB2&gt; cd test folder</w:t>
-      </w:r>
-    </w:p>
-    <w:p>
-      <w:pPr>
-        <w:pStyle w:val="SourceCode"/>
-        <w:spacing w:before="0" w:after="120" w:line="200" w:lineRule="auto"/>
-      </w:pPr>
-      <w:r>
-        <w:t xml:space="preserve">The system cannot find the path specified.</w:t>
-      </w:r>
-    </w:p>
-    <w:p>
-      <w:pPr>
-        <w:pStyle w:val="SourceCode"/>
-        <w:spacing w:before="120" w:after="0" w:line="200" w:lineRule="auto"/>
-      </w:pPr>
-      <w:r>
-        <w:t xml:space="preserve">C:\...\LAB2&gt; cd "test folder"</w:t>
-      </w:r>
-    </w:p>
-    <w:p>
-      <w:pPr>
-        <w:pStyle w:val="SourceCode"/>
-        <w:spacing w:before="0" w:after="0" w:line="200" w:lineRule="auto"/>
-      </w:pPr>
-      <w:r>
-        <w:t xml:space="preserve">C:\...\LAB2\test folder&gt; cd ..</w:t>
-      </w:r>
-    </w:p>
-    <w:p>
-      <w:pPr>
-        <w:pStyle w:val="SourceCode"/>
-        <w:spacing w:before="0" w:after="0" w:line="200" w:lineRule="auto"/>
-      </w:pPr>
-      <w:r>
-        <w:t xml:space="preserve">C:\...\LAB2&gt; pushd %SystemRoot%\Media</w:t>
-      </w:r>
-    </w:p>
-    <w:p>
-      <w:pPr>
-        <w:pStyle w:val="SourceCode"/>
-        <w:spacing w:before="0" w:after="0" w:line="200" w:lineRule="auto"/>
-      </w:pPr>
-      <w:r>
-        <w:t xml:space="preserve">C:\Windows\Media&gt; dir /b *.wav | find /c ".wav"</w:t>
-      </w:r>
-    </w:p>
-    <w:p>
-      <w:pPr>
-        <w:pStyle w:val="SourceCode"/>
-        <w:spacing w:before="0" w:after="0" w:line="200" w:lineRule="auto"/>
-      </w:pPr>
-      <w:r>
-        <w:t xml:space="preserve">70</w:t>
-      </w:r>
-    </w:p>
-    <w:p>
-      <w:pPr>
-        <w:pStyle w:val="SourceCode"/>
-        <w:spacing w:before="0" w:after="0" w:line="200" w:lineRule="auto"/>
-      </w:pPr>
-      <w:r>
-        <w:t xml:space="preserve">C:\Windows\Media&gt; popd</w:t>
-      </w:r>
-    </w:p>
-    <w:p>
-      <w:pPr>
-        <w:pStyle w:val="SourceCode"/>
-        <w:spacing w:before="0" w:after="120" w:line="200" w:lineRule="auto"/>
-      </w:pPr>
-      <w:r>
-        <w:t xml:space="preserve">C:\...\LAB2&gt;</w:t>
-      </w:r>
+        <w:spacing w:before="0" w:after="0" w:line="120" w:lineRule="exact"/>
+        <w:rPr>
+          <w:sz w:val="4"/>
+          <w:szCs w:val="4"/>
+        </w:rPr>
+      </w:pPr>
+    </w:p>
+    <w:tbl>
+      <w:tblPr>
+        <w:tblStyle w:val="SourceCodeTable"/>
+        <w:tblW w:type="dxa" w:w="9637"/>
+        <w:tblInd w:w="0" w:type="dxa"/>
+        <w:tblBorders>
+          <w:top w:color="BFBFBF" w:space="0" w:sz="4" w:val="single"/>
+          <w:left w:color="BFBFBF" w:space="0" w:sz="4" w:val="single"/>
+          <w:bottom w:color="BFBFBF" w:space="0" w:sz="4" w:val="single"/>
+          <w:right w:color="BFBFBF" w:space="0" w:sz="4" w:val="single"/>
+        </w:tblBorders>
+        <w:tblLayout w:type="fixed"/>
+        <w:tblCellMar>
+          <w:top w:type="dxa" w:w="113"/>
+          <w:left w:type="dxa" w:w="113"/>
+          <w:bottom w:type="dxa" w:w="113"/>
+          <w:right w:type="dxa" w:w="113"/>
+        </w:tblCellMar>
+        <w:tblLook w:val="0000" w:firstRow="0" w:lastRow="0" w:firstColumn="0" w:lastColumn="0" w:noHBand="1" w:noVBand="1"/>
+      </w:tblPr>
+      <w:tblGrid>
+        <w:gridCol w:w="9637"/>
+      </w:tblGrid>
+      <w:tr>
+        <w:tc>
+          <w:tcPr>
+            <w:tcW w:type="dxa" w:w="9637"/>
+          </w:tcPr>
+          <w:p>
+            <w:pPr>
+              <w:pStyle w:val="SourceCode"/>
+              <w:spacing w:before="0" w:after="0" w:line="200" w:lineRule="auto"/>
+            </w:pPr>
+            <w:r>
+              <w:t xml:space="preserve">C:\Users\Student&gt; cd %USERPROFILE%\Desktop</w:t>
+            </w:r>
+          </w:p>
+          <w:p>
+            <w:pPr>
+              <w:pStyle w:val="SourceCode"/>
+              <w:spacing w:before="0" w:after="0" w:line="200" w:lineRule="auto"/>
+            </w:pPr>
+            <w:r>
+              <w:t xml:space="preserve">C:\Users\Student\Desktop&gt; md LAB2</w:t>
+            </w:r>
+          </w:p>
+          <w:p>
+            <w:pPr>
+              <w:pStyle w:val="SourceCode"/>
+              <w:spacing w:before="0" w:after="0" w:line="200" w:lineRule="auto"/>
+            </w:pPr>
+            <w:r>
+              <w:t xml:space="preserve">C:\Users\Student\Desktop&gt; cd LAB2</w:t>
+            </w:r>
+          </w:p>
+          <w:p>
+            <w:pPr>
+              <w:pStyle w:val="SourceCode"/>
+              <w:spacing w:before="0" w:after="0" w:line="200" w:lineRule="auto"/>
+            </w:pPr>
+            <w:r>
+              <w:t xml:space="preserve">C:\...\LAB2&gt; md src docs bak "test folder"</w:t>
+            </w:r>
+          </w:p>
+          <w:p>
+            <w:pPr>
+              <w:pStyle w:val="SourceCode"/>
+              <w:spacing w:before="0" w:after="0" w:line="200" w:lineRule="auto"/>
+            </w:pPr>
+            <w:r>
+              <w:t xml:space="preserve">C:\...\LAB2&gt; dir /a:d /b</w:t>
+            </w:r>
+          </w:p>
+          <w:p>
+            <w:pPr>
+              <w:pStyle w:val="SourceCode"/>
+              <w:spacing w:before="0" w:after="0" w:line="200" w:lineRule="auto"/>
+            </w:pPr>
+            <w:r>
+              <w:t xml:space="preserve">bak</w:t>
+            </w:r>
+          </w:p>
+          <w:p>
+            <w:pPr>
+              <w:pStyle w:val="SourceCode"/>
+              <w:spacing w:before="0" w:after="0" w:line="200" w:lineRule="auto"/>
+            </w:pPr>
+            <w:r>
+              <w:t xml:space="preserve">docs</w:t>
+            </w:r>
+          </w:p>
+          <w:p>
+            <w:pPr>
+              <w:pStyle w:val="SourceCode"/>
+              <w:spacing w:before="0" w:after="0" w:line="200" w:lineRule="auto"/>
+            </w:pPr>
+            <w:r>
+              <w:t xml:space="preserve">src</w:t>
+            </w:r>
+          </w:p>
+          <w:p>
+            <w:pPr>
+              <w:pStyle w:val="SourceCode"/>
+              <w:spacing w:before="0" w:after="0" w:line="200" w:lineRule="auto"/>
+            </w:pPr>
+            <w:r>
+              <w:t xml:space="preserve">test folder</w:t>
+            </w:r>
+          </w:p>
+        </w:tc>
+      </w:tr>
+    </w:tbl>
+    <w:p>
+      <w:pPr>
+        <w:spacing w:before="0" w:after="0" w:line="120" w:lineRule="exact"/>
+        <w:rPr>
+          <w:sz w:val="4"/>
+          <w:szCs w:val="4"/>
+        </w:rPr>
+      </w:pPr>
+    </w:p>
+    <w:p>
+      <w:pPr>
+        <w:spacing w:before="0" w:after="0" w:line="120" w:lineRule="exact"/>
+        <w:rPr>
+          <w:sz w:val="4"/>
+          <w:szCs w:val="4"/>
+        </w:rPr>
+      </w:pPr>
+    </w:p>
+    <w:tbl>
+      <w:tblPr>
+        <w:tblStyle w:val="SourceCodeTable"/>
+        <w:tblW w:type="dxa" w:w="9637"/>
+        <w:tblInd w:w="0" w:type="dxa"/>
+        <w:tblBorders>
+          <w:top w:color="BFBFBF" w:space="0" w:sz="4" w:val="single"/>
+          <w:left w:color="BFBFBF" w:space="0" w:sz="4" w:val="single"/>
+          <w:bottom w:color="BFBFBF" w:space="0" w:sz="4" w:val="single"/>
+          <w:right w:color="BFBFBF" w:space="0" w:sz="4" w:val="single"/>
+        </w:tblBorders>
+        <w:tblLayout w:type="fixed"/>
+        <w:tblCellMar>
+          <w:top w:type="dxa" w:w="113"/>
+          <w:left w:type="dxa" w:w="113"/>
+          <w:bottom w:type="dxa" w:w="113"/>
+          <w:right w:type="dxa" w:w="113"/>
+        </w:tblCellMar>
+        <w:tblLook w:val="0000" w:firstRow="0" w:lastRow="0" w:firstColumn="0" w:lastColumn="0" w:noHBand="1" w:noVBand="1"/>
+      </w:tblPr>
+      <w:tblGrid>
+        <w:gridCol w:w="9637"/>
+      </w:tblGrid>
+      <w:tr>
+        <w:tc>
+          <w:tcPr>
+            <w:tcW w:type="dxa" w:w="9637"/>
+          </w:tcPr>
+          <w:p>
+            <w:pPr>
+              <w:pStyle w:val="SourceCode"/>
+              <w:spacing w:before="0" w:after="0" w:line="200" w:lineRule="auto"/>
+            </w:pPr>
+            <w:r>
+              <w:t xml:space="preserve">C:\...\LAB2&gt; cd test folder</w:t>
+            </w:r>
+          </w:p>
+          <w:p>
+            <w:pPr>
+              <w:pStyle w:val="SourceCode"/>
+              <w:spacing w:before="0" w:after="0" w:line="200" w:lineRule="auto"/>
+            </w:pPr>
+            <w:r>
+              <w:t xml:space="preserve">The system cannot find the path specified.</w:t>
+            </w:r>
+          </w:p>
+        </w:tc>
+      </w:tr>
+    </w:tbl>
+    <w:p>
+      <w:pPr>
+        <w:spacing w:before="0" w:after="0" w:line="120" w:lineRule="exact"/>
+        <w:rPr>
+          <w:sz w:val="4"/>
+          <w:szCs w:val="4"/>
+        </w:rPr>
+      </w:pPr>
+    </w:p>
+    <w:p>
+      <w:pPr>
+        <w:spacing w:before="0" w:after="0" w:line="120" w:lineRule="exact"/>
+        <w:rPr>
+          <w:sz w:val="4"/>
+          <w:szCs w:val="4"/>
+        </w:rPr>
+      </w:pPr>
+    </w:p>
+    <w:tbl>
+      <w:tblPr>
+        <w:tblStyle w:val="SourceCodeTable"/>
+        <w:tblW w:type="dxa" w:w="9637"/>
+        <w:tblInd w:w="0" w:type="dxa"/>
+        <w:tblBorders>
+          <w:top w:color="BFBFBF" w:space="0" w:sz="4" w:val="single"/>
+          <w:left w:color="BFBFBF" w:space="0" w:sz="4" w:val="single"/>
+          <w:bottom w:color="BFBFBF" w:space="0" w:sz="4" w:val="single"/>
+          <w:right w:color="BFBFBF" w:space="0" w:sz="4" w:val="single"/>
+        </w:tblBorders>
+        <w:tblLayout w:type="fixed"/>
+        <w:tblCellMar>
+          <w:top w:type="dxa" w:w="113"/>
+          <w:left w:type="dxa" w:w="113"/>
+          <w:bottom w:type="dxa" w:w="113"/>
+          <w:right w:type="dxa" w:w="113"/>
+        </w:tblCellMar>
+        <w:tblLook w:val="0000" w:firstRow="0" w:lastRow="0" w:firstColumn="0" w:lastColumn="0" w:noHBand="1" w:noVBand="1"/>
+      </w:tblPr>
+      <w:tblGrid>
+        <w:gridCol w:w="9637"/>
+      </w:tblGrid>
+      <w:tr>
+        <w:tc>
+          <w:tcPr>
+            <w:tcW w:type="dxa" w:w="9637"/>
+          </w:tcPr>
+          <w:p>
+            <w:pPr>
+              <w:pStyle w:val="SourceCode"/>
+              <w:spacing w:before="0" w:after="0" w:line="200" w:lineRule="auto"/>
+            </w:pPr>
+            <w:r>
+              <w:t xml:space="preserve">C:\...\LAB2&gt; cd "test folder"</w:t>
+            </w:r>
+          </w:p>
+          <w:p>
+            <w:pPr>
+              <w:pStyle w:val="SourceCode"/>
+              <w:spacing w:before="0" w:after="0" w:line="200" w:lineRule="auto"/>
+            </w:pPr>
+            <w:r>
+              <w:t xml:space="preserve">C:\...\LAB2\test folder&gt; cd ..</w:t>
+            </w:r>
+          </w:p>
+          <w:p>
+            <w:pPr>
+              <w:pStyle w:val="SourceCode"/>
+              <w:spacing w:before="0" w:after="0" w:line="200" w:lineRule="auto"/>
+            </w:pPr>
+            <w:r>
+              <w:t xml:space="preserve">C:\...\LAB2&gt; pushd %SystemRoot%\Media</w:t>
+            </w:r>
+          </w:p>
+          <w:p>
+            <w:pPr>
+              <w:pStyle w:val="SourceCode"/>
+              <w:spacing w:before="0" w:after="0" w:line="200" w:lineRule="auto"/>
+            </w:pPr>
+            <w:r>
+              <w:t xml:space="preserve">C:\Windows\Media&gt; dir /b *.wav | find /c ".wav"</w:t>
+            </w:r>
+          </w:p>
+          <w:p>
+            <w:pPr>
+              <w:pStyle w:val="SourceCode"/>
+              <w:spacing w:before="0" w:after="0" w:line="200" w:lineRule="auto"/>
+            </w:pPr>
+            <w:r>
+              <w:t xml:space="preserve">70</w:t>
+            </w:r>
+          </w:p>
+          <w:p>
+            <w:pPr>
+              <w:pStyle w:val="SourceCode"/>
+              <w:spacing w:before="0" w:after="0" w:line="200" w:lineRule="auto"/>
+            </w:pPr>
+            <w:r>
+              <w:t xml:space="preserve">C:\Windows\Media&gt; popd</w:t>
+            </w:r>
+          </w:p>
+          <w:p>
+            <w:pPr>
+              <w:pStyle w:val="SourceCode"/>
+              <w:spacing w:before="0" w:after="0" w:line="200" w:lineRule="auto"/>
+            </w:pPr>
+            <w:r>
+              <w:t xml:space="preserve">C:\...\LAB2&gt;</w:t>
+            </w:r>
+          </w:p>
+        </w:tc>
+      </w:tr>
+    </w:tbl>
+    <w:p>
+      <w:pPr>
+        <w:spacing w:before="0" w:after="0" w:line="120" w:lineRule="exact"/>
+        <w:rPr>
+          <w:sz w:val="4"/>
+          <w:szCs w:val="4"/>
+        </w:rPr>
+      </w:pPr>
     </w:p>
     <w:p>
       <w:pPr>
@@ -2215,102 +2901,200 @@
     </w:p>
     <w:p>
       <w:pPr>
-        <w:pStyle w:val="SourceCode"/>
-        <w:spacing w:before="120" w:after="0" w:line="200" w:lineRule="auto"/>
-      </w:pPr>
-      <w:r>
-        <w:t xml:space="preserve">C:\...\LAB2&gt; xcopy /s /i %SystemRoot%\Media src</w:t>
-      </w:r>
-    </w:p>
-    <w:p>
-      <w:pPr>
-        <w:pStyle w:val="SourceCode"/>
-        <w:spacing w:before="0" w:after="0" w:line="200" w:lineRule="auto"/>
-      </w:pPr>
-      <w:r>
-        <w:t xml:space="preserve">...</w:t>
-      </w:r>
-    </w:p>
-    <w:p>
-      <w:pPr>
-        <w:pStyle w:val="SourceCode"/>
-        <w:spacing w:before="0" w:after="120" w:line="200" w:lineRule="auto"/>
-      </w:pPr>
-      <w:r>
-        <w:t xml:space="preserve">70 File(s) copied</w:t>
-      </w:r>
-    </w:p>
-    <w:p>
-      <w:pPr>
-        <w:pStyle w:val="SourceCode"/>
-        <w:spacing w:before="120" w:after="0" w:line="200" w:lineRule="auto"/>
-      </w:pPr>
-      <w:r>
-        <w:t xml:space="preserve">C:\...\LAB2&gt; dir src /s /b | find /c ":"</w:t>
-      </w:r>
-    </w:p>
-    <w:p>
-      <w:pPr>
-        <w:pStyle w:val="SourceCode"/>
-        <w:spacing w:before="0" w:after="0" w:line="200" w:lineRule="auto"/>
-      </w:pPr>
-      <w:r>
-        <w:t xml:space="preserve">78</w:t>
-      </w:r>
-    </w:p>
-    <w:p>
-      <w:pPr>
-        <w:pStyle w:val="SourceCode"/>
-        <w:spacing w:before="0" w:after="0" w:line="200" w:lineRule="auto"/>
-      </w:pPr>
-      <w:r>
-        <w:t xml:space="preserve">C:\...\LAB2&gt; dir src\*.wav /o:-s /b</w:t>
-      </w:r>
-    </w:p>
-    <w:p>
-      <w:pPr>
-        <w:pStyle w:val="SourceCode"/>
-        <w:spacing w:before="0" w:after="0" w:line="200" w:lineRule="auto"/>
-      </w:pPr>
-      <w:r>
-        <w:t xml:space="preserve">Windows Ringin.wav</w:t>
-      </w:r>
-    </w:p>
-    <w:p>
-      <w:pPr>
-        <w:pStyle w:val="SourceCode"/>
-        <w:spacing w:before="0" w:after="0" w:line="200" w:lineRule="auto"/>
-      </w:pPr>
-      <w:r>
-        <w:t xml:space="preserve">Windows Notify Calendar.wav</w:t>
-      </w:r>
-    </w:p>
-    <w:p>
-      <w:pPr>
-        <w:pStyle w:val="SourceCode"/>
-        <w:spacing w:before="0" w:after="0" w:line="200" w:lineRule="auto"/>
-      </w:pPr>
-      <w:r>
-        <w:t xml:space="preserve">...</w:t>
-      </w:r>
-    </w:p>
-    <w:p>
-      <w:pPr>
-        <w:pStyle w:val="SourceCode"/>
-        <w:spacing w:before="0" w:after="0" w:line="200" w:lineRule="auto"/>
-      </w:pPr>
-      <w:r>
-        <w:t xml:space="preserve">C:\...\LAB2&gt; dir src\??.wav /b</w:t>
-      </w:r>
-    </w:p>
-    <w:p>
-      <w:pPr>
-        <w:pStyle w:val="SourceCode"/>
-        <w:spacing w:before="0" w:after="120" w:line="200" w:lineRule="auto"/>
-      </w:pPr>
-      <w:r>
-        <w:t xml:space="preserve">File Not Found</w:t>
-      </w:r>
+        <w:spacing w:before="0" w:after="0" w:line="120" w:lineRule="exact"/>
+        <w:rPr>
+          <w:sz w:val="4"/>
+          <w:szCs w:val="4"/>
+        </w:rPr>
+      </w:pPr>
+    </w:p>
+    <w:tbl>
+      <w:tblPr>
+        <w:tblStyle w:val="SourceCodeTable"/>
+        <w:tblW w:type="dxa" w:w="9637"/>
+        <w:tblInd w:w="0" w:type="dxa"/>
+        <w:tblBorders>
+          <w:top w:color="BFBFBF" w:space="0" w:sz="4" w:val="single"/>
+          <w:left w:color="BFBFBF" w:space="0" w:sz="4" w:val="single"/>
+          <w:bottom w:color="BFBFBF" w:space="0" w:sz="4" w:val="single"/>
+          <w:right w:color="BFBFBF" w:space="0" w:sz="4" w:val="single"/>
+        </w:tblBorders>
+        <w:tblLayout w:type="fixed"/>
+        <w:tblCellMar>
+          <w:top w:type="dxa" w:w="113"/>
+          <w:left w:type="dxa" w:w="113"/>
+          <w:bottom w:type="dxa" w:w="113"/>
+          <w:right w:type="dxa" w:w="113"/>
+        </w:tblCellMar>
+        <w:tblLook w:val="0000" w:firstRow="0" w:lastRow="0" w:firstColumn="0" w:lastColumn="0" w:noHBand="1" w:noVBand="1"/>
+      </w:tblPr>
+      <w:tblGrid>
+        <w:gridCol w:w="9637"/>
+      </w:tblGrid>
+      <w:tr>
+        <w:tc>
+          <w:tcPr>
+            <w:tcW w:type="dxa" w:w="9637"/>
+          </w:tcPr>
+          <w:p>
+            <w:pPr>
+              <w:pStyle w:val="SourceCode"/>
+              <w:spacing w:before="0" w:after="0" w:line="200" w:lineRule="auto"/>
+            </w:pPr>
+            <w:r>
+              <w:t xml:space="preserve">C:\...\LAB2&gt; xcopy /s /i %SystemRoot%\Media src</w:t>
+            </w:r>
+          </w:p>
+          <w:p>
+            <w:pPr>
+              <w:pStyle w:val="SourceCode"/>
+              <w:spacing w:before="0" w:after="0" w:line="200" w:lineRule="auto"/>
+            </w:pPr>
+            <w:r>
+              <w:t xml:space="preserve">...</w:t>
+            </w:r>
+          </w:p>
+          <w:p>
+            <w:pPr>
+              <w:pStyle w:val="SourceCode"/>
+              <w:spacing w:before="0" w:after="0" w:line="200" w:lineRule="auto"/>
+            </w:pPr>
+            <w:r>
+              <w:t xml:space="preserve">70 File(s) copied</w:t>
+            </w:r>
+          </w:p>
+        </w:tc>
+      </w:tr>
+    </w:tbl>
+    <w:p>
+      <w:pPr>
+        <w:spacing w:before="0" w:after="0" w:line="120" w:lineRule="exact"/>
+        <w:rPr>
+          <w:sz w:val="4"/>
+          <w:szCs w:val="4"/>
+        </w:rPr>
+      </w:pPr>
+    </w:p>
+    <w:p>
+      <w:pPr>
+        <w:spacing w:before="0" w:after="0" w:line="120" w:lineRule="exact"/>
+        <w:rPr>
+          <w:sz w:val="4"/>
+          <w:szCs w:val="4"/>
+        </w:rPr>
+      </w:pPr>
+    </w:p>
+    <w:tbl>
+      <w:tblPr>
+        <w:tblStyle w:val="SourceCodeTable"/>
+        <w:tblW w:type="dxa" w:w="9637"/>
+        <w:tblInd w:w="0" w:type="dxa"/>
+        <w:tblBorders>
+          <w:top w:color="BFBFBF" w:space="0" w:sz="4" w:val="single"/>
+          <w:left w:color="BFBFBF" w:space="0" w:sz="4" w:val="single"/>
+          <w:bottom w:color="BFBFBF" w:space="0" w:sz="4" w:val="single"/>
+          <w:right w:color="BFBFBF" w:space="0" w:sz="4" w:val="single"/>
+        </w:tblBorders>
+        <w:tblLayout w:type="fixed"/>
+        <w:tblCellMar>
+          <w:top w:type="dxa" w:w="113"/>
+          <w:left w:type="dxa" w:w="113"/>
+          <w:bottom w:type="dxa" w:w="113"/>
+          <w:right w:type="dxa" w:w="113"/>
+        </w:tblCellMar>
+        <w:tblLook w:val="0000" w:firstRow="0" w:lastRow="0" w:firstColumn="0" w:lastColumn="0" w:noHBand="1" w:noVBand="1"/>
+      </w:tblPr>
+      <w:tblGrid>
+        <w:gridCol w:w="9637"/>
+      </w:tblGrid>
+      <w:tr>
+        <w:tc>
+          <w:tcPr>
+            <w:tcW w:type="dxa" w:w="9637"/>
+          </w:tcPr>
+          <w:p>
+            <w:pPr>
+              <w:pStyle w:val="SourceCode"/>
+              <w:spacing w:before="0" w:after="0" w:line="200" w:lineRule="auto"/>
+            </w:pPr>
+            <w:r>
+              <w:t xml:space="preserve">C:\...\LAB2&gt; dir src /s /b | find /c ":"</w:t>
+            </w:r>
+          </w:p>
+          <w:p>
+            <w:pPr>
+              <w:pStyle w:val="SourceCode"/>
+              <w:spacing w:before="0" w:after="0" w:line="200" w:lineRule="auto"/>
+            </w:pPr>
+            <w:r>
+              <w:t xml:space="preserve">78</w:t>
+            </w:r>
+          </w:p>
+          <w:p>
+            <w:pPr>
+              <w:pStyle w:val="SourceCode"/>
+              <w:spacing w:before="0" w:after="0" w:line="200" w:lineRule="auto"/>
+            </w:pPr>
+            <w:r>
+              <w:t xml:space="preserve">C:\...\LAB2&gt; dir src\*.wav /o:-s /b</w:t>
+            </w:r>
+          </w:p>
+          <w:p>
+            <w:pPr>
+              <w:pStyle w:val="SourceCode"/>
+              <w:spacing w:before="0" w:after="0" w:line="200" w:lineRule="auto"/>
+            </w:pPr>
+            <w:r>
+              <w:t xml:space="preserve">Windows Ringin.wav</w:t>
+            </w:r>
+          </w:p>
+          <w:p>
+            <w:pPr>
+              <w:pStyle w:val="SourceCode"/>
+              <w:spacing w:before="0" w:after="0" w:line="200" w:lineRule="auto"/>
+            </w:pPr>
+            <w:r>
+              <w:t xml:space="preserve">Windows Notify Calendar.wav</w:t>
+            </w:r>
+          </w:p>
+          <w:p>
+            <w:pPr>
+              <w:pStyle w:val="SourceCode"/>
+              <w:spacing w:before="0" w:after="0" w:line="200" w:lineRule="auto"/>
+            </w:pPr>
+            <w:r>
+              <w:t xml:space="preserve">...</w:t>
+            </w:r>
+          </w:p>
+          <w:p>
+            <w:pPr>
+              <w:pStyle w:val="SourceCode"/>
+              <w:spacing w:before="0" w:after="0" w:line="200" w:lineRule="auto"/>
+            </w:pPr>
+            <w:r>
+              <w:t xml:space="preserve">C:\...\LAB2&gt; dir src\??.wav /b</w:t>
+            </w:r>
+          </w:p>
+          <w:p>
+            <w:pPr>
+              <w:pStyle w:val="SourceCode"/>
+              <w:spacing w:before="0" w:after="0" w:line="200" w:lineRule="auto"/>
+            </w:pPr>
+            <w:r>
+              <w:t xml:space="preserve">File Not Found</w:t>
+            </w:r>
+          </w:p>
+        </w:tc>
+      </w:tr>
+    </w:tbl>
+    <w:p>
+      <w:pPr>
+        <w:spacing w:before="0" w:after="0" w:line="120" w:lineRule="exact"/>
+        <w:rPr>
+          <w:sz w:val="4"/>
+          <w:szCs w:val="4"/>
+        </w:rPr>
+      </w:pPr>
     </w:p>
     <w:p>
       <w:pPr>
@@ -2332,201 +3116,446 @@
     </w:p>
     <w:p>
       <w:pPr>
-        <w:pStyle w:val="SourceCode"/>
-        <w:spacing w:before="120" w:after="120" w:line="200" w:lineRule="auto"/>
-      </w:pPr>
-      <w:r>
-        <w:t xml:space="preserve">C:\...\LAB2&gt; md copy1 copy2 copy3</w:t>
-      </w:r>
-    </w:p>
-    <w:p>
-      <w:pPr>
-        <w:pStyle w:val="SourceCode"/>
-        <w:spacing w:before="120" w:after="0" w:line="200" w:lineRule="auto"/>
-      </w:pPr>
-      <w:r>
-        <w:t xml:space="preserve">C:\...\LAB2&gt; echo %time%</w:t>
-      </w:r>
-    </w:p>
-    <w:p>
-      <w:pPr>
-        <w:pStyle w:val="SourceCode"/>
-        <w:spacing w:before="0" w:after="0" w:line="200" w:lineRule="auto"/>
-      </w:pPr>
-      <w:r>
-        <w:t xml:space="preserve">14:22:05,31</w:t>
-      </w:r>
-    </w:p>
-    <w:p>
-      <w:pPr>
-        <w:pStyle w:val="SourceCode"/>
-        <w:spacing w:before="0" w:after="0" w:line="200" w:lineRule="auto"/>
-      </w:pPr>
-      <w:r>
-        <w:t xml:space="preserve">C:\...\LAB2&gt; copy src\*.* copy1\ &gt; nul</w:t>
-      </w:r>
-    </w:p>
-    <w:p>
-      <w:pPr>
-        <w:pStyle w:val="SourceCode"/>
-        <w:spacing w:before="0" w:after="0" w:line="200" w:lineRule="auto"/>
-      </w:pPr>
-      <w:r>
-        <w:t xml:space="preserve">C:\...\LAB2&gt; echo %time%</w:t>
-      </w:r>
-    </w:p>
-    <w:p>
-      <w:pPr>
-        <w:pStyle w:val="SourceCode"/>
-        <w:spacing w:before="0" w:after="120" w:line="200" w:lineRule="auto"/>
-      </w:pPr>
-      <w:r>
-        <w:t xml:space="preserve">14:22:06,08</w:t>
-      </w:r>
-    </w:p>
-    <w:p>
-      <w:pPr>
-        <w:pStyle w:val="SourceCode"/>
-        <w:spacing w:before="120" w:after="0" w:line="200" w:lineRule="auto"/>
-      </w:pPr>
-      <w:r>
-        <w:t xml:space="preserve">C:\...\LAB2&gt; echo %time%</w:t>
-      </w:r>
-    </w:p>
-    <w:p>
-      <w:pPr>
-        <w:pStyle w:val="SourceCode"/>
-        <w:spacing w:before="0" w:after="0" w:line="200" w:lineRule="auto"/>
-      </w:pPr>
-      <w:r>
-        <w:t xml:space="preserve">14:22:11,44</w:t>
-      </w:r>
-    </w:p>
-    <w:p>
-      <w:pPr>
-        <w:pStyle w:val="SourceCode"/>
-        <w:spacing w:before="0" w:after="0" w:line="200" w:lineRule="auto"/>
-      </w:pPr>
-      <w:r>
-        <w:t xml:space="preserve">C:\...\LAB2&gt; xcopy /s /e /q src copy2\ &gt; nul</w:t>
-      </w:r>
-    </w:p>
-    <w:p>
-      <w:pPr>
-        <w:pStyle w:val="SourceCode"/>
-        <w:spacing w:before="0" w:after="0" w:line="200" w:lineRule="auto"/>
-      </w:pPr>
-      <w:r>
-        <w:t xml:space="preserve">C:\...\LAB2&gt; echo %time%</w:t>
-      </w:r>
-    </w:p>
-    <w:p>
-      <w:pPr>
-        <w:pStyle w:val="SourceCode"/>
-        <w:spacing w:before="0" w:after="120" w:line="200" w:lineRule="auto"/>
-      </w:pPr>
-      <w:r>
-        <w:t xml:space="preserve">14:22:12,97</w:t>
-      </w:r>
-    </w:p>
-    <w:p>
-      <w:pPr>
-        <w:pStyle w:val="SourceCode"/>
-        <w:spacing w:before="120" w:after="0" w:line="200" w:lineRule="auto"/>
-      </w:pPr>
-      <w:r>
-        <w:t xml:space="preserve">C:\...\LAB2&gt; echo %time%</w:t>
-      </w:r>
-    </w:p>
-    <w:p>
-      <w:pPr>
-        <w:pStyle w:val="SourceCode"/>
-        <w:spacing w:before="0" w:after="0" w:line="200" w:lineRule="auto"/>
-      </w:pPr>
-      <w:r>
-        <w:t xml:space="preserve">14:22:20,12</w:t>
-      </w:r>
-    </w:p>
-    <w:p>
-      <w:pPr>
-        <w:pStyle w:val="SourceCode"/>
-        <w:spacing w:before="0" w:after="0" w:line="200" w:lineRule="auto"/>
-      </w:pPr>
-      <w:r>
-        <w:t xml:space="preserve">C:\...\LAB2&gt; robocopy src copy3 /e /mt:8 /njh /njs /nfl /ndl &gt; nul</w:t>
-      </w:r>
-    </w:p>
-    <w:p>
-      <w:pPr>
-        <w:pStyle w:val="SourceCode"/>
-        <w:spacing w:before="0" w:after="0" w:line="200" w:lineRule="auto"/>
-      </w:pPr>
-      <w:r>
-        <w:t xml:space="preserve">C:\...\LAB2&gt; echo %time%</w:t>
-      </w:r>
-    </w:p>
-    <w:p>
-      <w:pPr>
-        <w:pStyle w:val="SourceCode"/>
-        <w:spacing w:before="0" w:after="120" w:line="200" w:lineRule="auto"/>
-      </w:pPr>
-      <w:r>
-        <w:t xml:space="preserve">14:22:20,79</w:t>
-      </w:r>
-    </w:p>
-    <w:p>
-      <w:pPr>
-        <w:pStyle w:val="SourceCode"/>
-        <w:spacing w:before="120" w:after="0" w:line="200" w:lineRule="auto"/>
-      </w:pPr>
-      <w:r>
-        <w:t xml:space="preserve">C:\...\LAB2&gt; dir copy1 /s /b | find /c ":"</w:t>
-      </w:r>
-    </w:p>
-    <w:p>
-      <w:pPr>
-        <w:pStyle w:val="SourceCode"/>
-        <w:spacing w:before="0" w:after="0" w:line="200" w:lineRule="auto"/>
-      </w:pPr>
-      <w:r>
-        <w:t xml:space="preserve">70</w:t>
-      </w:r>
-    </w:p>
-    <w:p>
-      <w:pPr>
-        <w:pStyle w:val="SourceCode"/>
-        <w:spacing w:before="0" w:after="0" w:line="200" w:lineRule="auto"/>
-      </w:pPr>
-      <w:r>
-        <w:t xml:space="preserve">C:\...\LAB2&gt; dir copy2 /s /b | find /c ":"</w:t>
-      </w:r>
-    </w:p>
-    <w:p>
-      <w:pPr>
-        <w:pStyle w:val="SourceCode"/>
-        <w:spacing w:before="0" w:after="0" w:line="200" w:lineRule="auto"/>
-      </w:pPr>
-      <w:r>
-        <w:t xml:space="preserve">78</w:t>
-      </w:r>
-    </w:p>
-    <w:p>
-      <w:pPr>
-        <w:pStyle w:val="SourceCode"/>
-        <w:spacing w:before="0" w:after="0" w:line="200" w:lineRule="auto"/>
-      </w:pPr>
-      <w:r>
-        <w:t xml:space="preserve">C:\...\LAB2&gt; dir copy3 /s /b | find /c ":"</w:t>
-      </w:r>
-    </w:p>
-    <w:p>
-      <w:pPr>
-        <w:pStyle w:val="SourceCode"/>
-        <w:spacing w:before="0" w:after="120" w:line="200" w:lineRule="auto"/>
-      </w:pPr>
-      <w:r>
-        <w:t xml:space="preserve">78</w:t>
-      </w:r>
+        <w:spacing w:before="0" w:after="0" w:line="120" w:lineRule="exact"/>
+        <w:rPr>
+          <w:sz w:val="4"/>
+          <w:szCs w:val="4"/>
+        </w:rPr>
+      </w:pPr>
+    </w:p>
+    <w:tbl>
+      <w:tblPr>
+        <w:tblStyle w:val="SourceCodeTable"/>
+        <w:tblW w:type="dxa" w:w="9637"/>
+        <w:tblInd w:w="0" w:type="dxa"/>
+        <w:tblBorders>
+          <w:top w:color="BFBFBF" w:space="0" w:sz="4" w:val="single"/>
+          <w:left w:color="BFBFBF" w:space="0" w:sz="4" w:val="single"/>
+          <w:bottom w:color="BFBFBF" w:space="0" w:sz="4" w:val="single"/>
+          <w:right w:color="BFBFBF" w:space="0" w:sz="4" w:val="single"/>
+        </w:tblBorders>
+        <w:tblLayout w:type="fixed"/>
+        <w:tblCellMar>
+          <w:top w:type="dxa" w:w="113"/>
+          <w:left w:type="dxa" w:w="113"/>
+          <w:bottom w:type="dxa" w:w="113"/>
+          <w:right w:type="dxa" w:w="113"/>
+        </w:tblCellMar>
+        <w:tblLook w:val="0000" w:firstRow="0" w:lastRow="0" w:firstColumn="0" w:lastColumn="0" w:noHBand="1" w:noVBand="1"/>
+      </w:tblPr>
+      <w:tblGrid>
+        <w:gridCol w:w="9637"/>
+      </w:tblGrid>
+      <w:tr>
+        <w:tc>
+          <w:tcPr>
+            <w:tcW w:type="dxa" w:w="9637"/>
+          </w:tcPr>
+          <w:p>
+            <w:pPr>
+              <w:pStyle w:val="SourceCode"/>
+              <w:spacing w:before="0" w:after="0" w:line="200" w:lineRule="auto"/>
+            </w:pPr>
+            <w:r>
+              <w:t xml:space="preserve">C:\...\LAB2&gt; md copy1 copy2 copy3</w:t>
+            </w:r>
+          </w:p>
+        </w:tc>
+      </w:tr>
+    </w:tbl>
+    <w:p>
+      <w:pPr>
+        <w:spacing w:before="0" w:after="0" w:line="120" w:lineRule="exact"/>
+        <w:rPr>
+          <w:sz w:val="4"/>
+          <w:szCs w:val="4"/>
+        </w:rPr>
+      </w:pPr>
+    </w:p>
+    <w:p>
+      <w:pPr>
+        <w:spacing w:before="0" w:after="0" w:line="120" w:lineRule="exact"/>
+        <w:rPr>
+          <w:sz w:val="4"/>
+          <w:szCs w:val="4"/>
+        </w:rPr>
+      </w:pPr>
+    </w:p>
+    <w:tbl>
+      <w:tblPr>
+        <w:tblStyle w:val="SourceCodeTable"/>
+        <w:tblW w:type="dxa" w:w="9637"/>
+        <w:tblInd w:w="0" w:type="dxa"/>
+        <w:tblBorders>
+          <w:top w:color="BFBFBF" w:space="0" w:sz="4" w:val="single"/>
+          <w:left w:color="BFBFBF" w:space="0" w:sz="4" w:val="single"/>
+          <w:bottom w:color="BFBFBF" w:space="0" w:sz="4" w:val="single"/>
+          <w:right w:color="BFBFBF" w:space="0" w:sz="4" w:val="single"/>
+        </w:tblBorders>
+        <w:tblLayout w:type="fixed"/>
+        <w:tblCellMar>
+          <w:top w:type="dxa" w:w="113"/>
+          <w:left w:type="dxa" w:w="113"/>
+          <w:bottom w:type="dxa" w:w="113"/>
+          <w:right w:type="dxa" w:w="113"/>
+        </w:tblCellMar>
+        <w:tblLook w:val="0000" w:firstRow="0" w:lastRow="0" w:firstColumn="0" w:lastColumn="0" w:noHBand="1" w:noVBand="1"/>
+      </w:tblPr>
+      <w:tblGrid>
+        <w:gridCol w:w="9637"/>
+      </w:tblGrid>
+      <w:tr>
+        <w:tc>
+          <w:tcPr>
+            <w:tcW w:type="dxa" w:w="9637"/>
+          </w:tcPr>
+          <w:p>
+            <w:pPr>
+              <w:pStyle w:val="SourceCode"/>
+              <w:spacing w:before="0" w:after="0" w:line="200" w:lineRule="auto"/>
+            </w:pPr>
+            <w:r>
+              <w:t xml:space="preserve">C:\...\LAB2&gt; echo %time%</w:t>
+            </w:r>
+          </w:p>
+          <w:p>
+            <w:pPr>
+              <w:pStyle w:val="SourceCode"/>
+              <w:spacing w:before="0" w:after="0" w:line="200" w:lineRule="auto"/>
+            </w:pPr>
+            <w:r>
+              <w:t xml:space="preserve">14:22:05,31</w:t>
+            </w:r>
+          </w:p>
+          <w:p>
+            <w:pPr>
+              <w:pStyle w:val="SourceCode"/>
+              <w:spacing w:before="0" w:after="0" w:line="200" w:lineRule="auto"/>
+            </w:pPr>
+            <w:r>
+              <w:t xml:space="preserve">C:\...\LAB2&gt; copy src\*.* copy1\ &gt; nul</w:t>
+            </w:r>
+          </w:p>
+          <w:p>
+            <w:pPr>
+              <w:pStyle w:val="SourceCode"/>
+              <w:spacing w:before="0" w:after="0" w:line="200" w:lineRule="auto"/>
+            </w:pPr>
+            <w:r>
+              <w:t xml:space="preserve">C:\...\LAB2&gt; echo %time%</w:t>
+            </w:r>
+          </w:p>
+          <w:p>
+            <w:pPr>
+              <w:pStyle w:val="SourceCode"/>
+              <w:spacing w:before="0" w:after="0" w:line="200" w:lineRule="auto"/>
+            </w:pPr>
+            <w:r>
+              <w:t xml:space="preserve">14:22:06,08</w:t>
+            </w:r>
+          </w:p>
+        </w:tc>
+      </w:tr>
+    </w:tbl>
+    <w:p>
+      <w:pPr>
+        <w:spacing w:before="0" w:after="0" w:line="120" w:lineRule="exact"/>
+        <w:rPr>
+          <w:sz w:val="4"/>
+          <w:szCs w:val="4"/>
+        </w:rPr>
+      </w:pPr>
+    </w:p>
+    <w:p>
+      <w:pPr>
+        <w:spacing w:before="0" w:after="0" w:line="120" w:lineRule="exact"/>
+        <w:rPr>
+          <w:sz w:val="4"/>
+          <w:szCs w:val="4"/>
+        </w:rPr>
+      </w:pPr>
+    </w:p>
+    <w:tbl>
+      <w:tblPr>
+        <w:tblStyle w:val="SourceCodeTable"/>
+        <w:tblW w:type="dxa" w:w="9637"/>
+        <w:tblInd w:w="0" w:type="dxa"/>
+        <w:tblBorders>
+          <w:top w:color="BFBFBF" w:space="0" w:sz="4" w:val="single"/>
+          <w:left w:color="BFBFBF" w:space="0" w:sz="4" w:val="single"/>
+          <w:bottom w:color="BFBFBF" w:space="0" w:sz="4" w:val="single"/>
+          <w:right w:color="BFBFBF" w:space="0" w:sz="4" w:val="single"/>
+        </w:tblBorders>
+        <w:tblLayout w:type="fixed"/>
+        <w:tblCellMar>
+          <w:top w:type="dxa" w:w="113"/>
+          <w:left w:type="dxa" w:w="113"/>
+          <w:bottom w:type="dxa" w:w="113"/>
+          <w:right w:type="dxa" w:w="113"/>
+        </w:tblCellMar>
+        <w:tblLook w:val="0000" w:firstRow="0" w:lastRow="0" w:firstColumn="0" w:lastColumn="0" w:noHBand="1" w:noVBand="1"/>
+      </w:tblPr>
+      <w:tblGrid>
+        <w:gridCol w:w="9637"/>
+      </w:tblGrid>
+      <w:tr>
+        <w:tc>
+          <w:tcPr>
+            <w:tcW w:type="dxa" w:w="9637"/>
+          </w:tcPr>
+          <w:p>
+            <w:pPr>
+              <w:pStyle w:val="SourceCode"/>
+              <w:spacing w:before="0" w:after="0" w:line="200" w:lineRule="auto"/>
+            </w:pPr>
+            <w:r>
+              <w:t xml:space="preserve">C:\...\LAB2&gt; echo %time%</w:t>
+            </w:r>
+          </w:p>
+          <w:p>
+            <w:pPr>
+              <w:pStyle w:val="SourceCode"/>
+              <w:spacing w:before="0" w:after="0" w:line="200" w:lineRule="auto"/>
+            </w:pPr>
+            <w:r>
+              <w:t xml:space="preserve">14:22:11,44</w:t>
+            </w:r>
+          </w:p>
+          <w:p>
+            <w:pPr>
+              <w:pStyle w:val="SourceCode"/>
+              <w:spacing w:before="0" w:after="0" w:line="200" w:lineRule="auto"/>
+            </w:pPr>
+            <w:r>
+              <w:t xml:space="preserve">C:\...\LAB2&gt; xcopy /s /e /q src copy2\ &gt; nul</w:t>
+            </w:r>
+          </w:p>
+          <w:p>
+            <w:pPr>
+              <w:pStyle w:val="SourceCode"/>
+              <w:spacing w:before="0" w:after="0" w:line="200" w:lineRule="auto"/>
+            </w:pPr>
+            <w:r>
+              <w:t xml:space="preserve">C:\...\LAB2&gt; echo %time%</w:t>
+            </w:r>
+          </w:p>
+          <w:p>
+            <w:pPr>
+              <w:pStyle w:val="SourceCode"/>
+              <w:spacing w:before="0" w:after="0" w:line="200" w:lineRule="auto"/>
+            </w:pPr>
+            <w:r>
+              <w:t xml:space="preserve">14:22:12,97</w:t>
+            </w:r>
+          </w:p>
+        </w:tc>
+      </w:tr>
+    </w:tbl>
+    <w:p>
+      <w:pPr>
+        <w:spacing w:before="0" w:after="0" w:line="120" w:lineRule="exact"/>
+        <w:rPr>
+          <w:sz w:val="4"/>
+          <w:szCs w:val="4"/>
+        </w:rPr>
+      </w:pPr>
+    </w:p>
+    <w:p>
+      <w:pPr>
+        <w:spacing w:before="0" w:after="0" w:line="120" w:lineRule="exact"/>
+        <w:rPr>
+          <w:sz w:val="4"/>
+          <w:szCs w:val="4"/>
+        </w:rPr>
+      </w:pPr>
+    </w:p>
+    <w:tbl>
+      <w:tblPr>
+        <w:tblStyle w:val="SourceCodeTable"/>
+        <w:tblW w:type="dxa" w:w="9637"/>
+        <w:tblInd w:w="0" w:type="dxa"/>
+        <w:tblBorders>
+          <w:top w:color="BFBFBF" w:space="0" w:sz="4" w:val="single"/>
+          <w:left w:color="BFBFBF" w:space="0" w:sz="4" w:val="single"/>
+          <w:bottom w:color="BFBFBF" w:space="0" w:sz="4" w:val="single"/>
+          <w:right w:color="BFBFBF" w:space="0" w:sz="4" w:val="single"/>
+        </w:tblBorders>
+        <w:tblLayout w:type="fixed"/>
+        <w:tblCellMar>
+          <w:top w:type="dxa" w:w="113"/>
+          <w:left w:type="dxa" w:w="113"/>
+          <w:bottom w:type="dxa" w:w="113"/>
+          <w:right w:type="dxa" w:w="113"/>
+        </w:tblCellMar>
+        <w:tblLook w:val="0000" w:firstRow="0" w:lastRow="0" w:firstColumn="0" w:lastColumn="0" w:noHBand="1" w:noVBand="1"/>
+      </w:tblPr>
+      <w:tblGrid>
+        <w:gridCol w:w="9637"/>
+      </w:tblGrid>
+      <w:tr>
+        <w:tc>
+          <w:tcPr>
+            <w:tcW w:type="dxa" w:w="9637"/>
+          </w:tcPr>
+          <w:p>
+            <w:pPr>
+              <w:pStyle w:val="SourceCode"/>
+              <w:spacing w:before="0" w:after="0" w:line="200" w:lineRule="auto"/>
+            </w:pPr>
+            <w:r>
+              <w:t xml:space="preserve">C:\...\LAB2&gt; echo %time%</w:t>
+            </w:r>
+          </w:p>
+          <w:p>
+            <w:pPr>
+              <w:pStyle w:val="SourceCode"/>
+              <w:spacing w:before="0" w:after="0" w:line="200" w:lineRule="auto"/>
+            </w:pPr>
+            <w:r>
+              <w:t xml:space="preserve">14:22:20,12</w:t>
+            </w:r>
+          </w:p>
+          <w:p>
+            <w:pPr>
+              <w:pStyle w:val="SourceCode"/>
+              <w:spacing w:before="0" w:after="0" w:line="200" w:lineRule="auto"/>
+            </w:pPr>
+            <w:r>
+              <w:t xml:space="preserve">C:\...\LAB2&gt; robocopy src copy3 /e /mt:8 /njh /njs /nfl /ndl &gt; nul</w:t>
+            </w:r>
+          </w:p>
+          <w:p>
+            <w:pPr>
+              <w:pStyle w:val="SourceCode"/>
+              <w:spacing w:before="0" w:after="0" w:line="200" w:lineRule="auto"/>
+            </w:pPr>
+            <w:r>
+              <w:t xml:space="preserve">C:\...\LAB2&gt; echo %time%</w:t>
+            </w:r>
+          </w:p>
+          <w:p>
+            <w:pPr>
+              <w:pStyle w:val="SourceCode"/>
+              <w:spacing w:before="0" w:after="0" w:line="200" w:lineRule="auto"/>
+            </w:pPr>
+            <w:r>
+              <w:t xml:space="preserve">14:22:20,79</w:t>
+            </w:r>
+          </w:p>
+        </w:tc>
+      </w:tr>
+    </w:tbl>
+    <w:p>
+      <w:pPr>
+        <w:spacing w:before="0" w:after="0" w:line="120" w:lineRule="exact"/>
+        <w:rPr>
+          <w:sz w:val="4"/>
+          <w:szCs w:val="4"/>
+        </w:rPr>
+      </w:pPr>
+    </w:p>
+    <w:p>
+      <w:pPr>
+        <w:spacing w:before="0" w:after="0" w:line="120" w:lineRule="exact"/>
+        <w:rPr>
+          <w:sz w:val="4"/>
+          <w:szCs w:val="4"/>
+        </w:rPr>
+      </w:pPr>
+    </w:p>
+    <w:tbl>
+      <w:tblPr>
+        <w:tblStyle w:val="SourceCodeTable"/>
+        <w:tblW w:type="dxa" w:w="9637"/>
+        <w:tblInd w:w="0" w:type="dxa"/>
+        <w:tblBorders>
+          <w:top w:color="BFBFBF" w:space="0" w:sz="4" w:val="single"/>
+          <w:left w:color="BFBFBF" w:space="0" w:sz="4" w:val="single"/>
+          <w:bottom w:color="BFBFBF" w:space="0" w:sz="4" w:val="single"/>
+          <w:right w:color="BFBFBF" w:space="0" w:sz="4" w:val="single"/>
+        </w:tblBorders>
+        <w:tblLayout w:type="fixed"/>
+        <w:tblCellMar>
+          <w:top w:type="dxa" w:w="113"/>
+          <w:left w:type="dxa" w:w="113"/>
+          <w:bottom w:type="dxa" w:w="113"/>
+          <w:right w:type="dxa" w:w="113"/>
+        </w:tblCellMar>
+        <w:tblLook w:val="0000" w:firstRow="0" w:lastRow="0" w:firstColumn="0" w:lastColumn="0" w:noHBand="1" w:noVBand="1"/>
+      </w:tblPr>
+      <w:tblGrid>
+        <w:gridCol w:w="9637"/>
+      </w:tblGrid>
+      <w:tr>
+        <w:tc>
+          <w:tcPr>
+            <w:tcW w:type="dxa" w:w="9637"/>
+          </w:tcPr>
+          <w:p>
+            <w:pPr>
+              <w:pStyle w:val="SourceCode"/>
+              <w:spacing w:before="0" w:after="0" w:line="200" w:lineRule="auto"/>
+            </w:pPr>
+            <w:r>
+              <w:t xml:space="preserve">C:\...\LAB2&gt; dir copy1 /s /b | find /c ":"</w:t>
+            </w:r>
+          </w:p>
+          <w:p>
+            <w:pPr>
+              <w:pStyle w:val="SourceCode"/>
+              <w:spacing w:before="0" w:after="0" w:line="200" w:lineRule="auto"/>
+            </w:pPr>
+            <w:r>
+              <w:t xml:space="preserve">70</w:t>
+            </w:r>
+          </w:p>
+          <w:p>
+            <w:pPr>
+              <w:pStyle w:val="SourceCode"/>
+              <w:spacing w:before="0" w:after="0" w:line="200" w:lineRule="auto"/>
+            </w:pPr>
+            <w:r>
+              <w:t xml:space="preserve">C:\...\LAB2&gt; dir copy2 /s /b | find /c ":"</w:t>
+            </w:r>
+          </w:p>
+          <w:p>
+            <w:pPr>
+              <w:pStyle w:val="SourceCode"/>
+              <w:spacing w:before="0" w:after="0" w:line="200" w:lineRule="auto"/>
+            </w:pPr>
+            <w:r>
+              <w:t xml:space="preserve">78</w:t>
+            </w:r>
+          </w:p>
+          <w:p>
+            <w:pPr>
+              <w:pStyle w:val="SourceCode"/>
+              <w:spacing w:before="0" w:after="0" w:line="200" w:lineRule="auto"/>
+            </w:pPr>
+            <w:r>
+              <w:t xml:space="preserve">C:\...\LAB2&gt; dir copy3 /s /b | find /c ":"</w:t>
+            </w:r>
+          </w:p>
+          <w:p>
+            <w:pPr>
+              <w:pStyle w:val="SourceCode"/>
+              <w:spacing w:before="0" w:after="0" w:line="200" w:lineRule="auto"/>
+            </w:pPr>
+            <w:r>
+              <w:t xml:space="preserve">78</w:t>
+            </w:r>
+          </w:p>
+        </w:tc>
+      </w:tr>
+    </w:tbl>
+    <w:p>
+      <w:pPr>
+        <w:spacing w:before="0" w:after="0" w:line="120" w:lineRule="exact"/>
+        <w:rPr>
+          <w:sz w:val="4"/>
+          <w:szCs w:val="4"/>
+        </w:rPr>
+      </w:pPr>
     </w:p>
     <w:p>
       <w:pPr>
@@ -2548,183 +3577,379 @@
     </w:p>
     <w:p>
       <w:pPr>
-        <w:pStyle w:val="SourceCode"/>
-        <w:spacing w:before="120" w:after="0" w:line="200" w:lineRule="auto"/>
-      </w:pPr>
-      <w:r>
-        <w:t xml:space="preserve">C:\...\LAB2&gt; cd copy1</w:t>
-      </w:r>
-    </w:p>
-    <w:p>
-      <w:pPr>
-        <w:pStyle w:val="SourceCode"/>
-        <w:spacing w:before="0" w:after="0" w:line="200" w:lineRule="auto"/>
-      </w:pPr>
-      <w:r>
-        <w:t xml:space="preserve">C:\...\copy1&gt; ren *.wav *.bak</w:t>
-      </w:r>
-    </w:p>
-    <w:p>
-      <w:pPr>
-        <w:pStyle w:val="SourceCode"/>
-        <w:spacing w:before="0" w:after="0" w:line="200" w:lineRule="auto"/>
-      </w:pPr>
-      <w:r>
-        <w:t xml:space="preserve">C:\...\copy1&gt; dir /b | find /c ".bak"</w:t>
-      </w:r>
-    </w:p>
-    <w:p>
-      <w:pPr>
-        <w:pStyle w:val="SourceCode"/>
-        <w:spacing w:before="0" w:after="120" w:line="200" w:lineRule="auto"/>
-      </w:pPr>
-      <w:r>
-        <w:t xml:space="preserve">70</w:t>
-      </w:r>
-    </w:p>
-    <w:p>
-      <w:pPr>
-        <w:pStyle w:val="SourceCode"/>
-        <w:spacing w:before="120" w:after="0" w:line="200" w:lineRule="auto"/>
-      </w:pPr>
-      <w:r>
-        <w:t xml:space="preserve">C:\...\copy1&gt; attrib +r "Windows Ringin.bak"</w:t>
-      </w:r>
-    </w:p>
-    <w:p>
-      <w:pPr>
-        <w:pStyle w:val="SourceCode"/>
-        <w:spacing w:before="0" w:after="0" w:line="200" w:lineRule="auto"/>
-      </w:pPr>
-      <w:r>
-        <w:t xml:space="preserve">C:\...\copy1&gt; attrib "Windows Ringin.bak"</w:t>
-      </w:r>
-    </w:p>
-    <w:p>
-      <w:pPr>
-        <w:pStyle w:val="SourceCode"/>
-        <w:spacing w:before="0" w:after="120" w:line="200" w:lineRule="auto"/>
-      </w:pPr>
-      <w:r>
-        <w:t xml:space="preserve">A  R     C:\Users\Student\Desktop\LAB2\copy1\Windows Ringin.bak</w:t>
-      </w:r>
-    </w:p>
-    <w:p>
-      <w:pPr>
-        <w:pStyle w:val="SourceCode"/>
-        <w:spacing w:before="120" w:after="0" w:line="200" w:lineRule="auto"/>
-      </w:pPr>
-      <w:r>
-        <w:t xml:space="preserve">C:\...\copy1&gt; del "Windows Ringin.bak"</w:t>
-      </w:r>
-    </w:p>
-    <w:p>
-      <w:pPr>
-        <w:pStyle w:val="SourceCode"/>
-        <w:spacing w:before="0" w:after="0" w:line="200" w:lineRule="auto"/>
-      </w:pPr>
-      <w:r>
-        <w:t xml:space="preserve">C:\...\copy1\Windows Ringin.bak</w:t>
-      </w:r>
-    </w:p>
-    <w:p>
-      <w:pPr>
-        <w:pStyle w:val="SourceCode"/>
-        <w:spacing w:before="0" w:after="120" w:line="200" w:lineRule="auto"/>
-      </w:pPr>
-      <w:r>
-        <w:t xml:space="preserve">Access is denied.</w:t>
-      </w:r>
-    </w:p>
-    <w:p>
-      <w:pPr>
-        <w:pStyle w:val="SourceCode"/>
-        <w:spacing w:before="120" w:after="0" w:line="200" w:lineRule="auto"/>
-      </w:pPr>
-      <w:r>
-        <w:t xml:space="preserve">C:\...\copy1&gt; del /f "Windows Ringin.bak"</w:t>
-      </w:r>
-    </w:p>
-    <w:p>
-      <w:pPr>
-        <w:pStyle w:val="SourceCode"/>
-        <w:spacing w:before="0" w:after="0" w:line="200" w:lineRule="auto"/>
-      </w:pPr>
-      <w:r>
-        <w:t xml:space="preserve">C:\...\copy1&gt; cd ..</w:t>
-      </w:r>
-    </w:p>
-    <w:p>
-      <w:pPr>
-        <w:pStyle w:val="SourceCode"/>
-        <w:spacing w:before="0" w:after="0" w:line="200" w:lineRule="auto"/>
-      </w:pPr>
-      <w:r>
-        <w:t xml:space="preserve">C:\...\LAB2&gt; rd /s /q copy1</w:t>
-      </w:r>
-    </w:p>
-    <w:p>
-      <w:pPr>
-        <w:pStyle w:val="SourceCode"/>
-        <w:spacing w:before="0" w:after="0" w:line="200" w:lineRule="auto"/>
-      </w:pPr>
-      <w:r>
-        <w:t xml:space="preserve">C:\...\LAB2&gt; dir /a:d /b</w:t>
-      </w:r>
-    </w:p>
-    <w:p>
-      <w:pPr>
-        <w:pStyle w:val="SourceCode"/>
-        <w:spacing w:before="0" w:after="0" w:line="200" w:lineRule="auto"/>
-      </w:pPr>
-      <w:r>
-        <w:t xml:space="preserve">bak</w:t>
-      </w:r>
-    </w:p>
-    <w:p>
-      <w:pPr>
-        <w:pStyle w:val="SourceCode"/>
-        <w:spacing w:before="0" w:after="0" w:line="200" w:lineRule="auto"/>
-      </w:pPr>
-      <w:r>
-        <w:t xml:space="preserve">copy2</w:t>
-      </w:r>
-    </w:p>
-    <w:p>
-      <w:pPr>
-        <w:pStyle w:val="SourceCode"/>
-        <w:spacing w:before="0" w:after="0" w:line="200" w:lineRule="auto"/>
-      </w:pPr>
-      <w:r>
-        <w:t xml:space="preserve">copy3</w:t>
-      </w:r>
-    </w:p>
-    <w:p>
-      <w:pPr>
-        <w:pStyle w:val="SourceCode"/>
-        <w:spacing w:before="0" w:after="0" w:line="200" w:lineRule="auto"/>
-      </w:pPr>
-      <w:r>
-        <w:t xml:space="preserve">docs</w:t>
-      </w:r>
-    </w:p>
-    <w:p>
-      <w:pPr>
-        <w:pStyle w:val="SourceCode"/>
-        <w:spacing w:before="0" w:after="0" w:line="200" w:lineRule="auto"/>
-      </w:pPr>
-      <w:r>
-        <w:t xml:space="preserve">src</w:t>
-      </w:r>
-    </w:p>
-    <w:p>
-      <w:pPr>
-        <w:pStyle w:val="SourceCode"/>
-        <w:spacing w:before="0" w:after="120" w:line="200" w:lineRule="auto"/>
-      </w:pPr>
-      <w:r>
-        <w:t xml:space="preserve">test folder</w:t>
-      </w:r>
+        <w:spacing w:before="0" w:after="0" w:line="120" w:lineRule="exact"/>
+        <w:rPr>
+          <w:sz w:val="4"/>
+          <w:szCs w:val="4"/>
+        </w:rPr>
+      </w:pPr>
+    </w:p>
+    <w:tbl>
+      <w:tblPr>
+        <w:tblStyle w:val="SourceCodeTable"/>
+        <w:tblW w:type="dxa" w:w="9637"/>
+        <w:tblInd w:w="0" w:type="dxa"/>
+        <w:tblBorders>
+          <w:top w:color="BFBFBF" w:space="0" w:sz="4" w:val="single"/>
+          <w:left w:color="BFBFBF" w:space="0" w:sz="4" w:val="single"/>
+          <w:bottom w:color="BFBFBF" w:space="0" w:sz="4" w:val="single"/>
+          <w:right w:color="BFBFBF" w:space="0" w:sz="4" w:val="single"/>
+        </w:tblBorders>
+        <w:tblLayout w:type="fixed"/>
+        <w:tblCellMar>
+          <w:top w:type="dxa" w:w="113"/>
+          <w:left w:type="dxa" w:w="113"/>
+          <w:bottom w:type="dxa" w:w="113"/>
+          <w:right w:type="dxa" w:w="113"/>
+        </w:tblCellMar>
+        <w:tblLook w:val="0000" w:firstRow="0" w:lastRow="0" w:firstColumn="0" w:lastColumn="0" w:noHBand="1" w:noVBand="1"/>
+      </w:tblPr>
+      <w:tblGrid>
+        <w:gridCol w:w="9637"/>
+      </w:tblGrid>
+      <w:tr>
+        <w:tc>
+          <w:tcPr>
+            <w:tcW w:type="dxa" w:w="9637"/>
+          </w:tcPr>
+          <w:p>
+            <w:pPr>
+              <w:pStyle w:val="SourceCode"/>
+              <w:spacing w:before="0" w:after="0" w:line="200" w:lineRule="auto"/>
+            </w:pPr>
+            <w:r>
+              <w:t xml:space="preserve">C:\...\LAB2&gt; cd copy1</w:t>
+            </w:r>
+          </w:p>
+          <w:p>
+            <w:pPr>
+              <w:pStyle w:val="SourceCode"/>
+              <w:spacing w:before="0" w:after="0" w:line="200" w:lineRule="auto"/>
+            </w:pPr>
+            <w:r>
+              <w:t xml:space="preserve">C:\...\copy1&gt; ren *.wav *.bak</w:t>
+            </w:r>
+          </w:p>
+          <w:p>
+            <w:pPr>
+              <w:pStyle w:val="SourceCode"/>
+              <w:spacing w:before="0" w:after="0" w:line="200" w:lineRule="auto"/>
+            </w:pPr>
+            <w:r>
+              <w:t xml:space="preserve">C:\...\copy1&gt; dir /b | find /c ".bak"</w:t>
+            </w:r>
+          </w:p>
+          <w:p>
+            <w:pPr>
+              <w:pStyle w:val="SourceCode"/>
+              <w:spacing w:before="0" w:after="0" w:line="200" w:lineRule="auto"/>
+            </w:pPr>
+            <w:r>
+              <w:t xml:space="preserve">70</w:t>
+            </w:r>
+          </w:p>
+        </w:tc>
+      </w:tr>
+    </w:tbl>
+    <w:p>
+      <w:pPr>
+        <w:spacing w:before="0" w:after="0" w:line="120" w:lineRule="exact"/>
+        <w:rPr>
+          <w:sz w:val="4"/>
+          <w:szCs w:val="4"/>
+        </w:rPr>
+      </w:pPr>
+    </w:p>
+    <w:p>
+      <w:pPr>
+        <w:spacing w:before="0" w:after="0" w:line="120" w:lineRule="exact"/>
+        <w:rPr>
+          <w:sz w:val="4"/>
+          <w:szCs w:val="4"/>
+        </w:rPr>
+      </w:pPr>
+    </w:p>
+    <w:tbl>
+      <w:tblPr>
+        <w:tblStyle w:val="SourceCodeTable"/>
+        <w:tblW w:type="dxa" w:w="9637"/>
+        <w:tblInd w:w="0" w:type="dxa"/>
+        <w:tblBorders>
+          <w:top w:color="BFBFBF" w:space="0" w:sz="4" w:val="single"/>
+          <w:left w:color="BFBFBF" w:space="0" w:sz="4" w:val="single"/>
+          <w:bottom w:color="BFBFBF" w:space="0" w:sz="4" w:val="single"/>
+          <w:right w:color="BFBFBF" w:space="0" w:sz="4" w:val="single"/>
+        </w:tblBorders>
+        <w:tblLayout w:type="fixed"/>
+        <w:tblCellMar>
+          <w:top w:type="dxa" w:w="113"/>
+          <w:left w:type="dxa" w:w="113"/>
+          <w:bottom w:type="dxa" w:w="113"/>
+          <w:right w:type="dxa" w:w="113"/>
+        </w:tblCellMar>
+        <w:tblLook w:val="0000" w:firstRow="0" w:lastRow="0" w:firstColumn="0" w:lastColumn="0" w:noHBand="1" w:noVBand="1"/>
+      </w:tblPr>
+      <w:tblGrid>
+        <w:gridCol w:w="9637"/>
+      </w:tblGrid>
+      <w:tr>
+        <w:tc>
+          <w:tcPr>
+            <w:tcW w:type="dxa" w:w="9637"/>
+          </w:tcPr>
+          <w:p>
+            <w:pPr>
+              <w:pStyle w:val="SourceCode"/>
+              <w:spacing w:before="0" w:after="0" w:line="200" w:lineRule="auto"/>
+            </w:pPr>
+            <w:r>
+              <w:t xml:space="preserve">C:\...\copy1&gt; attrib +r "Windows Ringin.bak"</w:t>
+            </w:r>
+          </w:p>
+          <w:p>
+            <w:pPr>
+              <w:pStyle w:val="SourceCode"/>
+              <w:spacing w:before="0" w:after="0" w:line="200" w:lineRule="auto"/>
+            </w:pPr>
+            <w:r>
+              <w:t xml:space="preserve">C:\...\copy1&gt; attrib "Windows Ringin.bak"</w:t>
+            </w:r>
+          </w:p>
+          <w:p>
+            <w:pPr>
+              <w:pStyle w:val="SourceCode"/>
+              <w:spacing w:before="0" w:after="0" w:line="200" w:lineRule="auto"/>
+            </w:pPr>
+            <w:r>
+              <w:t xml:space="preserve">A  R     C:\Users\Student\Desktop\LAB2\copy1\Windows Ringin.bak</w:t>
+            </w:r>
+          </w:p>
+        </w:tc>
+      </w:tr>
+    </w:tbl>
+    <w:p>
+      <w:pPr>
+        <w:spacing w:before="0" w:after="0" w:line="120" w:lineRule="exact"/>
+        <w:rPr>
+          <w:sz w:val="4"/>
+          <w:szCs w:val="4"/>
+        </w:rPr>
+      </w:pPr>
+    </w:p>
+    <w:p>
+      <w:pPr>
+        <w:spacing w:before="0" w:after="0" w:line="120" w:lineRule="exact"/>
+        <w:rPr>
+          <w:sz w:val="4"/>
+          <w:szCs w:val="4"/>
+        </w:rPr>
+      </w:pPr>
+    </w:p>
+    <w:tbl>
+      <w:tblPr>
+        <w:tblStyle w:val="SourceCodeTable"/>
+        <w:tblW w:type="dxa" w:w="9637"/>
+        <w:tblInd w:w="0" w:type="dxa"/>
+        <w:tblBorders>
+          <w:top w:color="BFBFBF" w:space="0" w:sz="4" w:val="single"/>
+          <w:left w:color="BFBFBF" w:space="0" w:sz="4" w:val="single"/>
+          <w:bottom w:color="BFBFBF" w:space="0" w:sz="4" w:val="single"/>
+          <w:right w:color="BFBFBF" w:space="0" w:sz="4" w:val="single"/>
+        </w:tblBorders>
+        <w:tblLayout w:type="fixed"/>
+        <w:tblCellMar>
+          <w:top w:type="dxa" w:w="113"/>
+          <w:left w:type="dxa" w:w="113"/>
+          <w:bottom w:type="dxa" w:w="113"/>
+          <w:right w:type="dxa" w:w="113"/>
+        </w:tblCellMar>
+        <w:tblLook w:val="0000" w:firstRow="0" w:lastRow="0" w:firstColumn="0" w:lastColumn="0" w:noHBand="1" w:noVBand="1"/>
+      </w:tblPr>
+      <w:tblGrid>
+        <w:gridCol w:w="9637"/>
+      </w:tblGrid>
+      <w:tr>
+        <w:tc>
+          <w:tcPr>
+            <w:tcW w:type="dxa" w:w="9637"/>
+          </w:tcPr>
+          <w:p>
+            <w:pPr>
+              <w:pStyle w:val="SourceCode"/>
+              <w:spacing w:before="0" w:after="0" w:line="200" w:lineRule="auto"/>
+            </w:pPr>
+            <w:r>
+              <w:t xml:space="preserve">C:\...\copy1&gt; del "Windows Ringin.bak"</w:t>
+            </w:r>
+          </w:p>
+          <w:p>
+            <w:pPr>
+              <w:pStyle w:val="SourceCode"/>
+              <w:spacing w:before="0" w:after="0" w:line="200" w:lineRule="auto"/>
+            </w:pPr>
+            <w:r>
+              <w:t xml:space="preserve">C:\...\copy1\Windows Ringin.bak</w:t>
+            </w:r>
+          </w:p>
+          <w:p>
+            <w:pPr>
+              <w:pStyle w:val="SourceCode"/>
+              <w:spacing w:before="0" w:after="0" w:line="200" w:lineRule="auto"/>
+            </w:pPr>
+            <w:r>
+              <w:t xml:space="preserve">Access is denied.</w:t>
+            </w:r>
+          </w:p>
+        </w:tc>
+      </w:tr>
+    </w:tbl>
+    <w:p>
+      <w:pPr>
+        <w:spacing w:before="0" w:after="0" w:line="120" w:lineRule="exact"/>
+        <w:rPr>
+          <w:sz w:val="4"/>
+          <w:szCs w:val="4"/>
+        </w:rPr>
+      </w:pPr>
+    </w:p>
+    <w:p>
+      <w:pPr>
+        <w:spacing w:before="0" w:after="0" w:line="120" w:lineRule="exact"/>
+        <w:rPr>
+          <w:sz w:val="4"/>
+          <w:szCs w:val="4"/>
+        </w:rPr>
+      </w:pPr>
+    </w:p>
+    <w:tbl>
+      <w:tblPr>
+        <w:tblStyle w:val="SourceCodeTable"/>
+        <w:tblW w:type="dxa" w:w="9637"/>
+        <w:tblInd w:w="0" w:type="dxa"/>
+        <w:tblBorders>
+          <w:top w:color="BFBFBF" w:space="0" w:sz="4" w:val="single"/>
+          <w:left w:color="BFBFBF" w:space="0" w:sz="4" w:val="single"/>
+          <w:bottom w:color="BFBFBF" w:space="0" w:sz="4" w:val="single"/>
+          <w:right w:color="BFBFBF" w:space="0" w:sz="4" w:val="single"/>
+        </w:tblBorders>
+        <w:tblLayout w:type="fixed"/>
+        <w:tblCellMar>
+          <w:top w:type="dxa" w:w="113"/>
+          <w:left w:type="dxa" w:w="113"/>
+          <w:bottom w:type="dxa" w:w="113"/>
+          <w:right w:type="dxa" w:w="113"/>
+        </w:tblCellMar>
+        <w:tblLook w:val="0000" w:firstRow="0" w:lastRow="0" w:firstColumn="0" w:lastColumn="0" w:noHBand="1" w:noVBand="1"/>
+      </w:tblPr>
+      <w:tblGrid>
+        <w:gridCol w:w="9637"/>
+      </w:tblGrid>
+      <w:tr>
+        <w:tc>
+          <w:tcPr>
+            <w:tcW w:type="dxa" w:w="9637"/>
+          </w:tcPr>
+          <w:p>
+            <w:pPr>
+              <w:pStyle w:val="SourceCode"/>
+              <w:spacing w:before="0" w:after="0" w:line="200" w:lineRule="auto"/>
+            </w:pPr>
+            <w:r>
+              <w:t xml:space="preserve">C:\...\copy1&gt; del /f "Windows Ringin.bak"</w:t>
+            </w:r>
+          </w:p>
+          <w:p>
+            <w:pPr>
+              <w:pStyle w:val="SourceCode"/>
+              <w:spacing w:before="0" w:after="0" w:line="200" w:lineRule="auto"/>
+            </w:pPr>
+            <w:r>
+              <w:t xml:space="preserve">C:\...\copy1&gt; cd ..</w:t>
+            </w:r>
+          </w:p>
+          <w:p>
+            <w:pPr>
+              <w:pStyle w:val="SourceCode"/>
+              <w:spacing w:before="0" w:after="0" w:line="200" w:lineRule="auto"/>
+            </w:pPr>
+            <w:r>
+              <w:t xml:space="preserve">C:\...\LAB2&gt; rd /s /q copy1</w:t>
+            </w:r>
+          </w:p>
+          <w:p>
+            <w:pPr>
+              <w:pStyle w:val="SourceCode"/>
+              <w:spacing w:before="0" w:after="0" w:line="200" w:lineRule="auto"/>
+            </w:pPr>
+            <w:r>
+              <w:t xml:space="preserve">C:\...\LAB2&gt; dir /a:d /b</w:t>
+            </w:r>
+          </w:p>
+          <w:p>
+            <w:pPr>
+              <w:pStyle w:val="SourceCode"/>
+              <w:spacing w:before="0" w:after="0" w:line="200" w:lineRule="auto"/>
+            </w:pPr>
+            <w:r>
+              <w:t xml:space="preserve">bak</w:t>
+            </w:r>
+          </w:p>
+          <w:p>
+            <w:pPr>
+              <w:pStyle w:val="SourceCode"/>
+              <w:spacing w:before="0" w:after="0" w:line="200" w:lineRule="auto"/>
+            </w:pPr>
+            <w:r>
+              <w:t xml:space="preserve">copy2</w:t>
+            </w:r>
+          </w:p>
+          <w:p>
+            <w:pPr>
+              <w:pStyle w:val="SourceCode"/>
+              <w:spacing w:before="0" w:after="0" w:line="200" w:lineRule="auto"/>
+            </w:pPr>
+            <w:r>
+              <w:t xml:space="preserve">copy3</w:t>
+            </w:r>
+          </w:p>
+          <w:p>
+            <w:pPr>
+              <w:pStyle w:val="SourceCode"/>
+              <w:spacing w:before="0" w:after="0" w:line="200" w:lineRule="auto"/>
+            </w:pPr>
+            <w:r>
+              <w:t xml:space="preserve">docs</w:t>
+            </w:r>
+          </w:p>
+          <w:p>
+            <w:pPr>
+              <w:pStyle w:val="SourceCode"/>
+              <w:spacing w:before="0" w:after="0" w:line="200" w:lineRule="auto"/>
+            </w:pPr>
+            <w:r>
+              <w:t xml:space="preserve">src</w:t>
+            </w:r>
+          </w:p>
+          <w:p>
+            <w:pPr>
+              <w:pStyle w:val="SourceCode"/>
+              <w:spacing w:before="0" w:after="0" w:line="200" w:lineRule="auto"/>
+            </w:pPr>
+            <w:r>
+              <w:t xml:space="preserve">test folder</w:t>
+            </w:r>
+          </w:p>
+        </w:tc>
+      </w:tr>
+    </w:tbl>
+    <w:p>
+      <w:pPr>
+        <w:spacing w:before="0" w:after="0" w:line="120" w:lineRule="exact"/>
+        <w:rPr>
+          <w:sz w:val="4"/>
+          <w:szCs w:val="4"/>
+        </w:rPr>
+      </w:pPr>
     </w:p>
     <w:p>
       <w:pPr>
@@ -2746,147 +3971,343 @@
     </w:p>
     <w:p>
       <w:pPr>
-        <w:pStyle w:val="SourceCode"/>
-        <w:spacing w:before="120" w:after="0" w:line="200" w:lineRule="auto"/>
-      </w:pPr>
-      <w:r>
-        <w:t xml:space="preserve">C:\...\LAB2&gt; dir src /s /b &gt; docs\listing.txt</w:t>
-      </w:r>
-    </w:p>
-    <w:p>
-      <w:pPr>
-        <w:pStyle w:val="SourceCode"/>
-        <w:spacing w:before="0" w:after="0" w:line="200" w:lineRule="auto"/>
-      </w:pPr>
-      <w:r>
-        <w:t xml:space="preserve">C:\...\LAB2&gt; find /c ".wav" docs\listing.txt</w:t>
-      </w:r>
-    </w:p>
-    <w:p>
-      <w:pPr>
-        <w:pStyle w:val="SourceCode"/>
-        <w:spacing w:before="0" w:after="120" w:line="200" w:lineRule="auto"/>
-      </w:pPr>
-      <w:r>
-        <w:t xml:space="preserve">---------- DOCS\LISTING.TXT: 70</w:t>
-      </w:r>
-    </w:p>
-    <w:p>
-      <w:pPr>
-        <w:pStyle w:val="SourceCode"/>
-        <w:spacing w:before="120" w:after="0" w:line="200" w:lineRule="auto"/>
-      </w:pPr>
-      <w:r>
-        <w:t xml:space="preserve">C:\...\LAB2&gt; findstr /i /n "alarm" docs\listing.txt</w:t>
-      </w:r>
-    </w:p>
-    <w:p>
-      <w:pPr>
-        <w:pStyle w:val="SourceCode"/>
-        <w:spacing w:before="0" w:after="0" w:line="200" w:lineRule="auto"/>
-      </w:pPr>
-      <w:r>
-        <w:t xml:space="preserve">3:C:\Users\Student\Desktop\LAB2\src\Alarm01.wav</w:t>
-      </w:r>
-    </w:p>
-    <w:p>
-      <w:pPr>
-        <w:pStyle w:val="SourceCode"/>
-        <w:spacing w:before="0" w:after="0" w:line="200" w:lineRule="auto"/>
-      </w:pPr>
-      <w:r>
-        <w:t xml:space="preserve">4:C:\Users\Student\Desktop\LAB2\src\Alarm02.wav</w:t>
-      </w:r>
-    </w:p>
-    <w:p>
-      <w:pPr>
-        <w:pStyle w:val="SourceCode"/>
-        <w:spacing w:before="0" w:after="120" w:line="200" w:lineRule="auto"/>
-      </w:pPr>
-      <w:r>
-        <w:t xml:space="preserve">...</w:t>
-      </w:r>
-    </w:p>
-    <w:p>
-      <w:pPr>
-        <w:pStyle w:val="SourceCode"/>
-        <w:spacing w:before="120" w:after="0" w:line="200" w:lineRule="auto"/>
-      </w:pPr>
-      <w:r>
-        <w:t xml:space="preserve">C:\...\LAB2&gt; echo Звіт сформовано &gt;&gt; docs\listing.txt</w:t>
-      </w:r>
-    </w:p>
-    <w:p>
-      <w:pPr>
-        <w:pStyle w:val="SourceCode"/>
-        <w:spacing w:before="0" w:after="0" w:line="200" w:lineRule="auto"/>
-      </w:pPr>
-      <w:r>
-        <w:t xml:space="preserve">C:\...\LAB2&gt; dir nosuchfile.txt 2&gt; docs\errors.txt</w:t>
-      </w:r>
-    </w:p>
-    <w:p>
-      <w:pPr>
-        <w:pStyle w:val="SourceCode"/>
-        <w:spacing w:before="0" w:after="0" w:line="200" w:lineRule="auto"/>
-      </w:pPr>
-      <w:r>
-        <w:t xml:space="preserve">C:\...\LAB2&gt; type docs\errors.txt</w:t>
-      </w:r>
-    </w:p>
-    <w:p>
-      <w:pPr>
-        <w:pStyle w:val="SourceCode"/>
-        <w:spacing w:before="0" w:after="120" w:line="200" w:lineRule="auto"/>
-      </w:pPr>
-      <w:r>
-        <w:t xml:space="preserve">File Not Found</w:t>
-      </w:r>
-    </w:p>
-    <w:p>
-      <w:pPr>
-        <w:pStyle w:val="SourceCode"/>
-        <w:spacing w:before="120" w:after="0" w:line="200" w:lineRule="auto"/>
-      </w:pPr>
-      <w:r>
-        <w:t xml:space="preserve">C:\...\LAB2&gt; type nul &gt; docs\empty.txt</w:t>
-      </w:r>
-    </w:p>
-    <w:p>
-      <w:pPr>
-        <w:pStyle w:val="SourceCode"/>
-        <w:spacing w:before="0" w:after="0" w:line="200" w:lineRule="auto"/>
-      </w:pPr>
-      <w:r>
-        <w:t xml:space="preserve">C:\...\LAB2&gt; dir docs /b</w:t>
-      </w:r>
-    </w:p>
-    <w:p>
-      <w:pPr>
-        <w:pStyle w:val="SourceCode"/>
-        <w:spacing w:before="0" w:after="0" w:line="200" w:lineRule="auto"/>
-      </w:pPr>
-      <w:r>
-        <w:t xml:space="preserve">empty.txt</w:t>
-      </w:r>
-    </w:p>
-    <w:p>
-      <w:pPr>
-        <w:pStyle w:val="SourceCode"/>
-        <w:spacing w:before="0" w:after="0" w:line="200" w:lineRule="auto"/>
-      </w:pPr>
-      <w:r>
-        <w:t xml:space="preserve">errors.txt</w:t>
-      </w:r>
-    </w:p>
-    <w:p>
-      <w:pPr>
-        <w:pStyle w:val="SourceCode"/>
-        <w:spacing w:before="0" w:after="120" w:line="200" w:lineRule="auto"/>
-      </w:pPr>
-      <w:r>
-        <w:t xml:space="preserve">listing.txt</w:t>
-      </w:r>
+        <w:spacing w:before="0" w:after="0" w:line="120" w:lineRule="exact"/>
+        <w:rPr>
+          <w:sz w:val="4"/>
+          <w:szCs w:val="4"/>
+        </w:rPr>
+      </w:pPr>
+    </w:p>
+    <w:tbl>
+      <w:tblPr>
+        <w:tblStyle w:val="SourceCodeTable"/>
+        <w:tblW w:type="dxa" w:w="9637"/>
+        <w:tblInd w:w="0" w:type="dxa"/>
+        <w:tblBorders>
+          <w:top w:color="BFBFBF" w:space="0" w:sz="4" w:val="single"/>
+          <w:left w:color="BFBFBF" w:space="0" w:sz="4" w:val="single"/>
+          <w:bottom w:color="BFBFBF" w:space="0" w:sz="4" w:val="single"/>
+          <w:right w:color="BFBFBF" w:space="0" w:sz="4" w:val="single"/>
+        </w:tblBorders>
+        <w:tblLayout w:type="fixed"/>
+        <w:tblCellMar>
+          <w:top w:type="dxa" w:w="113"/>
+          <w:left w:type="dxa" w:w="113"/>
+          <w:bottom w:type="dxa" w:w="113"/>
+          <w:right w:type="dxa" w:w="113"/>
+        </w:tblCellMar>
+        <w:tblLook w:val="0000" w:firstRow="0" w:lastRow="0" w:firstColumn="0" w:lastColumn="0" w:noHBand="1" w:noVBand="1"/>
+      </w:tblPr>
+      <w:tblGrid>
+        <w:gridCol w:w="9637"/>
+      </w:tblGrid>
+      <w:tr>
+        <w:tc>
+          <w:tcPr>
+            <w:tcW w:type="dxa" w:w="9637"/>
+          </w:tcPr>
+          <w:p>
+            <w:pPr>
+              <w:pStyle w:val="SourceCode"/>
+              <w:spacing w:before="0" w:after="0" w:line="200" w:lineRule="auto"/>
+            </w:pPr>
+            <w:r>
+              <w:t xml:space="preserve">C:\...\LAB2&gt; dir src /s /b &gt; docs\listing.txt</w:t>
+            </w:r>
+          </w:p>
+          <w:p>
+            <w:pPr>
+              <w:pStyle w:val="SourceCode"/>
+              <w:spacing w:before="0" w:after="0" w:line="200" w:lineRule="auto"/>
+            </w:pPr>
+            <w:r>
+              <w:t xml:space="preserve">C:\...\LAB2&gt; find /c ".wav" docs\listing.txt</w:t>
+            </w:r>
+          </w:p>
+          <w:p>
+            <w:pPr>
+              <w:pStyle w:val="SourceCode"/>
+              <w:spacing w:before="0" w:after="0" w:line="200" w:lineRule="auto"/>
+            </w:pPr>
+            <w:r>
+              <w:t xml:space="preserve">---------- DOCS\LISTING.TXT: 70</w:t>
+            </w:r>
+          </w:p>
+        </w:tc>
+      </w:tr>
+    </w:tbl>
+    <w:p>
+      <w:pPr>
+        <w:spacing w:before="0" w:after="0" w:line="120" w:lineRule="exact"/>
+        <w:rPr>
+          <w:sz w:val="4"/>
+          <w:szCs w:val="4"/>
+        </w:rPr>
+      </w:pPr>
+    </w:p>
+    <w:p>
+      <w:pPr>
+        <w:spacing w:before="0" w:after="0" w:line="120" w:lineRule="exact"/>
+        <w:rPr>
+          <w:sz w:val="4"/>
+          <w:szCs w:val="4"/>
+        </w:rPr>
+      </w:pPr>
+    </w:p>
+    <w:tbl>
+      <w:tblPr>
+        <w:tblStyle w:val="SourceCodeTable"/>
+        <w:tblW w:type="dxa" w:w="9637"/>
+        <w:tblInd w:w="0" w:type="dxa"/>
+        <w:tblBorders>
+          <w:top w:color="BFBFBF" w:space="0" w:sz="4" w:val="single"/>
+          <w:left w:color="BFBFBF" w:space="0" w:sz="4" w:val="single"/>
+          <w:bottom w:color="BFBFBF" w:space="0" w:sz="4" w:val="single"/>
+          <w:right w:color="BFBFBF" w:space="0" w:sz="4" w:val="single"/>
+        </w:tblBorders>
+        <w:tblLayout w:type="fixed"/>
+        <w:tblCellMar>
+          <w:top w:type="dxa" w:w="113"/>
+          <w:left w:type="dxa" w:w="113"/>
+          <w:bottom w:type="dxa" w:w="113"/>
+          <w:right w:type="dxa" w:w="113"/>
+        </w:tblCellMar>
+        <w:tblLook w:val="0000" w:firstRow="0" w:lastRow="0" w:firstColumn="0" w:lastColumn="0" w:noHBand="1" w:noVBand="1"/>
+      </w:tblPr>
+      <w:tblGrid>
+        <w:gridCol w:w="9637"/>
+      </w:tblGrid>
+      <w:tr>
+        <w:tc>
+          <w:tcPr>
+            <w:tcW w:type="dxa" w:w="9637"/>
+          </w:tcPr>
+          <w:p>
+            <w:pPr>
+              <w:pStyle w:val="SourceCode"/>
+              <w:spacing w:before="0" w:after="0" w:line="200" w:lineRule="auto"/>
+            </w:pPr>
+            <w:r>
+              <w:t xml:space="preserve">C:\...\LAB2&gt; findstr /i /n "alarm" docs\listing.txt</w:t>
+            </w:r>
+          </w:p>
+          <w:p>
+            <w:pPr>
+              <w:pStyle w:val="SourceCode"/>
+              <w:spacing w:before="0" w:after="0" w:line="200" w:lineRule="auto"/>
+            </w:pPr>
+            <w:r>
+              <w:t xml:space="preserve">3:C:\Users\Student\Desktop\LAB2\src\Alarm01.wav</w:t>
+            </w:r>
+          </w:p>
+          <w:p>
+            <w:pPr>
+              <w:pStyle w:val="SourceCode"/>
+              <w:spacing w:before="0" w:after="0" w:line="200" w:lineRule="auto"/>
+            </w:pPr>
+            <w:r>
+              <w:t xml:space="preserve">4:C:\Users\Student\Desktop\LAB2\src\Alarm02.wav</w:t>
+            </w:r>
+          </w:p>
+          <w:p>
+            <w:pPr>
+              <w:pStyle w:val="SourceCode"/>
+              <w:spacing w:before="0" w:after="0" w:line="200" w:lineRule="auto"/>
+            </w:pPr>
+            <w:r>
+              <w:t xml:space="preserve">...</w:t>
+            </w:r>
+          </w:p>
+        </w:tc>
+      </w:tr>
+    </w:tbl>
+    <w:p>
+      <w:pPr>
+        <w:spacing w:before="0" w:after="0" w:line="120" w:lineRule="exact"/>
+        <w:rPr>
+          <w:sz w:val="4"/>
+          <w:szCs w:val="4"/>
+        </w:rPr>
+      </w:pPr>
+    </w:p>
+    <w:p>
+      <w:pPr>
+        <w:spacing w:before="0" w:after="0" w:line="120" w:lineRule="exact"/>
+        <w:rPr>
+          <w:sz w:val="4"/>
+          <w:szCs w:val="4"/>
+        </w:rPr>
+      </w:pPr>
+    </w:p>
+    <w:tbl>
+      <w:tblPr>
+        <w:tblStyle w:val="SourceCodeTable"/>
+        <w:tblW w:type="dxa" w:w="9637"/>
+        <w:tblInd w:w="0" w:type="dxa"/>
+        <w:tblBorders>
+          <w:top w:color="BFBFBF" w:space="0" w:sz="4" w:val="single"/>
+          <w:left w:color="BFBFBF" w:space="0" w:sz="4" w:val="single"/>
+          <w:bottom w:color="BFBFBF" w:space="0" w:sz="4" w:val="single"/>
+          <w:right w:color="BFBFBF" w:space="0" w:sz="4" w:val="single"/>
+        </w:tblBorders>
+        <w:tblLayout w:type="fixed"/>
+        <w:tblCellMar>
+          <w:top w:type="dxa" w:w="113"/>
+          <w:left w:type="dxa" w:w="113"/>
+          <w:bottom w:type="dxa" w:w="113"/>
+          <w:right w:type="dxa" w:w="113"/>
+        </w:tblCellMar>
+        <w:tblLook w:val="0000" w:firstRow="0" w:lastRow="0" w:firstColumn="0" w:lastColumn="0" w:noHBand="1" w:noVBand="1"/>
+      </w:tblPr>
+      <w:tblGrid>
+        <w:gridCol w:w="9637"/>
+      </w:tblGrid>
+      <w:tr>
+        <w:tc>
+          <w:tcPr>
+            <w:tcW w:type="dxa" w:w="9637"/>
+          </w:tcPr>
+          <w:p>
+            <w:pPr>
+              <w:pStyle w:val="SourceCode"/>
+              <w:spacing w:before="0" w:after="0" w:line="200" w:lineRule="auto"/>
+            </w:pPr>
+            <w:r>
+              <w:t xml:space="preserve">C:\...\LAB2&gt; echo Звіт сформовано &gt;&gt; docs\listing.txt</w:t>
+            </w:r>
+          </w:p>
+          <w:p>
+            <w:pPr>
+              <w:pStyle w:val="SourceCode"/>
+              <w:spacing w:before="0" w:after="0" w:line="200" w:lineRule="auto"/>
+            </w:pPr>
+            <w:r>
+              <w:t xml:space="preserve">C:\...\LAB2&gt; dir nosuchfile.txt 2&gt; docs\errors.txt</w:t>
+            </w:r>
+          </w:p>
+          <w:p>
+            <w:pPr>
+              <w:pStyle w:val="SourceCode"/>
+              <w:spacing w:before="0" w:after="0" w:line="200" w:lineRule="auto"/>
+            </w:pPr>
+            <w:r>
+              <w:t xml:space="preserve">C:\...\LAB2&gt; type docs\errors.txt</w:t>
+            </w:r>
+          </w:p>
+          <w:p>
+            <w:pPr>
+              <w:pStyle w:val="SourceCode"/>
+              <w:spacing w:before="0" w:after="0" w:line="200" w:lineRule="auto"/>
+            </w:pPr>
+            <w:r>
+              <w:t xml:space="preserve">File Not Found</w:t>
+            </w:r>
+          </w:p>
+        </w:tc>
+      </w:tr>
+    </w:tbl>
+    <w:p>
+      <w:pPr>
+        <w:spacing w:before="0" w:after="0" w:line="120" w:lineRule="exact"/>
+        <w:rPr>
+          <w:sz w:val="4"/>
+          <w:szCs w:val="4"/>
+        </w:rPr>
+      </w:pPr>
+    </w:p>
+    <w:p>
+      <w:pPr>
+        <w:spacing w:before="0" w:after="0" w:line="120" w:lineRule="exact"/>
+        <w:rPr>
+          <w:sz w:val="4"/>
+          <w:szCs w:val="4"/>
+        </w:rPr>
+      </w:pPr>
+    </w:p>
+    <w:tbl>
+      <w:tblPr>
+        <w:tblStyle w:val="SourceCodeTable"/>
+        <w:tblW w:type="dxa" w:w="9637"/>
+        <w:tblInd w:w="0" w:type="dxa"/>
+        <w:tblBorders>
+          <w:top w:color="BFBFBF" w:space="0" w:sz="4" w:val="single"/>
+          <w:left w:color="BFBFBF" w:space="0" w:sz="4" w:val="single"/>
+          <w:bottom w:color="BFBFBF" w:space="0" w:sz="4" w:val="single"/>
+          <w:right w:color="BFBFBF" w:space="0" w:sz="4" w:val="single"/>
+        </w:tblBorders>
+        <w:tblLayout w:type="fixed"/>
+        <w:tblCellMar>
+          <w:top w:type="dxa" w:w="113"/>
+          <w:left w:type="dxa" w:w="113"/>
+          <w:bottom w:type="dxa" w:w="113"/>
+          <w:right w:type="dxa" w:w="113"/>
+        </w:tblCellMar>
+        <w:tblLook w:val="0000" w:firstRow="0" w:lastRow="0" w:firstColumn="0" w:lastColumn="0" w:noHBand="1" w:noVBand="1"/>
+      </w:tblPr>
+      <w:tblGrid>
+        <w:gridCol w:w="9637"/>
+      </w:tblGrid>
+      <w:tr>
+        <w:tc>
+          <w:tcPr>
+            <w:tcW w:type="dxa" w:w="9637"/>
+          </w:tcPr>
+          <w:p>
+            <w:pPr>
+              <w:pStyle w:val="SourceCode"/>
+              <w:spacing w:before="0" w:after="0" w:line="200" w:lineRule="auto"/>
+            </w:pPr>
+            <w:r>
+              <w:t xml:space="preserve">C:\...\LAB2&gt; type nul &gt; docs\empty.txt</w:t>
+            </w:r>
+          </w:p>
+          <w:p>
+            <w:pPr>
+              <w:pStyle w:val="SourceCode"/>
+              <w:spacing w:before="0" w:after="0" w:line="200" w:lineRule="auto"/>
+            </w:pPr>
+            <w:r>
+              <w:t xml:space="preserve">C:\...\LAB2&gt; dir docs /b</w:t>
+            </w:r>
+          </w:p>
+          <w:p>
+            <w:pPr>
+              <w:pStyle w:val="SourceCode"/>
+              <w:spacing w:before="0" w:after="0" w:line="200" w:lineRule="auto"/>
+            </w:pPr>
+            <w:r>
+              <w:t xml:space="preserve">empty.txt</w:t>
+            </w:r>
+          </w:p>
+          <w:p>
+            <w:pPr>
+              <w:pStyle w:val="SourceCode"/>
+              <w:spacing w:before="0" w:after="0" w:line="200" w:lineRule="auto"/>
+            </w:pPr>
+            <w:r>
+              <w:t xml:space="preserve">errors.txt</w:t>
+            </w:r>
+          </w:p>
+          <w:p>
+            <w:pPr>
+              <w:pStyle w:val="SourceCode"/>
+              <w:spacing w:before="0" w:after="0" w:line="200" w:lineRule="auto"/>
+            </w:pPr>
+            <w:r>
+              <w:t xml:space="preserve">listing.txt</w:t>
+            </w:r>
+          </w:p>
+        </w:tc>
+      </w:tr>
+    </w:tbl>
+    <w:p>
+      <w:pPr>
+        <w:spacing w:before="0" w:after="0" w:line="120" w:lineRule="exact"/>
+        <w:rPr>
+          <w:sz w:val="4"/>
+          <w:szCs w:val="4"/>
+        </w:rPr>
+      </w:pPr>
     </w:p>
     <w:bookmarkEnd w:id="24"/>
     <w:bookmarkStart w:id="25" w:name="крок-6.-те-саме-в-powershell"/>
@@ -2900,111 +4321,307 @@
     </w:p>
     <w:p>
       <w:pPr>
-        <w:pStyle w:val="SourceCode"/>
-        <w:spacing w:before="120" w:after="0" w:line="200" w:lineRule="auto"/>
-      </w:pPr>
-      <w:r>
-        <w:t xml:space="preserve">PS C:\...\LAB2&gt; Get-ChildItem src -Recurse -File |</w:t>
-      </w:r>
-    </w:p>
-    <w:p>
-      <w:pPr>
-        <w:pStyle w:val="SourceCode"/>
-        <w:spacing w:before="0" w:after="120" w:line="200" w:lineRule="auto"/>
-      </w:pPr>
-      <w:r>
-        <w:t xml:space="preserve">&gt;&gt;     Measure-Object -Property Length -Sum</w:t>
-      </w:r>
-    </w:p>
-    <w:p>
-      <w:pPr>
-        <w:pStyle w:val="SourceCode"/>
-        <w:spacing w:before="120" w:after="0" w:line="200" w:lineRule="auto"/>
-      </w:pPr>
-      <w:r>
-        <w:t xml:space="preserve">Count    : 70</w:t>
-      </w:r>
-    </w:p>
-    <w:p>
-      <w:pPr>
-        <w:pStyle w:val="SourceCode"/>
-        <w:spacing w:before="0" w:after="120" w:line="200" w:lineRule="auto"/>
-      </w:pPr>
-      <w:r>
-        <w:t xml:space="preserve">Sum      : 12648174</w:t>
-      </w:r>
-    </w:p>
-    <w:p>
-      <w:pPr>
-        <w:pStyle w:val="SourceCode"/>
-        <w:spacing w:before="120" w:after="0" w:line="200" w:lineRule="auto"/>
-      </w:pPr>
-      <w:r>
-        <w:t xml:space="preserve">PS C:\...\LAB2&gt; Get-ChildItem src -Recurse -File |</w:t>
-      </w:r>
-    </w:p>
-    <w:p>
-      <w:pPr>
-        <w:pStyle w:val="SourceCode"/>
-        <w:spacing w:before="0" w:after="0" w:line="200" w:lineRule="auto"/>
-      </w:pPr>
-      <w:r>
-        <w:t xml:space="preserve">&gt;&gt;     Sort-Object Length -Descending |</w:t>
-      </w:r>
-    </w:p>
-    <w:p>
-      <w:pPr>
-        <w:pStyle w:val="SourceCode"/>
-        <w:spacing w:before="0" w:after="120" w:line="200" w:lineRule="auto"/>
-      </w:pPr>
-      <w:r>
-        <w:t xml:space="preserve">&gt;&gt;     Select-Object -First 3 Name, Length</w:t>
-      </w:r>
-    </w:p>
-    <w:p>
-      <w:pPr>
-        <w:pStyle w:val="SourceCode"/>
-        <w:spacing w:before="120" w:after="0" w:line="200" w:lineRule="auto"/>
-      </w:pPr>
-      <w:r>
-        <w:t xml:space="preserve">Name                       Length</w:t>
-      </w:r>
-    </w:p>
-    <w:p>
-      <w:pPr>
-        <w:pStyle w:val="SourceCode"/>
-        <w:spacing w:before="0" w:after="0" w:line="200" w:lineRule="auto"/>
-      </w:pPr>
-      <w:r>
-        <w:t xml:space="preserve">----                       ------</w:t>
-      </w:r>
-    </w:p>
-    <w:p>
-      <w:pPr>
-        <w:pStyle w:val="SourceCode"/>
-        <w:spacing w:before="0" w:after="0" w:line="200" w:lineRule="auto"/>
-      </w:pPr>
-      <w:r>
-        <w:t xml:space="preserve">Windows Logon.wav         1189836</w:t>
-      </w:r>
-    </w:p>
-    <w:p>
-      <w:pPr>
-        <w:pStyle w:val="SourceCode"/>
-        <w:spacing w:before="0" w:after="0" w:line="200" w:lineRule="auto"/>
-      </w:pPr>
-      <w:r>
-        <w:t xml:space="preserve">Windows Shutdown.wav       729068</w:t>
-      </w:r>
-    </w:p>
-    <w:p>
-      <w:pPr>
-        <w:pStyle w:val="SourceCode"/>
-        <w:spacing w:before="0" w:after="120" w:line="200" w:lineRule="auto"/>
-      </w:pPr>
-      <w:r>
-        <w:t xml:space="preserve">Windows Startup.wav        497908</w:t>
-      </w:r>
+        <w:spacing w:before="0" w:after="0" w:line="120" w:lineRule="exact"/>
+        <w:rPr>
+          <w:sz w:val="4"/>
+          <w:szCs w:val="4"/>
+        </w:rPr>
+      </w:pPr>
+    </w:p>
+    <w:tbl>
+      <w:tblPr>
+        <w:tblStyle w:val="SourceCodeTable"/>
+        <w:tblW w:type="dxa" w:w="9637"/>
+        <w:tblInd w:w="0" w:type="dxa"/>
+        <w:tblBorders>
+          <w:top w:color="BFBFBF" w:space="0" w:sz="4" w:val="single"/>
+          <w:left w:color="BFBFBF" w:space="0" w:sz="4" w:val="single"/>
+          <w:bottom w:color="BFBFBF" w:space="0" w:sz="4" w:val="single"/>
+          <w:right w:color="BFBFBF" w:space="0" w:sz="4" w:val="single"/>
+        </w:tblBorders>
+        <w:tblLayout w:type="fixed"/>
+        <w:tblCellMar>
+          <w:top w:type="dxa" w:w="113"/>
+          <w:left w:type="dxa" w:w="113"/>
+          <w:bottom w:type="dxa" w:w="113"/>
+          <w:right w:type="dxa" w:w="113"/>
+        </w:tblCellMar>
+        <w:tblLook w:val="0000" w:firstRow="0" w:lastRow="0" w:firstColumn="0" w:lastColumn="0" w:noHBand="1" w:noVBand="1"/>
+      </w:tblPr>
+      <w:tblGrid>
+        <w:gridCol w:w="9637"/>
+      </w:tblGrid>
+      <w:tr>
+        <w:tc>
+          <w:tcPr>
+            <w:tcW w:type="dxa" w:w="9637"/>
+          </w:tcPr>
+          <w:p>
+            <w:pPr>
+              <w:pStyle w:val="SourceCode"/>
+              <w:spacing w:before="0" w:after="0" w:line="200" w:lineRule="auto"/>
+            </w:pPr>
+            <w:r>
+              <w:t xml:space="preserve">PS C:\...\LAB2&gt; Get-ChildItem src -Recurse -File |</w:t>
+            </w:r>
+          </w:p>
+          <w:p>
+            <w:pPr>
+              <w:pStyle w:val="SourceCode"/>
+              <w:spacing w:before="0" w:after="0" w:line="200" w:lineRule="auto"/>
+            </w:pPr>
+            <w:r>
+              <w:t xml:space="preserve">&gt;&gt;     Measure-Object -Property Length -Sum</w:t>
+            </w:r>
+          </w:p>
+        </w:tc>
+      </w:tr>
+    </w:tbl>
+    <w:p>
+      <w:pPr>
+        <w:spacing w:before="0" w:after="0" w:line="120" w:lineRule="exact"/>
+        <w:rPr>
+          <w:sz w:val="4"/>
+          <w:szCs w:val="4"/>
+        </w:rPr>
+      </w:pPr>
+    </w:p>
+    <w:p>
+      <w:pPr>
+        <w:spacing w:before="0" w:after="0" w:line="120" w:lineRule="exact"/>
+        <w:rPr>
+          <w:sz w:val="4"/>
+          <w:szCs w:val="4"/>
+        </w:rPr>
+      </w:pPr>
+    </w:p>
+    <w:tbl>
+      <w:tblPr>
+        <w:tblStyle w:val="SourceCodeTable"/>
+        <w:tblW w:type="dxa" w:w="9637"/>
+        <w:tblInd w:w="0" w:type="dxa"/>
+        <w:tblBorders>
+          <w:top w:color="BFBFBF" w:space="0" w:sz="4" w:val="single"/>
+          <w:left w:color="BFBFBF" w:space="0" w:sz="4" w:val="single"/>
+          <w:bottom w:color="BFBFBF" w:space="0" w:sz="4" w:val="single"/>
+          <w:right w:color="BFBFBF" w:space="0" w:sz="4" w:val="single"/>
+        </w:tblBorders>
+        <w:tblLayout w:type="fixed"/>
+        <w:tblCellMar>
+          <w:top w:type="dxa" w:w="113"/>
+          <w:left w:type="dxa" w:w="113"/>
+          <w:bottom w:type="dxa" w:w="113"/>
+          <w:right w:type="dxa" w:w="113"/>
+        </w:tblCellMar>
+        <w:tblLook w:val="0000" w:firstRow="0" w:lastRow="0" w:firstColumn="0" w:lastColumn="0" w:noHBand="1" w:noVBand="1"/>
+      </w:tblPr>
+      <w:tblGrid>
+        <w:gridCol w:w="9637"/>
+      </w:tblGrid>
+      <w:tr>
+        <w:tc>
+          <w:tcPr>
+            <w:tcW w:type="dxa" w:w="9637"/>
+          </w:tcPr>
+          <w:p>
+            <w:pPr>
+              <w:pStyle w:val="SourceCode"/>
+              <w:spacing w:before="0" w:after="0" w:line="200" w:lineRule="auto"/>
+            </w:pPr>
+            <w:r>
+              <w:t xml:space="preserve">Count    : 70</w:t>
+            </w:r>
+          </w:p>
+          <w:p>
+            <w:pPr>
+              <w:pStyle w:val="SourceCode"/>
+              <w:spacing w:before="0" w:after="0" w:line="200" w:lineRule="auto"/>
+            </w:pPr>
+            <w:r>
+              <w:t xml:space="preserve">Sum      : 12648174</w:t>
+            </w:r>
+          </w:p>
+        </w:tc>
+      </w:tr>
+    </w:tbl>
+    <w:p>
+      <w:pPr>
+        <w:spacing w:before="0" w:after="0" w:line="120" w:lineRule="exact"/>
+        <w:rPr>
+          <w:sz w:val="4"/>
+          <w:szCs w:val="4"/>
+        </w:rPr>
+      </w:pPr>
+    </w:p>
+    <w:p>
+      <w:pPr>
+        <w:spacing w:before="0" w:after="0" w:line="120" w:lineRule="exact"/>
+        <w:rPr>
+          <w:sz w:val="4"/>
+          <w:szCs w:val="4"/>
+        </w:rPr>
+      </w:pPr>
+    </w:p>
+    <w:tbl>
+      <w:tblPr>
+        <w:tblStyle w:val="SourceCodeTable"/>
+        <w:tblW w:type="dxa" w:w="9637"/>
+        <w:tblInd w:w="0" w:type="dxa"/>
+        <w:tblBorders>
+          <w:top w:color="BFBFBF" w:space="0" w:sz="4" w:val="single"/>
+          <w:left w:color="BFBFBF" w:space="0" w:sz="4" w:val="single"/>
+          <w:bottom w:color="BFBFBF" w:space="0" w:sz="4" w:val="single"/>
+          <w:right w:color="BFBFBF" w:space="0" w:sz="4" w:val="single"/>
+        </w:tblBorders>
+        <w:tblLayout w:type="fixed"/>
+        <w:tblCellMar>
+          <w:top w:type="dxa" w:w="113"/>
+          <w:left w:type="dxa" w:w="113"/>
+          <w:bottom w:type="dxa" w:w="113"/>
+          <w:right w:type="dxa" w:w="113"/>
+        </w:tblCellMar>
+        <w:tblLook w:val="0000" w:firstRow="0" w:lastRow="0" w:firstColumn="0" w:lastColumn="0" w:noHBand="1" w:noVBand="1"/>
+      </w:tblPr>
+      <w:tblGrid>
+        <w:gridCol w:w="9637"/>
+      </w:tblGrid>
+      <w:tr>
+        <w:tc>
+          <w:tcPr>
+            <w:tcW w:type="dxa" w:w="9637"/>
+          </w:tcPr>
+          <w:p>
+            <w:pPr>
+              <w:pStyle w:val="SourceCode"/>
+              <w:spacing w:before="0" w:after="0" w:line="200" w:lineRule="auto"/>
+            </w:pPr>
+            <w:r>
+              <w:t xml:space="preserve">PS C:\...\LAB2&gt; Get-ChildItem src -Recurse -File |</w:t>
+            </w:r>
+          </w:p>
+          <w:p>
+            <w:pPr>
+              <w:pStyle w:val="SourceCode"/>
+              <w:spacing w:before="0" w:after="0" w:line="200" w:lineRule="auto"/>
+            </w:pPr>
+            <w:r>
+              <w:t xml:space="preserve">&gt;&gt;     Sort-Object Length -Descending |</w:t>
+            </w:r>
+          </w:p>
+          <w:p>
+            <w:pPr>
+              <w:pStyle w:val="SourceCode"/>
+              <w:spacing w:before="0" w:after="0" w:line="200" w:lineRule="auto"/>
+            </w:pPr>
+            <w:r>
+              <w:t xml:space="preserve">&gt;&gt;     Select-Object -First 3 Name, Length</w:t>
+            </w:r>
+          </w:p>
+        </w:tc>
+      </w:tr>
+    </w:tbl>
+    <w:p>
+      <w:pPr>
+        <w:spacing w:before="0" w:after="0" w:line="120" w:lineRule="exact"/>
+        <w:rPr>
+          <w:sz w:val="4"/>
+          <w:szCs w:val="4"/>
+        </w:rPr>
+      </w:pPr>
+    </w:p>
+    <w:p>
+      <w:pPr>
+        <w:spacing w:before="0" w:after="0" w:line="120" w:lineRule="exact"/>
+        <w:rPr>
+          <w:sz w:val="4"/>
+          <w:szCs w:val="4"/>
+        </w:rPr>
+      </w:pPr>
+    </w:p>
+    <w:tbl>
+      <w:tblPr>
+        <w:tblStyle w:val="SourceCodeTable"/>
+        <w:tblW w:type="dxa" w:w="9637"/>
+        <w:tblInd w:w="0" w:type="dxa"/>
+        <w:tblBorders>
+          <w:top w:color="BFBFBF" w:space="0" w:sz="4" w:val="single"/>
+          <w:left w:color="BFBFBF" w:space="0" w:sz="4" w:val="single"/>
+          <w:bottom w:color="BFBFBF" w:space="0" w:sz="4" w:val="single"/>
+          <w:right w:color="BFBFBF" w:space="0" w:sz="4" w:val="single"/>
+        </w:tblBorders>
+        <w:tblLayout w:type="fixed"/>
+        <w:tblCellMar>
+          <w:top w:type="dxa" w:w="113"/>
+          <w:left w:type="dxa" w:w="113"/>
+          <w:bottom w:type="dxa" w:w="113"/>
+          <w:right w:type="dxa" w:w="113"/>
+        </w:tblCellMar>
+        <w:tblLook w:val="0000" w:firstRow="0" w:lastRow="0" w:firstColumn="0" w:lastColumn="0" w:noHBand="1" w:noVBand="1"/>
+      </w:tblPr>
+      <w:tblGrid>
+        <w:gridCol w:w="9637"/>
+      </w:tblGrid>
+      <w:tr>
+        <w:tc>
+          <w:tcPr>
+            <w:tcW w:type="dxa" w:w="9637"/>
+          </w:tcPr>
+          <w:p>
+            <w:pPr>
+              <w:pStyle w:val="SourceCode"/>
+              <w:spacing w:before="0" w:after="0" w:line="200" w:lineRule="auto"/>
+            </w:pPr>
+            <w:r>
+              <w:t xml:space="preserve">Name                       Length</w:t>
+            </w:r>
+          </w:p>
+          <w:p>
+            <w:pPr>
+              <w:pStyle w:val="SourceCode"/>
+              <w:spacing w:before="0" w:after="0" w:line="200" w:lineRule="auto"/>
+            </w:pPr>
+            <w:r>
+              <w:t xml:space="preserve">----                       ------</w:t>
+            </w:r>
+          </w:p>
+          <w:p>
+            <w:pPr>
+              <w:pStyle w:val="SourceCode"/>
+              <w:spacing w:before="0" w:after="0" w:line="200" w:lineRule="auto"/>
+            </w:pPr>
+            <w:r>
+              <w:t xml:space="preserve">Windows Logon.wav         1189836</w:t>
+            </w:r>
+          </w:p>
+          <w:p>
+            <w:pPr>
+              <w:pStyle w:val="SourceCode"/>
+              <w:spacing w:before="0" w:after="0" w:line="200" w:lineRule="auto"/>
+            </w:pPr>
+            <w:r>
+              <w:t xml:space="preserve">Windows Shutdown.wav       729068</w:t>
+            </w:r>
+          </w:p>
+          <w:p>
+            <w:pPr>
+              <w:pStyle w:val="SourceCode"/>
+              <w:spacing w:before="0" w:after="0" w:line="200" w:lineRule="auto"/>
+            </w:pPr>
+            <w:r>
+              <w:t xml:space="preserve">Windows Startup.wav        497908</w:t>
+            </w:r>
+          </w:p>
+        </w:tc>
+      </w:tr>
+    </w:tbl>
+    <w:p>
+      <w:pPr>
+        <w:spacing w:before="0" w:after="0" w:line="120" w:lineRule="exact"/>
+        <w:rPr>
+          <w:sz w:val="4"/>
+          <w:szCs w:val="4"/>
+        </w:rPr>
+      </w:pPr>
     </w:p>
     <w:p>
       <w:pPr>
@@ -6334,7 +7951,7 @@
     <w:basedOn w:val="Normal"/>
     <w:qFormat/>
     <w:pPr>
-      <w:spacing w:after="120" w:before="120" w:line="200" w:lineRule="auto"/>
+      <w:spacing w:after="0" w:before="0" w:line="200" w:lineRule="auto"/>
       <w:ind w:hanging="340" w:left="340" w:right="0"/>
       <w:jc w:val="left"/>
     </w:pPr>
@@ -6343,6 +7960,26 @@
       <w:sz w:val="18"/>
       <w:szCs w:val="18"/>
     </w:rPr>
+  </w:style>
+  <w:style w:customStyle="1" w:styleId="SourceCodeTable" w:type="table">
+    <w:name w:val="Source Code Table"/>
+    <w:basedOn w:val="TableNormal"/>
+    <w:qFormat/>
+    <w:tblPr>
+      <w:tblInd w:type="dxa" w:w="0"/>
+      <w:tblBorders>
+        <w:top w:color="BFBFBF" w:space="0" w:sz="4" w:val="single"/>
+        <w:left w:color="BFBFBF" w:space="0" w:sz="4" w:val="single"/>
+        <w:bottom w:color="BFBFBF" w:space="0" w:sz="4" w:val="single"/>
+        <w:right w:color="BFBFBF" w:space="0" w:sz="4" w:val="single"/>
+      </w:tblBorders>
+      <w:tblCellMar>
+        <w:top w:type="dxa" w:w="113"/>
+        <w:left w:type="dxa" w:w="113"/>
+        <w:bottom w:type="dxa" w:w="113"/>
+        <w:right w:type="dxa" w:w="113"/>
+      </w:tblCellMar>
+    </w:tblPr>
   </w:style>
   <w:style w:type="paragraph" w:customStyle="1" w:styleId="TableCaption">
     <w:name w:val="TableCaption"/>

</xml_diff>

<commit_message>
feat: fill listings with a light grey background
The site sets a code block apart with a dark block; on paper the same
job is done by a light fill, so the listing table gets F4F4F4 alongside
its frame. It is written into the cell as well as the table, because
that is where every renderer looks for shading.

Co-Authored-By: Claude Opus 5 <noreply@anthropic.com>
</commit_message>
<xml_diff>
--- a/public/labs/os/kmp-23/ЛР1_ОС_Файли_та_каталоги_в_командному_рядку_Windows.docx
+++ b/public/labs/os/kmp-23/ЛР1_ОС_Файли_та_каталоги_в_командному_рядку_Windows.docx
@@ -188,6 +188,7 @@
           <w:bottom w:color="BFBFBF" w:space="0" w:sz="4" w:val="single"/>
           <w:right w:color="BFBFBF" w:space="0" w:sz="4" w:val="single"/>
         </w:tblBorders>
+        <w:shd w:color="auto" w:fill="F4F4F4" w:val="clear"/>
         <w:tblLayout w:type="fixed"/>
         <w:tblCellMar>
           <w:top w:type="dxa" w:w="113"/>
@@ -204,6 +205,7 @@
         <w:tc>
           <w:tcPr>
             <w:tcW w:type="dxa" w:w="9637"/>
+            <w:shd w:color="auto" w:fill="F4F4F4" w:val="clear"/>
           </w:tcPr>
           <w:p>
             <w:pPr>
@@ -326,6 +328,7 @@
           <w:bottom w:color="BFBFBF" w:space="0" w:sz="4" w:val="single"/>
           <w:right w:color="BFBFBF" w:space="0" w:sz="4" w:val="single"/>
         </w:tblBorders>
+        <w:shd w:color="auto" w:fill="F4F4F4" w:val="clear"/>
         <w:tblLayout w:type="fixed"/>
         <w:tblCellMar>
           <w:top w:type="dxa" w:w="113"/>
@@ -342,6 +345,7 @@
         <w:tc>
           <w:tcPr>
             <w:tcW w:type="dxa" w:w="9637"/>
+            <w:shd w:color="auto" w:fill="F4F4F4" w:val="clear"/>
           </w:tcPr>
           <w:p>
             <w:pPr>
@@ -1119,6 +1123,7 @@
           <w:bottom w:color="BFBFBF" w:space="0" w:sz="4" w:val="single"/>
           <w:right w:color="BFBFBF" w:space="0" w:sz="4" w:val="single"/>
         </w:tblBorders>
+        <w:shd w:color="auto" w:fill="F4F4F4" w:val="clear"/>
         <w:tblLayout w:type="fixed"/>
         <w:tblCellMar>
           <w:top w:type="dxa" w:w="113"/>
@@ -1135,6 +1140,7 @@
         <w:tc>
           <w:tcPr>
             <w:tcW w:type="dxa" w:w="9637"/>
+            <w:shd w:color="auto" w:fill="F4F4F4" w:val="clear"/>
           </w:tcPr>
           <w:p>
             <w:pPr>
@@ -1195,6 +1201,7 @@
           <w:bottom w:color="BFBFBF" w:space="0" w:sz="4" w:val="single"/>
           <w:right w:color="BFBFBF" w:space="0" w:sz="4" w:val="single"/>
         </w:tblBorders>
+        <w:shd w:color="auto" w:fill="F4F4F4" w:val="clear"/>
         <w:tblLayout w:type="fixed"/>
         <w:tblCellMar>
           <w:top w:type="dxa" w:w="113"/>
@@ -1211,6 +1218,7 @@
         <w:tc>
           <w:tcPr>
             <w:tcW w:type="dxa" w:w="9637"/>
+            <w:shd w:color="auto" w:fill="F4F4F4" w:val="clear"/>
           </w:tcPr>
           <w:p>
             <w:pPr>
@@ -1262,6 +1270,7 @@
           <w:bottom w:color="BFBFBF" w:space="0" w:sz="4" w:val="single"/>
           <w:right w:color="BFBFBF" w:space="0" w:sz="4" w:val="single"/>
         </w:tblBorders>
+        <w:shd w:color="auto" w:fill="F4F4F4" w:val="clear"/>
         <w:tblLayout w:type="fixed"/>
         <w:tblCellMar>
           <w:top w:type="dxa" w:w="113"/>
@@ -1278,6 +1287,7 @@
         <w:tc>
           <w:tcPr>
             <w:tcW w:type="dxa" w:w="9637"/>
+            <w:shd w:color="auto" w:fill="F4F4F4" w:val="clear"/>
           </w:tcPr>
           <w:p>
             <w:pPr>
@@ -1375,6 +1385,7 @@
           <w:bottom w:color="BFBFBF" w:space="0" w:sz="4" w:val="single"/>
           <w:right w:color="BFBFBF" w:space="0" w:sz="4" w:val="single"/>
         </w:tblBorders>
+        <w:shd w:color="auto" w:fill="F4F4F4" w:val="clear"/>
         <w:tblLayout w:type="fixed"/>
         <w:tblCellMar>
           <w:top w:type="dxa" w:w="113"/>
@@ -1391,6 +1402,7 @@
         <w:tc>
           <w:tcPr>
             <w:tcW w:type="dxa" w:w="9637"/>
+            <w:shd w:color="auto" w:fill="F4F4F4" w:val="clear"/>
           </w:tcPr>
           <w:p>
             <w:pPr>
@@ -1460,6 +1472,7 @@
           <w:bottom w:color="BFBFBF" w:space="0" w:sz="4" w:val="single"/>
           <w:right w:color="BFBFBF" w:space="0" w:sz="4" w:val="single"/>
         </w:tblBorders>
+        <w:shd w:color="auto" w:fill="F4F4F4" w:val="clear"/>
         <w:tblLayout w:type="fixed"/>
         <w:tblCellMar>
           <w:top w:type="dxa" w:w="113"/>
@@ -1476,6 +1489,7 @@
         <w:tc>
           <w:tcPr>
             <w:tcW w:type="dxa" w:w="9637"/>
+            <w:shd w:color="auto" w:fill="F4F4F4" w:val="clear"/>
           </w:tcPr>
           <w:p>
             <w:pPr>
@@ -1554,6 +1568,7 @@
           <w:bottom w:color="BFBFBF" w:space="0" w:sz="4" w:val="single"/>
           <w:right w:color="BFBFBF" w:space="0" w:sz="4" w:val="single"/>
         </w:tblBorders>
+        <w:shd w:color="auto" w:fill="F4F4F4" w:val="clear"/>
         <w:tblLayout w:type="fixed"/>
         <w:tblCellMar>
           <w:top w:type="dxa" w:w="113"/>
@@ -1570,6 +1585,7 @@
         <w:tc>
           <w:tcPr>
             <w:tcW w:type="dxa" w:w="9637"/>
+            <w:shd w:color="auto" w:fill="F4F4F4" w:val="clear"/>
           </w:tcPr>
           <w:p>
             <w:pPr>
@@ -1676,6 +1692,7 @@
           <w:bottom w:color="BFBFBF" w:space="0" w:sz="4" w:val="single"/>
           <w:right w:color="BFBFBF" w:space="0" w:sz="4" w:val="single"/>
         </w:tblBorders>
+        <w:shd w:color="auto" w:fill="F4F4F4" w:val="clear"/>
         <w:tblLayout w:type="fixed"/>
         <w:tblCellMar>
           <w:top w:type="dxa" w:w="113"/>
@@ -1692,6 +1709,7 @@
         <w:tc>
           <w:tcPr>
             <w:tcW w:type="dxa" w:w="9637"/>
+            <w:shd w:color="auto" w:fill="F4F4F4" w:val="clear"/>
           </w:tcPr>
           <w:p>
             <w:pPr>
@@ -2119,6 +2137,7 @@
           <w:bottom w:color="BFBFBF" w:space="0" w:sz="4" w:val="single"/>
           <w:right w:color="BFBFBF" w:space="0" w:sz="4" w:val="single"/>
         </w:tblBorders>
+        <w:shd w:color="auto" w:fill="F4F4F4" w:val="clear"/>
         <w:tblLayout w:type="fixed"/>
         <w:tblCellMar>
           <w:top w:type="dxa" w:w="113"/>
@@ -2135,6 +2154,7 @@
         <w:tc>
           <w:tcPr>
             <w:tcW w:type="dxa" w:w="9637"/>
+            <w:shd w:color="auto" w:fill="F4F4F4" w:val="clear"/>
           </w:tcPr>
           <w:p>
             <w:pPr>
@@ -2204,6 +2224,7 @@
           <w:bottom w:color="BFBFBF" w:space="0" w:sz="4" w:val="single"/>
           <w:right w:color="BFBFBF" w:space="0" w:sz="4" w:val="single"/>
         </w:tblBorders>
+        <w:shd w:color="auto" w:fill="F4F4F4" w:val="clear"/>
         <w:tblLayout w:type="fixed"/>
         <w:tblCellMar>
           <w:top w:type="dxa" w:w="113"/>
@@ -2220,6 +2241,7 @@
         <w:tc>
           <w:tcPr>
             <w:tcW w:type="dxa" w:w="9637"/>
+            <w:shd w:color="auto" w:fill="F4F4F4" w:val="clear"/>
           </w:tcPr>
           <w:p>
             <w:pPr>
@@ -2592,6 +2614,7 @@
           <w:bottom w:color="BFBFBF" w:space="0" w:sz="4" w:val="single"/>
           <w:right w:color="BFBFBF" w:space="0" w:sz="4" w:val="single"/>
         </w:tblBorders>
+        <w:shd w:color="auto" w:fill="F4F4F4" w:val="clear"/>
         <w:tblLayout w:type="fixed"/>
         <w:tblCellMar>
           <w:top w:type="dxa" w:w="113"/>
@@ -2608,6 +2631,7 @@
         <w:tc>
           <w:tcPr>
             <w:tcW w:type="dxa" w:w="9637"/>
+            <w:shd w:color="auto" w:fill="F4F4F4" w:val="clear"/>
           </w:tcPr>
           <w:p>
             <w:pPr>
@@ -2722,6 +2746,7 @@
           <w:bottom w:color="BFBFBF" w:space="0" w:sz="4" w:val="single"/>
           <w:right w:color="BFBFBF" w:space="0" w:sz="4" w:val="single"/>
         </w:tblBorders>
+        <w:shd w:color="auto" w:fill="F4F4F4" w:val="clear"/>
         <w:tblLayout w:type="fixed"/>
         <w:tblCellMar>
           <w:top w:type="dxa" w:w="113"/>
@@ -2738,6 +2763,7 @@
         <w:tc>
           <w:tcPr>
             <w:tcW w:type="dxa" w:w="9637"/>
+            <w:shd w:color="auto" w:fill="F4F4F4" w:val="clear"/>
           </w:tcPr>
           <w:p>
             <w:pPr>
@@ -2789,6 +2815,7 @@
           <w:bottom w:color="BFBFBF" w:space="0" w:sz="4" w:val="single"/>
           <w:right w:color="BFBFBF" w:space="0" w:sz="4" w:val="single"/>
         </w:tblBorders>
+        <w:shd w:color="auto" w:fill="F4F4F4" w:val="clear"/>
         <w:tblLayout w:type="fixed"/>
         <w:tblCellMar>
           <w:top w:type="dxa" w:w="113"/>
@@ -2805,6 +2832,7 @@
         <w:tc>
           <w:tcPr>
             <w:tcW w:type="dxa" w:w="9637"/>
+            <w:shd w:color="auto" w:fill="F4F4F4" w:val="clear"/>
           </w:tcPr>
           <w:p>
             <w:pPr>
@@ -2919,6 +2947,7 @@
           <w:bottom w:color="BFBFBF" w:space="0" w:sz="4" w:val="single"/>
           <w:right w:color="BFBFBF" w:space="0" w:sz="4" w:val="single"/>
         </w:tblBorders>
+        <w:shd w:color="auto" w:fill="F4F4F4" w:val="clear"/>
         <w:tblLayout w:type="fixed"/>
         <w:tblCellMar>
           <w:top w:type="dxa" w:w="113"/>
@@ -2935,6 +2964,7 @@
         <w:tc>
           <w:tcPr>
             <w:tcW w:type="dxa" w:w="9637"/>
+            <w:shd w:color="auto" w:fill="F4F4F4" w:val="clear"/>
           </w:tcPr>
           <w:p>
             <w:pPr>
@@ -2995,6 +3025,7 @@
           <w:bottom w:color="BFBFBF" w:space="0" w:sz="4" w:val="single"/>
           <w:right w:color="BFBFBF" w:space="0" w:sz="4" w:val="single"/>
         </w:tblBorders>
+        <w:shd w:color="auto" w:fill="F4F4F4" w:val="clear"/>
         <w:tblLayout w:type="fixed"/>
         <w:tblCellMar>
           <w:top w:type="dxa" w:w="113"/>
@@ -3011,6 +3042,7 @@
         <w:tc>
           <w:tcPr>
             <w:tcW w:type="dxa" w:w="9637"/>
+            <w:shd w:color="auto" w:fill="F4F4F4" w:val="clear"/>
           </w:tcPr>
           <w:p>
             <w:pPr>
@@ -3134,6 +3166,7 @@
           <w:bottom w:color="BFBFBF" w:space="0" w:sz="4" w:val="single"/>
           <w:right w:color="BFBFBF" w:space="0" w:sz="4" w:val="single"/>
         </w:tblBorders>
+        <w:shd w:color="auto" w:fill="F4F4F4" w:val="clear"/>
         <w:tblLayout w:type="fixed"/>
         <w:tblCellMar>
           <w:top w:type="dxa" w:w="113"/>
@@ -3150,6 +3183,7 @@
         <w:tc>
           <w:tcPr>
             <w:tcW w:type="dxa" w:w="9637"/>
+            <w:shd w:color="auto" w:fill="F4F4F4" w:val="clear"/>
           </w:tcPr>
           <w:p>
             <w:pPr>
@@ -3192,6 +3226,7 @@
           <w:bottom w:color="BFBFBF" w:space="0" w:sz="4" w:val="single"/>
           <w:right w:color="BFBFBF" w:space="0" w:sz="4" w:val="single"/>
         </w:tblBorders>
+        <w:shd w:color="auto" w:fill="F4F4F4" w:val="clear"/>
         <w:tblLayout w:type="fixed"/>
         <w:tblCellMar>
           <w:top w:type="dxa" w:w="113"/>
@@ -3208,6 +3243,7 @@
         <w:tc>
           <w:tcPr>
             <w:tcW w:type="dxa" w:w="9637"/>
+            <w:shd w:color="auto" w:fill="F4F4F4" w:val="clear"/>
           </w:tcPr>
           <w:p>
             <w:pPr>
@@ -3286,6 +3322,7 @@
           <w:bottom w:color="BFBFBF" w:space="0" w:sz="4" w:val="single"/>
           <w:right w:color="BFBFBF" w:space="0" w:sz="4" w:val="single"/>
         </w:tblBorders>
+        <w:shd w:color="auto" w:fill="F4F4F4" w:val="clear"/>
         <w:tblLayout w:type="fixed"/>
         <w:tblCellMar>
           <w:top w:type="dxa" w:w="113"/>
@@ -3302,6 +3339,7 @@
         <w:tc>
           <w:tcPr>
             <w:tcW w:type="dxa" w:w="9637"/>
+            <w:shd w:color="auto" w:fill="F4F4F4" w:val="clear"/>
           </w:tcPr>
           <w:p>
             <w:pPr>
@@ -3380,6 +3418,7 @@
           <w:bottom w:color="BFBFBF" w:space="0" w:sz="4" w:val="single"/>
           <w:right w:color="BFBFBF" w:space="0" w:sz="4" w:val="single"/>
         </w:tblBorders>
+        <w:shd w:color="auto" w:fill="F4F4F4" w:val="clear"/>
         <w:tblLayout w:type="fixed"/>
         <w:tblCellMar>
           <w:top w:type="dxa" w:w="113"/>
@@ -3396,6 +3435,7 @@
         <w:tc>
           <w:tcPr>
             <w:tcW w:type="dxa" w:w="9637"/>
+            <w:shd w:color="auto" w:fill="F4F4F4" w:val="clear"/>
           </w:tcPr>
           <w:p>
             <w:pPr>
@@ -3474,6 +3514,7 @@
           <w:bottom w:color="BFBFBF" w:space="0" w:sz="4" w:val="single"/>
           <w:right w:color="BFBFBF" w:space="0" w:sz="4" w:val="single"/>
         </w:tblBorders>
+        <w:shd w:color="auto" w:fill="F4F4F4" w:val="clear"/>
         <w:tblLayout w:type="fixed"/>
         <w:tblCellMar>
           <w:top w:type="dxa" w:w="113"/>
@@ -3490,6 +3531,7 @@
         <w:tc>
           <w:tcPr>
             <w:tcW w:type="dxa" w:w="9637"/>
+            <w:shd w:color="auto" w:fill="F4F4F4" w:val="clear"/>
           </w:tcPr>
           <w:p>
             <w:pPr>
@@ -3595,6 +3637,7 @@
           <w:bottom w:color="BFBFBF" w:space="0" w:sz="4" w:val="single"/>
           <w:right w:color="BFBFBF" w:space="0" w:sz="4" w:val="single"/>
         </w:tblBorders>
+        <w:shd w:color="auto" w:fill="F4F4F4" w:val="clear"/>
         <w:tblLayout w:type="fixed"/>
         <w:tblCellMar>
           <w:top w:type="dxa" w:w="113"/>
@@ -3611,6 +3654,7 @@
         <w:tc>
           <w:tcPr>
             <w:tcW w:type="dxa" w:w="9637"/>
+            <w:shd w:color="auto" w:fill="F4F4F4" w:val="clear"/>
           </w:tcPr>
           <w:p>
             <w:pPr>
@@ -3680,6 +3724,7 @@
           <w:bottom w:color="BFBFBF" w:space="0" w:sz="4" w:val="single"/>
           <w:right w:color="BFBFBF" w:space="0" w:sz="4" w:val="single"/>
         </w:tblBorders>
+        <w:shd w:color="auto" w:fill="F4F4F4" w:val="clear"/>
         <w:tblLayout w:type="fixed"/>
         <w:tblCellMar>
           <w:top w:type="dxa" w:w="113"/>
@@ -3696,6 +3741,7 @@
         <w:tc>
           <w:tcPr>
             <w:tcW w:type="dxa" w:w="9637"/>
+            <w:shd w:color="auto" w:fill="F4F4F4" w:val="clear"/>
           </w:tcPr>
           <w:p>
             <w:pPr>
@@ -3756,6 +3802,7 @@
           <w:bottom w:color="BFBFBF" w:space="0" w:sz="4" w:val="single"/>
           <w:right w:color="BFBFBF" w:space="0" w:sz="4" w:val="single"/>
         </w:tblBorders>
+        <w:shd w:color="auto" w:fill="F4F4F4" w:val="clear"/>
         <w:tblLayout w:type="fixed"/>
         <w:tblCellMar>
           <w:top w:type="dxa" w:w="113"/>
@@ -3772,6 +3819,7 @@
         <w:tc>
           <w:tcPr>
             <w:tcW w:type="dxa" w:w="9637"/>
+            <w:shd w:color="auto" w:fill="F4F4F4" w:val="clear"/>
           </w:tcPr>
           <w:p>
             <w:pPr>
@@ -3832,6 +3880,7 @@
           <w:bottom w:color="BFBFBF" w:space="0" w:sz="4" w:val="single"/>
           <w:right w:color="BFBFBF" w:space="0" w:sz="4" w:val="single"/>
         </w:tblBorders>
+        <w:shd w:color="auto" w:fill="F4F4F4" w:val="clear"/>
         <w:tblLayout w:type="fixed"/>
         <w:tblCellMar>
           <w:top w:type="dxa" w:w="113"/>
@@ -3848,6 +3897,7 @@
         <w:tc>
           <w:tcPr>
             <w:tcW w:type="dxa" w:w="9637"/>
+            <w:shd w:color="auto" w:fill="F4F4F4" w:val="clear"/>
           </w:tcPr>
           <w:p>
             <w:pPr>
@@ -3989,6 +4039,7 @@
           <w:bottom w:color="BFBFBF" w:space="0" w:sz="4" w:val="single"/>
           <w:right w:color="BFBFBF" w:space="0" w:sz="4" w:val="single"/>
         </w:tblBorders>
+        <w:shd w:color="auto" w:fill="F4F4F4" w:val="clear"/>
         <w:tblLayout w:type="fixed"/>
         <w:tblCellMar>
           <w:top w:type="dxa" w:w="113"/>
@@ -4005,6 +4056,7 @@
         <w:tc>
           <w:tcPr>
             <w:tcW w:type="dxa" w:w="9637"/>
+            <w:shd w:color="auto" w:fill="F4F4F4" w:val="clear"/>
           </w:tcPr>
           <w:p>
             <w:pPr>
@@ -4065,6 +4117,7 @@
           <w:bottom w:color="BFBFBF" w:space="0" w:sz="4" w:val="single"/>
           <w:right w:color="BFBFBF" w:space="0" w:sz="4" w:val="single"/>
         </w:tblBorders>
+        <w:shd w:color="auto" w:fill="F4F4F4" w:val="clear"/>
         <w:tblLayout w:type="fixed"/>
         <w:tblCellMar>
           <w:top w:type="dxa" w:w="113"/>
@@ -4081,6 +4134,7 @@
         <w:tc>
           <w:tcPr>
             <w:tcW w:type="dxa" w:w="9637"/>
+            <w:shd w:color="auto" w:fill="F4F4F4" w:val="clear"/>
           </w:tcPr>
           <w:p>
             <w:pPr>
@@ -4150,6 +4204,7 @@
           <w:bottom w:color="BFBFBF" w:space="0" w:sz="4" w:val="single"/>
           <w:right w:color="BFBFBF" w:space="0" w:sz="4" w:val="single"/>
         </w:tblBorders>
+        <w:shd w:color="auto" w:fill="F4F4F4" w:val="clear"/>
         <w:tblLayout w:type="fixed"/>
         <w:tblCellMar>
           <w:top w:type="dxa" w:w="113"/>
@@ -4166,6 +4221,7 @@
         <w:tc>
           <w:tcPr>
             <w:tcW w:type="dxa" w:w="9637"/>
+            <w:shd w:color="auto" w:fill="F4F4F4" w:val="clear"/>
           </w:tcPr>
           <w:p>
             <w:pPr>
@@ -4235,6 +4291,7 @@
           <w:bottom w:color="BFBFBF" w:space="0" w:sz="4" w:val="single"/>
           <w:right w:color="BFBFBF" w:space="0" w:sz="4" w:val="single"/>
         </w:tblBorders>
+        <w:shd w:color="auto" w:fill="F4F4F4" w:val="clear"/>
         <w:tblLayout w:type="fixed"/>
         <w:tblCellMar>
           <w:top w:type="dxa" w:w="113"/>
@@ -4251,6 +4308,7 @@
         <w:tc>
           <w:tcPr>
             <w:tcW w:type="dxa" w:w="9637"/>
+            <w:shd w:color="auto" w:fill="F4F4F4" w:val="clear"/>
           </w:tcPr>
           <w:p>
             <w:pPr>
@@ -4339,6 +4397,7 @@
           <w:bottom w:color="BFBFBF" w:space="0" w:sz="4" w:val="single"/>
           <w:right w:color="BFBFBF" w:space="0" w:sz="4" w:val="single"/>
         </w:tblBorders>
+        <w:shd w:color="auto" w:fill="F4F4F4" w:val="clear"/>
         <w:tblLayout w:type="fixed"/>
         <w:tblCellMar>
           <w:top w:type="dxa" w:w="113"/>
@@ -4355,6 +4414,7 @@
         <w:tc>
           <w:tcPr>
             <w:tcW w:type="dxa" w:w="9637"/>
+            <w:shd w:color="auto" w:fill="F4F4F4" w:val="clear"/>
           </w:tcPr>
           <w:p>
             <w:pPr>
@@ -4406,6 +4466,7 @@
           <w:bottom w:color="BFBFBF" w:space="0" w:sz="4" w:val="single"/>
           <w:right w:color="BFBFBF" w:space="0" w:sz="4" w:val="single"/>
         </w:tblBorders>
+        <w:shd w:color="auto" w:fill="F4F4F4" w:val="clear"/>
         <w:tblLayout w:type="fixed"/>
         <w:tblCellMar>
           <w:top w:type="dxa" w:w="113"/>
@@ -4422,6 +4483,7 @@
         <w:tc>
           <w:tcPr>
             <w:tcW w:type="dxa" w:w="9637"/>
+            <w:shd w:color="auto" w:fill="F4F4F4" w:val="clear"/>
           </w:tcPr>
           <w:p>
             <w:pPr>
@@ -4473,6 +4535,7 @@
           <w:bottom w:color="BFBFBF" w:space="0" w:sz="4" w:val="single"/>
           <w:right w:color="BFBFBF" w:space="0" w:sz="4" w:val="single"/>
         </w:tblBorders>
+        <w:shd w:color="auto" w:fill="F4F4F4" w:val="clear"/>
         <w:tblLayout w:type="fixed"/>
         <w:tblCellMar>
           <w:top w:type="dxa" w:w="113"/>
@@ -4489,6 +4552,7 @@
         <w:tc>
           <w:tcPr>
             <w:tcW w:type="dxa" w:w="9637"/>
+            <w:shd w:color="auto" w:fill="F4F4F4" w:val="clear"/>
           </w:tcPr>
           <w:p>
             <w:pPr>
@@ -4549,6 +4613,7 @@
           <w:bottom w:color="BFBFBF" w:space="0" w:sz="4" w:val="single"/>
           <w:right w:color="BFBFBF" w:space="0" w:sz="4" w:val="single"/>
         </w:tblBorders>
+        <w:shd w:color="auto" w:fill="F4F4F4" w:val="clear"/>
         <w:tblLayout w:type="fixed"/>
         <w:tblCellMar>
           <w:top w:type="dxa" w:w="113"/>
@@ -4565,6 +4630,7 @@
         <w:tc>
           <w:tcPr>
             <w:tcW w:type="dxa" w:w="9637"/>
+            <w:shd w:color="auto" w:fill="F4F4F4" w:val="clear"/>
           </w:tcPr>
           <w:p>
             <w:pPr>
@@ -7973,6 +8039,7 @@
         <w:bottom w:color="BFBFBF" w:space="0" w:sz="4" w:val="single"/>
         <w:right w:color="BFBFBF" w:space="0" w:sz="4" w:val="single"/>
       </w:tblBorders>
+      <w:shd w:color="auto" w:fill="F4F4F4" w:val="clear"/>
       <w:tblCellMar>
         <w:top w:type="dxa" w:w="113"/>
         <w:left w:type="dxa" w:w="113"/>

</xml_diff>

<commit_message>
chore: update lab report documents for OS and PMZI courses across all groups
</commit_message>
<xml_diff>
--- a/public/labs/os/kmp-23/ЛР1_ОС_Файли_та_каталоги_в_командному_рядку_Windows.docx
+++ b/public/labs/os/kmp-23/ЛР1_ОС_Файли_та_каталоги_в_командному_рядку_Windows.docx
@@ -170,68 +170,117 @@
     </w:p>
     <w:p>
       <w:pPr>
-        <w:pStyle w:val="SourceCode"/>
-      </w:pPr>
-      <w:r>
+        <w:spacing w:before="0" w:after="0" w:line="120" w:lineRule="exact"/>
         <w:rPr>
-          <w:rStyle w:val="VerbatimChar"/>
+          <w:sz w:val="4"/>
+          <w:szCs w:val="4"/>
         </w:rPr>
-        <w:t xml:space="preserve">cd Desktop            :: у підкаталог поточного каталогу</w:t>
-      </w:r>
-      <w:r>
-        <w:br/>
-      </w:r>
-      <w:r>
+      </w:pPr>
+    </w:p>
+    <w:tbl>
+      <w:tblPr>
+        <w:tblStyle w:val="SourceCodeTable"/>
+        <w:tblW w:type="dxa" w:w="9637"/>
+        <w:tblInd w:w="0" w:type="dxa"/>
+        <w:tblBorders>
+          <w:top w:color="BFBFBF" w:space="0" w:sz="4" w:val="single"/>
+          <w:left w:color="BFBFBF" w:space="0" w:sz="4" w:val="single"/>
+          <w:bottom w:color="BFBFBF" w:space="0" w:sz="4" w:val="single"/>
+          <w:right w:color="BFBFBF" w:space="0" w:sz="4" w:val="single"/>
+        </w:tblBorders>
+        <w:shd w:color="auto" w:fill="F4F4F4" w:val="clear"/>
+        <w:tblLayout w:type="fixed"/>
+        <w:tblCellMar>
+          <w:top w:type="dxa" w:w="113"/>
+          <w:left w:type="dxa" w:w="113"/>
+          <w:bottom w:type="dxa" w:w="113"/>
+          <w:right w:type="dxa" w:w="113"/>
+        </w:tblCellMar>
+        <w:tblLook w:val="0000" w:firstRow="0" w:lastRow="0" w:firstColumn="0" w:lastColumn="0" w:noHBand="1" w:noVBand="1"/>
+      </w:tblPr>
+      <w:tblGrid>
+        <w:gridCol w:w="9637"/>
+      </w:tblGrid>
+      <w:tr>
+        <w:tc>
+          <w:tcPr>
+            <w:tcW w:type="dxa" w:w="9637"/>
+            <w:shd w:color="auto" w:fill="F4F4F4" w:val="clear"/>
+          </w:tcPr>
+          <w:p>
+            <w:pPr>
+              <w:pStyle w:val="SourceCode"/>
+              <w:spacing w:before="0" w:after="0" w:line="200" w:lineRule="auto"/>
+            </w:pPr>
+            <w:r>
+              <w:t xml:space="preserve">cd Desktop            :: у підкаталог поточного каталогу</w:t>
+            </w:r>
+          </w:p>
+          <w:p>
+            <w:pPr>
+              <w:pStyle w:val="SourceCode"/>
+              <w:spacing w:before="0" w:after="0" w:line="200" w:lineRule="auto"/>
+            </w:pPr>
+            <w:r>
+              <w:t xml:space="preserve">cd ..                 :: на рівень вище</w:t>
+            </w:r>
+          </w:p>
+          <w:p>
+            <w:pPr>
+              <w:pStyle w:val="SourceCode"/>
+              <w:spacing w:before="0" w:after="0" w:line="200" w:lineRule="auto"/>
+            </w:pPr>
+            <w:r>
+              <w:t xml:space="preserve">cd \                  :: до кореня поточного диска</w:t>
+            </w:r>
+          </w:p>
+          <w:p>
+            <w:pPr>
+              <w:pStyle w:val="SourceCode"/>
+              <w:spacing w:before="0" w:after="0" w:line="200" w:lineRule="auto"/>
+            </w:pPr>
+            <w:r>
+              <w:t xml:space="preserve">D:                    :: змінити диск без зміни каталогу</w:t>
+            </w:r>
+          </w:p>
+          <w:p>
+            <w:pPr>
+              <w:pStyle w:val="SourceCode"/>
+              <w:spacing w:before="0" w:after="0" w:line="200" w:lineRule="auto"/>
+            </w:pPr>
+            <w:r>
+              <w:t xml:space="preserve">cd /d D:\Data         :: змінити диск і каталог одночасно</w:t>
+            </w:r>
+          </w:p>
+          <w:p>
+            <w:pPr>
+              <w:pStyle w:val="SourceCode"/>
+              <w:spacing w:before="0" w:after="0" w:line="200" w:lineRule="auto"/>
+            </w:pPr>
+            <w:r>
+              <w:t xml:space="preserve">pushd %SystemRoot%    :: перейти, запам’ятавши поточний каталог</w:t>
+            </w:r>
+          </w:p>
+          <w:p>
+            <w:pPr>
+              <w:pStyle w:val="SourceCode"/>
+              <w:spacing w:before="0" w:after="0" w:line="200" w:lineRule="auto"/>
+            </w:pPr>
+            <w:r>
+              <w:t xml:space="preserve">popd                  :: повернутися туди, звідки викликали pushd</w:t>
+            </w:r>
+          </w:p>
+        </w:tc>
+      </w:tr>
+    </w:tbl>
+    <w:p>
+      <w:pPr>
+        <w:spacing w:before="0" w:after="0" w:line="120" w:lineRule="exact"/>
         <w:rPr>
-          <w:rStyle w:val="VerbatimChar"/>
+          <w:sz w:val="4"/>
+          <w:szCs w:val="4"/>
         </w:rPr>
-        <w:t xml:space="preserve">cd ..                 :: на рівень вище</w:t>
-      </w:r>
-      <w:r>
-        <w:br/>
-      </w:r>
-      <w:r>
-        <w:rPr>
-          <w:rStyle w:val="VerbatimChar"/>
-        </w:rPr>
-        <w:t xml:space="preserve">cd \                  :: до кореня поточного диска</w:t>
-      </w:r>
-      <w:r>
-        <w:br/>
-      </w:r>
-      <w:r>
-        <w:rPr>
-          <w:rStyle w:val="VerbatimChar"/>
-        </w:rPr>
-        <w:t xml:space="preserve">D:                    :: змінити диск без зміни каталогу</w:t>
-      </w:r>
-      <w:r>
-        <w:br/>
-      </w:r>
-      <w:r>
-        <w:rPr>
-          <w:rStyle w:val="VerbatimChar"/>
-        </w:rPr>
-        <w:t xml:space="preserve">cd /d D:\Data         :: змінити диск і каталог одночасно</w:t>
-      </w:r>
-      <w:r>
-        <w:br/>
-      </w:r>
-      <w:r>
-        <w:rPr>
-          <w:rStyle w:val="VerbatimChar"/>
-        </w:rPr>
-        <w:t xml:space="preserve">pushd %SystemRoot%    :: перейти, запам’ятавши поточний каталог</w:t>
-      </w:r>
-      <w:r>
-        <w:br/>
-      </w:r>
-      <w:r>
-        <w:rPr>
-          <w:rStyle w:val="VerbatimChar"/>
-        </w:rPr>
-        <w:t xml:space="preserve">popd                  :: повернутися туди, звідки викликали pushd</w:t>
-      </w:r>
+      </w:pPr>
     </w:p>
     <w:p>
       <w:pPr>
@@ -261,59 +310,108 @@
     </w:p>
     <w:p>
       <w:pPr>
-        <w:pStyle w:val="SourceCode"/>
-      </w:pPr>
-      <w:r>
+        <w:spacing w:before="0" w:after="0" w:line="120" w:lineRule="exact"/>
         <w:rPr>
-          <w:rStyle w:val="VerbatimChar"/>
+          <w:sz w:val="4"/>
+          <w:szCs w:val="4"/>
         </w:rPr>
-        <w:t xml:space="preserve">*.txt        усі файли з розширенням txt</w:t>
-      </w:r>
-      <w:r>
-        <w:br/>
-      </w:r>
-      <w:r>
+      </w:pPr>
+    </w:p>
+    <w:tbl>
+      <w:tblPr>
+        <w:tblStyle w:val="SourceCodeTable"/>
+        <w:tblW w:type="dxa" w:w="9637"/>
+        <w:tblInd w:w="0" w:type="dxa"/>
+        <w:tblBorders>
+          <w:top w:color="BFBFBF" w:space="0" w:sz="4" w:val="single"/>
+          <w:left w:color="BFBFBF" w:space="0" w:sz="4" w:val="single"/>
+          <w:bottom w:color="BFBFBF" w:space="0" w:sz="4" w:val="single"/>
+          <w:right w:color="BFBFBF" w:space="0" w:sz="4" w:val="single"/>
+        </w:tblBorders>
+        <w:shd w:color="auto" w:fill="F4F4F4" w:val="clear"/>
+        <w:tblLayout w:type="fixed"/>
+        <w:tblCellMar>
+          <w:top w:type="dxa" w:w="113"/>
+          <w:left w:type="dxa" w:w="113"/>
+          <w:bottom w:type="dxa" w:w="113"/>
+          <w:right w:type="dxa" w:w="113"/>
+        </w:tblCellMar>
+        <w:tblLook w:val="0000" w:firstRow="0" w:lastRow="0" w:firstColumn="0" w:lastColumn="0" w:noHBand="1" w:noVBand="1"/>
+      </w:tblPr>
+      <w:tblGrid>
+        <w:gridCol w:w="9637"/>
+      </w:tblGrid>
+      <w:tr>
+        <w:tc>
+          <w:tcPr>
+            <w:tcW w:type="dxa" w:w="9637"/>
+            <w:shd w:color="auto" w:fill="F4F4F4" w:val="clear"/>
+          </w:tcPr>
+          <w:p>
+            <w:pPr>
+              <w:pStyle w:val="SourceCode"/>
+              <w:spacing w:before="0" w:after="0" w:line="200" w:lineRule="auto"/>
+            </w:pPr>
+            <w:r>
+              <w:t xml:space="preserve">*.txt        усі файли з розширенням txt</w:t>
+            </w:r>
+          </w:p>
+          <w:p>
+            <w:pPr>
+              <w:pStyle w:val="SourceCode"/>
+              <w:spacing w:before="0" w:after="0" w:line="200" w:lineRule="auto"/>
+            </w:pPr>
+            <w:r>
+              <w:t xml:space="preserve">report.*     усі файли з іменем report і будь-яким розширенням</w:t>
+            </w:r>
+          </w:p>
+          <w:p>
+            <w:pPr>
+              <w:pStyle w:val="SourceCode"/>
+              <w:spacing w:before="0" w:after="0" w:line="200" w:lineRule="auto"/>
+            </w:pPr>
+            <w:r>
+              <w:t xml:space="preserve">*.*          усі файли, що мають розширення</w:t>
+            </w:r>
+          </w:p>
+          <w:p>
+            <w:pPr>
+              <w:pStyle w:val="SourceCode"/>
+              <w:spacing w:before="0" w:after="0" w:line="200" w:lineRule="auto"/>
+            </w:pPr>
+            <w:r>
+              <w:t xml:space="preserve">*            усі файли взагалі</w:t>
+            </w:r>
+          </w:p>
+          <w:p>
+            <w:pPr>
+              <w:pStyle w:val="SourceCode"/>
+              <w:spacing w:before="0" w:after="0" w:line="200" w:lineRule="auto"/>
+            </w:pPr>
+            <w:r>
+              <w:t xml:space="preserve">data?.txt    data1.txt, data2.txt, dataA.txt, але не data10.txt</w:t>
+            </w:r>
+          </w:p>
+          <w:p>
+            <w:pPr>
+              <w:pStyle w:val="SourceCode"/>
+              <w:spacing w:before="0" w:after="0" w:line="200" w:lineRule="auto"/>
+            </w:pPr>
+            <w:r>
+              <w:t xml:space="preserve">??.log       файли, ім’я яких складається рівно з двох символів</w:t>
+            </w:r>
+          </w:p>
+        </w:tc>
+      </w:tr>
+    </w:tbl>
+    <w:p>
+      <w:pPr>
+        <w:spacing w:before="0" w:after="0" w:line="120" w:lineRule="exact"/>
         <w:rPr>
-          <w:rStyle w:val="VerbatimChar"/>
+          <w:sz w:val="4"/>
+          <w:szCs w:val="4"/>
         </w:rPr>
-        <w:t xml:space="preserve">report.*     усі файли з іменем report і будь-яким розширенням</w:t>
-      </w:r>
-      <w:r>
-        <w:br/>
-      </w:r>
-      <w:r>
-        <w:rPr>
-          <w:rStyle w:val="VerbatimChar"/>
-        </w:rPr>
-        <w:t xml:space="preserve">*.*          усі файли, що мають розширення</w:t>
-      </w:r>
-      <w:r>
-        <w:br/>
-      </w:r>
-      <w:r>
-        <w:rPr>
-          <w:rStyle w:val="VerbatimChar"/>
-        </w:rPr>
-        <w:t xml:space="preserve">*            усі файли взагалі</w:t>
-      </w:r>
-      <w:r>
-        <w:br/>
-      </w:r>
-      <w:r>
-        <w:rPr>
-          <w:rStyle w:val="VerbatimChar"/>
-        </w:rPr>
-        <w:t xml:space="preserve">data?.txt    data1.txt, data2.txt, dataA.txt, але не data10.txt</w:t>
-      </w:r>
-      <w:r>
-        <w:br/>
-      </w:r>
-      <w:r>
-        <w:rPr>
-          <w:rStyle w:val="VerbatimChar"/>
-        </w:rPr>
-        <w:t xml:space="preserve">??.log       файли, ім’я яких складається рівно з двох символів</w:t>
-      </w:r>
+      </w:pPr>
     </w:p>
     <w:p>
       <w:pPr>
@@ -1007,90 +1105,237 @@
     </w:tbl>
     <w:p>
       <w:pPr>
-        <w:pStyle w:val="SourceCode"/>
-      </w:pPr>
-      <w:r>
+        <w:spacing w:before="0" w:after="0" w:line="120" w:lineRule="exact"/>
         <w:rPr>
-          <w:rStyle w:val="VerbatimChar"/>
+          <w:sz w:val="4"/>
+          <w:szCs w:val="4"/>
         </w:rPr>
-        <w:t xml:space="preserve">copy file.txt backup.txt           :: копія одного файлу</w:t>
-      </w:r>
-      <w:r>
-        <w:br/>
-      </w:r>
-      <w:r>
+      </w:pPr>
+    </w:p>
+    <w:tbl>
+      <w:tblPr>
+        <w:tblStyle w:val="SourceCodeTable"/>
+        <w:tblW w:type="dxa" w:w="9637"/>
+        <w:tblInd w:w="0" w:type="dxa"/>
+        <w:tblBorders>
+          <w:top w:color="BFBFBF" w:space="0" w:sz="4" w:val="single"/>
+          <w:left w:color="BFBFBF" w:space="0" w:sz="4" w:val="single"/>
+          <w:bottom w:color="BFBFBF" w:space="0" w:sz="4" w:val="single"/>
+          <w:right w:color="BFBFBF" w:space="0" w:sz="4" w:val="single"/>
+        </w:tblBorders>
+        <w:shd w:color="auto" w:fill="F4F4F4" w:val="clear"/>
+        <w:tblLayout w:type="fixed"/>
+        <w:tblCellMar>
+          <w:top w:type="dxa" w:w="113"/>
+          <w:left w:type="dxa" w:w="113"/>
+          <w:bottom w:type="dxa" w:w="113"/>
+          <w:right w:type="dxa" w:w="113"/>
+        </w:tblCellMar>
+        <w:tblLook w:val="0000" w:firstRow="0" w:lastRow="0" w:firstColumn="0" w:lastColumn="0" w:noHBand="1" w:noVBand="1"/>
+      </w:tblPr>
+      <w:tblGrid>
+        <w:gridCol w:w="9637"/>
+      </w:tblGrid>
+      <w:tr>
+        <w:tc>
+          <w:tcPr>
+            <w:tcW w:type="dxa" w:w="9637"/>
+            <w:shd w:color="auto" w:fill="F4F4F4" w:val="clear"/>
+          </w:tcPr>
+          <w:p>
+            <w:pPr>
+              <w:pStyle w:val="SourceCode"/>
+              <w:spacing w:before="0" w:after="0" w:line="200" w:lineRule="auto"/>
+            </w:pPr>
+            <w:r>
+              <w:t xml:space="preserve">copy file.txt backup.txt           :: копія одного файлу</w:t>
+            </w:r>
+          </w:p>
+          <w:p>
+            <w:pPr>
+              <w:pStyle w:val="SourceCode"/>
+              <w:spacing w:before="0" w:after="0" w:line="200" w:lineRule="auto"/>
+            </w:pPr>
+            <w:r>
+              <w:t xml:space="preserve">copy *.wav audio\                  :: усі wav в підкаталог audio</w:t>
+            </w:r>
+          </w:p>
+          <w:p>
+            <w:pPr>
+              <w:pStyle w:val="SourceCode"/>
+              <w:spacing w:before="0" w:after="0" w:line="200" w:lineRule="auto"/>
+            </w:pPr>
+            <w:r>
+              <w:t xml:space="preserve">copy part1.txt+part2.txt all.txt   :: об’єднання файлів</w:t>
+            </w:r>
+          </w:p>
+        </w:tc>
+      </w:tr>
+    </w:tbl>
+    <w:p>
+      <w:pPr>
+        <w:spacing w:before="0" w:after="0" w:line="120" w:lineRule="exact"/>
         <w:rPr>
-          <w:rStyle w:val="VerbatimChar"/>
+          <w:sz w:val="4"/>
+          <w:szCs w:val="4"/>
         </w:rPr>
-        <w:t xml:space="preserve">copy *.wav audio\                  :: усі wav в підкаталог audio</w:t>
-      </w:r>
-      <w:r>
-        <w:br/>
-      </w:r>
-      <w:r>
+      </w:pPr>
+    </w:p>
+    <w:p>
+      <w:pPr>
+        <w:spacing w:before="0" w:after="0" w:line="120" w:lineRule="exact"/>
         <w:rPr>
-          <w:rStyle w:val="VerbatimChar"/>
+          <w:sz w:val="4"/>
+          <w:szCs w:val="4"/>
         </w:rPr>
-        <w:t xml:space="preserve">copy part1.txt+part2.txt all.txt   :: об’єднання файлів</w:t>
-      </w:r>
-    </w:p>
-    <w:p>
-      <w:pPr>
-        <w:pStyle w:val="SourceCode"/>
-      </w:pPr>
-      <w:r>
+      </w:pPr>
+    </w:p>
+    <w:tbl>
+      <w:tblPr>
+        <w:tblStyle w:val="SourceCodeTable"/>
+        <w:tblW w:type="dxa" w:w="9637"/>
+        <w:tblInd w:w="0" w:type="dxa"/>
+        <w:tblBorders>
+          <w:top w:color="BFBFBF" w:space="0" w:sz="4" w:val="single"/>
+          <w:left w:color="BFBFBF" w:space="0" w:sz="4" w:val="single"/>
+          <w:bottom w:color="BFBFBF" w:space="0" w:sz="4" w:val="single"/>
+          <w:right w:color="BFBFBF" w:space="0" w:sz="4" w:val="single"/>
+        </w:tblBorders>
+        <w:shd w:color="auto" w:fill="F4F4F4" w:val="clear"/>
+        <w:tblLayout w:type="fixed"/>
+        <w:tblCellMar>
+          <w:top w:type="dxa" w:w="113"/>
+          <w:left w:type="dxa" w:w="113"/>
+          <w:bottom w:type="dxa" w:w="113"/>
+          <w:right w:type="dxa" w:w="113"/>
+        </w:tblCellMar>
+        <w:tblLook w:val="0000" w:firstRow="0" w:lastRow="0" w:firstColumn="0" w:lastColumn="0" w:noHBand="1" w:noVBand="1"/>
+      </w:tblPr>
+      <w:tblGrid>
+        <w:gridCol w:w="9637"/>
+      </w:tblGrid>
+      <w:tr>
+        <w:tc>
+          <w:tcPr>
+            <w:tcW w:type="dxa" w:w="9637"/>
+            <w:shd w:color="auto" w:fill="F4F4F4" w:val="clear"/>
+          </w:tcPr>
+          <w:p>
+            <w:pPr>
+              <w:pStyle w:val="SourceCode"/>
+              <w:spacing w:before="0" w:after="0" w:line="200" w:lineRule="auto"/>
+            </w:pPr>
+            <w:r>
+              <w:t xml:space="preserve">xcopy /s /i src dest               :: з підкаталогами (/i — dest це каталог)</w:t>
+            </w:r>
+          </w:p>
+          <w:p>
+            <w:pPr>
+              <w:pStyle w:val="SourceCode"/>
+              <w:spacing w:before="0" w:after="0" w:line="200" w:lineRule="auto"/>
+            </w:pPr>
+            <w:r>
+              <w:t xml:space="preserve">xcopy /s /e /h /y src dest         :: + порожні каталоги, приховані, без запитів</w:t>
+            </w:r>
+          </w:p>
+        </w:tc>
+      </w:tr>
+    </w:tbl>
+    <w:p>
+      <w:pPr>
+        <w:spacing w:before="0" w:after="0" w:line="120" w:lineRule="exact"/>
         <w:rPr>
-          <w:rStyle w:val="VerbatimChar"/>
+          <w:sz w:val="4"/>
+          <w:szCs w:val="4"/>
         </w:rPr>
-        <w:t xml:space="preserve">xcopy /s /i src dest               :: з підкаталогами (/i — dest це каталог)</w:t>
-      </w:r>
-      <w:r>
-        <w:br/>
-      </w:r>
-      <w:r>
+      </w:pPr>
+    </w:p>
+    <w:p>
+      <w:pPr>
+        <w:spacing w:before="0" w:after="0" w:line="120" w:lineRule="exact"/>
         <w:rPr>
-          <w:rStyle w:val="VerbatimChar"/>
+          <w:sz w:val="4"/>
+          <w:szCs w:val="4"/>
         </w:rPr>
-        <w:t xml:space="preserve">xcopy /s /e /h /y src dest         :: + порожні каталоги, приховані, без запитів</w:t>
-      </w:r>
-    </w:p>
-    <w:p>
-      <w:pPr>
-        <w:pStyle w:val="SourceCode"/>
-      </w:pPr>
-      <w:r>
+      </w:pPr>
+    </w:p>
+    <w:tbl>
+      <w:tblPr>
+        <w:tblStyle w:val="SourceCodeTable"/>
+        <w:tblW w:type="dxa" w:w="9637"/>
+        <w:tblInd w:w="0" w:type="dxa"/>
+        <w:tblBorders>
+          <w:top w:color="BFBFBF" w:space="0" w:sz="4" w:val="single"/>
+          <w:left w:color="BFBFBF" w:space="0" w:sz="4" w:val="single"/>
+          <w:bottom w:color="BFBFBF" w:space="0" w:sz="4" w:val="single"/>
+          <w:right w:color="BFBFBF" w:space="0" w:sz="4" w:val="single"/>
+        </w:tblBorders>
+        <w:shd w:color="auto" w:fill="F4F4F4" w:val="clear"/>
+        <w:tblLayout w:type="fixed"/>
+        <w:tblCellMar>
+          <w:top w:type="dxa" w:w="113"/>
+          <w:left w:type="dxa" w:w="113"/>
+          <w:bottom w:type="dxa" w:w="113"/>
+          <w:right w:type="dxa" w:w="113"/>
+        </w:tblCellMar>
+        <w:tblLook w:val="0000" w:firstRow="0" w:lastRow="0" w:firstColumn="0" w:lastColumn="0" w:noHBand="1" w:noVBand="1"/>
+      </w:tblPr>
+      <w:tblGrid>
+        <w:gridCol w:w="9637"/>
+      </w:tblGrid>
+      <w:tr>
+        <w:tc>
+          <w:tcPr>
+            <w:tcW w:type="dxa" w:w="9637"/>
+            <w:shd w:color="auto" w:fill="F4F4F4" w:val="clear"/>
+          </w:tcPr>
+          <w:p>
+            <w:pPr>
+              <w:pStyle w:val="SourceCode"/>
+              <w:spacing w:before="0" w:after="0" w:line="200" w:lineRule="auto"/>
+            </w:pPr>
+            <w:r>
+              <w:t xml:space="preserve">robocopy src dest /e               :: дерево разом з порожніми каталогами</w:t>
+            </w:r>
+          </w:p>
+          <w:p>
+            <w:pPr>
+              <w:pStyle w:val="SourceCode"/>
+              <w:spacing w:before="0" w:after="0" w:line="200" w:lineRule="auto"/>
+            </w:pPr>
+            <w:r>
+              <w:t xml:space="preserve">robocopy src dest /e /mt:8         :: у вісім потоків</w:t>
+            </w:r>
+          </w:p>
+          <w:p>
+            <w:pPr>
+              <w:pStyle w:val="SourceCode"/>
+              <w:spacing w:before="0" w:after="0" w:line="200" w:lineRule="auto"/>
+            </w:pPr>
+            <w:r>
+              <w:t xml:space="preserve">robocopy src dest /e /log:copy.log :: із журналом</w:t>
+            </w:r>
+          </w:p>
+          <w:p>
+            <w:pPr>
+              <w:pStyle w:val="SourceCode"/>
+              <w:spacing w:before="0" w:after="0" w:line="200" w:lineRule="auto"/>
+            </w:pPr>
+            <w:r>
+              <w:t xml:space="preserve">robocopy src dest /e /l            :: лише показати, що було б скопійовано</w:t>
+            </w:r>
+          </w:p>
+        </w:tc>
+      </w:tr>
+    </w:tbl>
+    <w:p>
+      <w:pPr>
+        <w:spacing w:before="0" w:after="0" w:line="120" w:lineRule="exact"/>
         <w:rPr>
-          <w:rStyle w:val="VerbatimChar"/>
+          <w:sz w:val="4"/>
+          <w:szCs w:val="4"/>
         </w:rPr>
-        <w:t xml:space="preserve">robocopy src dest /e               :: дерево разом з порожніми каталогами</w:t>
-      </w:r>
-      <w:r>
-        <w:br/>
-      </w:r>
-      <w:r>
-        <w:rPr>
-          <w:rStyle w:val="VerbatimChar"/>
-        </w:rPr>
-        <w:t xml:space="preserve">robocopy src dest /e /mt:8         :: у вісім потоків</w:t>
-      </w:r>
-      <w:r>
-        <w:br/>
-      </w:r>
-      <w:r>
-        <w:rPr>
-          <w:rStyle w:val="VerbatimChar"/>
-        </w:rPr>
-        <w:t xml:space="preserve">robocopy src dest /e /log:copy.log :: із журналом</w:t>
-      </w:r>
-      <w:r>
-        <w:br/>
-      </w:r>
-      <w:r>
-        <w:rPr>
-          <w:rStyle w:val="VerbatimChar"/>
-        </w:rPr>
-        <w:t xml:space="preserve">robocopy src dest /e /l            :: лише показати, що було б скопійовано</w:t>
-      </w:r>
+      </w:pPr>
     </w:p>
     <w:p>
       <w:pPr>
@@ -1122,117 +1367,264 @@
     </w:p>
     <w:p>
       <w:pPr>
-        <w:pStyle w:val="SourceCode"/>
-      </w:pPr>
-      <w:r>
+        <w:spacing w:before="0" w:after="0" w:line="120" w:lineRule="exact"/>
         <w:rPr>
-          <w:rStyle w:val="VerbatimChar"/>
+          <w:sz w:val="4"/>
+          <w:szCs w:val="4"/>
         </w:rPr>
-        <w:t xml:space="preserve">move old.txt D:\arch\              :: перемістити файл</w:t>
-      </w:r>
-      <w:r>
-        <w:br/>
-      </w:r>
-      <w:r>
+      </w:pPr>
+    </w:p>
+    <w:tbl>
+      <w:tblPr>
+        <w:tblStyle w:val="SourceCodeTable"/>
+        <w:tblW w:type="dxa" w:w="9637"/>
+        <w:tblInd w:w="0" w:type="dxa"/>
+        <w:tblBorders>
+          <w:top w:color="BFBFBF" w:space="0" w:sz="4" w:val="single"/>
+          <w:left w:color="BFBFBF" w:space="0" w:sz="4" w:val="single"/>
+          <w:bottom w:color="BFBFBF" w:space="0" w:sz="4" w:val="single"/>
+          <w:right w:color="BFBFBF" w:space="0" w:sz="4" w:val="single"/>
+        </w:tblBorders>
+        <w:shd w:color="auto" w:fill="F4F4F4" w:val="clear"/>
+        <w:tblLayout w:type="fixed"/>
+        <w:tblCellMar>
+          <w:top w:type="dxa" w:w="113"/>
+          <w:left w:type="dxa" w:w="113"/>
+          <w:bottom w:type="dxa" w:w="113"/>
+          <w:right w:type="dxa" w:w="113"/>
+        </w:tblCellMar>
+        <w:tblLook w:val="0000" w:firstRow="0" w:lastRow="0" w:firstColumn="0" w:lastColumn="0" w:noHBand="1" w:noVBand="1"/>
+      </w:tblPr>
+      <w:tblGrid>
+        <w:gridCol w:w="9637"/>
+      </w:tblGrid>
+      <w:tr>
+        <w:tc>
+          <w:tcPr>
+            <w:tcW w:type="dxa" w:w="9637"/>
+            <w:shd w:color="auto" w:fill="F4F4F4" w:val="clear"/>
+          </w:tcPr>
+          <w:p>
+            <w:pPr>
+              <w:pStyle w:val="SourceCode"/>
+              <w:spacing w:before="0" w:after="0" w:line="200" w:lineRule="auto"/>
+            </w:pPr>
+            <w:r>
+              <w:t xml:space="preserve">move old.txt D:\arch\              :: перемістити файл</w:t>
+            </w:r>
+          </w:p>
+          <w:p>
+            <w:pPr>
+              <w:pStyle w:val="SourceCode"/>
+              <w:spacing w:before="0" w:after="0" w:line="200" w:lineRule="auto"/>
+            </w:pPr>
+            <w:r>
+              <w:t xml:space="preserve">move old.txt new.txt               :: перемістити = перейменувати</w:t>
+            </w:r>
+          </w:p>
+          <w:p>
+            <w:pPr>
+              <w:pStyle w:val="SourceCode"/>
+              <w:spacing w:before="0" w:after="0" w:line="200" w:lineRule="auto"/>
+            </w:pPr>
+            <w:r>
+              <w:t xml:space="preserve">ren report.txt report_2026.txt     :: перейменувати</w:t>
+            </w:r>
+          </w:p>
+          <w:p>
+            <w:pPr>
+              <w:pStyle w:val="SourceCode"/>
+              <w:spacing w:before="0" w:after="0" w:line="200" w:lineRule="auto"/>
+            </w:pPr>
+            <w:r>
+              <w:t xml:space="preserve">ren *.txt *.bak                    :: масове перейменування за маскою</w:t>
+            </w:r>
+          </w:p>
+        </w:tc>
+      </w:tr>
+    </w:tbl>
+    <w:p>
+      <w:pPr>
+        <w:spacing w:before="0" w:after="0" w:line="120" w:lineRule="exact"/>
         <w:rPr>
-          <w:rStyle w:val="VerbatimChar"/>
+          <w:sz w:val="4"/>
+          <w:szCs w:val="4"/>
         </w:rPr>
-        <w:t xml:space="preserve">move old.txt new.txt               :: перемістити = перейменувати</w:t>
-      </w:r>
-      <w:r>
-        <w:br/>
-      </w:r>
-      <w:r>
+      </w:pPr>
+    </w:p>
+    <w:p>
+      <w:pPr>
+        <w:spacing w:before="0" w:after="0" w:line="120" w:lineRule="exact"/>
         <w:rPr>
-          <w:rStyle w:val="VerbatimChar"/>
+          <w:sz w:val="4"/>
+          <w:szCs w:val="4"/>
         </w:rPr>
-        <w:t xml:space="preserve">ren report.txt report_2026.txt     :: перейменувати</w:t>
-      </w:r>
-      <w:r>
-        <w:br/>
-      </w:r>
-      <w:r>
+      </w:pPr>
+    </w:p>
+    <w:tbl>
+      <w:tblPr>
+        <w:tblStyle w:val="SourceCodeTable"/>
+        <w:tblW w:type="dxa" w:w="9637"/>
+        <w:tblInd w:w="0" w:type="dxa"/>
+        <w:tblBorders>
+          <w:top w:color="BFBFBF" w:space="0" w:sz="4" w:val="single"/>
+          <w:left w:color="BFBFBF" w:space="0" w:sz="4" w:val="single"/>
+          <w:bottom w:color="BFBFBF" w:space="0" w:sz="4" w:val="single"/>
+          <w:right w:color="BFBFBF" w:space="0" w:sz="4" w:val="single"/>
+        </w:tblBorders>
+        <w:shd w:color="auto" w:fill="F4F4F4" w:val="clear"/>
+        <w:tblLayout w:type="fixed"/>
+        <w:tblCellMar>
+          <w:top w:type="dxa" w:w="113"/>
+          <w:left w:type="dxa" w:w="113"/>
+          <w:bottom w:type="dxa" w:w="113"/>
+          <w:right w:type="dxa" w:w="113"/>
+        </w:tblCellMar>
+        <w:tblLook w:val="0000" w:firstRow="0" w:lastRow="0" w:firstColumn="0" w:lastColumn="0" w:noHBand="1" w:noVBand="1"/>
+      </w:tblPr>
+      <w:tblGrid>
+        <w:gridCol w:w="9637"/>
+      </w:tblGrid>
+      <w:tr>
+        <w:tc>
+          <w:tcPr>
+            <w:tcW w:type="dxa" w:w="9637"/>
+            <w:shd w:color="auto" w:fill="F4F4F4" w:val="clear"/>
+          </w:tcPr>
+          <w:p>
+            <w:pPr>
+              <w:pStyle w:val="SourceCode"/>
+              <w:spacing w:before="0" w:after="0" w:line="200" w:lineRule="auto"/>
+            </w:pPr>
+            <w:r>
+              <w:t xml:space="preserve">del file.txt                       :: видалити файл</w:t>
+            </w:r>
+          </w:p>
+          <w:p>
+            <w:pPr>
+              <w:pStyle w:val="SourceCode"/>
+              <w:spacing w:before="0" w:after="0" w:line="200" w:lineRule="auto"/>
+            </w:pPr>
+            <w:r>
+              <w:t xml:space="preserve">del /q *.tmp                       :: без підтвердження</w:t>
+            </w:r>
+          </w:p>
+          <w:p>
+            <w:pPr>
+              <w:pStyle w:val="SourceCode"/>
+              <w:spacing w:before="0" w:after="0" w:line="200" w:lineRule="auto"/>
+            </w:pPr>
+            <w:r>
+              <w:t xml:space="preserve">del /s *.tmp                       :: рекурсивно в усіх підкаталогах</w:t>
+            </w:r>
+          </w:p>
+          <w:p>
+            <w:pPr>
+              <w:pStyle w:val="SourceCode"/>
+              <w:spacing w:before="0" w:after="0" w:line="200" w:lineRule="auto"/>
+            </w:pPr>
+            <w:r>
+              <w:t xml:space="preserve">del /f readonly.txt                :: примусово, попри атрибут «лише читання»</w:t>
+            </w:r>
+          </w:p>
+          <w:p>
+            <w:pPr>
+              <w:pStyle w:val="SourceCode"/>
+              <w:spacing w:before="0" w:after="0" w:line="200" w:lineRule="auto"/>
+            </w:pPr>
+            <w:r>
+              <w:t xml:space="preserve">del /a:h *.txt                     :: приховані файли</w:t>
+            </w:r>
+          </w:p>
+        </w:tc>
+      </w:tr>
+    </w:tbl>
+    <w:p>
+      <w:pPr>
+        <w:spacing w:before="0" w:after="0" w:line="120" w:lineRule="exact"/>
         <w:rPr>
-          <w:rStyle w:val="VerbatimChar"/>
+          <w:sz w:val="4"/>
+          <w:szCs w:val="4"/>
         </w:rPr>
-        <w:t xml:space="preserve">ren *.txt *.bak                    :: масове перейменування за маскою</w:t>
-      </w:r>
-    </w:p>
-    <w:p>
-      <w:pPr>
-        <w:pStyle w:val="SourceCode"/>
-      </w:pPr>
-      <w:r>
+      </w:pPr>
+    </w:p>
+    <w:p>
+      <w:pPr>
+        <w:spacing w:before="0" w:after="0" w:line="120" w:lineRule="exact"/>
         <w:rPr>
-          <w:rStyle w:val="VerbatimChar"/>
+          <w:sz w:val="4"/>
+          <w:szCs w:val="4"/>
         </w:rPr>
-        <w:t xml:space="preserve">del file.txt                       :: видалити файл</w:t>
-      </w:r>
-      <w:r>
-        <w:br/>
-      </w:r>
-      <w:r>
+      </w:pPr>
+    </w:p>
+    <w:tbl>
+      <w:tblPr>
+        <w:tblStyle w:val="SourceCodeTable"/>
+        <w:tblW w:type="dxa" w:w="9637"/>
+        <w:tblInd w:w="0" w:type="dxa"/>
+        <w:tblBorders>
+          <w:top w:color="BFBFBF" w:space="0" w:sz="4" w:val="single"/>
+          <w:left w:color="BFBFBF" w:space="0" w:sz="4" w:val="single"/>
+          <w:bottom w:color="BFBFBF" w:space="0" w:sz="4" w:val="single"/>
+          <w:right w:color="BFBFBF" w:space="0" w:sz="4" w:val="single"/>
+        </w:tblBorders>
+        <w:shd w:color="auto" w:fill="F4F4F4" w:val="clear"/>
+        <w:tblLayout w:type="fixed"/>
+        <w:tblCellMar>
+          <w:top w:type="dxa" w:w="113"/>
+          <w:left w:type="dxa" w:w="113"/>
+          <w:bottom w:type="dxa" w:w="113"/>
+          <w:right w:type="dxa" w:w="113"/>
+        </w:tblCellMar>
+        <w:tblLook w:val="0000" w:firstRow="0" w:lastRow="0" w:firstColumn="0" w:lastColumn="0" w:noHBand="1" w:noVBand="1"/>
+      </w:tblPr>
+      <w:tblGrid>
+        <w:gridCol w:w="9637"/>
+      </w:tblGrid>
+      <w:tr>
+        <w:tc>
+          <w:tcPr>
+            <w:tcW w:type="dxa" w:w="9637"/>
+            <w:shd w:color="auto" w:fill="F4F4F4" w:val="clear"/>
+          </w:tcPr>
+          <w:p>
+            <w:pPr>
+              <w:pStyle w:val="SourceCode"/>
+              <w:spacing w:before="0" w:after="0" w:line="200" w:lineRule="auto"/>
+            </w:pPr>
+            <w:r>
+              <w:t xml:space="preserve">rd empty                           :: видалити порожній каталог</w:t>
+            </w:r>
+          </w:p>
+          <w:p>
+            <w:pPr>
+              <w:pStyle w:val="SourceCode"/>
+              <w:spacing w:before="0" w:after="0" w:line="200" w:lineRule="auto"/>
+            </w:pPr>
+            <w:r>
+              <w:t xml:space="preserve">rd /s folder                       :: разом із вмістом, із підтвердженням</w:t>
+            </w:r>
+          </w:p>
+          <w:p>
+            <w:pPr>
+              <w:pStyle w:val="SourceCode"/>
+              <w:spacing w:before="0" w:after="0" w:line="200" w:lineRule="auto"/>
+            </w:pPr>
+            <w:r>
+              <w:t xml:space="preserve">rd /s /q folder                    :: разом із вмістом, без підтвердження</w:t>
+            </w:r>
+          </w:p>
+        </w:tc>
+      </w:tr>
+    </w:tbl>
+    <w:p>
+      <w:pPr>
+        <w:spacing w:before="0" w:after="0" w:line="120" w:lineRule="exact"/>
         <w:rPr>
-          <w:rStyle w:val="VerbatimChar"/>
+          <w:sz w:val="4"/>
+          <w:szCs w:val="4"/>
         </w:rPr>
-        <w:t xml:space="preserve">del /q *.tmp                       :: без підтвердження</w:t>
-      </w:r>
-      <w:r>
-        <w:br/>
-      </w:r>
-      <w:r>
-        <w:rPr>
-          <w:rStyle w:val="VerbatimChar"/>
-        </w:rPr>
-        <w:t xml:space="preserve">del /s *.tmp                       :: рекурсивно в усіх підкаталогах</w:t>
-      </w:r>
-      <w:r>
-        <w:br/>
-      </w:r>
-      <w:r>
-        <w:rPr>
-          <w:rStyle w:val="VerbatimChar"/>
-        </w:rPr>
-        <w:t xml:space="preserve">del /f readonly.txt                :: примусово, попри атрибут «лише читання»</w:t>
-      </w:r>
-      <w:r>
-        <w:br/>
-      </w:r>
-      <w:r>
-        <w:rPr>
-          <w:rStyle w:val="VerbatimChar"/>
-        </w:rPr>
-        <w:t xml:space="preserve">del /a:h *.txt                     :: приховані файли</w:t>
-      </w:r>
-    </w:p>
-    <w:p>
-      <w:pPr>
-        <w:pStyle w:val="SourceCode"/>
-      </w:pPr>
-      <w:r>
-        <w:rPr>
-          <w:rStyle w:val="VerbatimChar"/>
-        </w:rPr>
-        <w:t xml:space="preserve">rd empty                           :: видалити порожній каталог</w:t>
-      </w:r>
-      <w:r>
-        <w:br/>
-      </w:r>
-      <w:r>
-        <w:rPr>
-          <w:rStyle w:val="VerbatimChar"/>
-        </w:rPr>
-        <w:t xml:space="preserve">rd /s folder                       :: разом із вмістом, із підтвердженням</w:t>
-      </w:r>
-      <w:r>
-        <w:br/>
-      </w:r>
-      <w:r>
-        <w:rPr>
-          <w:rStyle w:val="VerbatimChar"/>
-        </w:rPr>
-        <w:t xml:space="preserve">rd /s /q folder                    :: разом із вмістом, без підтвердження</w:t>
-      </w:r>
+      </w:pPr>
     </w:p>
     <w:p>
       <w:pPr>
@@ -1282,50 +1674,99 @@
     </w:p>
     <w:p>
       <w:pPr>
-        <w:pStyle w:val="SourceCode"/>
-      </w:pPr>
-      <w:r>
+        <w:spacing w:before="0" w:after="0" w:line="120" w:lineRule="exact"/>
         <w:rPr>
-          <w:rStyle w:val="VerbatimChar"/>
+          <w:sz w:val="4"/>
+          <w:szCs w:val="4"/>
         </w:rPr>
-        <w:t xml:space="preserve">attrib file.txt          :: показати атрибути</w:t>
-      </w:r>
-      <w:r>
-        <w:br/>
-      </w:r>
-      <w:r>
+      </w:pPr>
+    </w:p>
+    <w:tbl>
+      <w:tblPr>
+        <w:tblStyle w:val="SourceCodeTable"/>
+        <w:tblW w:type="dxa" w:w="9637"/>
+        <w:tblInd w:w="0" w:type="dxa"/>
+        <w:tblBorders>
+          <w:top w:color="BFBFBF" w:space="0" w:sz="4" w:val="single"/>
+          <w:left w:color="BFBFBF" w:space="0" w:sz="4" w:val="single"/>
+          <w:bottom w:color="BFBFBF" w:space="0" w:sz="4" w:val="single"/>
+          <w:right w:color="BFBFBF" w:space="0" w:sz="4" w:val="single"/>
+        </w:tblBorders>
+        <w:shd w:color="auto" w:fill="F4F4F4" w:val="clear"/>
+        <w:tblLayout w:type="fixed"/>
+        <w:tblCellMar>
+          <w:top w:type="dxa" w:w="113"/>
+          <w:left w:type="dxa" w:w="113"/>
+          <w:bottom w:type="dxa" w:w="113"/>
+          <w:right w:type="dxa" w:w="113"/>
+        </w:tblCellMar>
+        <w:tblLook w:val="0000" w:firstRow="0" w:lastRow="0" w:firstColumn="0" w:lastColumn="0" w:noHBand="1" w:noVBand="1"/>
+      </w:tblPr>
+      <w:tblGrid>
+        <w:gridCol w:w="9637"/>
+      </w:tblGrid>
+      <w:tr>
+        <w:tc>
+          <w:tcPr>
+            <w:tcW w:type="dxa" w:w="9637"/>
+            <w:shd w:color="auto" w:fill="F4F4F4" w:val="clear"/>
+          </w:tcPr>
+          <w:p>
+            <w:pPr>
+              <w:pStyle w:val="SourceCode"/>
+              <w:spacing w:before="0" w:after="0" w:line="200" w:lineRule="auto"/>
+            </w:pPr>
+            <w:r>
+              <w:t xml:space="preserve">attrib file.txt          :: показати атрибути</w:t>
+            </w:r>
+          </w:p>
+          <w:p>
+            <w:pPr>
+              <w:pStyle w:val="SourceCode"/>
+              <w:spacing w:before="0" w:after="0" w:line="200" w:lineRule="auto"/>
+            </w:pPr>
+            <w:r>
+              <w:t xml:space="preserve">attrib +r file.txt       :: захистити від зміни й видалення</w:t>
+            </w:r>
+          </w:p>
+          <w:p>
+            <w:pPr>
+              <w:pStyle w:val="SourceCode"/>
+              <w:spacing w:before="0" w:after="0" w:line="200" w:lineRule="auto"/>
+            </w:pPr>
+            <w:r>
+              <w:t xml:space="preserve">attrib -r file.txt       :: зняти захист</w:t>
+            </w:r>
+          </w:p>
+          <w:p>
+            <w:pPr>
+              <w:pStyle w:val="SourceCode"/>
+              <w:spacing w:before="0" w:after="0" w:line="200" w:lineRule="auto"/>
+            </w:pPr>
+            <w:r>
+              <w:t xml:space="preserve">attrib +h +s file.txt    :: прихований і системний</w:t>
+            </w:r>
+          </w:p>
+          <w:p>
+            <w:pPr>
+              <w:pStyle w:val="SourceCode"/>
+              <w:spacing w:before="0" w:after="0" w:line="200" w:lineRule="auto"/>
+            </w:pPr>
+            <w:r>
+              <w:t xml:space="preserve">attrib /s /d *.txt       :: рекурсивно, включно з каталогами</w:t>
+            </w:r>
+          </w:p>
+        </w:tc>
+      </w:tr>
+    </w:tbl>
+    <w:p>
+      <w:pPr>
+        <w:spacing w:before="0" w:after="0" w:line="120" w:lineRule="exact"/>
         <w:rPr>
-          <w:rStyle w:val="VerbatimChar"/>
+          <w:sz w:val="4"/>
+          <w:szCs w:val="4"/>
         </w:rPr>
-        <w:t xml:space="preserve">attrib +r file.txt       :: захистити від зміни й видалення</w:t>
-      </w:r>
-      <w:r>
-        <w:br/>
-      </w:r>
-      <w:r>
-        <w:rPr>
-          <w:rStyle w:val="VerbatimChar"/>
-        </w:rPr>
-        <w:t xml:space="preserve">attrib -r file.txt       :: зняти захист</w:t>
-      </w:r>
-      <w:r>
-        <w:br/>
-      </w:r>
-      <w:r>
-        <w:rPr>
-          <w:rStyle w:val="VerbatimChar"/>
-        </w:rPr>
-        <w:t xml:space="preserve">attrib +h +s file.txt    :: прихований і системний</w:t>
-      </w:r>
-      <w:r>
-        <w:br/>
-      </w:r>
-      <w:r>
-        <w:rPr>
-          <w:rStyle w:val="VerbatimChar"/>
-        </w:rPr>
-        <w:t xml:space="preserve">attrib /s /d *.txt       :: рекурсивно, включно з каталогами</w:t>
-      </w:r>
+      </w:pPr>
     </w:p>
     <w:p>
       <w:pPr>
@@ -1678,79 +2119,177 @@
     </w:p>
     <w:p>
       <w:pPr>
-        <w:pStyle w:val="SourceCode"/>
-      </w:pPr>
-      <w:r>
+        <w:spacing w:before="0" w:after="0" w:line="120" w:lineRule="exact"/>
         <w:rPr>
-          <w:rStyle w:val="VerbatimChar"/>
+          <w:sz w:val="4"/>
+          <w:szCs w:val="4"/>
         </w:rPr>
-        <w:t xml:space="preserve">find "error" log.txt         :: рядки, що містять error</w:t>
-      </w:r>
-      <w:r>
-        <w:br/>
-      </w:r>
-      <w:r>
+      </w:pPr>
+    </w:p>
+    <w:tbl>
+      <w:tblPr>
+        <w:tblStyle w:val="SourceCodeTable"/>
+        <w:tblW w:type="dxa" w:w="9637"/>
+        <w:tblInd w:w="0" w:type="dxa"/>
+        <w:tblBorders>
+          <w:top w:color="BFBFBF" w:space="0" w:sz="4" w:val="single"/>
+          <w:left w:color="BFBFBF" w:space="0" w:sz="4" w:val="single"/>
+          <w:bottom w:color="BFBFBF" w:space="0" w:sz="4" w:val="single"/>
+          <w:right w:color="BFBFBF" w:space="0" w:sz="4" w:val="single"/>
+        </w:tblBorders>
+        <w:shd w:color="auto" w:fill="F4F4F4" w:val="clear"/>
+        <w:tblLayout w:type="fixed"/>
+        <w:tblCellMar>
+          <w:top w:type="dxa" w:w="113"/>
+          <w:left w:type="dxa" w:w="113"/>
+          <w:bottom w:type="dxa" w:w="113"/>
+          <w:right w:type="dxa" w:w="113"/>
+        </w:tblCellMar>
+        <w:tblLook w:val="0000" w:firstRow="0" w:lastRow="0" w:firstColumn="0" w:lastColumn="0" w:noHBand="1" w:noVBand="1"/>
+      </w:tblPr>
+      <w:tblGrid>
+        <w:gridCol w:w="9637"/>
+      </w:tblGrid>
+      <w:tr>
+        <w:tc>
+          <w:tcPr>
+            <w:tcW w:type="dxa" w:w="9637"/>
+            <w:shd w:color="auto" w:fill="F4F4F4" w:val="clear"/>
+          </w:tcPr>
+          <w:p>
+            <w:pPr>
+              <w:pStyle w:val="SourceCode"/>
+              <w:spacing w:before="0" w:after="0" w:line="200" w:lineRule="auto"/>
+            </w:pPr>
+            <w:r>
+              <w:t xml:space="preserve">find "error" log.txt         :: рядки, що містять error</w:t>
+            </w:r>
+          </w:p>
+          <w:p>
+            <w:pPr>
+              <w:pStyle w:val="SourceCode"/>
+              <w:spacing w:before="0" w:after="0" w:line="200" w:lineRule="auto"/>
+            </w:pPr>
+            <w:r>
+              <w:t xml:space="preserve">find /i "error" log.txt      :: без урахування регістру</w:t>
+            </w:r>
+          </w:p>
+          <w:p>
+            <w:pPr>
+              <w:pStyle w:val="SourceCode"/>
+              <w:spacing w:before="0" w:after="0" w:line="200" w:lineRule="auto"/>
+            </w:pPr>
+            <w:r>
+              <w:t xml:space="preserve">find /c "error" log.txt      :: тільки кількість таких рядків</w:t>
+            </w:r>
+          </w:p>
+          <w:p>
+            <w:pPr>
+              <w:pStyle w:val="SourceCode"/>
+              <w:spacing w:before="0" w:after="0" w:line="200" w:lineRule="auto"/>
+            </w:pPr>
+            <w:r>
+              <w:t xml:space="preserve">find /v "error" log.txt      :: рядки, які НЕ містять error</w:t>
+            </w:r>
+          </w:p>
+        </w:tc>
+      </w:tr>
+    </w:tbl>
+    <w:p>
+      <w:pPr>
+        <w:spacing w:before="0" w:after="0" w:line="120" w:lineRule="exact"/>
         <w:rPr>
-          <w:rStyle w:val="VerbatimChar"/>
+          <w:sz w:val="4"/>
+          <w:szCs w:val="4"/>
         </w:rPr>
-        <w:t xml:space="preserve">find /i "error" log.txt      :: без урахування регістру</w:t>
-      </w:r>
-      <w:r>
-        <w:br/>
-      </w:r>
-      <w:r>
+      </w:pPr>
+    </w:p>
+    <w:p>
+      <w:pPr>
+        <w:spacing w:before="0" w:after="0" w:line="120" w:lineRule="exact"/>
         <w:rPr>
-          <w:rStyle w:val="VerbatimChar"/>
+          <w:sz w:val="4"/>
+          <w:szCs w:val="4"/>
         </w:rPr>
-        <w:t xml:space="preserve">find /c "error" log.txt      :: тільки кількість таких рядків</w:t>
-      </w:r>
-      <w:r>
-        <w:br/>
-      </w:r>
-      <w:r>
+      </w:pPr>
+    </w:p>
+    <w:tbl>
+      <w:tblPr>
+        <w:tblStyle w:val="SourceCodeTable"/>
+        <w:tblW w:type="dxa" w:w="9637"/>
+        <w:tblInd w:w="0" w:type="dxa"/>
+        <w:tblBorders>
+          <w:top w:color="BFBFBF" w:space="0" w:sz="4" w:val="single"/>
+          <w:left w:color="BFBFBF" w:space="0" w:sz="4" w:val="single"/>
+          <w:bottom w:color="BFBFBF" w:space="0" w:sz="4" w:val="single"/>
+          <w:right w:color="BFBFBF" w:space="0" w:sz="4" w:val="single"/>
+        </w:tblBorders>
+        <w:shd w:color="auto" w:fill="F4F4F4" w:val="clear"/>
+        <w:tblLayout w:type="fixed"/>
+        <w:tblCellMar>
+          <w:top w:type="dxa" w:w="113"/>
+          <w:left w:type="dxa" w:w="113"/>
+          <w:bottom w:type="dxa" w:w="113"/>
+          <w:right w:type="dxa" w:w="113"/>
+        </w:tblCellMar>
+        <w:tblLook w:val="0000" w:firstRow="0" w:lastRow="0" w:firstColumn="0" w:lastColumn="0" w:noHBand="1" w:noVBand="1"/>
+      </w:tblPr>
+      <w:tblGrid>
+        <w:gridCol w:w="9637"/>
+      </w:tblGrid>
+      <w:tr>
+        <w:tc>
+          <w:tcPr>
+            <w:tcW w:type="dxa" w:w="9637"/>
+            <w:shd w:color="auto" w:fill="F4F4F4" w:val="clear"/>
+          </w:tcPr>
+          <w:p>
+            <w:pPr>
+              <w:pStyle w:val="SourceCode"/>
+              <w:spacing w:before="0" w:after="0" w:line="200" w:lineRule="auto"/>
+            </w:pPr>
+            <w:r>
+              <w:t xml:space="preserve">findstr /i "error" *.log     :: у всіх файлах поточного каталогу</w:t>
+            </w:r>
+          </w:p>
+          <w:p>
+            <w:pPr>
+              <w:pStyle w:val="SourceCode"/>
+              <w:spacing w:before="0" w:after="0" w:line="200" w:lineRule="auto"/>
+            </w:pPr>
+            <w:r>
+              <w:t xml:space="preserve">findstr /s /i "error" *.log  :: рекурсивно по дереву</w:t>
+            </w:r>
+          </w:p>
+          <w:p>
+            <w:pPr>
+              <w:pStyle w:val="SourceCode"/>
+              <w:spacing w:before="0" w:after="0" w:line="200" w:lineRule="auto"/>
+            </w:pPr>
+            <w:r>
+              <w:t xml:space="preserve">findstr /n "error" log.txt   :: з номерами рядків</w:t>
+            </w:r>
+          </w:p>
+          <w:p>
+            <w:pPr>
+              <w:pStyle w:val="SourceCode"/>
+              <w:spacing w:before="0" w:after="0" w:line="200" w:lineRule="auto"/>
+            </w:pPr>
+            <w:r>
+              <w:t xml:space="preserve">findstr /r "^[0-9]" log.txt  :: регулярний вираз: рядки, що починаються з цифри</w:t>
+            </w:r>
+          </w:p>
+        </w:tc>
+      </w:tr>
+    </w:tbl>
+    <w:p>
+      <w:pPr>
+        <w:spacing w:before="0" w:after="0" w:line="120" w:lineRule="exact"/>
         <w:rPr>
-          <w:rStyle w:val="VerbatimChar"/>
+          <w:sz w:val="4"/>
+          <w:szCs w:val="4"/>
         </w:rPr>
-        <w:t xml:space="preserve">find /v "error" log.txt      :: рядки, які НЕ містять error</w:t>
-      </w:r>
-    </w:p>
-    <w:p>
-      <w:pPr>
-        <w:pStyle w:val="SourceCode"/>
-      </w:pPr>
-      <w:r>
-        <w:rPr>
-          <w:rStyle w:val="VerbatimChar"/>
-        </w:rPr>
-        <w:t xml:space="preserve">findstr /i "error" *.log     :: у всіх файлах поточного каталогу</w:t>
-      </w:r>
-      <w:r>
-        <w:br/>
-      </w:r>
-      <w:r>
-        <w:rPr>
-          <w:rStyle w:val="VerbatimChar"/>
-        </w:rPr>
-        <w:t xml:space="preserve">findstr /s /i "error" *.log  :: рекурсивно по дереву</w:t>
-      </w:r>
-      <w:r>
-        <w:br/>
-      </w:r>
-      <w:r>
-        <w:rPr>
-          <w:rStyle w:val="VerbatimChar"/>
-        </w:rPr>
-        <w:t xml:space="preserve">findstr /n "error" log.txt   :: з номерами рядків</w:t>
-      </w:r>
-      <w:r>
-        <w:br/>
-      </w:r>
-      <w:r>
-        <w:rPr>
-          <w:rStyle w:val="VerbatimChar"/>
-        </w:rPr>
-        <w:t xml:space="preserve">findstr /r "^[0-9]" log.txt  :: регулярний вираз: рядки, що починаються з цифри</w:t>
-      </w:r>
+      </w:pPr>
     </w:p>
     <w:bookmarkEnd w:id="17"/>
     <w:bookmarkStart w:id="18" w:name="ті-самі-задачі-мовою-powershell"/>
@@ -2057,178 +2596,331 @@
     </w:p>
     <w:p>
       <w:pPr>
-        <w:pStyle w:val="SourceCode"/>
-      </w:pPr>
-      <w:r>
+        <w:spacing w:before="0" w:after="0" w:line="120" w:lineRule="exact"/>
         <w:rPr>
-          <w:rStyle w:val="VerbatimChar"/>
+          <w:sz w:val="4"/>
+          <w:szCs w:val="4"/>
         </w:rPr>
-        <w:t xml:space="preserve">C:\Users\Student&gt; cd %USERPROFILE%\Desktop</w:t>
-      </w:r>
-      <w:r>
-        <w:br/>
-      </w:r>
-      <w:r>
+      </w:pPr>
+    </w:p>
+    <w:tbl>
+      <w:tblPr>
+        <w:tblStyle w:val="SourceCodeTable"/>
+        <w:tblW w:type="dxa" w:w="9637"/>
+        <w:tblInd w:w="0" w:type="dxa"/>
+        <w:tblBorders>
+          <w:top w:color="BFBFBF" w:space="0" w:sz="4" w:val="single"/>
+          <w:left w:color="BFBFBF" w:space="0" w:sz="4" w:val="single"/>
+          <w:bottom w:color="BFBFBF" w:space="0" w:sz="4" w:val="single"/>
+          <w:right w:color="BFBFBF" w:space="0" w:sz="4" w:val="single"/>
+        </w:tblBorders>
+        <w:shd w:color="auto" w:fill="F4F4F4" w:val="clear"/>
+        <w:tblLayout w:type="fixed"/>
+        <w:tblCellMar>
+          <w:top w:type="dxa" w:w="113"/>
+          <w:left w:type="dxa" w:w="113"/>
+          <w:bottom w:type="dxa" w:w="113"/>
+          <w:right w:type="dxa" w:w="113"/>
+        </w:tblCellMar>
+        <w:tblLook w:val="0000" w:firstRow="0" w:lastRow="0" w:firstColumn="0" w:lastColumn="0" w:noHBand="1" w:noVBand="1"/>
+      </w:tblPr>
+      <w:tblGrid>
+        <w:gridCol w:w="9637"/>
+      </w:tblGrid>
+      <w:tr>
+        <w:tc>
+          <w:tcPr>
+            <w:tcW w:type="dxa" w:w="9637"/>
+            <w:shd w:color="auto" w:fill="F4F4F4" w:val="clear"/>
+          </w:tcPr>
+          <w:p>
+            <w:pPr>
+              <w:pStyle w:val="SourceCode"/>
+              <w:spacing w:before="0" w:after="0" w:line="200" w:lineRule="auto"/>
+            </w:pPr>
+            <w:r>
+              <w:t xml:space="preserve">C:\Users\Student&gt; cd %USERPROFILE%\Desktop</w:t>
+            </w:r>
+          </w:p>
+          <w:p>
+            <w:pPr>
+              <w:pStyle w:val="SourceCode"/>
+              <w:spacing w:before="0" w:after="0" w:line="200" w:lineRule="auto"/>
+            </w:pPr>
+            <w:r>
+              <w:t xml:space="preserve">C:\Users\Student\Desktop&gt; md LAB2</w:t>
+            </w:r>
+          </w:p>
+          <w:p>
+            <w:pPr>
+              <w:pStyle w:val="SourceCode"/>
+              <w:spacing w:before="0" w:after="0" w:line="200" w:lineRule="auto"/>
+            </w:pPr>
+            <w:r>
+              <w:t xml:space="preserve">C:\Users\Student\Desktop&gt; cd LAB2</w:t>
+            </w:r>
+          </w:p>
+          <w:p>
+            <w:pPr>
+              <w:pStyle w:val="SourceCode"/>
+              <w:spacing w:before="0" w:after="0" w:line="200" w:lineRule="auto"/>
+            </w:pPr>
+            <w:r>
+              <w:t xml:space="preserve">C:\...\LAB2&gt; md src docs bak "test folder"</w:t>
+            </w:r>
+          </w:p>
+          <w:p>
+            <w:pPr>
+              <w:pStyle w:val="SourceCode"/>
+              <w:spacing w:before="0" w:after="0" w:line="200" w:lineRule="auto"/>
+            </w:pPr>
+            <w:r>
+              <w:t xml:space="preserve">C:\...\LAB2&gt; dir /a:d /b</w:t>
+            </w:r>
+          </w:p>
+          <w:p>
+            <w:pPr>
+              <w:pStyle w:val="SourceCode"/>
+              <w:spacing w:before="0" w:after="0" w:line="200" w:lineRule="auto"/>
+            </w:pPr>
+            <w:r>
+              <w:t xml:space="preserve">bak</w:t>
+            </w:r>
+          </w:p>
+          <w:p>
+            <w:pPr>
+              <w:pStyle w:val="SourceCode"/>
+              <w:spacing w:before="0" w:after="0" w:line="200" w:lineRule="auto"/>
+            </w:pPr>
+            <w:r>
+              <w:t xml:space="preserve">docs</w:t>
+            </w:r>
+          </w:p>
+          <w:p>
+            <w:pPr>
+              <w:pStyle w:val="SourceCode"/>
+              <w:spacing w:before="0" w:after="0" w:line="200" w:lineRule="auto"/>
+            </w:pPr>
+            <w:r>
+              <w:t xml:space="preserve">src</w:t>
+            </w:r>
+          </w:p>
+          <w:p>
+            <w:pPr>
+              <w:pStyle w:val="SourceCode"/>
+              <w:spacing w:before="0" w:after="0" w:line="200" w:lineRule="auto"/>
+            </w:pPr>
+            <w:r>
+              <w:t xml:space="preserve">test folder</w:t>
+            </w:r>
+          </w:p>
+        </w:tc>
+      </w:tr>
+    </w:tbl>
+    <w:p>
+      <w:pPr>
+        <w:spacing w:before="0" w:after="0" w:line="120" w:lineRule="exact"/>
         <w:rPr>
-          <w:rStyle w:val="VerbatimChar"/>
+          <w:sz w:val="4"/>
+          <w:szCs w:val="4"/>
         </w:rPr>
-        <w:t xml:space="preserve">C:\Users\Student\Desktop&gt; md LAB2</w:t>
-      </w:r>
-      <w:r>
-        <w:br/>
-      </w:r>
-      <w:r>
+      </w:pPr>
+    </w:p>
+    <w:p>
+      <w:pPr>
+        <w:spacing w:before="0" w:after="0" w:line="120" w:lineRule="exact"/>
         <w:rPr>
-          <w:rStyle w:val="VerbatimChar"/>
+          <w:sz w:val="4"/>
+          <w:szCs w:val="4"/>
         </w:rPr>
-        <w:t xml:space="preserve">C:\Users\Student\Desktop&gt; cd LAB2</w:t>
-      </w:r>
-      <w:r>
-        <w:br/>
-      </w:r>
-      <w:r>
+      </w:pPr>
+    </w:p>
+    <w:tbl>
+      <w:tblPr>
+        <w:tblStyle w:val="SourceCodeTable"/>
+        <w:tblW w:type="dxa" w:w="9637"/>
+        <w:tblInd w:w="0" w:type="dxa"/>
+        <w:tblBorders>
+          <w:top w:color="BFBFBF" w:space="0" w:sz="4" w:val="single"/>
+          <w:left w:color="BFBFBF" w:space="0" w:sz="4" w:val="single"/>
+          <w:bottom w:color="BFBFBF" w:space="0" w:sz="4" w:val="single"/>
+          <w:right w:color="BFBFBF" w:space="0" w:sz="4" w:val="single"/>
+        </w:tblBorders>
+        <w:shd w:color="auto" w:fill="F4F4F4" w:val="clear"/>
+        <w:tblLayout w:type="fixed"/>
+        <w:tblCellMar>
+          <w:top w:type="dxa" w:w="113"/>
+          <w:left w:type="dxa" w:w="113"/>
+          <w:bottom w:type="dxa" w:w="113"/>
+          <w:right w:type="dxa" w:w="113"/>
+        </w:tblCellMar>
+        <w:tblLook w:val="0000" w:firstRow="0" w:lastRow="0" w:firstColumn="0" w:lastColumn="0" w:noHBand="1" w:noVBand="1"/>
+      </w:tblPr>
+      <w:tblGrid>
+        <w:gridCol w:w="9637"/>
+      </w:tblGrid>
+      <w:tr>
+        <w:tc>
+          <w:tcPr>
+            <w:tcW w:type="dxa" w:w="9637"/>
+            <w:shd w:color="auto" w:fill="F4F4F4" w:val="clear"/>
+          </w:tcPr>
+          <w:p>
+            <w:pPr>
+              <w:pStyle w:val="SourceCode"/>
+              <w:spacing w:before="0" w:after="0" w:line="200" w:lineRule="auto"/>
+            </w:pPr>
+            <w:r>
+              <w:t xml:space="preserve">C:\...\LAB2&gt; cd test folder</w:t>
+            </w:r>
+          </w:p>
+          <w:p>
+            <w:pPr>
+              <w:pStyle w:val="SourceCode"/>
+              <w:spacing w:before="0" w:after="0" w:line="200" w:lineRule="auto"/>
+            </w:pPr>
+            <w:r>
+              <w:t xml:space="preserve">C:\...\LAB2\test folder&gt; cd ..</w:t>
+            </w:r>
+          </w:p>
+        </w:tc>
+      </w:tr>
+    </w:tbl>
+    <w:p>
+      <w:pPr>
+        <w:spacing w:before="0" w:after="0" w:line="120" w:lineRule="exact"/>
         <w:rPr>
-          <w:rStyle w:val="VerbatimChar"/>
+          <w:sz w:val="4"/>
+          <w:szCs w:val="4"/>
         </w:rPr>
-        <w:t xml:space="preserve">C:\...\LAB2&gt; md src docs bak "test folder"</w:t>
-      </w:r>
-      <w:r>
-        <w:br/>
-      </w:r>
-      <w:r>
+      </w:pPr>
+    </w:p>
+    <w:p>
+      <w:pPr>
+        <w:spacing w:before="0" w:after="0" w:line="120" w:lineRule="exact"/>
         <w:rPr>
-          <w:rStyle w:val="VerbatimChar"/>
+          <w:sz w:val="4"/>
+          <w:szCs w:val="4"/>
         </w:rPr>
-        <w:t xml:space="preserve">C:\...\LAB2&gt; dir /a:d /b</w:t>
-      </w:r>
-      <w:r>
-        <w:br/>
-      </w:r>
-      <w:r>
+      </w:pPr>
+    </w:p>
+    <w:tbl>
+      <w:tblPr>
+        <w:tblStyle w:val="SourceCodeTable"/>
+        <w:tblW w:type="dxa" w:w="9637"/>
+        <w:tblInd w:w="0" w:type="dxa"/>
+        <w:tblBorders>
+          <w:top w:color="BFBFBF" w:space="0" w:sz="4" w:val="single"/>
+          <w:left w:color="BFBFBF" w:space="0" w:sz="4" w:val="single"/>
+          <w:bottom w:color="BFBFBF" w:space="0" w:sz="4" w:val="single"/>
+          <w:right w:color="BFBFBF" w:space="0" w:sz="4" w:val="single"/>
+        </w:tblBorders>
+        <w:shd w:color="auto" w:fill="F4F4F4" w:val="clear"/>
+        <w:tblLayout w:type="fixed"/>
+        <w:tblCellMar>
+          <w:top w:type="dxa" w:w="113"/>
+          <w:left w:type="dxa" w:w="113"/>
+          <w:bottom w:type="dxa" w:w="113"/>
+          <w:right w:type="dxa" w:w="113"/>
+        </w:tblCellMar>
+        <w:tblLook w:val="0000" w:firstRow="0" w:lastRow="0" w:firstColumn="0" w:lastColumn="0" w:noHBand="1" w:noVBand="1"/>
+      </w:tblPr>
+      <w:tblGrid>
+        <w:gridCol w:w="9637"/>
+      </w:tblGrid>
+      <w:tr>
+        <w:tc>
+          <w:tcPr>
+            <w:tcW w:type="dxa" w:w="9637"/>
+            <w:shd w:color="auto" w:fill="F4F4F4" w:val="clear"/>
+          </w:tcPr>
+          <w:p>
+            <w:pPr>
+              <w:pStyle w:val="SourceCode"/>
+              <w:spacing w:before="0" w:after="0" w:line="200" w:lineRule="auto"/>
+            </w:pPr>
+            <w:r>
+              <w:t xml:space="preserve">C:\...\LAB2&gt; cd "test folder"</w:t>
+            </w:r>
+          </w:p>
+          <w:p>
+            <w:pPr>
+              <w:pStyle w:val="SourceCode"/>
+              <w:spacing w:before="0" w:after="0" w:line="200" w:lineRule="auto"/>
+            </w:pPr>
+            <w:r>
+              <w:t xml:space="preserve">C:\...\LAB2\test folder&gt; cd ..</w:t>
+            </w:r>
+          </w:p>
+          <w:p>
+            <w:pPr>
+              <w:pStyle w:val="SourceCode"/>
+              <w:spacing w:before="0" w:after="0" w:line="200" w:lineRule="auto"/>
+            </w:pPr>
+            <w:r>
+              <w:t xml:space="preserve">C:\...\LAB2&gt; pushd %SystemRoot%\Media</w:t>
+            </w:r>
+          </w:p>
+          <w:p>
+            <w:pPr>
+              <w:pStyle w:val="SourceCode"/>
+              <w:spacing w:before="0" w:after="0" w:line="200" w:lineRule="auto"/>
+            </w:pPr>
+            <w:r>
+              <w:t xml:space="preserve">C:\Windows\Media&gt; dir /b *.wav | find /c ".wav"</w:t>
+            </w:r>
+          </w:p>
+          <w:p>
+            <w:pPr>
+              <w:pStyle w:val="SourceCode"/>
+              <w:spacing w:before="0" w:after="0" w:line="200" w:lineRule="auto"/>
+            </w:pPr>
+            <w:r>
+              <w:t xml:space="preserve">70</w:t>
+            </w:r>
+          </w:p>
+          <w:p>
+            <w:pPr>
+              <w:pStyle w:val="SourceCode"/>
+              <w:spacing w:before="0" w:after="0" w:line="200" w:lineRule="auto"/>
+            </w:pPr>
+            <w:r>
+              <w:t xml:space="preserve">C:\Windows\Media&gt; popd</w:t>
+            </w:r>
+          </w:p>
+          <w:p>
+            <w:pPr>
+              <w:pStyle w:val="SourceCode"/>
+              <w:spacing w:before="0" w:after="0" w:line="200" w:lineRule="auto"/>
+            </w:pPr>
+            <w:r>
+              <w:t xml:space="preserve">C:\...\LAB2&gt;</w:t>
+            </w:r>
+          </w:p>
+        </w:tc>
+      </w:tr>
+    </w:tbl>
+    <w:p>
+      <w:pPr>
+        <w:spacing w:before="0" w:after="0" w:line="120" w:lineRule="exact"/>
         <w:rPr>
-          <w:rStyle w:val="VerbatimChar"/>
+          <w:sz w:val="4"/>
+          <w:szCs w:val="4"/>
         </w:rPr>
-        <w:t xml:space="preserve">bak</w:t>
-      </w:r>
-      <w:r>
-        <w:br/>
-      </w:r>
-      <w:r>
-        <w:rPr>
-          <w:rStyle w:val="VerbatimChar"/>
-        </w:rPr>
-        <w:t xml:space="preserve">docs</w:t>
-      </w:r>
-      <w:r>
-        <w:br/>
-      </w:r>
-      <w:r>
-        <w:rPr>
-          <w:rStyle w:val="VerbatimChar"/>
-        </w:rPr>
-        <w:t xml:space="preserve">src</w:t>
-      </w:r>
-      <w:r>
-        <w:br/>
-      </w:r>
-      <w:r>
-        <w:rPr>
-          <w:rStyle w:val="VerbatimChar"/>
-        </w:rPr>
-        <w:t xml:space="preserve">test folder</w:t>
-      </w:r>
-    </w:p>
-    <w:p>
-      <w:pPr>
-        <w:pStyle w:val="SourceCode"/>
-      </w:pPr>
-      <w:r>
-        <w:rPr>
-          <w:rStyle w:val="VerbatimChar"/>
-        </w:rPr>
-        <w:t xml:space="preserve">C:\...\LAB2&gt; cd test folder</w:t>
-      </w:r>
-      <w:r>
-        <w:br/>
-      </w:r>
-      <w:r>
-        <w:rPr>
-          <w:rStyle w:val="VerbatimChar"/>
-        </w:rPr>
-        <w:t xml:space="preserve">The system cannot find the path specified.</w:t>
-      </w:r>
-    </w:p>
-    <w:p>
-      <w:pPr>
-        <w:pStyle w:val="SourceCode"/>
-      </w:pPr>
-      <w:r>
-        <w:rPr>
-          <w:rStyle w:val="VerbatimChar"/>
-        </w:rPr>
-        <w:t xml:space="preserve">C:\...\LAB2&gt; cd "test folder"</w:t>
-      </w:r>
-      <w:r>
-        <w:br/>
-      </w:r>
-      <w:r>
-        <w:rPr>
-          <w:rStyle w:val="VerbatimChar"/>
-        </w:rPr>
-        <w:t xml:space="preserve">C:\...\LAB2\test folder&gt; cd ..</w:t>
-      </w:r>
-      <w:r>
-        <w:br/>
-      </w:r>
-      <w:r>
-        <w:rPr>
-          <w:rStyle w:val="VerbatimChar"/>
-        </w:rPr>
-        <w:t xml:space="preserve">C:\...\LAB2&gt; pushd %SystemRoot%\Media</w:t>
-      </w:r>
-      <w:r>
-        <w:br/>
-      </w:r>
-      <w:r>
-        <w:rPr>
-          <w:rStyle w:val="VerbatimChar"/>
-        </w:rPr>
-        <w:t xml:space="preserve">C:\Windows\Media&gt; dir /b *.wav | find /c ".wav"</w:t>
-      </w:r>
-      <w:r>
-        <w:br/>
-      </w:r>
-      <w:r>
-        <w:rPr>
-          <w:rStyle w:val="VerbatimChar"/>
-        </w:rPr>
-        <w:t xml:space="preserve">70</w:t>
-      </w:r>
-      <w:r>
-        <w:br/>
-      </w:r>
-      <w:r>
-        <w:rPr>
-          <w:rStyle w:val="VerbatimChar"/>
-        </w:rPr>
-        <w:t xml:space="preserve">C:\Windows\Media&gt; popd</w:t>
-      </w:r>
-      <w:r>
-        <w:br/>
-      </w:r>
-      <w:r>
-        <w:rPr>
-          <w:rStyle w:val="VerbatimChar"/>
-        </w:rPr>
-        <w:t xml:space="preserve">C:\...\LAB2&gt;</w:t>
-      </w:r>
+      </w:pPr>
     </w:p>
     <w:p>
       <w:pPr>
         <w:pStyle w:val="FirstParagraph"/>
       </w:pPr>
       <w:r>
-        <w:t xml:space="preserve">Перша спроба перейти в каталог «test folder» провалилася: без лапок cd отримав два аргументи замість одного.</w:t>
+        <w:t xml:space="preserve">Windows CMD дозволяє використовувати пробіли в якості значення аргументу, який приймає cd «test folder» і «</w:t>
+      </w:r>
+      <w:r>
+        <w:t xml:space="preserve">“test folder”</w:t>
+      </w:r>
+      <w:r>
+        <w:t xml:space="preserve">» працюють однаково.</w:t>
       </w:r>
     </w:p>
     <w:bookmarkEnd w:id="20"/>
@@ -2243,106 +2935,204 @@
     </w:p>
     <w:p>
       <w:pPr>
-        <w:pStyle w:val="SourceCode"/>
-      </w:pPr>
-      <w:r>
+        <w:spacing w:before="0" w:after="0" w:line="120" w:lineRule="exact"/>
         <w:rPr>
-          <w:rStyle w:val="VerbatimChar"/>
+          <w:sz w:val="4"/>
+          <w:szCs w:val="4"/>
         </w:rPr>
-        <w:t xml:space="preserve">C:\...\LAB2&gt; xcopy /s /i %SystemRoot%\Media src</w:t>
-      </w:r>
-      <w:r>
-        <w:br/>
-      </w:r>
-      <w:r>
+      </w:pPr>
+    </w:p>
+    <w:tbl>
+      <w:tblPr>
+        <w:tblStyle w:val="SourceCodeTable"/>
+        <w:tblW w:type="dxa" w:w="9637"/>
+        <w:tblInd w:w="0" w:type="dxa"/>
+        <w:tblBorders>
+          <w:top w:color="BFBFBF" w:space="0" w:sz="4" w:val="single"/>
+          <w:left w:color="BFBFBF" w:space="0" w:sz="4" w:val="single"/>
+          <w:bottom w:color="BFBFBF" w:space="0" w:sz="4" w:val="single"/>
+          <w:right w:color="BFBFBF" w:space="0" w:sz="4" w:val="single"/>
+        </w:tblBorders>
+        <w:shd w:color="auto" w:fill="F4F4F4" w:val="clear"/>
+        <w:tblLayout w:type="fixed"/>
+        <w:tblCellMar>
+          <w:top w:type="dxa" w:w="113"/>
+          <w:left w:type="dxa" w:w="113"/>
+          <w:bottom w:type="dxa" w:w="113"/>
+          <w:right w:type="dxa" w:w="113"/>
+        </w:tblCellMar>
+        <w:tblLook w:val="0000" w:firstRow="0" w:lastRow="0" w:firstColumn="0" w:lastColumn="0" w:noHBand="1" w:noVBand="1"/>
+      </w:tblPr>
+      <w:tblGrid>
+        <w:gridCol w:w="9637"/>
+      </w:tblGrid>
+      <w:tr>
+        <w:tc>
+          <w:tcPr>
+            <w:tcW w:type="dxa" w:w="9637"/>
+            <w:shd w:color="auto" w:fill="F4F4F4" w:val="clear"/>
+          </w:tcPr>
+          <w:p>
+            <w:pPr>
+              <w:pStyle w:val="SourceCode"/>
+              <w:spacing w:before="0" w:after="0" w:line="200" w:lineRule="auto"/>
+            </w:pPr>
+            <w:r>
+              <w:t xml:space="preserve">C:\...\LAB2&gt; xcopy /s /i %SystemRoot%\Media src</w:t>
+            </w:r>
+          </w:p>
+          <w:p>
+            <w:pPr>
+              <w:pStyle w:val="SourceCode"/>
+              <w:spacing w:before="0" w:after="0" w:line="200" w:lineRule="auto"/>
+            </w:pPr>
+            <w:r>
+              <w:t xml:space="preserve">...</w:t>
+            </w:r>
+          </w:p>
+          <w:p>
+            <w:pPr>
+              <w:pStyle w:val="SourceCode"/>
+              <w:spacing w:before="0" w:after="0" w:line="200" w:lineRule="auto"/>
+            </w:pPr>
+            <w:r>
+              <w:t xml:space="preserve">70 File(s) copied</w:t>
+            </w:r>
+          </w:p>
+        </w:tc>
+      </w:tr>
+    </w:tbl>
+    <w:p>
+      <w:pPr>
+        <w:spacing w:before="0" w:after="0" w:line="120" w:lineRule="exact"/>
         <w:rPr>
-          <w:rStyle w:val="VerbatimChar"/>
+          <w:sz w:val="4"/>
+          <w:szCs w:val="4"/>
         </w:rPr>
-        <w:t xml:space="preserve">...</w:t>
-      </w:r>
-      <w:r>
-        <w:br/>
-      </w:r>
-      <w:r>
+      </w:pPr>
+    </w:p>
+    <w:p>
+      <w:pPr>
+        <w:spacing w:before="0" w:after="0" w:line="120" w:lineRule="exact"/>
         <w:rPr>
-          <w:rStyle w:val="VerbatimChar"/>
+          <w:sz w:val="4"/>
+          <w:szCs w:val="4"/>
         </w:rPr>
-        <w:t xml:space="preserve">70 File(s) copied</w:t>
-      </w:r>
-    </w:p>
-    <w:p>
-      <w:pPr>
-        <w:pStyle w:val="SourceCode"/>
-      </w:pPr>
-      <w:r>
+      </w:pPr>
+    </w:p>
+    <w:tbl>
+      <w:tblPr>
+        <w:tblStyle w:val="SourceCodeTable"/>
+        <w:tblW w:type="dxa" w:w="9637"/>
+        <w:tblInd w:w="0" w:type="dxa"/>
+        <w:tblBorders>
+          <w:top w:color="BFBFBF" w:space="0" w:sz="4" w:val="single"/>
+          <w:left w:color="BFBFBF" w:space="0" w:sz="4" w:val="single"/>
+          <w:bottom w:color="BFBFBF" w:space="0" w:sz="4" w:val="single"/>
+          <w:right w:color="BFBFBF" w:space="0" w:sz="4" w:val="single"/>
+        </w:tblBorders>
+        <w:shd w:color="auto" w:fill="F4F4F4" w:val="clear"/>
+        <w:tblLayout w:type="fixed"/>
+        <w:tblCellMar>
+          <w:top w:type="dxa" w:w="113"/>
+          <w:left w:type="dxa" w:w="113"/>
+          <w:bottom w:type="dxa" w:w="113"/>
+          <w:right w:type="dxa" w:w="113"/>
+        </w:tblCellMar>
+        <w:tblLook w:val="0000" w:firstRow="0" w:lastRow="0" w:firstColumn="0" w:lastColumn="0" w:noHBand="1" w:noVBand="1"/>
+      </w:tblPr>
+      <w:tblGrid>
+        <w:gridCol w:w="9637"/>
+      </w:tblGrid>
+      <w:tr>
+        <w:tc>
+          <w:tcPr>
+            <w:tcW w:type="dxa" w:w="9637"/>
+            <w:shd w:color="auto" w:fill="F4F4F4" w:val="clear"/>
+          </w:tcPr>
+          <w:p>
+            <w:pPr>
+              <w:pStyle w:val="SourceCode"/>
+              <w:spacing w:before="0" w:after="0" w:line="200" w:lineRule="auto"/>
+            </w:pPr>
+            <w:r>
+              <w:t xml:space="preserve">C:\...\LAB2&gt; dir src /s /b | find /c ":"</w:t>
+            </w:r>
+          </w:p>
+          <w:p>
+            <w:pPr>
+              <w:pStyle w:val="SourceCode"/>
+              <w:spacing w:before="0" w:after="0" w:line="200" w:lineRule="auto"/>
+            </w:pPr>
+            <w:r>
+              <w:t xml:space="preserve">78</w:t>
+            </w:r>
+          </w:p>
+          <w:p>
+            <w:pPr>
+              <w:pStyle w:val="SourceCode"/>
+              <w:spacing w:before="0" w:after="0" w:line="200" w:lineRule="auto"/>
+            </w:pPr>
+            <w:r>
+              <w:t xml:space="preserve">C:\...\LAB2&gt; dir src\*.wav /o:-s /b</w:t>
+            </w:r>
+          </w:p>
+          <w:p>
+            <w:pPr>
+              <w:pStyle w:val="SourceCode"/>
+              <w:spacing w:before="0" w:after="0" w:line="200" w:lineRule="auto"/>
+            </w:pPr>
+            <w:r>
+              <w:t xml:space="preserve">Windows Ringin.wav</w:t>
+            </w:r>
+          </w:p>
+          <w:p>
+            <w:pPr>
+              <w:pStyle w:val="SourceCode"/>
+              <w:spacing w:before="0" w:after="0" w:line="200" w:lineRule="auto"/>
+            </w:pPr>
+            <w:r>
+              <w:t xml:space="preserve">Windows Notify Calendar.wav</w:t>
+            </w:r>
+          </w:p>
+          <w:p>
+            <w:pPr>
+              <w:pStyle w:val="SourceCode"/>
+              <w:spacing w:before="0" w:after="0" w:line="200" w:lineRule="auto"/>
+            </w:pPr>
+            <w:r>
+              <w:t xml:space="preserve">...</w:t>
+            </w:r>
+          </w:p>
+          <w:p>
+            <w:pPr>
+              <w:pStyle w:val="SourceCode"/>
+              <w:spacing w:before="0" w:after="0" w:line="200" w:lineRule="auto"/>
+            </w:pPr>
+            <w:r>
+              <w:t xml:space="preserve">C:\...\LAB2&gt; dir src\??.wav /b</w:t>
+            </w:r>
+          </w:p>
+          <w:p>
+            <w:pPr>
+              <w:pStyle w:val="SourceCode"/>
+              <w:spacing w:before="0" w:after="0" w:line="200" w:lineRule="auto"/>
+            </w:pPr>
+            <w:r>
+              <w:t xml:space="preserve">File Not Found</w:t>
+            </w:r>
+          </w:p>
+        </w:tc>
+      </w:tr>
+    </w:tbl>
+    <w:p>
+      <w:pPr>
+        <w:spacing w:before="0" w:after="0" w:line="120" w:lineRule="exact"/>
         <w:rPr>
-          <w:rStyle w:val="VerbatimChar"/>
+          <w:sz w:val="4"/>
+          <w:szCs w:val="4"/>
         </w:rPr>
-        <w:t xml:space="preserve">C:\...\LAB2&gt; dir src /s /b | find /c ":"</w:t>
-      </w:r>
-      <w:r>
-        <w:br/>
-      </w:r>
-      <w:r>
-        <w:rPr>
-          <w:rStyle w:val="VerbatimChar"/>
-        </w:rPr>
-        <w:t xml:space="preserve">78</w:t>
-      </w:r>
-      <w:r>
-        <w:br/>
-      </w:r>
-      <w:r>
-        <w:rPr>
-          <w:rStyle w:val="VerbatimChar"/>
-        </w:rPr>
-        <w:t xml:space="preserve">C:\...\LAB2&gt; dir src\*.wav /o:-s /b</w:t>
-      </w:r>
-      <w:r>
-        <w:br/>
-      </w:r>
-      <w:r>
-        <w:rPr>
-          <w:rStyle w:val="VerbatimChar"/>
-        </w:rPr>
-        <w:t xml:space="preserve">Windows Ringin.wav</w:t>
-      </w:r>
-      <w:r>
-        <w:br/>
-      </w:r>
-      <w:r>
-        <w:rPr>
-          <w:rStyle w:val="VerbatimChar"/>
-        </w:rPr>
-        <w:t xml:space="preserve">Windows Notify Calendar.wav</w:t>
-      </w:r>
-      <w:r>
-        <w:br/>
-      </w:r>
-      <w:r>
-        <w:rPr>
-          <w:rStyle w:val="VerbatimChar"/>
-        </w:rPr>
-        <w:t xml:space="preserve">...</w:t>
-      </w:r>
-      <w:r>
-        <w:br/>
-      </w:r>
-      <w:r>
-        <w:rPr>
-          <w:rStyle w:val="VerbatimChar"/>
-        </w:rPr>
-        <w:t xml:space="preserve">C:\...\LAB2&gt; dir src\??.wav /b</w:t>
-      </w:r>
-      <w:r>
-        <w:br/>
-      </w:r>
-      <w:r>
-        <w:rPr>
-          <w:rStyle w:val="VerbatimChar"/>
-        </w:rPr>
-        <w:t xml:space="preserve">File Not Found</w:t>
-      </w:r>
+      </w:pPr>
     </w:p>
     <w:p>
       <w:pPr>
@@ -2364,211 +3154,456 @@
     </w:p>
     <w:p>
       <w:pPr>
-        <w:pStyle w:val="SourceCode"/>
-      </w:pPr>
-      <w:r>
+        <w:spacing w:before="0" w:after="0" w:line="120" w:lineRule="exact"/>
         <w:rPr>
-          <w:rStyle w:val="VerbatimChar"/>
+          <w:sz w:val="4"/>
+          <w:szCs w:val="4"/>
         </w:rPr>
-        <w:t xml:space="preserve">C:\...\LAB2&gt; md copy1 copy2 copy3</w:t>
-      </w:r>
-    </w:p>
-    <w:p>
-      <w:pPr>
-        <w:pStyle w:val="SourceCode"/>
-      </w:pPr>
-      <w:r>
+      </w:pPr>
+    </w:p>
+    <w:tbl>
+      <w:tblPr>
+        <w:tblStyle w:val="SourceCodeTable"/>
+        <w:tblW w:type="dxa" w:w="9637"/>
+        <w:tblInd w:w="0" w:type="dxa"/>
+        <w:tblBorders>
+          <w:top w:color="BFBFBF" w:space="0" w:sz="4" w:val="single"/>
+          <w:left w:color="BFBFBF" w:space="0" w:sz="4" w:val="single"/>
+          <w:bottom w:color="BFBFBF" w:space="0" w:sz="4" w:val="single"/>
+          <w:right w:color="BFBFBF" w:space="0" w:sz="4" w:val="single"/>
+        </w:tblBorders>
+        <w:shd w:color="auto" w:fill="F4F4F4" w:val="clear"/>
+        <w:tblLayout w:type="fixed"/>
+        <w:tblCellMar>
+          <w:top w:type="dxa" w:w="113"/>
+          <w:left w:type="dxa" w:w="113"/>
+          <w:bottom w:type="dxa" w:w="113"/>
+          <w:right w:type="dxa" w:w="113"/>
+        </w:tblCellMar>
+        <w:tblLook w:val="0000" w:firstRow="0" w:lastRow="0" w:firstColumn="0" w:lastColumn="0" w:noHBand="1" w:noVBand="1"/>
+      </w:tblPr>
+      <w:tblGrid>
+        <w:gridCol w:w="9637"/>
+      </w:tblGrid>
+      <w:tr>
+        <w:tc>
+          <w:tcPr>
+            <w:tcW w:type="dxa" w:w="9637"/>
+            <w:shd w:color="auto" w:fill="F4F4F4" w:val="clear"/>
+          </w:tcPr>
+          <w:p>
+            <w:pPr>
+              <w:pStyle w:val="SourceCode"/>
+              <w:spacing w:before="0" w:after="0" w:line="200" w:lineRule="auto"/>
+            </w:pPr>
+            <w:r>
+              <w:t xml:space="preserve">C:\...\LAB2&gt; md copy1 copy2 copy3</w:t>
+            </w:r>
+          </w:p>
+        </w:tc>
+      </w:tr>
+    </w:tbl>
+    <w:p>
+      <w:pPr>
+        <w:spacing w:before="0" w:after="0" w:line="120" w:lineRule="exact"/>
         <w:rPr>
-          <w:rStyle w:val="VerbatimChar"/>
+          <w:sz w:val="4"/>
+          <w:szCs w:val="4"/>
         </w:rPr>
-        <w:t xml:space="preserve">C:\...\LAB2&gt; echo %time%</w:t>
-      </w:r>
-      <w:r>
-        <w:br/>
-      </w:r>
-      <w:r>
+      </w:pPr>
+    </w:p>
+    <w:p>
+      <w:pPr>
+        <w:spacing w:before="0" w:after="0" w:line="120" w:lineRule="exact"/>
         <w:rPr>
-          <w:rStyle w:val="VerbatimChar"/>
+          <w:sz w:val="4"/>
+          <w:szCs w:val="4"/>
         </w:rPr>
-        <w:t xml:space="preserve">14:22:05,31</w:t>
-      </w:r>
-      <w:r>
-        <w:br/>
-      </w:r>
-      <w:r>
+      </w:pPr>
+    </w:p>
+    <w:tbl>
+      <w:tblPr>
+        <w:tblStyle w:val="SourceCodeTable"/>
+        <w:tblW w:type="dxa" w:w="9637"/>
+        <w:tblInd w:w="0" w:type="dxa"/>
+        <w:tblBorders>
+          <w:top w:color="BFBFBF" w:space="0" w:sz="4" w:val="single"/>
+          <w:left w:color="BFBFBF" w:space="0" w:sz="4" w:val="single"/>
+          <w:bottom w:color="BFBFBF" w:space="0" w:sz="4" w:val="single"/>
+          <w:right w:color="BFBFBF" w:space="0" w:sz="4" w:val="single"/>
+        </w:tblBorders>
+        <w:shd w:color="auto" w:fill="F4F4F4" w:val="clear"/>
+        <w:tblLayout w:type="fixed"/>
+        <w:tblCellMar>
+          <w:top w:type="dxa" w:w="113"/>
+          <w:left w:type="dxa" w:w="113"/>
+          <w:bottom w:type="dxa" w:w="113"/>
+          <w:right w:type="dxa" w:w="113"/>
+        </w:tblCellMar>
+        <w:tblLook w:val="0000" w:firstRow="0" w:lastRow="0" w:firstColumn="0" w:lastColumn="0" w:noHBand="1" w:noVBand="1"/>
+      </w:tblPr>
+      <w:tblGrid>
+        <w:gridCol w:w="9637"/>
+      </w:tblGrid>
+      <w:tr>
+        <w:tc>
+          <w:tcPr>
+            <w:tcW w:type="dxa" w:w="9637"/>
+            <w:shd w:color="auto" w:fill="F4F4F4" w:val="clear"/>
+          </w:tcPr>
+          <w:p>
+            <w:pPr>
+              <w:pStyle w:val="SourceCode"/>
+              <w:spacing w:before="0" w:after="0" w:line="200" w:lineRule="auto"/>
+            </w:pPr>
+            <w:r>
+              <w:t xml:space="preserve">C:\...\LAB2&gt; echo %time%</w:t>
+            </w:r>
+          </w:p>
+          <w:p>
+            <w:pPr>
+              <w:pStyle w:val="SourceCode"/>
+              <w:spacing w:before="0" w:after="0" w:line="200" w:lineRule="auto"/>
+            </w:pPr>
+            <w:r>
+              <w:t xml:space="preserve">14:22:05,31</w:t>
+            </w:r>
+          </w:p>
+          <w:p>
+            <w:pPr>
+              <w:pStyle w:val="SourceCode"/>
+              <w:spacing w:before="0" w:after="0" w:line="200" w:lineRule="auto"/>
+            </w:pPr>
+            <w:r>
+              <w:t xml:space="preserve">C:\...\LAB2&gt; copy src\*.* copy1\ &gt; nul</w:t>
+            </w:r>
+          </w:p>
+          <w:p>
+            <w:pPr>
+              <w:pStyle w:val="SourceCode"/>
+              <w:spacing w:before="0" w:after="0" w:line="200" w:lineRule="auto"/>
+            </w:pPr>
+            <w:r>
+              <w:t xml:space="preserve">C:\...\LAB2&gt; echo %time%</w:t>
+            </w:r>
+          </w:p>
+          <w:p>
+            <w:pPr>
+              <w:pStyle w:val="SourceCode"/>
+              <w:spacing w:before="0" w:after="0" w:line="200" w:lineRule="auto"/>
+            </w:pPr>
+            <w:r>
+              <w:t xml:space="preserve">14:22:06,08</w:t>
+            </w:r>
+          </w:p>
+        </w:tc>
+      </w:tr>
+    </w:tbl>
+    <w:p>
+      <w:pPr>
+        <w:spacing w:before="0" w:after="0" w:line="120" w:lineRule="exact"/>
         <w:rPr>
-          <w:rStyle w:val="VerbatimChar"/>
+          <w:sz w:val="4"/>
+          <w:szCs w:val="4"/>
         </w:rPr>
-        <w:t xml:space="preserve">C:\...\LAB2&gt; copy src\*.* copy1\ &gt; nul</w:t>
-      </w:r>
-      <w:r>
-        <w:br/>
-      </w:r>
-      <w:r>
+      </w:pPr>
+    </w:p>
+    <w:p>
+      <w:pPr>
+        <w:spacing w:before="0" w:after="0" w:line="120" w:lineRule="exact"/>
         <w:rPr>
-          <w:rStyle w:val="VerbatimChar"/>
+          <w:sz w:val="4"/>
+          <w:szCs w:val="4"/>
         </w:rPr>
-        <w:t xml:space="preserve">C:\...\LAB2&gt; echo %time%</w:t>
-      </w:r>
-      <w:r>
-        <w:br/>
-      </w:r>
-      <w:r>
+      </w:pPr>
+    </w:p>
+    <w:tbl>
+      <w:tblPr>
+        <w:tblStyle w:val="SourceCodeTable"/>
+        <w:tblW w:type="dxa" w:w="9637"/>
+        <w:tblInd w:w="0" w:type="dxa"/>
+        <w:tblBorders>
+          <w:top w:color="BFBFBF" w:space="0" w:sz="4" w:val="single"/>
+          <w:left w:color="BFBFBF" w:space="0" w:sz="4" w:val="single"/>
+          <w:bottom w:color="BFBFBF" w:space="0" w:sz="4" w:val="single"/>
+          <w:right w:color="BFBFBF" w:space="0" w:sz="4" w:val="single"/>
+        </w:tblBorders>
+        <w:shd w:color="auto" w:fill="F4F4F4" w:val="clear"/>
+        <w:tblLayout w:type="fixed"/>
+        <w:tblCellMar>
+          <w:top w:type="dxa" w:w="113"/>
+          <w:left w:type="dxa" w:w="113"/>
+          <w:bottom w:type="dxa" w:w="113"/>
+          <w:right w:type="dxa" w:w="113"/>
+        </w:tblCellMar>
+        <w:tblLook w:val="0000" w:firstRow="0" w:lastRow="0" w:firstColumn="0" w:lastColumn="0" w:noHBand="1" w:noVBand="1"/>
+      </w:tblPr>
+      <w:tblGrid>
+        <w:gridCol w:w="9637"/>
+      </w:tblGrid>
+      <w:tr>
+        <w:tc>
+          <w:tcPr>
+            <w:tcW w:type="dxa" w:w="9637"/>
+            <w:shd w:color="auto" w:fill="F4F4F4" w:val="clear"/>
+          </w:tcPr>
+          <w:p>
+            <w:pPr>
+              <w:pStyle w:val="SourceCode"/>
+              <w:spacing w:before="0" w:after="0" w:line="200" w:lineRule="auto"/>
+            </w:pPr>
+            <w:r>
+              <w:t xml:space="preserve">C:\...\LAB2&gt; echo %time%</w:t>
+            </w:r>
+          </w:p>
+          <w:p>
+            <w:pPr>
+              <w:pStyle w:val="SourceCode"/>
+              <w:spacing w:before="0" w:after="0" w:line="200" w:lineRule="auto"/>
+            </w:pPr>
+            <w:r>
+              <w:t xml:space="preserve">14:22:11,44</w:t>
+            </w:r>
+          </w:p>
+          <w:p>
+            <w:pPr>
+              <w:pStyle w:val="SourceCode"/>
+              <w:spacing w:before="0" w:after="0" w:line="200" w:lineRule="auto"/>
+            </w:pPr>
+            <w:r>
+              <w:t xml:space="preserve">C:\...\LAB2&gt; xcopy /s /e /q src copy2\ &gt; nul</w:t>
+            </w:r>
+          </w:p>
+          <w:p>
+            <w:pPr>
+              <w:pStyle w:val="SourceCode"/>
+              <w:spacing w:before="0" w:after="0" w:line="200" w:lineRule="auto"/>
+            </w:pPr>
+            <w:r>
+              <w:t xml:space="preserve">C:\...\LAB2&gt; echo %time%</w:t>
+            </w:r>
+          </w:p>
+          <w:p>
+            <w:pPr>
+              <w:pStyle w:val="SourceCode"/>
+              <w:spacing w:before="0" w:after="0" w:line="200" w:lineRule="auto"/>
+            </w:pPr>
+            <w:r>
+              <w:t xml:space="preserve">14:22:12,97</w:t>
+            </w:r>
+          </w:p>
+        </w:tc>
+      </w:tr>
+    </w:tbl>
+    <w:p>
+      <w:pPr>
+        <w:spacing w:before="0" w:after="0" w:line="120" w:lineRule="exact"/>
         <w:rPr>
-          <w:rStyle w:val="VerbatimChar"/>
+          <w:sz w:val="4"/>
+          <w:szCs w:val="4"/>
         </w:rPr>
-        <w:t xml:space="preserve">14:22:06,08</w:t>
-      </w:r>
-    </w:p>
-    <w:p>
-      <w:pPr>
-        <w:pStyle w:val="SourceCode"/>
-      </w:pPr>
-      <w:r>
+      </w:pPr>
+    </w:p>
+    <w:p>
+      <w:pPr>
+        <w:spacing w:before="0" w:after="0" w:line="120" w:lineRule="exact"/>
         <w:rPr>
-          <w:rStyle w:val="VerbatimChar"/>
+          <w:sz w:val="4"/>
+          <w:szCs w:val="4"/>
         </w:rPr>
-        <w:t xml:space="preserve">C:\...\LAB2&gt; echo %time%</w:t>
-      </w:r>
-      <w:r>
-        <w:br/>
-      </w:r>
-      <w:r>
+      </w:pPr>
+    </w:p>
+    <w:tbl>
+      <w:tblPr>
+        <w:tblStyle w:val="SourceCodeTable"/>
+        <w:tblW w:type="dxa" w:w="9637"/>
+        <w:tblInd w:w="0" w:type="dxa"/>
+        <w:tblBorders>
+          <w:top w:color="BFBFBF" w:space="0" w:sz="4" w:val="single"/>
+          <w:left w:color="BFBFBF" w:space="0" w:sz="4" w:val="single"/>
+          <w:bottom w:color="BFBFBF" w:space="0" w:sz="4" w:val="single"/>
+          <w:right w:color="BFBFBF" w:space="0" w:sz="4" w:val="single"/>
+        </w:tblBorders>
+        <w:shd w:color="auto" w:fill="F4F4F4" w:val="clear"/>
+        <w:tblLayout w:type="fixed"/>
+        <w:tblCellMar>
+          <w:top w:type="dxa" w:w="113"/>
+          <w:left w:type="dxa" w:w="113"/>
+          <w:bottom w:type="dxa" w:w="113"/>
+          <w:right w:type="dxa" w:w="113"/>
+        </w:tblCellMar>
+        <w:tblLook w:val="0000" w:firstRow="0" w:lastRow="0" w:firstColumn="0" w:lastColumn="0" w:noHBand="1" w:noVBand="1"/>
+      </w:tblPr>
+      <w:tblGrid>
+        <w:gridCol w:w="9637"/>
+      </w:tblGrid>
+      <w:tr>
+        <w:tc>
+          <w:tcPr>
+            <w:tcW w:type="dxa" w:w="9637"/>
+            <w:shd w:color="auto" w:fill="F4F4F4" w:val="clear"/>
+          </w:tcPr>
+          <w:p>
+            <w:pPr>
+              <w:pStyle w:val="SourceCode"/>
+              <w:spacing w:before="0" w:after="0" w:line="200" w:lineRule="auto"/>
+            </w:pPr>
+            <w:r>
+              <w:t xml:space="preserve">C:\...\LAB2&gt; echo %time%</w:t>
+            </w:r>
+          </w:p>
+          <w:p>
+            <w:pPr>
+              <w:pStyle w:val="SourceCode"/>
+              <w:spacing w:before="0" w:after="0" w:line="200" w:lineRule="auto"/>
+            </w:pPr>
+            <w:r>
+              <w:t xml:space="preserve">14:22:20,12</w:t>
+            </w:r>
+          </w:p>
+          <w:p>
+            <w:pPr>
+              <w:pStyle w:val="SourceCode"/>
+              <w:spacing w:before="0" w:after="0" w:line="200" w:lineRule="auto"/>
+            </w:pPr>
+            <w:r>
+              <w:t xml:space="preserve">C:\...\LAB2&gt; robocopy src copy3 /e /mt:8 /njh /njs /nfl /ndl &gt; nul</w:t>
+            </w:r>
+          </w:p>
+          <w:p>
+            <w:pPr>
+              <w:pStyle w:val="SourceCode"/>
+              <w:spacing w:before="0" w:after="0" w:line="200" w:lineRule="auto"/>
+            </w:pPr>
+            <w:r>
+              <w:t xml:space="preserve">C:\...\LAB2&gt; echo %time%</w:t>
+            </w:r>
+          </w:p>
+          <w:p>
+            <w:pPr>
+              <w:pStyle w:val="SourceCode"/>
+              <w:spacing w:before="0" w:after="0" w:line="200" w:lineRule="auto"/>
+            </w:pPr>
+            <w:r>
+              <w:t xml:space="preserve">14:22:20,79</w:t>
+            </w:r>
+          </w:p>
+        </w:tc>
+      </w:tr>
+    </w:tbl>
+    <w:p>
+      <w:pPr>
+        <w:spacing w:before="0" w:after="0" w:line="120" w:lineRule="exact"/>
         <w:rPr>
-          <w:rStyle w:val="VerbatimChar"/>
+          <w:sz w:val="4"/>
+          <w:szCs w:val="4"/>
         </w:rPr>
-        <w:t xml:space="preserve">14:22:11,44</w:t>
-      </w:r>
-      <w:r>
-        <w:br/>
-      </w:r>
-      <w:r>
+      </w:pPr>
+    </w:p>
+    <w:p>
+      <w:pPr>
+        <w:spacing w:before="0" w:after="0" w:line="120" w:lineRule="exact"/>
         <w:rPr>
-          <w:rStyle w:val="VerbatimChar"/>
+          <w:sz w:val="4"/>
+          <w:szCs w:val="4"/>
         </w:rPr>
-        <w:t xml:space="preserve">C:\...\LAB2&gt; xcopy /s /e /q src copy2\ &gt; nul</w:t>
-      </w:r>
-      <w:r>
-        <w:br/>
-      </w:r>
-      <w:r>
+      </w:pPr>
+    </w:p>
+    <w:tbl>
+      <w:tblPr>
+        <w:tblStyle w:val="SourceCodeTable"/>
+        <w:tblW w:type="dxa" w:w="9637"/>
+        <w:tblInd w:w="0" w:type="dxa"/>
+        <w:tblBorders>
+          <w:top w:color="BFBFBF" w:space="0" w:sz="4" w:val="single"/>
+          <w:left w:color="BFBFBF" w:space="0" w:sz="4" w:val="single"/>
+          <w:bottom w:color="BFBFBF" w:space="0" w:sz="4" w:val="single"/>
+          <w:right w:color="BFBFBF" w:space="0" w:sz="4" w:val="single"/>
+        </w:tblBorders>
+        <w:shd w:color="auto" w:fill="F4F4F4" w:val="clear"/>
+        <w:tblLayout w:type="fixed"/>
+        <w:tblCellMar>
+          <w:top w:type="dxa" w:w="113"/>
+          <w:left w:type="dxa" w:w="113"/>
+          <w:bottom w:type="dxa" w:w="113"/>
+          <w:right w:type="dxa" w:w="113"/>
+        </w:tblCellMar>
+        <w:tblLook w:val="0000" w:firstRow="0" w:lastRow="0" w:firstColumn="0" w:lastColumn="0" w:noHBand="1" w:noVBand="1"/>
+      </w:tblPr>
+      <w:tblGrid>
+        <w:gridCol w:w="9637"/>
+      </w:tblGrid>
+      <w:tr>
+        <w:tc>
+          <w:tcPr>
+            <w:tcW w:type="dxa" w:w="9637"/>
+            <w:shd w:color="auto" w:fill="F4F4F4" w:val="clear"/>
+          </w:tcPr>
+          <w:p>
+            <w:pPr>
+              <w:pStyle w:val="SourceCode"/>
+              <w:spacing w:before="0" w:after="0" w:line="200" w:lineRule="auto"/>
+            </w:pPr>
+            <w:r>
+              <w:t xml:space="preserve">C:\...\LAB2&gt; dir copy1 /s /b | find /c ":"</w:t>
+            </w:r>
+          </w:p>
+          <w:p>
+            <w:pPr>
+              <w:pStyle w:val="SourceCode"/>
+              <w:spacing w:before="0" w:after="0" w:line="200" w:lineRule="auto"/>
+            </w:pPr>
+            <w:r>
+              <w:t xml:space="preserve">70</w:t>
+            </w:r>
+          </w:p>
+          <w:p>
+            <w:pPr>
+              <w:pStyle w:val="SourceCode"/>
+              <w:spacing w:before="0" w:after="0" w:line="200" w:lineRule="auto"/>
+            </w:pPr>
+            <w:r>
+              <w:t xml:space="preserve">C:\...\LAB2&gt; dir copy2 /s /b | find /c ":"</w:t>
+            </w:r>
+          </w:p>
+          <w:p>
+            <w:pPr>
+              <w:pStyle w:val="SourceCode"/>
+              <w:spacing w:before="0" w:after="0" w:line="200" w:lineRule="auto"/>
+            </w:pPr>
+            <w:r>
+              <w:t xml:space="preserve">78</w:t>
+            </w:r>
+          </w:p>
+          <w:p>
+            <w:pPr>
+              <w:pStyle w:val="SourceCode"/>
+              <w:spacing w:before="0" w:after="0" w:line="200" w:lineRule="auto"/>
+            </w:pPr>
+            <w:r>
+              <w:t xml:space="preserve">C:\...\LAB2&gt; dir copy3 /s /b | find /c ":"</w:t>
+            </w:r>
+          </w:p>
+          <w:p>
+            <w:pPr>
+              <w:pStyle w:val="SourceCode"/>
+              <w:spacing w:before="0" w:after="0" w:line="200" w:lineRule="auto"/>
+            </w:pPr>
+            <w:r>
+              <w:t xml:space="preserve">78</w:t>
+            </w:r>
+          </w:p>
+        </w:tc>
+      </w:tr>
+    </w:tbl>
+    <w:p>
+      <w:pPr>
+        <w:spacing w:before="0" w:after="0" w:line="120" w:lineRule="exact"/>
         <w:rPr>
-          <w:rStyle w:val="VerbatimChar"/>
+          <w:sz w:val="4"/>
+          <w:szCs w:val="4"/>
         </w:rPr>
-        <w:t xml:space="preserve">C:\...\LAB2&gt; echo %time%</w:t>
-      </w:r>
-      <w:r>
-        <w:br/>
-      </w:r>
-      <w:r>
-        <w:rPr>
-          <w:rStyle w:val="VerbatimChar"/>
-        </w:rPr>
-        <w:t xml:space="preserve">14:22:12,97</w:t>
-      </w:r>
-    </w:p>
-    <w:p>
-      <w:pPr>
-        <w:pStyle w:val="SourceCode"/>
-      </w:pPr>
-      <w:r>
-        <w:rPr>
-          <w:rStyle w:val="VerbatimChar"/>
-        </w:rPr>
-        <w:t xml:space="preserve">C:\...\LAB2&gt; echo %time%</w:t>
-      </w:r>
-      <w:r>
-        <w:br/>
-      </w:r>
-      <w:r>
-        <w:rPr>
-          <w:rStyle w:val="VerbatimChar"/>
-        </w:rPr>
-        <w:t xml:space="preserve">14:22:20,12</w:t>
-      </w:r>
-      <w:r>
-        <w:br/>
-      </w:r>
-      <w:r>
-        <w:rPr>
-          <w:rStyle w:val="VerbatimChar"/>
-        </w:rPr>
-        <w:t xml:space="preserve">C:\...\LAB2&gt; robocopy src copy3 /e /mt:8 /njh /njs /nfl /ndl &gt; nul</w:t>
-      </w:r>
-      <w:r>
-        <w:br/>
-      </w:r>
-      <w:r>
-        <w:rPr>
-          <w:rStyle w:val="VerbatimChar"/>
-        </w:rPr>
-        <w:t xml:space="preserve">C:\...\LAB2&gt; echo %time%</w:t>
-      </w:r>
-      <w:r>
-        <w:br/>
-      </w:r>
-      <w:r>
-        <w:rPr>
-          <w:rStyle w:val="VerbatimChar"/>
-        </w:rPr>
-        <w:t xml:space="preserve">14:22:20,79</w:t>
-      </w:r>
-    </w:p>
-    <w:p>
-      <w:pPr>
-        <w:pStyle w:val="SourceCode"/>
-      </w:pPr>
-      <w:r>
-        <w:rPr>
-          <w:rStyle w:val="VerbatimChar"/>
-        </w:rPr>
-        <w:t xml:space="preserve">C:\...\LAB2&gt; dir copy1 /s /b | find /c ":"</w:t>
-      </w:r>
-      <w:r>
-        <w:br/>
-      </w:r>
-      <w:r>
-        <w:rPr>
-          <w:rStyle w:val="VerbatimChar"/>
-        </w:rPr>
-        <w:t xml:space="preserve">70</w:t>
-      </w:r>
-      <w:r>
-        <w:br/>
-      </w:r>
-      <w:r>
-        <w:rPr>
-          <w:rStyle w:val="VerbatimChar"/>
-        </w:rPr>
-        <w:t xml:space="preserve">C:\...\LAB2&gt; dir copy2 /s /b | find /c ":"</w:t>
-      </w:r>
-      <w:r>
-        <w:br/>
-      </w:r>
-      <w:r>
-        <w:rPr>
-          <w:rStyle w:val="VerbatimChar"/>
-        </w:rPr>
-        <w:t xml:space="preserve">78</w:t>
-      </w:r>
-      <w:r>
-        <w:br/>
-      </w:r>
-      <w:r>
-        <w:rPr>
-          <w:rStyle w:val="VerbatimChar"/>
-        </w:rPr>
-        <w:t xml:space="preserve">C:\...\LAB2&gt; dir copy3 /s /b | find /c ":"</w:t>
-      </w:r>
-      <w:r>
-        <w:br/>
-      </w:r>
-      <w:r>
-        <w:rPr>
-          <w:rStyle w:val="VerbatimChar"/>
-        </w:rPr>
-        <w:t xml:space="preserve">78</w:t>
-      </w:r>
+      </w:pPr>
     </w:p>
     <w:p>
       <w:pPr>
@@ -2590,191 +3625,387 @@
     </w:p>
     <w:p>
       <w:pPr>
-        <w:pStyle w:val="SourceCode"/>
-      </w:pPr>
-      <w:r>
+        <w:spacing w:before="0" w:after="0" w:line="120" w:lineRule="exact"/>
         <w:rPr>
-          <w:rStyle w:val="VerbatimChar"/>
+          <w:sz w:val="4"/>
+          <w:szCs w:val="4"/>
         </w:rPr>
-        <w:t xml:space="preserve">C:\...\LAB2&gt; cd copy1</w:t>
-      </w:r>
-      <w:r>
-        <w:br/>
-      </w:r>
-      <w:r>
+      </w:pPr>
+    </w:p>
+    <w:tbl>
+      <w:tblPr>
+        <w:tblStyle w:val="SourceCodeTable"/>
+        <w:tblW w:type="dxa" w:w="9637"/>
+        <w:tblInd w:w="0" w:type="dxa"/>
+        <w:tblBorders>
+          <w:top w:color="BFBFBF" w:space="0" w:sz="4" w:val="single"/>
+          <w:left w:color="BFBFBF" w:space="0" w:sz="4" w:val="single"/>
+          <w:bottom w:color="BFBFBF" w:space="0" w:sz="4" w:val="single"/>
+          <w:right w:color="BFBFBF" w:space="0" w:sz="4" w:val="single"/>
+        </w:tblBorders>
+        <w:shd w:color="auto" w:fill="F4F4F4" w:val="clear"/>
+        <w:tblLayout w:type="fixed"/>
+        <w:tblCellMar>
+          <w:top w:type="dxa" w:w="113"/>
+          <w:left w:type="dxa" w:w="113"/>
+          <w:bottom w:type="dxa" w:w="113"/>
+          <w:right w:type="dxa" w:w="113"/>
+        </w:tblCellMar>
+        <w:tblLook w:val="0000" w:firstRow="0" w:lastRow="0" w:firstColumn="0" w:lastColumn="0" w:noHBand="1" w:noVBand="1"/>
+      </w:tblPr>
+      <w:tblGrid>
+        <w:gridCol w:w="9637"/>
+      </w:tblGrid>
+      <w:tr>
+        <w:tc>
+          <w:tcPr>
+            <w:tcW w:type="dxa" w:w="9637"/>
+            <w:shd w:color="auto" w:fill="F4F4F4" w:val="clear"/>
+          </w:tcPr>
+          <w:p>
+            <w:pPr>
+              <w:pStyle w:val="SourceCode"/>
+              <w:spacing w:before="0" w:after="0" w:line="200" w:lineRule="auto"/>
+            </w:pPr>
+            <w:r>
+              <w:t xml:space="preserve">C:\...\LAB2&gt; cd copy1</w:t>
+            </w:r>
+          </w:p>
+          <w:p>
+            <w:pPr>
+              <w:pStyle w:val="SourceCode"/>
+              <w:spacing w:before="0" w:after="0" w:line="200" w:lineRule="auto"/>
+            </w:pPr>
+            <w:r>
+              <w:t xml:space="preserve">C:\...\copy1&gt; ren *.wav *.bak</w:t>
+            </w:r>
+          </w:p>
+          <w:p>
+            <w:pPr>
+              <w:pStyle w:val="SourceCode"/>
+              <w:spacing w:before="0" w:after="0" w:line="200" w:lineRule="auto"/>
+            </w:pPr>
+            <w:r>
+              <w:t xml:space="preserve">C:\...\copy1&gt; dir /b | find /c ".bak"</w:t>
+            </w:r>
+          </w:p>
+          <w:p>
+            <w:pPr>
+              <w:pStyle w:val="SourceCode"/>
+              <w:spacing w:before="0" w:after="0" w:line="200" w:lineRule="auto"/>
+            </w:pPr>
+            <w:r>
+              <w:t xml:space="preserve">70</w:t>
+            </w:r>
+          </w:p>
+        </w:tc>
+      </w:tr>
+    </w:tbl>
+    <w:p>
+      <w:pPr>
+        <w:spacing w:before="0" w:after="0" w:line="120" w:lineRule="exact"/>
         <w:rPr>
-          <w:rStyle w:val="VerbatimChar"/>
+          <w:sz w:val="4"/>
+          <w:szCs w:val="4"/>
         </w:rPr>
-        <w:t xml:space="preserve">C:\...\copy1&gt; ren *.wav *.bak</w:t>
-      </w:r>
-      <w:r>
-        <w:br/>
-      </w:r>
-      <w:r>
+      </w:pPr>
+    </w:p>
+    <w:p>
+      <w:pPr>
+        <w:spacing w:before="0" w:after="0" w:line="120" w:lineRule="exact"/>
         <w:rPr>
-          <w:rStyle w:val="VerbatimChar"/>
+          <w:sz w:val="4"/>
+          <w:szCs w:val="4"/>
         </w:rPr>
-        <w:t xml:space="preserve">C:\...\copy1&gt; dir /b | find /c ".bak"</w:t>
-      </w:r>
-      <w:r>
-        <w:br/>
-      </w:r>
-      <w:r>
+      </w:pPr>
+    </w:p>
+    <w:tbl>
+      <w:tblPr>
+        <w:tblStyle w:val="SourceCodeTable"/>
+        <w:tblW w:type="dxa" w:w="9637"/>
+        <w:tblInd w:w="0" w:type="dxa"/>
+        <w:tblBorders>
+          <w:top w:color="BFBFBF" w:space="0" w:sz="4" w:val="single"/>
+          <w:left w:color="BFBFBF" w:space="0" w:sz="4" w:val="single"/>
+          <w:bottom w:color="BFBFBF" w:space="0" w:sz="4" w:val="single"/>
+          <w:right w:color="BFBFBF" w:space="0" w:sz="4" w:val="single"/>
+        </w:tblBorders>
+        <w:shd w:color="auto" w:fill="F4F4F4" w:val="clear"/>
+        <w:tblLayout w:type="fixed"/>
+        <w:tblCellMar>
+          <w:top w:type="dxa" w:w="113"/>
+          <w:left w:type="dxa" w:w="113"/>
+          <w:bottom w:type="dxa" w:w="113"/>
+          <w:right w:type="dxa" w:w="113"/>
+        </w:tblCellMar>
+        <w:tblLook w:val="0000" w:firstRow="0" w:lastRow="0" w:firstColumn="0" w:lastColumn="0" w:noHBand="1" w:noVBand="1"/>
+      </w:tblPr>
+      <w:tblGrid>
+        <w:gridCol w:w="9637"/>
+      </w:tblGrid>
+      <w:tr>
+        <w:tc>
+          <w:tcPr>
+            <w:tcW w:type="dxa" w:w="9637"/>
+            <w:shd w:color="auto" w:fill="F4F4F4" w:val="clear"/>
+          </w:tcPr>
+          <w:p>
+            <w:pPr>
+              <w:pStyle w:val="SourceCode"/>
+              <w:spacing w:before="0" w:after="0" w:line="200" w:lineRule="auto"/>
+            </w:pPr>
+            <w:r>
+              <w:t xml:space="preserve">C:\...\copy1&gt; attrib +r "Windows Ringin.bak"</w:t>
+            </w:r>
+          </w:p>
+          <w:p>
+            <w:pPr>
+              <w:pStyle w:val="SourceCode"/>
+              <w:spacing w:before="0" w:after="0" w:line="200" w:lineRule="auto"/>
+            </w:pPr>
+            <w:r>
+              <w:t xml:space="preserve">C:\...\copy1&gt; attrib "Windows Ringin.bak"</w:t>
+            </w:r>
+          </w:p>
+          <w:p>
+            <w:pPr>
+              <w:pStyle w:val="SourceCode"/>
+              <w:spacing w:before="0" w:after="0" w:line="200" w:lineRule="auto"/>
+            </w:pPr>
+            <w:r>
+              <w:t xml:space="preserve">A  R     C:\Users\Student\Desktop\LAB2\copy1\Windows Ringin.bak</w:t>
+            </w:r>
+          </w:p>
+        </w:tc>
+      </w:tr>
+    </w:tbl>
+    <w:p>
+      <w:pPr>
+        <w:spacing w:before="0" w:after="0" w:line="120" w:lineRule="exact"/>
         <w:rPr>
-          <w:rStyle w:val="VerbatimChar"/>
+          <w:sz w:val="4"/>
+          <w:szCs w:val="4"/>
         </w:rPr>
-        <w:t xml:space="preserve">70</w:t>
-      </w:r>
-    </w:p>
-    <w:p>
-      <w:pPr>
-        <w:pStyle w:val="SourceCode"/>
-      </w:pPr>
-      <w:r>
+      </w:pPr>
+    </w:p>
+    <w:p>
+      <w:pPr>
+        <w:spacing w:before="0" w:after="0" w:line="120" w:lineRule="exact"/>
         <w:rPr>
-          <w:rStyle w:val="VerbatimChar"/>
+          <w:sz w:val="4"/>
+          <w:szCs w:val="4"/>
         </w:rPr>
-        <w:t xml:space="preserve">C:\...\copy1&gt; attrib +r "Windows Ringin.bak"</w:t>
-      </w:r>
-      <w:r>
-        <w:br/>
-      </w:r>
-      <w:r>
+      </w:pPr>
+    </w:p>
+    <w:tbl>
+      <w:tblPr>
+        <w:tblStyle w:val="SourceCodeTable"/>
+        <w:tblW w:type="dxa" w:w="9637"/>
+        <w:tblInd w:w="0" w:type="dxa"/>
+        <w:tblBorders>
+          <w:top w:color="BFBFBF" w:space="0" w:sz="4" w:val="single"/>
+          <w:left w:color="BFBFBF" w:space="0" w:sz="4" w:val="single"/>
+          <w:bottom w:color="BFBFBF" w:space="0" w:sz="4" w:val="single"/>
+          <w:right w:color="BFBFBF" w:space="0" w:sz="4" w:val="single"/>
+        </w:tblBorders>
+        <w:shd w:color="auto" w:fill="F4F4F4" w:val="clear"/>
+        <w:tblLayout w:type="fixed"/>
+        <w:tblCellMar>
+          <w:top w:type="dxa" w:w="113"/>
+          <w:left w:type="dxa" w:w="113"/>
+          <w:bottom w:type="dxa" w:w="113"/>
+          <w:right w:type="dxa" w:w="113"/>
+        </w:tblCellMar>
+        <w:tblLook w:val="0000" w:firstRow="0" w:lastRow="0" w:firstColumn="0" w:lastColumn="0" w:noHBand="1" w:noVBand="1"/>
+      </w:tblPr>
+      <w:tblGrid>
+        <w:gridCol w:w="9637"/>
+      </w:tblGrid>
+      <w:tr>
+        <w:tc>
+          <w:tcPr>
+            <w:tcW w:type="dxa" w:w="9637"/>
+            <w:shd w:color="auto" w:fill="F4F4F4" w:val="clear"/>
+          </w:tcPr>
+          <w:p>
+            <w:pPr>
+              <w:pStyle w:val="SourceCode"/>
+              <w:spacing w:before="0" w:after="0" w:line="200" w:lineRule="auto"/>
+            </w:pPr>
+            <w:r>
+              <w:t xml:space="preserve">C:\...\copy1&gt; del "Windows Ringin.bak"</w:t>
+            </w:r>
+          </w:p>
+          <w:p>
+            <w:pPr>
+              <w:pStyle w:val="SourceCode"/>
+              <w:spacing w:before="0" w:after="0" w:line="200" w:lineRule="auto"/>
+            </w:pPr>
+            <w:r>
+              <w:t xml:space="preserve">C:\...\copy1\Windows Ringin.bak</w:t>
+            </w:r>
+          </w:p>
+          <w:p>
+            <w:pPr>
+              <w:pStyle w:val="SourceCode"/>
+              <w:spacing w:before="0" w:after="0" w:line="200" w:lineRule="auto"/>
+            </w:pPr>
+            <w:r>
+              <w:t xml:space="preserve">Access is denied.</w:t>
+            </w:r>
+          </w:p>
+        </w:tc>
+      </w:tr>
+    </w:tbl>
+    <w:p>
+      <w:pPr>
+        <w:spacing w:before="0" w:after="0" w:line="120" w:lineRule="exact"/>
         <w:rPr>
-          <w:rStyle w:val="VerbatimChar"/>
+          <w:sz w:val="4"/>
+          <w:szCs w:val="4"/>
         </w:rPr>
-        <w:t xml:space="preserve">C:\...\copy1&gt; attrib "Windows Ringin.bak"</w:t>
-      </w:r>
-      <w:r>
-        <w:br/>
-      </w:r>
-      <w:r>
+      </w:pPr>
+    </w:p>
+    <w:p>
+      <w:pPr>
+        <w:spacing w:before="0" w:after="0" w:line="120" w:lineRule="exact"/>
         <w:rPr>
-          <w:rStyle w:val="VerbatimChar"/>
+          <w:sz w:val="4"/>
+          <w:szCs w:val="4"/>
         </w:rPr>
-        <w:t xml:space="preserve">A  R     C:\Users\Student\Desktop\LAB2\copy1\Windows Ringin.bak</w:t>
-      </w:r>
-    </w:p>
-    <w:p>
-      <w:pPr>
-        <w:pStyle w:val="SourceCode"/>
-      </w:pPr>
-      <w:r>
+      </w:pPr>
+    </w:p>
+    <w:tbl>
+      <w:tblPr>
+        <w:tblStyle w:val="SourceCodeTable"/>
+        <w:tblW w:type="dxa" w:w="9637"/>
+        <w:tblInd w:w="0" w:type="dxa"/>
+        <w:tblBorders>
+          <w:top w:color="BFBFBF" w:space="0" w:sz="4" w:val="single"/>
+          <w:left w:color="BFBFBF" w:space="0" w:sz="4" w:val="single"/>
+          <w:bottom w:color="BFBFBF" w:space="0" w:sz="4" w:val="single"/>
+          <w:right w:color="BFBFBF" w:space="0" w:sz="4" w:val="single"/>
+        </w:tblBorders>
+        <w:shd w:color="auto" w:fill="F4F4F4" w:val="clear"/>
+        <w:tblLayout w:type="fixed"/>
+        <w:tblCellMar>
+          <w:top w:type="dxa" w:w="113"/>
+          <w:left w:type="dxa" w:w="113"/>
+          <w:bottom w:type="dxa" w:w="113"/>
+          <w:right w:type="dxa" w:w="113"/>
+        </w:tblCellMar>
+        <w:tblLook w:val="0000" w:firstRow="0" w:lastRow="0" w:firstColumn="0" w:lastColumn="0" w:noHBand="1" w:noVBand="1"/>
+      </w:tblPr>
+      <w:tblGrid>
+        <w:gridCol w:w="9637"/>
+      </w:tblGrid>
+      <w:tr>
+        <w:tc>
+          <w:tcPr>
+            <w:tcW w:type="dxa" w:w="9637"/>
+            <w:shd w:color="auto" w:fill="F4F4F4" w:val="clear"/>
+          </w:tcPr>
+          <w:p>
+            <w:pPr>
+              <w:pStyle w:val="SourceCode"/>
+              <w:spacing w:before="0" w:after="0" w:line="200" w:lineRule="auto"/>
+            </w:pPr>
+            <w:r>
+              <w:t xml:space="preserve">C:\...\copy1&gt; del /f "Windows Ringin.bak"</w:t>
+            </w:r>
+          </w:p>
+          <w:p>
+            <w:pPr>
+              <w:pStyle w:val="SourceCode"/>
+              <w:spacing w:before="0" w:after="0" w:line="200" w:lineRule="auto"/>
+            </w:pPr>
+            <w:r>
+              <w:t xml:space="preserve">C:\...\copy1&gt; cd ..</w:t>
+            </w:r>
+          </w:p>
+          <w:p>
+            <w:pPr>
+              <w:pStyle w:val="SourceCode"/>
+              <w:spacing w:before="0" w:after="0" w:line="200" w:lineRule="auto"/>
+            </w:pPr>
+            <w:r>
+              <w:t xml:space="preserve">C:\...\LAB2&gt; rd /s /q copy1</w:t>
+            </w:r>
+          </w:p>
+          <w:p>
+            <w:pPr>
+              <w:pStyle w:val="SourceCode"/>
+              <w:spacing w:before="0" w:after="0" w:line="200" w:lineRule="auto"/>
+            </w:pPr>
+            <w:r>
+              <w:t xml:space="preserve">C:\...\LAB2&gt; dir /a:d /b</w:t>
+            </w:r>
+          </w:p>
+          <w:p>
+            <w:pPr>
+              <w:pStyle w:val="SourceCode"/>
+              <w:spacing w:before="0" w:after="0" w:line="200" w:lineRule="auto"/>
+            </w:pPr>
+            <w:r>
+              <w:t xml:space="preserve">bak</w:t>
+            </w:r>
+          </w:p>
+          <w:p>
+            <w:pPr>
+              <w:pStyle w:val="SourceCode"/>
+              <w:spacing w:before="0" w:after="0" w:line="200" w:lineRule="auto"/>
+            </w:pPr>
+            <w:r>
+              <w:t xml:space="preserve">copy2</w:t>
+            </w:r>
+          </w:p>
+          <w:p>
+            <w:pPr>
+              <w:pStyle w:val="SourceCode"/>
+              <w:spacing w:before="0" w:after="0" w:line="200" w:lineRule="auto"/>
+            </w:pPr>
+            <w:r>
+              <w:t xml:space="preserve">copy3</w:t>
+            </w:r>
+          </w:p>
+          <w:p>
+            <w:pPr>
+              <w:pStyle w:val="SourceCode"/>
+              <w:spacing w:before="0" w:after="0" w:line="200" w:lineRule="auto"/>
+            </w:pPr>
+            <w:r>
+              <w:t xml:space="preserve">docs</w:t>
+            </w:r>
+          </w:p>
+          <w:p>
+            <w:pPr>
+              <w:pStyle w:val="SourceCode"/>
+              <w:spacing w:before="0" w:after="0" w:line="200" w:lineRule="auto"/>
+            </w:pPr>
+            <w:r>
+              <w:t xml:space="preserve">src</w:t>
+            </w:r>
+          </w:p>
+          <w:p>
+            <w:pPr>
+              <w:pStyle w:val="SourceCode"/>
+              <w:spacing w:before="0" w:after="0" w:line="200" w:lineRule="auto"/>
+            </w:pPr>
+            <w:r>
+              <w:t xml:space="preserve">test folder</w:t>
+            </w:r>
+          </w:p>
+        </w:tc>
+      </w:tr>
+    </w:tbl>
+    <w:p>
+      <w:pPr>
+        <w:spacing w:before="0" w:after="0" w:line="120" w:lineRule="exact"/>
         <w:rPr>
-          <w:rStyle w:val="VerbatimChar"/>
+          <w:sz w:val="4"/>
+          <w:szCs w:val="4"/>
         </w:rPr>
-        <w:t xml:space="preserve">C:\...\copy1&gt; del "Windows Ringin.bak"</w:t>
-      </w:r>
-      <w:r>
-        <w:br/>
-      </w:r>
-      <w:r>
-        <w:rPr>
-          <w:rStyle w:val="VerbatimChar"/>
-        </w:rPr>
-        <w:t xml:space="preserve">C:\...\copy1\Windows Ringin.bak</w:t>
-      </w:r>
-      <w:r>
-        <w:br/>
-      </w:r>
-      <w:r>
-        <w:rPr>
-          <w:rStyle w:val="VerbatimChar"/>
-        </w:rPr>
-        <w:t xml:space="preserve">Access is denied.</w:t>
-      </w:r>
-    </w:p>
-    <w:p>
-      <w:pPr>
-        <w:pStyle w:val="SourceCode"/>
-      </w:pPr>
-      <w:r>
-        <w:rPr>
-          <w:rStyle w:val="VerbatimChar"/>
-        </w:rPr>
-        <w:t xml:space="preserve">C:\...\copy1&gt; del /f "Windows Ringin.bak"</w:t>
-      </w:r>
-      <w:r>
-        <w:br/>
-      </w:r>
-      <w:r>
-        <w:rPr>
-          <w:rStyle w:val="VerbatimChar"/>
-        </w:rPr>
-        <w:t xml:space="preserve">C:\...\copy1&gt; cd ..</w:t>
-      </w:r>
-      <w:r>
-        <w:br/>
-      </w:r>
-      <w:r>
-        <w:rPr>
-          <w:rStyle w:val="VerbatimChar"/>
-        </w:rPr>
-        <w:t xml:space="preserve">C:\...\LAB2&gt; rd /s /q copy1</w:t>
-      </w:r>
-      <w:r>
-        <w:br/>
-      </w:r>
-      <w:r>
-        <w:rPr>
-          <w:rStyle w:val="VerbatimChar"/>
-        </w:rPr>
-        <w:t xml:space="preserve">C:\...\LAB2&gt; dir /a:d /b</w:t>
-      </w:r>
-      <w:r>
-        <w:br/>
-      </w:r>
-      <w:r>
-        <w:rPr>
-          <w:rStyle w:val="VerbatimChar"/>
-        </w:rPr>
-        <w:t xml:space="preserve">bak</w:t>
-      </w:r>
-      <w:r>
-        <w:br/>
-      </w:r>
-      <w:r>
-        <w:rPr>
-          <w:rStyle w:val="VerbatimChar"/>
-        </w:rPr>
-        <w:t xml:space="preserve">copy2</w:t>
-      </w:r>
-      <w:r>
-        <w:br/>
-      </w:r>
-      <w:r>
-        <w:rPr>
-          <w:rStyle w:val="VerbatimChar"/>
-        </w:rPr>
-        <w:t xml:space="preserve">copy3</w:t>
-      </w:r>
-      <w:r>
-        <w:br/>
-      </w:r>
-      <w:r>
-        <w:rPr>
-          <w:rStyle w:val="VerbatimChar"/>
-        </w:rPr>
-        <w:t xml:space="preserve">docs</w:t>
-      </w:r>
-      <w:r>
-        <w:br/>
-      </w:r>
-      <w:r>
-        <w:rPr>
-          <w:rStyle w:val="VerbatimChar"/>
-        </w:rPr>
-        <w:t xml:space="preserve">src</w:t>
-      </w:r>
-      <w:r>
-        <w:br/>
-      </w:r>
-      <w:r>
-        <w:rPr>
-          <w:rStyle w:val="VerbatimChar"/>
-        </w:rPr>
-        <w:t xml:space="preserve">test folder</w:t>
-      </w:r>
+      </w:pPr>
     </w:p>
     <w:p>
       <w:pPr>
@@ -2796,155 +4027,351 @@
     </w:p>
     <w:p>
       <w:pPr>
-        <w:pStyle w:val="SourceCode"/>
-      </w:pPr>
-      <w:r>
+        <w:spacing w:before="0" w:after="0" w:line="120" w:lineRule="exact"/>
         <w:rPr>
-          <w:rStyle w:val="VerbatimChar"/>
+          <w:sz w:val="4"/>
+          <w:szCs w:val="4"/>
         </w:rPr>
-        <w:t xml:space="preserve">C:\...\LAB2&gt; dir src /s /b &gt; docs\listing.txt</w:t>
-      </w:r>
-      <w:r>
-        <w:br/>
-      </w:r>
-      <w:r>
+      </w:pPr>
+    </w:p>
+    <w:tbl>
+      <w:tblPr>
+        <w:tblStyle w:val="SourceCodeTable"/>
+        <w:tblW w:type="dxa" w:w="9637"/>
+        <w:tblInd w:w="0" w:type="dxa"/>
+        <w:tblBorders>
+          <w:top w:color="BFBFBF" w:space="0" w:sz="4" w:val="single"/>
+          <w:left w:color="BFBFBF" w:space="0" w:sz="4" w:val="single"/>
+          <w:bottom w:color="BFBFBF" w:space="0" w:sz="4" w:val="single"/>
+          <w:right w:color="BFBFBF" w:space="0" w:sz="4" w:val="single"/>
+        </w:tblBorders>
+        <w:shd w:color="auto" w:fill="F4F4F4" w:val="clear"/>
+        <w:tblLayout w:type="fixed"/>
+        <w:tblCellMar>
+          <w:top w:type="dxa" w:w="113"/>
+          <w:left w:type="dxa" w:w="113"/>
+          <w:bottom w:type="dxa" w:w="113"/>
+          <w:right w:type="dxa" w:w="113"/>
+        </w:tblCellMar>
+        <w:tblLook w:val="0000" w:firstRow="0" w:lastRow="0" w:firstColumn="0" w:lastColumn="0" w:noHBand="1" w:noVBand="1"/>
+      </w:tblPr>
+      <w:tblGrid>
+        <w:gridCol w:w="9637"/>
+      </w:tblGrid>
+      <w:tr>
+        <w:tc>
+          <w:tcPr>
+            <w:tcW w:type="dxa" w:w="9637"/>
+            <w:shd w:color="auto" w:fill="F4F4F4" w:val="clear"/>
+          </w:tcPr>
+          <w:p>
+            <w:pPr>
+              <w:pStyle w:val="SourceCode"/>
+              <w:spacing w:before="0" w:after="0" w:line="200" w:lineRule="auto"/>
+            </w:pPr>
+            <w:r>
+              <w:t xml:space="preserve">C:\...\LAB2&gt; dir src /s /b &gt; docs\listing.txt</w:t>
+            </w:r>
+          </w:p>
+          <w:p>
+            <w:pPr>
+              <w:pStyle w:val="SourceCode"/>
+              <w:spacing w:before="0" w:after="0" w:line="200" w:lineRule="auto"/>
+            </w:pPr>
+            <w:r>
+              <w:t xml:space="preserve">C:\...\LAB2&gt; find /c ".wav" docs\listing.txt</w:t>
+            </w:r>
+          </w:p>
+          <w:p>
+            <w:pPr>
+              <w:pStyle w:val="SourceCode"/>
+              <w:spacing w:before="0" w:after="0" w:line="200" w:lineRule="auto"/>
+            </w:pPr>
+            <w:r>
+              <w:t xml:space="preserve">---------- DOCS\LISTING.TXT: 70</w:t>
+            </w:r>
+          </w:p>
+        </w:tc>
+      </w:tr>
+    </w:tbl>
+    <w:p>
+      <w:pPr>
+        <w:spacing w:before="0" w:after="0" w:line="120" w:lineRule="exact"/>
         <w:rPr>
-          <w:rStyle w:val="VerbatimChar"/>
+          <w:sz w:val="4"/>
+          <w:szCs w:val="4"/>
         </w:rPr>
-        <w:t xml:space="preserve">C:\...\LAB2&gt; find /c ".wav" docs\listing.txt</w:t>
-      </w:r>
-      <w:r>
-        <w:br/>
-      </w:r>
-      <w:r>
+      </w:pPr>
+    </w:p>
+    <w:p>
+      <w:pPr>
+        <w:spacing w:before="0" w:after="0" w:line="120" w:lineRule="exact"/>
         <w:rPr>
-          <w:rStyle w:val="VerbatimChar"/>
+          <w:sz w:val="4"/>
+          <w:szCs w:val="4"/>
         </w:rPr>
-        <w:t xml:space="preserve">---------- DOCS\LISTING.TXT: 70</w:t>
-      </w:r>
-    </w:p>
-    <w:p>
-      <w:pPr>
-        <w:pStyle w:val="SourceCode"/>
-      </w:pPr>
-      <w:r>
+      </w:pPr>
+    </w:p>
+    <w:tbl>
+      <w:tblPr>
+        <w:tblStyle w:val="SourceCodeTable"/>
+        <w:tblW w:type="dxa" w:w="9637"/>
+        <w:tblInd w:w="0" w:type="dxa"/>
+        <w:tblBorders>
+          <w:top w:color="BFBFBF" w:space="0" w:sz="4" w:val="single"/>
+          <w:left w:color="BFBFBF" w:space="0" w:sz="4" w:val="single"/>
+          <w:bottom w:color="BFBFBF" w:space="0" w:sz="4" w:val="single"/>
+          <w:right w:color="BFBFBF" w:space="0" w:sz="4" w:val="single"/>
+        </w:tblBorders>
+        <w:shd w:color="auto" w:fill="F4F4F4" w:val="clear"/>
+        <w:tblLayout w:type="fixed"/>
+        <w:tblCellMar>
+          <w:top w:type="dxa" w:w="113"/>
+          <w:left w:type="dxa" w:w="113"/>
+          <w:bottom w:type="dxa" w:w="113"/>
+          <w:right w:type="dxa" w:w="113"/>
+        </w:tblCellMar>
+        <w:tblLook w:val="0000" w:firstRow="0" w:lastRow="0" w:firstColumn="0" w:lastColumn="0" w:noHBand="1" w:noVBand="1"/>
+      </w:tblPr>
+      <w:tblGrid>
+        <w:gridCol w:w="9637"/>
+      </w:tblGrid>
+      <w:tr>
+        <w:tc>
+          <w:tcPr>
+            <w:tcW w:type="dxa" w:w="9637"/>
+            <w:shd w:color="auto" w:fill="F4F4F4" w:val="clear"/>
+          </w:tcPr>
+          <w:p>
+            <w:pPr>
+              <w:pStyle w:val="SourceCode"/>
+              <w:spacing w:before="0" w:after="0" w:line="200" w:lineRule="auto"/>
+            </w:pPr>
+            <w:r>
+              <w:t xml:space="preserve">C:\...\LAB2&gt; findstr /i /n "alarm" docs\listing.txt</w:t>
+            </w:r>
+          </w:p>
+          <w:p>
+            <w:pPr>
+              <w:pStyle w:val="SourceCode"/>
+              <w:spacing w:before="0" w:after="0" w:line="200" w:lineRule="auto"/>
+            </w:pPr>
+            <w:r>
+              <w:t xml:space="preserve">3:C:\Users\Student\Desktop\LAB2\src\Alarm01.wav</w:t>
+            </w:r>
+          </w:p>
+          <w:p>
+            <w:pPr>
+              <w:pStyle w:val="SourceCode"/>
+              <w:spacing w:before="0" w:after="0" w:line="200" w:lineRule="auto"/>
+            </w:pPr>
+            <w:r>
+              <w:t xml:space="preserve">4:C:\Users\Student\Desktop\LAB2\src\Alarm02.wav</w:t>
+            </w:r>
+          </w:p>
+          <w:p>
+            <w:pPr>
+              <w:pStyle w:val="SourceCode"/>
+              <w:spacing w:before="0" w:after="0" w:line="200" w:lineRule="auto"/>
+            </w:pPr>
+            <w:r>
+              <w:t xml:space="preserve">...</w:t>
+            </w:r>
+          </w:p>
+        </w:tc>
+      </w:tr>
+    </w:tbl>
+    <w:p>
+      <w:pPr>
+        <w:spacing w:before="0" w:after="0" w:line="120" w:lineRule="exact"/>
         <w:rPr>
-          <w:rStyle w:val="VerbatimChar"/>
+          <w:sz w:val="4"/>
+          <w:szCs w:val="4"/>
         </w:rPr>
-        <w:t xml:space="preserve">C:\...\LAB2&gt; findstr /i /n "alarm" docs\listing.txt</w:t>
-      </w:r>
-      <w:r>
-        <w:br/>
-      </w:r>
-      <w:r>
+      </w:pPr>
+    </w:p>
+    <w:p>
+      <w:pPr>
+        <w:spacing w:before="0" w:after="0" w:line="120" w:lineRule="exact"/>
         <w:rPr>
-          <w:rStyle w:val="VerbatimChar"/>
+          <w:sz w:val="4"/>
+          <w:szCs w:val="4"/>
         </w:rPr>
-        <w:t xml:space="preserve">3:C:\Users\Student\Desktop\LAB2\src\Alarm01.wav</w:t>
-      </w:r>
-      <w:r>
-        <w:br/>
-      </w:r>
-      <w:r>
+      </w:pPr>
+    </w:p>
+    <w:tbl>
+      <w:tblPr>
+        <w:tblStyle w:val="SourceCodeTable"/>
+        <w:tblW w:type="dxa" w:w="9637"/>
+        <w:tblInd w:w="0" w:type="dxa"/>
+        <w:tblBorders>
+          <w:top w:color="BFBFBF" w:space="0" w:sz="4" w:val="single"/>
+          <w:left w:color="BFBFBF" w:space="0" w:sz="4" w:val="single"/>
+          <w:bottom w:color="BFBFBF" w:space="0" w:sz="4" w:val="single"/>
+          <w:right w:color="BFBFBF" w:space="0" w:sz="4" w:val="single"/>
+        </w:tblBorders>
+        <w:shd w:color="auto" w:fill="F4F4F4" w:val="clear"/>
+        <w:tblLayout w:type="fixed"/>
+        <w:tblCellMar>
+          <w:top w:type="dxa" w:w="113"/>
+          <w:left w:type="dxa" w:w="113"/>
+          <w:bottom w:type="dxa" w:w="113"/>
+          <w:right w:type="dxa" w:w="113"/>
+        </w:tblCellMar>
+        <w:tblLook w:val="0000" w:firstRow="0" w:lastRow="0" w:firstColumn="0" w:lastColumn="0" w:noHBand="1" w:noVBand="1"/>
+      </w:tblPr>
+      <w:tblGrid>
+        <w:gridCol w:w="9637"/>
+      </w:tblGrid>
+      <w:tr>
+        <w:tc>
+          <w:tcPr>
+            <w:tcW w:type="dxa" w:w="9637"/>
+            <w:shd w:color="auto" w:fill="F4F4F4" w:val="clear"/>
+          </w:tcPr>
+          <w:p>
+            <w:pPr>
+              <w:pStyle w:val="SourceCode"/>
+              <w:spacing w:before="0" w:after="0" w:line="200" w:lineRule="auto"/>
+            </w:pPr>
+            <w:r>
+              <w:t xml:space="preserve">C:\...\LAB2&gt; echo Звіт сформовано &gt;&gt; docs\listing.txt</w:t>
+            </w:r>
+          </w:p>
+          <w:p>
+            <w:pPr>
+              <w:pStyle w:val="SourceCode"/>
+              <w:spacing w:before="0" w:after="0" w:line="200" w:lineRule="auto"/>
+            </w:pPr>
+            <w:r>
+              <w:t xml:space="preserve">C:\...\LAB2&gt; dir nosuchfile.txt 2&gt; docs\errors.txt</w:t>
+            </w:r>
+          </w:p>
+          <w:p>
+            <w:pPr>
+              <w:pStyle w:val="SourceCode"/>
+              <w:spacing w:before="0" w:after="0" w:line="200" w:lineRule="auto"/>
+            </w:pPr>
+            <w:r>
+              <w:t xml:space="preserve">C:\...\LAB2&gt; type docs\errors.txt</w:t>
+            </w:r>
+          </w:p>
+          <w:p>
+            <w:pPr>
+              <w:pStyle w:val="SourceCode"/>
+              <w:spacing w:before="0" w:after="0" w:line="200" w:lineRule="auto"/>
+            </w:pPr>
+            <w:r>
+              <w:t xml:space="preserve">File Not Found</w:t>
+            </w:r>
+          </w:p>
+        </w:tc>
+      </w:tr>
+    </w:tbl>
+    <w:p>
+      <w:pPr>
+        <w:spacing w:before="0" w:after="0" w:line="120" w:lineRule="exact"/>
         <w:rPr>
-          <w:rStyle w:val="VerbatimChar"/>
+          <w:sz w:val="4"/>
+          <w:szCs w:val="4"/>
         </w:rPr>
-        <w:t xml:space="preserve">4:C:\Users\Student\Desktop\LAB2\src\Alarm02.wav</w:t>
-      </w:r>
-      <w:r>
-        <w:br/>
-      </w:r>
-      <w:r>
+      </w:pPr>
+    </w:p>
+    <w:p>
+      <w:pPr>
+        <w:spacing w:before="0" w:after="0" w:line="120" w:lineRule="exact"/>
         <w:rPr>
-          <w:rStyle w:val="VerbatimChar"/>
+          <w:sz w:val="4"/>
+          <w:szCs w:val="4"/>
         </w:rPr>
-        <w:t xml:space="preserve">...</w:t>
-      </w:r>
-    </w:p>
-    <w:p>
-      <w:pPr>
-        <w:pStyle w:val="SourceCode"/>
-      </w:pPr>
-      <w:r>
+      </w:pPr>
+    </w:p>
+    <w:tbl>
+      <w:tblPr>
+        <w:tblStyle w:val="SourceCodeTable"/>
+        <w:tblW w:type="dxa" w:w="9637"/>
+        <w:tblInd w:w="0" w:type="dxa"/>
+        <w:tblBorders>
+          <w:top w:color="BFBFBF" w:space="0" w:sz="4" w:val="single"/>
+          <w:left w:color="BFBFBF" w:space="0" w:sz="4" w:val="single"/>
+          <w:bottom w:color="BFBFBF" w:space="0" w:sz="4" w:val="single"/>
+          <w:right w:color="BFBFBF" w:space="0" w:sz="4" w:val="single"/>
+        </w:tblBorders>
+        <w:shd w:color="auto" w:fill="F4F4F4" w:val="clear"/>
+        <w:tblLayout w:type="fixed"/>
+        <w:tblCellMar>
+          <w:top w:type="dxa" w:w="113"/>
+          <w:left w:type="dxa" w:w="113"/>
+          <w:bottom w:type="dxa" w:w="113"/>
+          <w:right w:type="dxa" w:w="113"/>
+        </w:tblCellMar>
+        <w:tblLook w:val="0000" w:firstRow="0" w:lastRow="0" w:firstColumn="0" w:lastColumn="0" w:noHBand="1" w:noVBand="1"/>
+      </w:tblPr>
+      <w:tblGrid>
+        <w:gridCol w:w="9637"/>
+      </w:tblGrid>
+      <w:tr>
+        <w:tc>
+          <w:tcPr>
+            <w:tcW w:type="dxa" w:w="9637"/>
+            <w:shd w:color="auto" w:fill="F4F4F4" w:val="clear"/>
+          </w:tcPr>
+          <w:p>
+            <w:pPr>
+              <w:pStyle w:val="SourceCode"/>
+              <w:spacing w:before="0" w:after="0" w:line="200" w:lineRule="auto"/>
+            </w:pPr>
+            <w:r>
+              <w:t xml:space="preserve">C:\...\LAB2&gt; type nul &gt; docs\empty.txt</w:t>
+            </w:r>
+          </w:p>
+          <w:p>
+            <w:pPr>
+              <w:pStyle w:val="SourceCode"/>
+              <w:spacing w:before="0" w:after="0" w:line="200" w:lineRule="auto"/>
+            </w:pPr>
+            <w:r>
+              <w:t xml:space="preserve">C:\...\LAB2&gt; dir docs /b</w:t>
+            </w:r>
+          </w:p>
+          <w:p>
+            <w:pPr>
+              <w:pStyle w:val="SourceCode"/>
+              <w:spacing w:before="0" w:after="0" w:line="200" w:lineRule="auto"/>
+            </w:pPr>
+            <w:r>
+              <w:t xml:space="preserve">empty.txt</w:t>
+            </w:r>
+          </w:p>
+          <w:p>
+            <w:pPr>
+              <w:pStyle w:val="SourceCode"/>
+              <w:spacing w:before="0" w:after="0" w:line="200" w:lineRule="auto"/>
+            </w:pPr>
+            <w:r>
+              <w:t xml:space="preserve">errors.txt</w:t>
+            </w:r>
+          </w:p>
+          <w:p>
+            <w:pPr>
+              <w:pStyle w:val="SourceCode"/>
+              <w:spacing w:before="0" w:after="0" w:line="200" w:lineRule="auto"/>
+            </w:pPr>
+            <w:r>
+              <w:t xml:space="preserve">listing.txt</w:t>
+            </w:r>
+          </w:p>
+        </w:tc>
+      </w:tr>
+    </w:tbl>
+    <w:p>
+      <w:pPr>
+        <w:spacing w:before="0" w:after="0" w:line="120" w:lineRule="exact"/>
         <w:rPr>
-          <w:rStyle w:val="VerbatimChar"/>
+          <w:sz w:val="4"/>
+          <w:szCs w:val="4"/>
         </w:rPr>
-        <w:t xml:space="preserve">C:\...\LAB2&gt; echo Звіт сформовано &gt;&gt; docs\listing.txt</w:t>
-      </w:r>
-      <w:r>
-        <w:br/>
-      </w:r>
-      <w:r>
-        <w:rPr>
-          <w:rStyle w:val="VerbatimChar"/>
-        </w:rPr>
-        <w:t xml:space="preserve">C:\...\LAB2&gt; dir nosuchfile.txt 2&gt; docs\errors.txt</w:t>
-      </w:r>
-      <w:r>
-        <w:br/>
-      </w:r>
-      <w:r>
-        <w:rPr>
-          <w:rStyle w:val="VerbatimChar"/>
-        </w:rPr>
-        <w:t xml:space="preserve">C:\...\LAB2&gt; type docs\errors.txt</w:t>
-      </w:r>
-      <w:r>
-        <w:br/>
-      </w:r>
-      <w:r>
-        <w:rPr>
-          <w:rStyle w:val="VerbatimChar"/>
-        </w:rPr>
-        <w:t xml:space="preserve">File Not Found</w:t>
-      </w:r>
-    </w:p>
-    <w:p>
-      <w:pPr>
-        <w:pStyle w:val="SourceCode"/>
-      </w:pPr>
-      <w:r>
-        <w:rPr>
-          <w:rStyle w:val="VerbatimChar"/>
-        </w:rPr>
-        <w:t xml:space="preserve">C:\...\LAB2&gt; type nul &gt; docs\empty.txt</w:t>
-      </w:r>
-      <w:r>
-        <w:br/>
-      </w:r>
-      <w:r>
-        <w:rPr>
-          <w:rStyle w:val="VerbatimChar"/>
-        </w:rPr>
-        <w:t xml:space="preserve">C:\...\LAB2&gt; dir docs /b</w:t>
-      </w:r>
-      <w:r>
-        <w:br/>
-      </w:r>
-      <w:r>
-        <w:rPr>
-          <w:rStyle w:val="VerbatimChar"/>
-        </w:rPr>
-        <w:t xml:space="preserve">empty.txt</w:t>
-      </w:r>
-      <w:r>
-        <w:br/>
-      </w:r>
-      <w:r>
-        <w:rPr>
-          <w:rStyle w:val="VerbatimChar"/>
-        </w:rPr>
-        <w:t xml:space="preserve">errors.txt</w:t>
-      </w:r>
-      <w:r>
-        <w:br/>
-      </w:r>
-      <w:r>
-        <w:rPr>
-          <w:rStyle w:val="VerbatimChar"/>
-        </w:rPr>
-        <w:t xml:space="preserve">listing.txt</w:t>
-      </w:r>
+      </w:pPr>
     </w:p>
     <w:bookmarkEnd w:id="24"/>
     <w:bookmarkStart w:id="25" w:name="крок-6.-те-саме-в-powershell"/>
@@ -2958,119 +4385,315 @@
     </w:p>
     <w:p>
       <w:pPr>
-        <w:pStyle w:val="SourceCode"/>
-      </w:pPr>
-      <w:r>
+        <w:spacing w:before="0" w:after="0" w:line="120" w:lineRule="exact"/>
         <w:rPr>
-          <w:rStyle w:val="VerbatimChar"/>
+          <w:sz w:val="4"/>
+          <w:szCs w:val="4"/>
         </w:rPr>
-        <w:t xml:space="preserve">PS C:\...\LAB2&gt; Get-ChildItem src -Recurse -File |</w:t>
-      </w:r>
-      <w:r>
-        <w:br/>
-      </w:r>
-      <w:r>
+      </w:pPr>
+    </w:p>
+    <w:tbl>
+      <w:tblPr>
+        <w:tblStyle w:val="SourceCodeTable"/>
+        <w:tblW w:type="dxa" w:w="9637"/>
+        <w:tblInd w:w="0" w:type="dxa"/>
+        <w:tblBorders>
+          <w:top w:color="BFBFBF" w:space="0" w:sz="4" w:val="single"/>
+          <w:left w:color="BFBFBF" w:space="0" w:sz="4" w:val="single"/>
+          <w:bottom w:color="BFBFBF" w:space="0" w:sz="4" w:val="single"/>
+          <w:right w:color="BFBFBF" w:space="0" w:sz="4" w:val="single"/>
+        </w:tblBorders>
+        <w:shd w:color="auto" w:fill="F4F4F4" w:val="clear"/>
+        <w:tblLayout w:type="fixed"/>
+        <w:tblCellMar>
+          <w:top w:type="dxa" w:w="113"/>
+          <w:left w:type="dxa" w:w="113"/>
+          <w:bottom w:type="dxa" w:w="113"/>
+          <w:right w:type="dxa" w:w="113"/>
+        </w:tblCellMar>
+        <w:tblLook w:val="0000" w:firstRow="0" w:lastRow="0" w:firstColumn="0" w:lastColumn="0" w:noHBand="1" w:noVBand="1"/>
+      </w:tblPr>
+      <w:tblGrid>
+        <w:gridCol w:w="9637"/>
+      </w:tblGrid>
+      <w:tr>
+        <w:tc>
+          <w:tcPr>
+            <w:tcW w:type="dxa" w:w="9637"/>
+            <w:shd w:color="auto" w:fill="F4F4F4" w:val="clear"/>
+          </w:tcPr>
+          <w:p>
+            <w:pPr>
+              <w:pStyle w:val="SourceCode"/>
+              <w:spacing w:before="0" w:after="0" w:line="200" w:lineRule="auto"/>
+            </w:pPr>
+            <w:r>
+              <w:t xml:space="preserve">PS C:\...\LAB2&gt; Get-ChildItem src -Recurse -File |</w:t>
+            </w:r>
+          </w:p>
+          <w:p>
+            <w:pPr>
+              <w:pStyle w:val="SourceCode"/>
+              <w:spacing w:before="0" w:after="0" w:line="200" w:lineRule="auto"/>
+            </w:pPr>
+            <w:r>
+              <w:t xml:space="preserve">&gt;&gt;     Measure-Object -Property Length -Sum</w:t>
+            </w:r>
+          </w:p>
+        </w:tc>
+      </w:tr>
+    </w:tbl>
+    <w:p>
+      <w:pPr>
+        <w:spacing w:before="0" w:after="0" w:line="120" w:lineRule="exact"/>
         <w:rPr>
-          <w:rStyle w:val="VerbatimChar"/>
+          <w:sz w:val="4"/>
+          <w:szCs w:val="4"/>
         </w:rPr>
-        <w:t xml:space="preserve">&gt;&gt;     Measure-Object -Property Length -Sum</w:t>
-      </w:r>
-    </w:p>
-    <w:p>
-      <w:pPr>
-        <w:pStyle w:val="SourceCode"/>
-      </w:pPr>
-      <w:r>
+      </w:pPr>
+    </w:p>
+    <w:p>
+      <w:pPr>
+        <w:spacing w:before="0" w:after="0" w:line="120" w:lineRule="exact"/>
         <w:rPr>
-          <w:rStyle w:val="VerbatimChar"/>
+          <w:sz w:val="4"/>
+          <w:szCs w:val="4"/>
         </w:rPr>
-        <w:t xml:space="preserve">Count    : 70</w:t>
-      </w:r>
-      <w:r>
-        <w:br/>
-      </w:r>
-      <w:r>
+      </w:pPr>
+    </w:p>
+    <w:tbl>
+      <w:tblPr>
+        <w:tblStyle w:val="SourceCodeTable"/>
+        <w:tblW w:type="dxa" w:w="9637"/>
+        <w:tblInd w:w="0" w:type="dxa"/>
+        <w:tblBorders>
+          <w:top w:color="BFBFBF" w:space="0" w:sz="4" w:val="single"/>
+          <w:left w:color="BFBFBF" w:space="0" w:sz="4" w:val="single"/>
+          <w:bottom w:color="BFBFBF" w:space="0" w:sz="4" w:val="single"/>
+          <w:right w:color="BFBFBF" w:space="0" w:sz="4" w:val="single"/>
+        </w:tblBorders>
+        <w:shd w:color="auto" w:fill="F4F4F4" w:val="clear"/>
+        <w:tblLayout w:type="fixed"/>
+        <w:tblCellMar>
+          <w:top w:type="dxa" w:w="113"/>
+          <w:left w:type="dxa" w:w="113"/>
+          <w:bottom w:type="dxa" w:w="113"/>
+          <w:right w:type="dxa" w:w="113"/>
+        </w:tblCellMar>
+        <w:tblLook w:val="0000" w:firstRow="0" w:lastRow="0" w:firstColumn="0" w:lastColumn="0" w:noHBand="1" w:noVBand="1"/>
+      </w:tblPr>
+      <w:tblGrid>
+        <w:gridCol w:w="9637"/>
+      </w:tblGrid>
+      <w:tr>
+        <w:tc>
+          <w:tcPr>
+            <w:tcW w:type="dxa" w:w="9637"/>
+            <w:shd w:color="auto" w:fill="F4F4F4" w:val="clear"/>
+          </w:tcPr>
+          <w:p>
+            <w:pPr>
+              <w:pStyle w:val="SourceCode"/>
+              <w:spacing w:before="0" w:after="0" w:line="200" w:lineRule="auto"/>
+            </w:pPr>
+            <w:r>
+              <w:t xml:space="preserve">Count    : 70</w:t>
+            </w:r>
+          </w:p>
+          <w:p>
+            <w:pPr>
+              <w:pStyle w:val="SourceCode"/>
+              <w:spacing w:before="0" w:after="0" w:line="200" w:lineRule="auto"/>
+            </w:pPr>
+            <w:r>
+              <w:t xml:space="preserve">Sum      : 12648174</w:t>
+            </w:r>
+          </w:p>
+        </w:tc>
+      </w:tr>
+    </w:tbl>
+    <w:p>
+      <w:pPr>
+        <w:spacing w:before="0" w:after="0" w:line="120" w:lineRule="exact"/>
         <w:rPr>
-          <w:rStyle w:val="VerbatimChar"/>
+          <w:sz w:val="4"/>
+          <w:szCs w:val="4"/>
         </w:rPr>
-        <w:t xml:space="preserve">Sum      : 12648174</w:t>
-      </w:r>
-    </w:p>
-    <w:p>
-      <w:pPr>
-        <w:pStyle w:val="SourceCode"/>
-      </w:pPr>
-      <w:r>
+      </w:pPr>
+    </w:p>
+    <w:p>
+      <w:pPr>
+        <w:spacing w:before="0" w:after="0" w:line="120" w:lineRule="exact"/>
         <w:rPr>
-          <w:rStyle w:val="VerbatimChar"/>
+          <w:sz w:val="4"/>
+          <w:szCs w:val="4"/>
         </w:rPr>
-        <w:t xml:space="preserve">PS C:\...\LAB2&gt; Get-ChildItem src -Recurse -File |</w:t>
-      </w:r>
-      <w:r>
-        <w:br/>
-      </w:r>
-      <w:r>
+      </w:pPr>
+    </w:p>
+    <w:tbl>
+      <w:tblPr>
+        <w:tblStyle w:val="SourceCodeTable"/>
+        <w:tblW w:type="dxa" w:w="9637"/>
+        <w:tblInd w:w="0" w:type="dxa"/>
+        <w:tblBorders>
+          <w:top w:color="BFBFBF" w:space="0" w:sz="4" w:val="single"/>
+          <w:left w:color="BFBFBF" w:space="0" w:sz="4" w:val="single"/>
+          <w:bottom w:color="BFBFBF" w:space="0" w:sz="4" w:val="single"/>
+          <w:right w:color="BFBFBF" w:space="0" w:sz="4" w:val="single"/>
+        </w:tblBorders>
+        <w:shd w:color="auto" w:fill="F4F4F4" w:val="clear"/>
+        <w:tblLayout w:type="fixed"/>
+        <w:tblCellMar>
+          <w:top w:type="dxa" w:w="113"/>
+          <w:left w:type="dxa" w:w="113"/>
+          <w:bottom w:type="dxa" w:w="113"/>
+          <w:right w:type="dxa" w:w="113"/>
+        </w:tblCellMar>
+        <w:tblLook w:val="0000" w:firstRow="0" w:lastRow="0" w:firstColumn="0" w:lastColumn="0" w:noHBand="1" w:noVBand="1"/>
+      </w:tblPr>
+      <w:tblGrid>
+        <w:gridCol w:w="9637"/>
+      </w:tblGrid>
+      <w:tr>
+        <w:tc>
+          <w:tcPr>
+            <w:tcW w:type="dxa" w:w="9637"/>
+            <w:shd w:color="auto" w:fill="F4F4F4" w:val="clear"/>
+          </w:tcPr>
+          <w:p>
+            <w:pPr>
+              <w:pStyle w:val="SourceCode"/>
+              <w:spacing w:before="0" w:after="0" w:line="200" w:lineRule="auto"/>
+            </w:pPr>
+            <w:r>
+              <w:t xml:space="preserve">PS C:\...\LAB2&gt; Get-ChildItem src -Recurse -File |</w:t>
+            </w:r>
+          </w:p>
+          <w:p>
+            <w:pPr>
+              <w:pStyle w:val="SourceCode"/>
+              <w:spacing w:before="0" w:after="0" w:line="200" w:lineRule="auto"/>
+            </w:pPr>
+            <w:r>
+              <w:t xml:space="preserve">&gt;&gt;     Sort-Object Length -Descending |</w:t>
+            </w:r>
+          </w:p>
+          <w:p>
+            <w:pPr>
+              <w:pStyle w:val="SourceCode"/>
+              <w:spacing w:before="0" w:after="0" w:line="200" w:lineRule="auto"/>
+            </w:pPr>
+            <w:r>
+              <w:t xml:space="preserve">&gt;&gt;     Select-Object -First 3 Name, Length</w:t>
+            </w:r>
+          </w:p>
+        </w:tc>
+      </w:tr>
+    </w:tbl>
+    <w:p>
+      <w:pPr>
+        <w:spacing w:before="0" w:after="0" w:line="120" w:lineRule="exact"/>
         <w:rPr>
-          <w:rStyle w:val="VerbatimChar"/>
+          <w:sz w:val="4"/>
+          <w:szCs w:val="4"/>
         </w:rPr>
-        <w:t xml:space="preserve">&gt;&gt;     Sort-Object Length -Descending |</w:t>
-      </w:r>
-      <w:r>
-        <w:br/>
-      </w:r>
-      <w:r>
+      </w:pPr>
+    </w:p>
+    <w:p>
+      <w:pPr>
+        <w:spacing w:before="0" w:after="0" w:line="120" w:lineRule="exact"/>
         <w:rPr>
-          <w:rStyle w:val="VerbatimChar"/>
+          <w:sz w:val="4"/>
+          <w:szCs w:val="4"/>
         </w:rPr>
-        <w:t xml:space="preserve">&gt;&gt;     Select-Object -First 3 Name, Length</w:t>
-      </w:r>
-    </w:p>
-    <w:p>
-      <w:pPr>
-        <w:pStyle w:val="SourceCode"/>
-      </w:pPr>
-      <w:r>
+      </w:pPr>
+    </w:p>
+    <w:tbl>
+      <w:tblPr>
+        <w:tblStyle w:val="SourceCodeTable"/>
+        <w:tblW w:type="dxa" w:w="9637"/>
+        <w:tblInd w:w="0" w:type="dxa"/>
+        <w:tblBorders>
+          <w:top w:color="BFBFBF" w:space="0" w:sz="4" w:val="single"/>
+          <w:left w:color="BFBFBF" w:space="0" w:sz="4" w:val="single"/>
+          <w:bottom w:color="BFBFBF" w:space="0" w:sz="4" w:val="single"/>
+          <w:right w:color="BFBFBF" w:space="0" w:sz="4" w:val="single"/>
+        </w:tblBorders>
+        <w:shd w:color="auto" w:fill="F4F4F4" w:val="clear"/>
+        <w:tblLayout w:type="fixed"/>
+        <w:tblCellMar>
+          <w:top w:type="dxa" w:w="113"/>
+          <w:left w:type="dxa" w:w="113"/>
+          <w:bottom w:type="dxa" w:w="113"/>
+          <w:right w:type="dxa" w:w="113"/>
+        </w:tblCellMar>
+        <w:tblLook w:val="0000" w:firstRow="0" w:lastRow="0" w:firstColumn="0" w:lastColumn="0" w:noHBand="1" w:noVBand="1"/>
+      </w:tblPr>
+      <w:tblGrid>
+        <w:gridCol w:w="9637"/>
+      </w:tblGrid>
+      <w:tr>
+        <w:tc>
+          <w:tcPr>
+            <w:tcW w:type="dxa" w:w="9637"/>
+            <w:shd w:color="auto" w:fill="F4F4F4" w:val="clear"/>
+          </w:tcPr>
+          <w:p>
+            <w:pPr>
+              <w:pStyle w:val="SourceCode"/>
+              <w:spacing w:before="0" w:after="0" w:line="200" w:lineRule="auto"/>
+            </w:pPr>
+            <w:r>
+              <w:t xml:space="preserve">Name                       Length</w:t>
+            </w:r>
+          </w:p>
+          <w:p>
+            <w:pPr>
+              <w:pStyle w:val="SourceCode"/>
+              <w:spacing w:before="0" w:after="0" w:line="200" w:lineRule="auto"/>
+            </w:pPr>
+            <w:r>
+              <w:t xml:space="preserve">----                       ------</w:t>
+            </w:r>
+          </w:p>
+          <w:p>
+            <w:pPr>
+              <w:pStyle w:val="SourceCode"/>
+              <w:spacing w:before="0" w:after="0" w:line="200" w:lineRule="auto"/>
+            </w:pPr>
+            <w:r>
+              <w:t xml:space="preserve">Windows Logon.wav         1189836</w:t>
+            </w:r>
+          </w:p>
+          <w:p>
+            <w:pPr>
+              <w:pStyle w:val="SourceCode"/>
+              <w:spacing w:before="0" w:after="0" w:line="200" w:lineRule="auto"/>
+            </w:pPr>
+            <w:r>
+              <w:t xml:space="preserve">Windows Shutdown.wav       729068</w:t>
+            </w:r>
+          </w:p>
+          <w:p>
+            <w:pPr>
+              <w:pStyle w:val="SourceCode"/>
+              <w:spacing w:before="0" w:after="0" w:line="200" w:lineRule="auto"/>
+            </w:pPr>
+            <w:r>
+              <w:t xml:space="preserve">Windows Startup.wav        497908</w:t>
+            </w:r>
+          </w:p>
+        </w:tc>
+      </w:tr>
+    </w:tbl>
+    <w:p>
+      <w:pPr>
+        <w:spacing w:before="0" w:after="0" w:line="120" w:lineRule="exact"/>
         <w:rPr>
-          <w:rStyle w:val="VerbatimChar"/>
+          <w:sz w:val="4"/>
+          <w:szCs w:val="4"/>
         </w:rPr>
-        <w:t xml:space="preserve">Name                       Length</w:t>
-      </w:r>
-      <w:r>
-        <w:br/>
-      </w:r>
-      <w:r>
-        <w:rPr>
-          <w:rStyle w:val="VerbatimChar"/>
-        </w:rPr>
-        <w:t xml:space="preserve">----                       ------</w:t>
-      </w:r>
-      <w:r>
-        <w:br/>
-      </w:r>
-      <w:r>
-        <w:rPr>
-          <w:rStyle w:val="VerbatimChar"/>
-        </w:rPr>
-        <w:t xml:space="preserve">Windows Logon.wav         1189836</w:t>
-      </w:r>
-      <w:r>
-        <w:br/>
-      </w:r>
-      <w:r>
-        <w:rPr>
-          <w:rStyle w:val="VerbatimChar"/>
-        </w:rPr>
-        <w:t xml:space="preserve">Windows Shutdown.wav       729068</w:t>
-      </w:r>
-      <w:r>
-        <w:br/>
-      </w:r>
-      <w:r>
-        <w:rPr>
-          <w:rStyle w:val="VerbatimChar"/>
-        </w:rPr>
-        <w:t xml:space="preserve">Windows Startup.wav        497908</w:t>
-      </w:r>
+      </w:pPr>
     </w:p>
     <w:p>
       <w:pPr>
@@ -6400,15 +8023,8 @@
     <w:basedOn w:val="Normal"/>
     <w:qFormat/>
     <w:pPr>
-      <w:pBdr>
-        <w:top w:color="BFBFBF" w:space="4" w:sz="4" w:val="single"/>
-        <w:left w:color="BFBFBF" w:space="4" w:sz="4" w:val="single"/>
-        <w:bottom w:color="BFBFBF" w:space="4" w:sz="4" w:val="single"/>
-        <w:right w:color="BFBFBF" w:space="4" w:sz="4" w:val="single"/>
-      </w:pBdr>
-      <w:shd w:color="auto" w:fill="F4F4F4" w:val="clear"/>
-      <w:spacing w:after="120" w:before="120" w:line="200" w:lineRule="auto"/>
-      <w:ind w:firstLine="0" w:left="284" w:right="284"/>
+      <w:spacing w:after="0" w:before="0" w:line="200" w:lineRule="auto"/>
+      <w:ind w:hanging="340" w:left="340" w:right="0"/>
       <w:jc w:val="left"/>
     </w:pPr>
     <w:rPr>
@@ -6416,6 +8032,27 @@
       <w:sz w:val="18"/>
       <w:szCs w:val="18"/>
     </w:rPr>
+  </w:style>
+  <w:style w:customStyle="1" w:styleId="SourceCodeTable" w:type="table">
+    <w:name w:val="Source Code Table"/>
+    <w:basedOn w:val="TableNormal"/>
+    <w:qFormat/>
+    <w:tblPr>
+      <w:tblInd w:type="dxa" w:w="0"/>
+      <w:tblBorders>
+        <w:top w:color="BFBFBF" w:space="0" w:sz="4" w:val="single"/>
+        <w:left w:color="BFBFBF" w:space="0" w:sz="4" w:val="single"/>
+        <w:bottom w:color="BFBFBF" w:space="0" w:sz="4" w:val="single"/>
+        <w:right w:color="BFBFBF" w:space="0" w:sz="4" w:val="single"/>
+      </w:tblBorders>
+      <w:shd w:color="auto" w:fill="F4F4F4" w:val="clear"/>
+      <w:tblCellMar>
+        <w:top w:type="dxa" w:w="113"/>
+        <w:left w:type="dxa" w:w="113"/>
+        <w:bottom w:type="dxa" w:w="113"/>
+        <w:right w:type="dxa" w:w="113"/>
+      </w:tblCellMar>
+    </w:tblPr>
   </w:style>
   <w:style w:type="paragraph" w:customStyle="1" w:styleId="TableCaption">
     <w:name w:val="TableCaption"/>

</xml_diff>

<commit_message>
docs: expand OS lecture content and improve formatting
- Update Windows OS timeline with additional details
- Refine diagrams, including process states and kernel architecture
- Add sections on Master File Table, NTFS internals, and Windows registry
- Enhance real-world applications and career examples
</commit_message>
<xml_diff>
--- a/public/labs/os/kmp-23/ЛР1_ОС_Файли_та_каталоги_в_командному_рядку_Windows.docx
+++ b/public/labs/os/kmp-23/ЛР1_ОС_Файли_та_каталоги_в_командному_рядку_Windows.docx
@@ -135,7 +135,7 @@
         <w:pStyle w:val="BodyText"/>
       </w:pPr>
       <w:r>
-        <w:t xml:space="preserve">Якщо шлях містить пробіли, його беруть у подвійні лапки: cd</w:t>
+        <w:t xml:space="preserve">Якщо шлях містить пробіли, його беруть у подвійні лапки: dir</w:t>
       </w:r>
       <w:r>
         <w:t xml:space="preserve"> </w:t>
@@ -144,7 +144,15 @@
         <w:t xml:space="preserve">“Program Files”</w:t>
       </w:r>
       <w:r>
-        <w:t xml:space="preserve">. Без лапок командний процесор сприйме пробіл як роздільник аргументів і повідомить про помилку синтаксису.</w:t>
+        <w:t xml:space="preserve">. Без лапок командний процесор сприйме пробіл як роздільник аргументів: команда dir Program Files шукатиме два різні об’єкти — Program і Files — і повідомить, що файл не знайдено.</w:t>
+      </w:r>
+    </w:p>
+    <w:p>
+      <w:pPr>
+        <w:pStyle w:val="BodyText"/>
+      </w:pPr>
+      <w:r>
+        <w:t xml:space="preserve">Команда cd — виняток. Вона приймає лише один аргумент, тому весь рядок після cd вважає одним шляхом: cd Program Files спрацює і без лапок. Покладатися на цей виняток не варто: для будь-якої іншої команди пробіл без лапок розріже шлях. Найнебезпечніше це для del — команда del test folder спробує видалити два файли, test і folder, у поточному каталозі, а зовсім не каталог «test folder». Тому шляхи з пробілами беруть у лапки завжди.</w:t>
       </w:r>
     </w:p>
     <w:bookmarkEnd w:id="9"/>
@@ -287,6 +295,14 @@
         <w:pStyle w:val="FirstParagraph"/>
       </w:pPr>
       <w:r>
+        <w:t xml:space="preserve">Пояснення після :: у цьому та наступних переліках — лише для читача, вводити їх не треба: посеред рядка :: не є коментарем, і командний процесор передасть ці символи команді як зайві аргументи.</w:t>
+      </w:r>
+    </w:p>
+    <w:p>
+      <w:pPr>
+        <w:pStyle w:val="BodyText"/>
+      </w:pPr>
+      <w:r>
         <w:t xml:space="preserve">Пара pushd / popd зручна, коли треба ненадовго відлучитися в інший каталог і гарантовано повернутися: вона працює як стек, тому виклики можна вкладати.</w:t>
       </w:r>
     </w:p>
@@ -418,7 +434,15 @@
         <w:pStyle w:val="FirstParagraph"/>
       </w:pPr>
       <w:r>
-        <w:t xml:space="preserve">Маска розкривається не командою, а самою командою-адресатом, тому одна й та сама маска в dir і в del дає однаковий набір файлів. Це властивість, на якій ґрунтується головне правило безпеки: перш ніж виконати del із маскою, виконайте з тією самою маскою dir і подивіться, що саме потрапить під видалення.</w:t>
+        <w:t xml:space="preserve">Маску розкриває не командний процесор, як в оболонках Linux, а сама команда, якій її передали; dir і del роблять це однаково, тож одна й та сама маска дає в них однаковий набір файлів. На цьому ґрунтується головне правило безпеки: перш ніж виконати del із маскою, виконайте з тією самою маскою dir і подивіться, що саме потрапить під видалення.</w:t>
+      </w:r>
+    </w:p>
+    <w:p>
+      <w:pPr>
+        <w:pStyle w:val="BodyText"/>
+      </w:pPr>
+      <w:r>
+        <w:t xml:space="preserve">Перевірка потрібна ще й тому, що маски в Windows мають несподіванки. Для сумісності з MS-DOS файлова система може зберігати для кожного файлу друге, коротке ім’я у форматі 8.3 — наприклад, PRESEN~1.HTM для presentation.html. Маска зіставляється з обома іменами, тож на диску, де короткі імена ввімкнено (зазвичай це системний диск C:), del *.htm видалить і файли з розширенням html.</w:t>
       </w:r>
     </w:p>
     <w:bookmarkEnd w:id="11"/>
@@ -2313,8 +2337,8 @@
       <w:tblPr>
         <w:tblStyle w:val="Table"/>
         <w:tblW w:type="dxa" w:w="9637"/>
+        <w:tblLayout w:type="fixed"/>
         <w:tblLook w:firstRow="1" w:lastRow="0" w:firstColumn="0" w:lastColumn="0" w:noHBand="0" w:noVBand="0" w:val="0020"/>
-        <w:tblLayout w:type="fixed"/>
       </w:tblPr>
       <w:tblGrid>
         <w:gridCol w:w="4819"/>
@@ -2372,7 +2396,7 @@
               <w:rPr>
                 <w:rStyle w:val="VerbatimChar"/>
               </w:rPr>
-              <w:t xml:space="preserve">Get-ChildItem -Recurse -Name</w:t>
+              <w:t xml:space="preserve">(Get-ChildItem -Recurse).FullName</w:t>
             </w:r>
           </w:p>
         </w:tc>
@@ -2492,7 +2516,7 @@
               <w:rPr>
                 <w:rStyle w:val="VerbatimChar"/>
               </w:rPr>
-              <w:t xml:space="preserve">Remove-Item *.tmp -Recurse</w:t>
+              <w:t xml:space="preserve">Get-ChildItem -Recurse -Filter *.tmp \| Remove-Item</w:t>
             </w:r>
           </w:p>
         </w:tc>
@@ -2522,7 +2546,7 @@
               <w:rPr>
                 <w:rStyle w:val="VerbatimChar"/>
               </w:rPr>
-              <w:t xml:space="preserve">Select-String "error" *.log -Recurse</w:t>
+              <w:t xml:space="preserve">Get-ChildItem -Recurse -Filter *.log \| Select-String "error"</w:t>
             </w:r>
           </w:p>
         </w:tc>
@@ -2558,6 +2582,14 @@
         </w:tc>
       </w:tr>
     </w:tbl>
+    <w:p>
+      <w:pPr>
+        <w:pStyle w:val="BodyText"/>
+      </w:pPr>
+      <w:r>
+        <w:t xml:space="preserve">Два останні рядки свідомо записано конвеєром. Очевидний варіант Remove-Item *.tmp -Recurse не шукає файли в підкаталогах: ключ -Recurse стосується лише каталогів, які самі підпали під маску, — поведінка, яку Microsoft описує в документації як відому. А в Select-String параметра -Recurse немає зовсім. Пошук по дереву в PowerShell завжди робить Get-ChildItem -Recurse, а решта команд обробляє те, що вона передала.</w:t>
+      </w:r>
+    </w:p>
     <w:p>
       <w:pPr>
         <w:pStyle w:val="BodyText"/>
@@ -2914,23 +2946,7 @@
         <w:pStyle w:val="FirstParagraph"/>
       </w:pPr>
       <w:r>
-        <w:t xml:space="preserve">Windows CMD дозволяє використовувати пробіли в якості значення аргументу, який приймає cd «test folder» і «</w:t>
-      </w:r>
-      <w:r>
-        <w:t xml:space="preserve">“test folder”</w:t>
-      </w:r>
-      <w:r>
-        <w:t xml:space="preserve">» працюють однаково.</w:t>
-      </w:r>
-    </w:p>
-    <w:bookmarkEnd w:id="20"/>
-    <w:bookmarkStart w:id="21" w:name="крок-2.-наповнення-та-маски"/>
-    <w:p>
-      <w:pPr>
-        <w:pStyle w:val="Heading3"/>
-      </w:pPr>
-      <w:r>
-        <w:t xml:space="preserve">Крок 2. Наповнення та маски</w:t>
+        <w:t xml:space="preserve">Команда cd спрацювала і з лапками, і без них: вона приймає лише один аргумент і вважає шляхом весь рядок. Інші команди так не роблять — порівняйте:</w:t>
       </w:r>
     </w:p>
     <w:p>
@@ -2978,25 +2994,34 @@
               <w:spacing w:before="0" w:after="0" w:line="200" w:lineRule="auto"/>
             </w:pPr>
             <w:r>
-              <w:t xml:space="preserve">C:\...\LAB2&gt; xcopy /s /i %SystemRoot%\Media src</w:t>
-            </w:r>
-          </w:p>
-          <w:p>
-            <w:pPr>
-              <w:pStyle w:val="SourceCode"/>
-              <w:spacing w:before="0" w:after="0" w:line="200" w:lineRule="auto"/>
-            </w:pPr>
-            <w:r>
-              <w:t xml:space="preserve">...</w:t>
-            </w:r>
-          </w:p>
-          <w:p>
-            <w:pPr>
-              <w:pStyle w:val="SourceCode"/>
-              <w:spacing w:before="0" w:after="0" w:line="200" w:lineRule="auto"/>
-            </w:pPr>
-            <w:r>
-              <w:t xml:space="preserve">70 File(s) copied</w:t>
+              <w:t xml:space="preserve">C:\...\LAB2&gt; dir /b test folder</w:t>
+            </w:r>
+          </w:p>
+          <w:p>
+            <w:pPr>
+              <w:pStyle w:val="SourceCode"/>
+              <w:spacing w:before="0" w:after="0" w:line="200" w:lineRule="auto"/>
+            </w:pPr>
+            <w:r>
+              <w:t xml:space="preserve">File Not Found</w:t>
+            </w:r>
+          </w:p>
+          <w:p>
+            <w:pPr>
+              <w:pStyle w:val="SourceCode"/>
+              <w:spacing w:before="0" w:after="0" w:line="200" w:lineRule="auto"/>
+            </w:pPr>
+            <w:r>
+              <w:t xml:space="preserve">C:\...\LAB2&gt; dir /b "test folder"</w:t>
+            </w:r>
+          </w:p>
+          <w:p>
+            <w:pPr>
+              <w:pStyle w:val="SourceCode"/>
+              <w:spacing w:before="0" w:after="0" w:line="200" w:lineRule="auto"/>
+            </w:pPr>
+            <w:r>
+              <w:t xml:space="preserve">C:\...\LAB2&gt;</w:t>
             </w:r>
           </w:p>
         </w:tc>
@@ -3010,6 +3035,24 @@
           <w:szCs w:val="4"/>
         </w:rPr>
       </w:pPr>
+    </w:p>
+    <w:p>
+      <w:pPr>
+        <w:pStyle w:val="FirstParagraph"/>
+      </w:pPr>
+      <w:r>
+        <w:t xml:space="preserve">Без лапок dir шукала два окремі об’єкти, test і folder, і не знайшла жодного. З лапками команда відпрацювала: каталог «test folder» поки порожній, тому вивід порожній.</w:t>
+      </w:r>
+    </w:p>
+    <w:bookmarkEnd w:id="20"/>
+    <w:bookmarkStart w:id="21" w:name="крок-2.-наповнення-та-маски"/>
+    <w:p>
+      <w:pPr>
+        <w:pStyle w:val="Heading3"/>
+      </w:pPr>
+      <w:r>
+        <w:t xml:space="preserve">Крок 2. Наповнення та маски</w:t>
+      </w:r>
     </w:p>
     <w:p>
       <w:pPr>
@@ -3056,43 +3099,7 @@
               <w:spacing w:before="0" w:after="0" w:line="200" w:lineRule="auto"/>
             </w:pPr>
             <w:r>
-              <w:t xml:space="preserve">C:\...\LAB2&gt; dir src /s /b | find /c ":"</w:t>
-            </w:r>
-          </w:p>
-          <w:p>
-            <w:pPr>
-              <w:pStyle w:val="SourceCode"/>
-              <w:spacing w:before="0" w:after="0" w:line="200" w:lineRule="auto"/>
-            </w:pPr>
-            <w:r>
-              <w:t xml:space="preserve">78</w:t>
-            </w:r>
-          </w:p>
-          <w:p>
-            <w:pPr>
-              <w:pStyle w:val="SourceCode"/>
-              <w:spacing w:before="0" w:after="0" w:line="200" w:lineRule="auto"/>
-            </w:pPr>
-            <w:r>
-              <w:t xml:space="preserve">C:\...\LAB2&gt; dir src\*.wav /o:-s /b</w:t>
-            </w:r>
-          </w:p>
-          <w:p>
-            <w:pPr>
-              <w:pStyle w:val="SourceCode"/>
-              <w:spacing w:before="0" w:after="0" w:line="200" w:lineRule="auto"/>
-            </w:pPr>
-            <w:r>
-              <w:t xml:space="preserve">Windows Ringin.wav</w:t>
-            </w:r>
-          </w:p>
-          <w:p>
-            <w:pPr>
-              <w:pStyle w:val="SourceCode"/>
-              <w:spacing w:before="0" w:after="0" w:line="200" w:lineRule="auto"/>
-            </w:pPr>
-            <w:r>
-              <w:t xml:space="preserve">Windows Notify Calendar.wav</w:t>
+              <w:t xml:space="preserve">C:\...\LAB2&gt; xcopy /s /e /i %SystemRoot%\Media src</w:t>
             </w:r>
           </w:p>
           <w:p>
@@ -3110,16 +3117,7 @@
               <w:spacing w:before="0" w:after="0" w:line="200" w:lineRule="auto"/>
             </w:pPr>
             <w:r>
-              <w:t xml:space="preserve">C:\...\LAB2&gt; dir src\??.wav /b</w:t>
-            </w:r>
-          </w:p>
-          <w:p>
-            <w:pPr>
-              <w:pStyle w:val="SourceCode"/>
-              <w:spacing w:before="0" w:after="0" w:line="200" w:lineRule="auto"/>
-            </w:pPr>
-            <w:r>
-              <w:t xml:space="preserve">File Not Found</w:t>
+              <w:t xml:space="preserve">70 File(s) copied</w:t>
             </w:r>
           </w:p>
         </w:tc>
@@ -3133,24 +3131,6 @@
           <w:szCs w:val="4"/>
         </w:rPr>
       </w:pPr>
-    </w:p>
-    <w:p>
-      <w:pPr>
-        <w:pStyle w:val="FirstParagraph"/>
-      </w:pPr>
-      <w:r>
-        <w:t xml:space="preserve">Маска ??.wav не знайшла нічого: серед файлів немає жодного, ім’я якого складається рівно з двох символів. Маска *.wav дала б усі сімдесят.</w:t>
-      </w:r>
-    </w:p>
-    <w:bookmarkEnd w:id="21"/>
-    <w:bookmarkStart w:id="22" w:name="крок-3.-три-способи-копіювання"/>
-    <w:p>
-      <w:pPr>
-        <w:pStyle w:val="Heading3"/>
-      </w:pPr>
-      <w:r>
-        <w:t xml:space="preserve">Крок 3. Три способи копіювання</w:t>
-      </w:r>
     </w:p>
     <w:p>
       <w:pPr>
@@ -3197,7 +3177,79 @@
               <w:spacing w:before="0" w:after="0" w:line="200" w:lineRule="auto"/>
             </w:pPr>
             <w:r>
-              <w:t xml:space="preserve">C:\...\LAB2&gt; md copy1 copy2 copy3</w:t>
+              <w:t xml:space="preserve">C:\...\LAB2&gt; dir src /s /b | find /c ":"</w:t>
+            </w:r>
+          </w:p>
+          <w:p>
+            <w:pPr>
+              <w:pStyle w:val="SourceCode"/>
+              <w:spacing w:before="0" w:after="0" w:line="200" w:lineRule="auto"/>
+            </w:pPr>
+            <w:r>
+              <w:t xml:space="preserve">78</w:t>
+            </w:r>
+          </w:p>
+          <w:p>
+            <w:pPr>
+              <w:pStyle w:val="SourceCode"/>
+              <w:spacing w:before="0" w:after="0" w:line="200" w:lineRule="auto"/>
+            </w:pPr>
+            <w:r>
+              <w:t xml:space="preserve">C:\...\LAB2&gt; dir src\*.wav /o:-s /b</w:t>
+            </w:r>
+          </w:p>
+          <w:p>
+            <w:pPr>
+              <w:pStyle w:val="SourceCode"/>
+              <w:spacing w:before="0" w:after="0" w:line="200" w:lineRule="auto"/>
+            </w:pPr>
+            <w:r>
+              <w:t xml:space="preserve">Windows Logon.wav</w:t>
+            </w:r>
+          </w:p>
+          <w:p>
+            <w:pPr>
+              <w:pStyle w:val="SourceCode"/>
+              <w:spacing w:before="0" w:after="0" w:line="200" w:lineRule="auto"/>
+            </w:pPr>
+            <w:r>
+              <w:t xml:space="preserve">Windows Shutdown.wav</w:t>
+            </w:r>
+          </w:p>
+          <w:p>
+            <w:pPr>
+              <w:pStyle w:val="SourceCode"/>
+              <w:spacing w:before="0" w:after="0" w:line="200" w:lineRule="auto"/>
+            </w:pPr>
+            <w:r>
+              <w:t xml:space="preserve">Windows Startup.wav</w:t>
+            </w:r>
+          </w:p>
+          <w:p>
+            <w:pPr>
+              <w:pStyle w:val="SourceCode"/>
+              <w:spacing w:before="0" w:after="0" w:line="200" w:lineRule="auto"/>
+            </w:pPr>
+            <w:r>
+              <w:t xml:space="preserve">...</w:t>
+            </w:r>
+          </w:p>
+          <w:p>
+            <w:pPr>
+              <w:pStyle w:val="SourceCode"/>
+              <w:spacing w:before="0" w:after="0" w:line="200" w:lineRule="auto"/>
+            </w:pPr>
+            <w:r>
+              <w:t xml:space="preserve">C:\...\LAB2&gt; dir src\??.wav /b</w:t>
+            </w:r>
+          </w:p>
+          <w:p>
+            <w:pPr>
+              <w:pStyle w:val="SourceCode"/>
+              <w:spacing w:before="0" w:after="0" w:line="200" w:lineRule="auto"/>
+            </w:pPr>
+            <w:r>
+              <w:t xml:space="preserve">File Not Found</w:t>
             </w:r>
           </w:p>
         </w:tc>
@@ -3211,6 +3263,32 @@
           <w:szCs w:val="4"/>
         </w:rPr>
       </w:pPr>
+    </w:p>
+    <w:p>
+      <w:pPr>
+        <w:pStyle w:val="FirstParagraph"/>
+      </w:pPr>
+      <w:r>
+        <w:t xml:space="preserve">xcopy повідомила про 70 файлів, а dir нарахувала 78 об’єктів: крім файлів, у src тепер є вісім підкаталогів джерела. У цьому прикладі вони порожні, тож скопіювати їх вдалося лише завдяки ключу /e — з самим /s xcopy пропускає порожні каталоги.</w:t>
+      </w:r>
+    </w:p>
+    <w:p>
+      <w:pPr>
+        <w:pStyle w:val="BodyText"/>
+      </w:pPr>
+      <w:r>
+        <w:t xml:space="preserve">Маска ??.wav не знайшла нічого: серед файлів немає жодного, ім’я якого складається рівно з двох символів. Маска *.wav дала б усі сімдесят.</w:t>
+      </w:r>
+    </w:p>
+    <w:bookmarkEnd w:id="21"/>
+    <w:bookmarkStart w:id="22" w:name="крок-3.-три-способи-копіювання"/>
+    <w:p>
+      <w:pPr>
+        <w:pStyle w:val="Heading3"/>
+      </w:pPr>
+      <w:r>
+        <w:t xml:space="preserve">Крок 3. Три способи копіювання</w:t>
+      </w:r>
     </w:p>
     <w:p>
       <w:pPr>
@@ -3257,43 +3335,7 @@
               <w:spacing w:before="0" w:after="0" w:line="200" w:lineRule="auto"/>
             </w:pPr>
             <w:r>
-              <w:t xml:space="preserve">C:\...\LAB2&gt; echo %time%</w:t>
-            </w:r>
-          </w:p>
-          <w:p>
-            <w:pPr>
-              <w:pStyle w:val="SourceCode"/>
-              <w:spacing w:before="0" w:after="0" w:line="200" w:lineRule="auto"/>
-            </w:pPr>
-            <w:r>
-              <w:t xml:space="preserve">14:22:05,31</w:t>
-            </w:r>
-          </w:p>
-          <w:p>
-            <w:pPr>
-              <w:pStyle w:val="SourceCode"/>
-              <w:spacing w:before="0" w:after="0" w:line="200" w:lineRule="auto"/>
-            </w:pPr>
-            <w:r>
-              <w:t xml:space="preserve">C:\...\LAB2&gt; copy src\*.* copy1\ &gt; nul</w:t>
-            </w:r>
-          </w:p>
-          <w:p>
-            <w:pPr>
-              <w:pStyle w:val="SourceCode"/>
-              <w:spacing w:before="0" w:after="0" w:line="200" w:lineRule="auto"/>
-            </w:pPr>
-            <w:r>
-              <w:t xml:space="preserve">C:\...\LAB2&gt; echo %time%</w:t>
-            </w:r>
-          </w:p>
-          <w:p>
-            <w:pPr>
-              <w:pStyle w:val="SourceCode"/>
-              <w:spacing w:before="0" w:after="0" w:line="200" w:lineRule="auto"/>
-            </w:pPr>
-            <w:r>
-              <w:t xml:space="preserve">14:22:06,08</w:t>
+              <w:t xml:space="preserve">C:\...\LAB2&gt; md copy1 copy2 copy3</w:t>
             </w:r>
           </w:p>
         </w:tc>
@@ -3362,16 +3404,16 @@
               <w:spacing w:before="0" w:after="0" w:line="200" w:lineRule="auto"/>
             </w:pPr>
             <w:r>
-              <w:t xml:space="preserve">14:22:11,44</w:t>
-            </w:r>
-          </w:p>
-          <w:p>
-            <w:pPr>
-              <w:pStyle w:val="SourceCode"/>
-              <w:spacing w:before="0" w:after="0" w:line="200" w:lineRule="auto"/>
-            </w:pPr>
-            <w:r>
-              <w:t xml:space="preserve">C:\...\LAB2&gt; xcopy /s /e /q src copy2\ &gt; nul</w:t>
+              <w:t xml:space="preserve">14:22:05,31</w:t>
+            </w:r>
+          </w:p>
+          <w:p>
+            <w:pPr>
+              <w:pStyle w:val="SourceCode"/>
+              <w:spacing w:before="0" w:after="0" w:line="200" w:lineRule="auto"/>
+            </w:pPr>
+            <w:r>
+              <w:t xml:space="preserve">C:\...\LAB2&gt; copy src\*.* copy1\ &gt; nul</w:t>
             </w:r>
           </w:p>
           <w:p>
@@ -3389,7 +3431,7 @@
               <w:spacing w:before="0" w:after="0" w:line="200" w:lineRule="auto"/>
             </w:pPr>
             <w:r>
-              <w:t xml:space="preserve">14:22:12,97</w:t>
+              <w:t xml:space="preserve">14:22:06,08</w:t>
             </w:r>
           </w:p>
         </w:tc>
@@ -3458,16 +3500,16 @@
               <w:spacing w:before="0" w:after="0" w:line="200" w:lineRule="auto"/>
             </w:pPr>
             <w:r>
-              <w:t xml:space="preserve">14:22:20,12</w:t>
-            </w:r>
-          </w:p>
-          <w:p>
-            <w:pPr>
-              <w:pStyle w:val="SourceCode"/>
-              <w:spacing w:before="0" w:after="0" w:line="200" w:lineRule="auto"/>
-            </w:pPr>
-            <w:r>
-              <w:t xml:space="preserve">C:\...\LAB2&gt; robocopy src copy3 /e /mt:8 /njh /njs /nfl /ndl &gt; nul</w:t>
+              <w:t xml:space="preserve">14:22:11,44</w:t>
+            </w:r>
+          </w:p>
+          <w:p>
+            <w:pPr>
+              <w:pStyle w:val="SourceCode"/>
+              <w:spacing w:before="0" w:after="0" w:line="200" w:lineRule="auto"/>
+            </w:pPr>
+            <w:r>
+              <w:t xml:space="preserve">C:\...\LAB2&gt; xcopy /s /e /q src copy2\ &gt; nul</w:t>
             </w:r>
           </w:p>
           <w:p>
@@ -3485,7 +3527,7 @@
               <w:spacing w:before="0" w:after="0" w:line="200" w:lineRule="auto"/>
             </w:pPr>
             <w:r>
-              <w:t xml:space="preserve">14:22:20,79</w:t>
+              <w:t xml:space="preserve">14:22:12,97</w:t>
             </w:r>
           </w:p>
         </w:tc>
@@ -3545,52 +3587,43 @@
               <w:spacing w:before="0" w:after="0" w:line="200" w:lineRule="auto"/>
             </w:pPr>
             <w:r>
-              <w:t xml:space="preserve">C:\...\LAB2&gt; dir copy1 /s /b | find /c ":"</w:t>
-            </w:r>
-          </w:p>
-          <w:p>
-            <w:pPr>
-              <w:pStyle w:val="SourceCode"/>
-              <w:spacing w:before="0" w:after="0" w:line="200" w:lineRule="auto"/>
-            </w:pPr>
-            <w:r>
-              <w:t xml:space="preserve">70</w:t>
-            </w:r>
-          </w:p>
-          <w:p>
-            <w:pPr>
-              <w:pStyle w:val="SourceCode"/>
-              <w:spacing w:before="0" w:after="0" w:line="200" w:lineRule="auto"/>
-            </w:pPr>
-            <w:r>
-              <w:t xml:space="preserve">C:\...\LAB2&gt; dir copy2 /s /b | find /c ":"</w:t>
-            </w:r>
-          </w:p>
-          <w:p>
-            <w:pPr>
-              <w:pStyle w:val="SourceCode"/>
-              <w:spacing w:before="0" w:after="0" w:line="200" w:lineRule="auto"/>
-            </w:pPr>
-            <w:r>
-              <w:t xml:space="preserve">78</w:t>
-            </w:r>
-          </w:p>
-          <w:p>
-            <w:pPr>
-              <w:pStyle w:val="SourceCode"/>
-              <w:spacing w:before="0" w:after="0" w:line="200" w:lineRule="auto"/>
-            </w:pPr>
-            <w:r>
-              <w:t xml:space="preserve">C:\...\LAB2&gt; dir copy3 /s /b | find /c ":"</w:t>
-            </w:r>
-          </w:p>
-          <w:p>
-            <w:pPr>
-              <w:pStyle w:val="SourceCode"/>
-              <w:spacing w:before="0" w:after="0" w:line="200" w:lineRule="auto"/>
-            </w:pPr>
-            <w:r>
-              <w:t xml:space="preserve">78</w:t>
+              <w:t xml:space="preserve">C:\...\LAB2&gt; echo %time%</w:t>
+            </w:r>
+          </w:p>
+          <w:p>
+            <w:pPr>
+              <w:pStyle w:val="SourceCode"/>
+              <w:spacing w:before="0" w:after="0" w:line="200" w:lineRule="auto"/>
+            </w:pPr>
+            <w:r>
+              <w:t xml:space="preserve">14:22:20,12</w:t>
+            </w:r>
+          </w:p>
+          <w:p>
+            <w:pPr>
+              <w:pStyle w:val="SourceCode"/>
+              <w:spacing w:before="0" w:after="0" w:line="200" w:lineRule="auto"/>
+            </w:pPr>
+            <w:r>
+              <w:t xml:space="preserve">C:\...\LAB2&gt; robocopy src copy3 /e /mt:8 /njh /njs /nfl /ndl &gt; nul</w:t>
+            </w:r>
+          </w:p>
+          <w:p>
+            <w:pPr>
+              <w:pStyle w:val="SourceCode"/>
+              <w:spacing w:before="0" w:after="0" w:line="200" w:lineRule="auto"/>
+            </w:pPr>
+            <w:r>
+              <w:t xml:space="preserve">C:\...\LAB2&gt; echo %time%</w:t>
+            </w:r>
+          </w:p>
+          <w:p>
+            <w:pPr>
+              <w:pStyle w:val="SourceCode"/>
+              <w:spacing w:before="0" w:after="0" w:line="200" w:lineRule="auto"/>
+            </w:pPr>
+            <w:r>
+              <w:t xml:space="preserve">14:22:20,79</w:t>
             </w:r>
           </w:p>
         </w:tc>
@@ -3604,24 +3637,6 @@
           <w:szCs w:val="4"/>
         </w:rPr>
       </w:pPr>
-    </w:p>
-    <w:p>
-      <w:pPr>
-        <w:pStyle w:val="FirstParagraph"/>
-      </w:pPr>
-      <w:r>
-        <w:t xml:space="preserve">У copy1 потрапило сімдесят файлів, у copy2 і copy3 — сімдесят вісім. Різниця у вісім об’єктів — це підкаталоги джерела з їхнім вмістом: команда copy їх просто не бачить, вона працює лише в межах одного каталогу. Це не помилка користувача, а межа можливостей самої команди.</w:t>
-      </w:r>
-    </w:p>
-    <w:bookmarkEnd w:id="22"/>
-    <w:bookmarkStart w:id="23" w:name="X5a4c47d5de03a59b13414b1bfccc68f7b27f2cf"/>
-    <w:p>
-      <w:pPr>
-        <w:pStyle w:val="Heading3"/>
-      </w:pPr>
-      <w:r>
-        <w:t xml:space="preserve">Крок 4. Перейменування, атрибути, видалення</w:t>
-      </w:r>
     </w:p>
     <w:p>
       <w:pPr>
@@ -3668,25 +3683,7 @@
               <w:spacing w:before="0" w:after="0" w:line="200" w:lineRule="auto"/>
             </w:pPr>
             <w:r>
-              <w:t xml:space="preserve">C:\...\LAB2&gt; cd copy1</w:t>
-            </w:r>
-          </w:p>
-          <w:p>
-            <w:pPr>
-              <w:pStyle w:val="SourceCode"/>
-              <w:spacing w:before="0" w:after="0" w:line="200" w:lineRule="auto"/>
-            </w:pPr>
-            <w:r>
-              <w:t xml:space="preserve">C:\...\copy1&gt; ren *.wav *.bak</w:t>
-            </w:r>
-          </w:p>
-          <w:p>
-            <w:pPr>
-              <w:pStyle w:val="SourceCode"/>
-              <w:spacing w:before="0" w:after="0" w:line="200" w:lineRule="auto"/>
-            </w:pPr>
-            <w:r>
-              <w:t xml:space="preserve">C:\...\copy1&gt; dir /b | find /c ".bak"</w:t>
+              <w:t xml:space="preserve">C:\...\LAB2&gt; dir copy1 /s /b | find /c ":"</w:t>
             </w:r>
           </w:p>
           <w:p>
@@ -3696,6 +3693,42 @@
             </w:pPr>
             <w:r>
               <w:t xml:space="preserve">70</w:t>
+            </w:r>
+          </w:p>
+          <w:p>
+            <w:pPr>
+              <w:pStyle w:val="SourceCode"/>
+              <w:spacing w:before="0" w:after="0" w:line="200" w:lineRule="auto"/>
+            </w:pPr>
+            <w:r>
+              <w:t xml:space="preserve">C:\...\LAB2&gt; dir copy2 /s /b | find /c ":"</w:t>
+            </w:r>
+          </w:p>
+          <w:p>
+            <w:pPr>
+              <w:pStyle w:val="SourceCode"/>
+              <w:spacing w:before="0" w:after="0" w:line="200" w:lineRule="auto"/>
+            </w:pPr>
+            <w:r>
+              <w:t xml:space="preserve">78</w:t>
+            </w:r>
+          </w:p>
+          <w:p>
+            <w:pPr>
+              <w:pStyle w:val="SourceCode"/>
+              <w:spacing w:before="0" w:after="0" w:line="200" w:lineRule="auto"/>
+            </w:pPr>
+            <w:r>
+              <w:t xml:space="preserve">C:\...\LAB2&gt; dir copy3 /s /b | find /c ":"</w:t>
+            </w:r>
+          </w:p>
+          <w:p>
+            <w:pPr>
+              <w:pStyle w:val="SourceCode"/>
+              <w:spacing w:before="0" w:after="0" w:line="200" w:lineRule="auto"/>
+            </w:pPr>
+            <w:r>
+              <w:t xml:space="preserve">78</w:t>
             </w:r>
           </w:p>
         </w:tc>
@@ -3709,6 +3742,24 @@
           <w:szCs w:val="4"/>
         </w:rPr>
       </w:pPr>
+    </w:p>
+    <w:p>
+      <w:pPr>
+        <w:pStyle w:val="FirstParagraph"/>
+      </w:pPr>
+      <w:r>
+        <w:t xml:space="preserve">У copy1 потрапило сімдесят файлів, у copy2 і copy3 — сімдесят вісім об’єктів. Різниця у вісім — це підкаталоги джерела: команда copy їх просто не бачить, вона працює лише в межах одного каталогу. Якби в підкаталогах лежали файли, copy пропустила б і їх. Це не помилка користувача, а межа можливостей самої команди.</w:t>
+      </w:r>
+    </w:p>
+    <w:bookmarkEnd w:id="22"/>
+    <w:bookmarkStart w:id="23" w:name="X5a4c47d5de03a59b13414b1bfccc68f7b27f2cf"/>
+    <w:p>
+      <w:pPr>
+        <w:pStyle w:val="Heading3"/>
+      </w:pPr>
+      <w:r>
+        <w:t xml:space="preserve">Крок 4. Перейменування, атрибути, видалення</w:t>
+      </w:r>
     </w:p>
     <w:p>
       <w:pPr>
@@ -3755,25 +3806,34 @@
               <w:spacing w:before="0" w:after="0" w:line="200" w:lineRule="auto"/>
             </w:pPr>
             <w:r>
-              <w:t xml:space="preserve">C:\...\copy1&gt; attrib +r "Windows Ringin.bak"</w:t>
-            </w:r>
-          </w:p>
-          <w:p>
-            <w:pPr>
-              <w:pStyle w:val="SourceCode"/>
-              <w:spacing w:before="0" w:after="0" w:line="200" w:lineRule="auto"/>
-            </w:pPr>
-            <w:r>
-              <w:t xml:space="preserve">C:\...\copy1&gt; attrib "Windows Ringin.bak"</w:t>
-            </w:r>
-          </w:p>
-          <w:p>
-            <w:pPr>
-              <w:pStyle w:val="SourceCode"/>
-              <w:spacing w:before="0" w:after="0" w:line="200" w:lineRule="auto"/>
-            </w:pPr>
-            <w:r>
-              <w:t xml:space="preserve">A  R     C:\Users\Student\Desktop\LAB2\copy1\Windows Ringin.bak</w:t>
+              <w:t xml:space="preserve">C:\...\LAB2&gt; cd copy1</w:t>
+            </w:r>
+          </w:p>
+          <w:p>
+            <w:pPr>
+              <w:pStyle w:val="SourceCode"/>
+              <w:spacing w:before="0" w:after="0" w:line="200" w:lineRule="auto"/>
+            </w:pPr>
+            <w:r>
+              <w:t xml:space="preserve">C:\...\copy1&gt; ren *.wav *.bak</w:t>
+            </w:r>
+          </w:p>
+          <w:p>
+            <w:pPr>
+              <w:pStyle w:val="SourceCode"/>
+              <w:spacing w:before="0" w:after="0" w:line="200" w:lineRule="auto"/>
+            </w:pPr>
+            <w:r>
+              <w:t xml:space="preserve">C:\...\copy1&gt; dir /b | find /c ".bak"</w:t>
+            </w:r>
+          </w:p>
+          <w:p>
+            <w:pPr>
+              <w:pStyle w:val="SourceCode"/>
+              <w:spacing w:before="0" w:after="0" w:line="200" w:lineRule="auto"/>
+            </w:pPr>
+            <w:r>
+              <w:t xml:space="preserve">70</w:t>
             </w:r>
           </w:p>
         </w:tc>
@@ -3833,25 +3893,25 @@
               <w:spacing w:before="0" w:after="0" w:line="200" w:lineRule="auto"/>
             </w:pPr>
             <w:r>
-              <w:t xml:space="preserve">C:\...\copy1&gt; del "Windows Ringin.bak"</w:t>
-            </w:r>
-          </w:p>
-          <w:p>
-            <w:pPr>
-              <w:pStyle w:val="SourceCode"/>
-              <w:spacing w:before="0" w:after="0" w:line="200" w:lineRule="auto"/>
-            </w:pPr>
-            <w:r>
-              <w:t xml:space="preserve">C:\...\copy1\Windows Ringin.bak</w:t>
-            </w:r>
-          </w:p>
-          <w:p>
-            <w:pPr>
-              <w:pStyle w:val="SourceCode"/>
-              <w:spacing w:before="0" w:after="0" w:line="200" w:lineRule="auto"/>
-            </w:pPr>
-            <w:r>
-              <w:t xml:space="preserve">Access is denied.</w:t>
+              <w:t xml:space="preserve">C:\...\copy1&gt; attrib +r "Windows Ringin.bak"</w:t>
+            </w:r>
+          </w:p>
+          <w:p>
+            <w:pPr>
+              <w:pStyle w:val="SourceCode"/>
+              <w:spacing w:before="0" w:after="0" w:line="200" w:lineRule="auto"/>
+            </w:pPr>
+            <w:r>
+              <w:t xml:space="preserve">C:\...\copy1&gt; attrib "Windows Ringin.bak"</w:t>
+            </w:r>
+          </w:p>
+          <w:p>
+            <w:pPr>
+              <w:pStyle w:val="SourceCode"/>
+              <w:spacing w:before="0" w:after="0" w:line="200" w:lineRule="auto"/>
+            </w:pPr>
+            <w:r>
+              <w:t xml:space="preserve">A  R     C:\Users\Student\Desktop\LAB2\copy1\Windows Ringin.bak</w:t>
             </w:r>
           </w:p>
         </w:tc>
@@ -3911,88 +3971,25 @@
               <w:spacing w:before="0" w:after="0" w:line="200" w:lineRule="auto"/>
             </w:pPr>
             <w:r>
-              <w:t xml:space="preserve">C:\...\copy1&gt; del /f "Windows Ringin.bak"</w:t>
-            </w:r>
-          </w:p>
-          <w:p>
-            <w:pPr>
-              <w:pStyle w:val="SourceCode"/>
-              <w:spacing w:before="0" w:after="0" w:line="200" w:lineRule="auto"/>
-            </w:pPr>
-            <w:r>
-              <w:t xml:space="preserve">C:\...\copy1&gt; cd ..</w:t>
-            </w:r>
-          </w:p>
-          <w:p>
-            <w:pPr>
-              <w:pStyle w:val="SourceCode"/>
-              <w:spacing w:before="0" w:after="0" w:line="200" w:lineRule="auto"/>
-            </w:pPr>
-            <w:r>
-              <w:t xml:space="preserve">C:\...\LAB2&gt; rd /s /q copy1</w:t>
-            </w:r>
-          </w:p>
-          <w:p>
-            <w:pPr>
-              <w:pStyle w:val="SourceCode"/>
-              <w:spacing w:before="0" w:after="0" w:line="200" w:lineRule="auto"/>
-            </w:pPr>
-            <w:r>
-              <w:t xml:space="preserve">C:\...\LAB2&gt; dir /a:d /b</w:t>
-            </w:r>
-          </w:p>
-          <w:p>
-            <w:pPr>
-              <w:pStyle w:val="SourceCode"/>
-              <w:spacing w:before="0" w:after="0" w:line="200" w:lineRule="auto"/>
-            </w:pPr>
-            <w:r>
-              <w:t xml:space="preserve">bak</w:t>
-            </w:r>
-          </w:p>
-          <w:p>
-            <w:pPr>
-              <w:pStyle w:val="SourceCode"/>
-              <w:spacing w:before="0" w:after="0" w:line="200" w:lineRule="auto"/>
-            </w:pPr>
-            <w:r>
-              <w:t xml:space="preserve">copy2</w:t>
-            </w:r>
-          </w:p>
-          <w:p>
-            <w:pPr>
-              <w:pStyle w:val="SourceCode"/>
-              <w:spacing w:before="0" w:after="0" w:line="200" w:lineRule="auto"/>
-            </w:pPr>
-            <w:r>
-              <w:t xml:space="preserve">copy3</w:t>
-            </w:r>
-          </w:p>
-          <w:p>
-            <w:pPr>
-              <w:pStyle w:val="SourceCode"/>
-              <w:spacing w:before="0" w:after="0" w:line="200" w:lineRule="auto"/>
-            </w:pPr>
-            <w:r>
-              <w:t xml:space="preserve">docs</w:t>
-            </w:r>
-          </w:p>
-          <w:p>
-            <w:pPr>
-              <w:pStyle w:val="SourceCode"/>
-              <w:spacing w:before="0" w:after="0" w:line="200" w:lineRule="auto"/>
-            </w:pPr>
-            <w:r>
-              <w:t xml:space="preserve">src</w:t>
-            </w:r>
-          </w:p>
-          <w:p>
-            <w:pPr>
-              <w:pStyle w:val="SourceCode"/>
-              <w:spacing w:before="0" w:after="0" w:line="200" w:lineRule="auto"/>
-            </w:pPr>
-            <w:r>
-              <w:t xml:space="preserve">test folder</w:t>
+              <w:t xml:space="preserve">C:\...\copy1&gt; del "Windows Ringin.bak"</w:t>
+            </w:r>
+          </w:p>
+          <w:p>
+            <w:pPr>
+              <w:pStyle w:val="SourceCode"/>
+              <w:spacing w:before="0" w:after="0" w:line="200" w:lineRule="auto"/>
+            </w:pPr>
+            <w:r>
+              <w:t xml:space="preserve">C:\...\copy1\Windows Ringin.bak</w:t>
+            </w:r>
+          </w:p>
+          <w:p>
+            <w:pPr>
+              <w:pStyle w:val="SourceCode"/>
+              <w:spacing w:before="0" w:after="0" w:line="200" w:lineRule="auto"/>
+            </w:pPr>
+            <w:r>
+              <w:t xml:space="preserve">Access is denied.</w:t>
             </w:r>
           </w:p>
         </w:tc>
@@ -4006,24 +4003,6 @@
           <w:szCs w:val="4"/>
         </w:rPr>
       </w:pPr>
-    </w:p>
-    <w:p>
-      <w:pPr>
-        <w:pStyle w:val="FirstParagraph"/>
-      </w:pPr>
-      <w:r>
-        <w:t xml:space="preserve">Атрибут R зупинив звичайне видалення: файлова система відмовила в доступі. Ключ /f знімає це обмеження. Зверніть увагу, що rd /s /q знищив увесь каталог із сімдесятьма файлами без жодного запитання і без переміщення в кошик.</w:t>
-      </w:r>
-    </w:p>
-    <w:bookmarkEnd w:id="23"/>
-    <w:bookmarkStart w:id="24" w:name="крок-5.-перенаправлення-конвеєр-пошук"/>
-    <w:p>
-      <w:pPr>
-        <w:pStyle w:val="Heading3"/>
-      </w:pPr>
-      <w:r>
-        <w:t xml:space="preserve">Крок 5. Перенаправлення, конвеєр, пошук</w:t>
-      </w:r>
     </w:p>
     <w:p>
       <w:pPr>
@@ -4070,25 +4049,88 @@
               <w:spacing w:before="0" w:after="0" w:line="200" w:lineRule="auto"/>
             </w:pPr>
             <w:r>
-              <w:t xml:space="preserve">C:\...\LAB2&gt; dir src /s /b &gt; docs\listing.txt</w:t>
-            </w:r>
-          </w:p>
-          <w:p>
-            <w:pPr>
-              <w:pStyle w:val="SourceCode"/>
-              <w:spacing w:before="0" w:after="0" w:line="200" w:lineRule="auto"/>
-            </w:pPr>
-            <w:r>
-              <w:t xml:space="preserve">C:\...\LAB2&gt; find /c ".wav" docs\listing.txt</w:t>
-            </w:r>
-          </w:p>
-          <w:p>
-            <w:pPr>
-              <w:pStyle w:val="SourceCode"/>
-              <w:spacing w:before="0" w:after="0" w:line="200" w:lineRule="auto"/>
-            </w:pPr>
-            <w:r>
-              <w:t xml:space="preserve">---------- DOCS\LISTING.TXT: 70</w:t>
+              <w:t xml:space="preserve">C:\...\copy1&gt; del /f "Windows Ringin.bak"</w:t>
+            </w:r>
+          </w:p>
+          <w:p>
+            <w:pPr>
+              <w:pStyle w:val="SourceCode"/>
+              <w:spacing w:before="0" w:after="0" w:line="200" w:lineRule="auto"/>
+            </w:pPr>
+            <w:r>
+              <w:t xml:space="preserve">C:\...\copy1&gt; cd ..</w:t>
+            </w:r>
+          </w:p>
+          <w:p>
+            <w:pPr>
+              <w:pStyle w:val="SourceCode"/>
+              <w:spacing w:before="0" w:after="0" w:line="200" w:lineRule="auto"/>
+            </w:pPr>
+            <w:r>
+              <w:t xml:space="preserve">C:\...\LAB2&gt; rd /s /q copy1</w:t>
+            </w:r>
+          </w:p>
+          <w:p>
+            <w:pPr>
+              <w:pStyle w:val="SourceCode"/>
+              <w:spacing w:before="0" w:after="0" w:line="200" w:lineRule="auto"/>
+            </w:pPr>
+            <w:r>
+              <w:t xml:space="preserve">C:\...\LAB2&gt; dir /a:d /b</w:t>
+            </w:r>
+          </w:p>
+          <w:p>
+            <w:pPr>
+              <w:pStyle w:val="SourceCode"/>
+              <w:spacing w:before="0" w:after="0" w:line="200" w:lineRule="auto"/>
+            </w:pPr>
+            <w:r>
+              <w:t xml:space="preserve">bak</w:t>
+            </w:r>
+          </w:p>
+          <w:p>
+            <w:pPr>
+              <w:pStyle w:val="SourceCode"/>
+              <w:spacing w:before="0" w:after="0" w:line="200" w:lineRule="auto"/>
+            </w:pPr>
+            <w:r>
+              <w:t xml:space="preserve">copy2</w:t>
+            </w:r>
+          </w:p>
+          <w:p>
+            <w:pPr>
+              <w:pStyle w:val="SourceCode"/>
+              <w:spacing w:before="0" w:after="0" w:line="200" w:lineRule="auto"/>
+            </w:pPr>
+            <w:r>
+              <w:t xml:space="preserve">copy3</w:t>
+            </w:r>
+          </w:p>
+          <w:p>
+            <w:pPr>
+              <w:pStyle w:val="SourceCode"/>
+              <w:spacing w:before="0" w:after="0" w:line="200" w:lineRule="auto"/>
+            </w:pPr>
+            <w:r>
+              <w:t xml:space="preserve">docs</w:t>
+            </w:r>
+          </w:p>
+          <w:p>
+            <w:pPr>
+              <w:pStyle w:val="SourceCode"/>
+              <w:spacing w:before="0" w:after="0" w:line="200" w:lineRule="auto"/>
+            </w:pPr>
+            <w:r>
+              <w:t xml:space="preserve">src</w:t>
+            </w:r>
+          </w:p>
+          <w:p>
+            <w:pPr>
+              <w:pStyle w:val="SourceCode"/>
+              <w:spacing w:before="0" w:after="0" w:line="200" w:lineRule="auto"/>
+            </w:pPr>
+            <w:r>
+              <w:t xml:space="preserve">test folder</w:t>
             </w:r>
           </w:p>
         </w:tc>
@@ -4102,6 +4144,24 @@
           <w:szCs w:val="4"/>
         </w:rPr>
       </w:pPr>
+    </w:p>
+    <w:p>
+      <w:pPr>
+        <w:pStyle w:val="FirstParagraph"/>
+      </w:pPr>
+      <w:r>
+        <w:t xml:space="preserve">Атрибут R зупинив звичайне видалення: файлова система відмовила в доступі. Ключ /f знімає це обмеження. Зверніть увагу, що rd /s /q знищив увесь каталог із сімдесятьма файлами без жодного запитання і без переміщення в кошик.</w:t>
+      </w:r>
+    </w:p>
+    <w:bookmarkEnd w:id="23"/>
+    <w:bookmarkStart w:id="24" w:name="крок-5.-перенаправлення-конвеєр-пошук"/>
+    <w:p>
+      <w:pPr>
+        <w:pStyle w:val="Heading3"/>
+      </w:pPr>
+      <w:r>
+        <w:t xml:space="preserve">Крок 5. Перенаправлення, конвеєр, пошук</w:t>
+      </w:r>
     </w:p>
     <w:p>
       <w:pPr>
@@ -4148,34 +4208,25 @@
               <w:spacing w:before="0" w:after="0" w:line="200" w:lineRule="auto"/>
             </w:pPr>
             <w:r>
-              <w:t xml:space="preserve">C:\...\LAB2&gt; findstr /i /n "alarm" docs\listing.txt</w:t>
-            </w:r>
-          </w:p>
-          <w:p>
-            <w:pPr>
-              <w:pStyle w:val="SourceCode"/>
-              <w:spacing w:before="0" w:after="0" w:line="200" w:lineRule="auto"/>
-            </w:pPr>
-            <w:r>
-              <w:t xml:space="preserve">3:C:\Users\Student\Desktop\LAB2\src\Alarm01.wav</w:t>
-            </w:r>
-          </w:p>
-          <w:p>
-            <w:pPr>
-              <w:pStyle w:val="SourceCode"/>
-              <w:spacing w:before="0" w:after="0" w:line="200" w:lineRule="auto"/>
-            </w:pPr>
-            <w:r>
-              <w:t xml:space="preserve">4:C:\Users\Student\Desktop\LAB2\src\Alarm02.wav</w:t>
-            </w:r>
-          </w:p>
-          <w:p>
-            <w:pPr>
-              <w:pStyle w:val="SourceCode"/>
-              <w:spacing w:before="0" w:after="0" w:line="200" w:lineRule="auto"/>
-            </w:pPr>
-            <w:r>
-              <w:t xml:space="preserve">...</w:t>
+              <w:t xml:space="preserve">C:\...\LAB2&gt; dir src /s /b &gt; docs\listing.txt</w:t>
+            </w:r>
+          </w:p>
+          <w:p>
+            <w:pPr>
+              <w:pStyle w:val="SourceCode"/>
+              <w:spacing w:before="0" w:after="0" w:line="200" w:lineRule="auto"/>
+            </w:pPr>
+            <w:r>
+              <w:t xml:space="preserve">C:\...\LAB2&gt; find /c ".wav" docs\listing.txt</w:t>
+            </w:r>
+          </w:p>
+          <w:p>
+            <w:pPr>
+              <w:pStyle w:val="SourceCode"/>
+              <w:spacing w:before="0" w:after="0" w:line="200" w:lineRule="auto"/>
+            </w:pPr>
+            <w:r>
+              <w:t xml:space="preserve">---------- DOCS\LISTING.TXT: 70</w:t>
             </w:r>
           </w:p>
         </w:tc>
@@ -4235,34 +4286,34 @@
               <w:spacing w:before="0" w:after="0" w:line="200" w:lineRule="auto"/>
             </w:pPr>
             <w:r>
-              <w:t xml:space="preserve">C:\...\LAB2&gt; echo Звіт сформовано &gt;&gt; docs\listing.txt</w:t>
-            </w:r>
-          </w:p>
-          <w:p>
-            <w:pPr>
-              <w:pStyle w:val="SourceCode"/>
-              <w:spacing w:before="0" w:after="0" w:line="200" w:lineRule="auto"/>
-            </w:pPr>
-            <w:r>
-              <w:t xml:space="preserve">C:\...\LAB2&gt; dir nosuchfile.txt 2&gt; docs\errors.txt</w:t>
-            </w:r>
-          </w:p>
-          <w:p>
-            <w:pPr>
-              <w:pStyle w:val="SourceCode"/>
-              <w:spacing w:before="0" w:after="0" w:line="200" w:lineRule="auto"/>
-            </w:pPr>
-            <w:r>
-              <w:t xml:space="preserve">C:\...\LAB2&gt; type docs\errors.txt</w:t>
-            </w:r>
-          </w:p>
-          <w:p>
-            <w:pPr>
-              <w:pStyle w:val="SourceCode"/>
-              <w:spacing w:before="0" w:after="0" w:line="200" w:lineRule="auto"/>
-            </w:pPr>
-            <w:r>
-              <w:t xml:space="preserve">File Not Found</w:t>
+              <w:t xml:space="preserve">C:\...\LAB2&gt; findstr /i /n "alarm" docs\listing.txt</w:t>
+            </w:r>
+          </w:p>
+          <w:p>
+            <w:pPr>
+              <w:pStyle w:val="SourceCode"/>
+              <w:spacing w:before="0" w:after="0" w:line="200" w:lineRule="auto"/>
+            </w:pPr>
+            <w:r>
+              <w:t xml:space="preserve">3:C:\Users\Student\Desktop\LAB2\src\Alarm01.wav</w:t>
+            </w:r>
+          </w:p>
+          <w:p>
+            <w:pPr>
+              <w:pStyle w:val="SourceCode"/>
+              <w:spacing w:before="0" w:after="0" w:line="200" w:lineRule="auto"/>
+            </w:pPr>
+            <w:r>
+              <w:t xml:space="preserve">4:C:\Users\Student\Desktop\LAB2\src\Alarm02.wav</w:t>
+            </w:r>
+          </w:p>
+          <w:p>
+            <w:pPr>
+              <w:pStyle w:val="SourceCode"/>
+              <w:spacing w:before="0" w:after="0" w:line="200" w:lineRule="auto"/>
+            </w:pPr>
+            <w:r>
+              <w:t xml:space="preserve">...</w:t>
             </w:r>
           </w:p>
         </w:tc>
@@ -4322,43 +4373,34 @@
               <w:spacing w:before="0" w:after="0" w:line="200" w:lineRule="auto"/>
             </w:pPr>
             <w:r>
-              <w:t xml:space="preserve">C:\...\LAB2&gt; type nul &gt; docs\empty.txt</w:t>
-            </w:r>
-          </w:p>
-          <w:p>
-            <w:pPr>
-              <w:pStyle w:val="SourceCode"/>
-              <w:spacing w:before="0" w:after="0" w:line="200" w:lineRule="auto"/>
-            </w:pPr>
-            <w:r>
-              <w:t xml:space="preserve">C:\...\LAB2&gt; dir docs /b</w:t>
-            </w:r>
-          </w:p>
-          <w:p>
-            <w:pPr>
-              <w:pStyle w:val="SourceCode"/>
-              <w:spacing w:before="0" w:after="0" w:line="200" w:lineRule="auto"/>
-            </w:pPr>
-            <w:r>
-              <w:t xml:space="preserve">empty.txt</w:t>
-            </w:r>
-          </w:p>
-          <w:p>
-            <w:pPr>
-              <w:pStyle w:val="SourceCode"/>
-              <w:spacing w:before="0" w:after="0" w:line="200" w:lineRule="auto"/>
-            </w:pPr>
-            <w:r>
-              <w:t xml:space="preserve">errors.txt</w:t>
-            </w:r>
-          </w:p>
-          <w:p>
-            <w:pPr>
-              <w:pStyle w:val="SourceCode"/>
-              <w:spacing w:before="0" w:after="0" w:line="200" w:lineRule="auto"/>
-            </w:pPr>
-            <w:r>
-              <w:t xml:space="preserve">listing.txt</w:t>
+              <w:t xml:space="preserve">C:\...\LAB2&gt; echo Звіт сформовано &gt;&gt; docs\listing.txt</w:t>
+            </w:r>
+          </w:p>
+          <w:p>
+            <w:pPr>
+              <w:pStyle w:val="SourceCode"/>
+              <w:spacing w:before="0" w:after="0" w:line="200" w:lineRule="auto"/>
+            </w:pPr>
+            <w:r>
+              <w:t xml:space="preserve">C:\...\LAB2&gt; dir nosuchfile.txt 2&gt; docs\errors.txt</w:t>
+            </w:r>
+          </w:p>
+          <w:p>
+            <w:pPr>
+              <w:pStyle w:val="SourceCode"/>
+              <w:spacing w:before="0" w:after="0" w:line="200" w:lineRule="auto"/>
+            </w:pPr>
+            <w:r>
+              <w:t xml:space="preserve">C:\...\LAB2&gt; type docs\errors.txt</w:t>
+            </w:r>
+          </w:p>
+          <w:p>
+            <w:pPr>
+              <w:pStyle w:val="SourceCode"/>
+              <w:spacing w:before="0" w:after="0" w:line="200" w:lineRule="auto"/>
+            </w:pPr>
+            <w:r>
+              <w:t xml:space="preserve">File Not Found</w:t>
             </w:r>
           </w:p>
         </w:tc>
@@ -4372,16 +4414,6 @@
           <w:szCs w:val="4"/>
         </w:rPr>
       </w:pPr>
-    </w:p>
-    <w:bookmarkEnd w:id="24"/>
-    <w:bookmarkStart w:id="25" w:name="крок-6.-те-саме-в-powershell"/>
-    <w:p>
-      <w:pPr>
-        <w:pStyle w:val="Heading3"/>
-      </w:pPr>
-      <w:r>
-        <w:t xml:space="preserve">Крок 6. Те саме в PowerShell</w:t>
-      </w:r>
     </w:p>
     <w:p>
       <w:pPr>
@@ -4428,16 +4460,43 @@
               <w:spacing w:before="0" w:after="0" w:line="200" w:lineRule="auto"/>
             </w:pPr>
             <w:r>
-              <w:t xml:space="preserve">PS C:\...\LAB2&gt; Get-ChildItem src -Recurse -File |</w:t>
-            </w:r>
-          </w:p>
-          <w:p>
-            <w:pPr>
-              <w:pStyle w:val="SourceCode"/>
-              <w:spacing w:before="0" w:after="0" w:line="200" w:lineRule="auto"/>
-            </w:pPr>
-            <w:r>
-              <w:t xml:space="preserve">&gt;&gt;     Measure-Object -Property Length -Sum</w:t>
+              <w:t xml:space="preserve">C:\...\LAB2&gt; type nul &gt; docs\empty.txt</w:t>
+            </w:r>
+          </w:p>
+          <w:p>
+            <w:pPr>
+              <w:pStyle w:val="SourceCode"/>
+              <w:spacing w:before="0" w:after="0" w:line="200" w:lineRule="auto"/>
+            </w:pPr>
+            <w:r>
+              <w:t xml:space="preserve">C:\...\LAB2&gt; dir docs /b</w:t>
+            </w:r>
+          </w:p>
+          <w:p>
+            <w:pPr>
+              <w:pStyle w:val="SourceCode"/>
+              <w:spacing w:before="0" w:after="0" w:line="200" w:lineRule="auto"/>
+            </w:pPr>
+            <w:r>
+              <w:t xml:space="preserve">empty.txt</w:t>
+            </w:r>
+          </w:p>
+          <w:p>
+            <w:pPr>
+              <w:pStyle w:val="SourceCode"/>
+              <w:spacing w:before="0" w:after="0" w:line="200" w:lineRule="auto"/>
+            </w:pPr>
+            <w:r>
+              <w:t xml:space="preserve">errors.txt</w:t>
+            </w:r>
+          </w:p>
+          <w:p>
+            <w:pPr>
+              <w:pStyle w:val="SourceCode"/>
+              <w:spacing w:before="0" w:after="0" w:line="200" w:lineRule="auto"/>
+            </w:pPr>
+            <w:r>
+              <w:t xml:space="preserve">listing.txt</w:t>
             </w:r>
           </w:p>
         </w:tc>
@@ -4451,6 +4510,16 @@
           <w:szCs w:val="4"/>
         </w:rPr>
       </w:pPr>
+    </w:p>
+    <w:bookmarkEnd w:id="24"/>
+    <w:bookmarkStart w:id="25" w:name="крок-6.-те-саме-в-powershell"/>
+    <w:p>
+      <w:pPr>
+        <w:pStyle w:val="Heading3"/>
+      </w:pPr>
+      <w:r>
+        <w:t xml:space="preserve">Крок 6. Те саме в PowerShell</w:t>
+      </w:r>
     </w:p>
     <w:p>
       <w:pPr>
@@ -4497,16 +4566,16 @@
               <w:spacing w:before="0" w:after="0" w:line="200" w:lineRule="auto"/>
             </w:pPr>
             <w:r>
-              <w:t xml:space="preserve">Count    : 70</w:t>
-            </w:r>
-          </w:p>
-          <w:p>
-            <w:pPr>
-              <w:pStyle w:val="SourceCode"/>
-              <w:spacing w:before="0" w:after="0" w:line="200" w:lineRule="auto"/>
-            </w:pPr>
-            <w:r>
-              <w:t xml:space="preserve">Sum      : 12648174</w:t>
+              <w:t xml:space="preserve">PS C:\...\LAB2&gt; Get-ChildItem src -Recurse -File |</w:t>
+            </w:r>
+          </w:p>
+          <w:p>
+            <w:pPr>
+              <w:pStyle w:val="SourceCode"/>
+              <w:spacing w:before="0" w:after="0" w:line="200" w:lineRule="auto"/>
+            </w:pPr>
+            <w:r>
+              <w:t xml:space="preserve">&gt;&gt;     Measure-Object -Property Length -Sum</w:t>
             </w:r>
           </w:p>
         </w:tc>
@@ -4566,25 +4635,16 @@
               <w:spacing w:before="0" w:after="0" w:line="200" w:lineRule="auto"/>
             </w:pPr>
             <w:r>
-              <w:t xml:space="preserve">PS C:\...\LAB2&gt; Get-ChildItem src -Recurse -File |</w:t>
-            </w:r>
-          </w:p>
-          <w:p>
-            <w:pPr>
-              <w:pStyle w:val="SourceCode"/>
-              <w:spacing w:before="0" w:after="0" w:line="200" w:lineRule="auto"/>
-            </w:pPr>
-            <w:r>
-              <w:t xml:space="preserve">&gt;&gt;     Sort-Object Length -Descending |</w:t>
-            </w:r>
-          </w:p>
-          <w:p>
-            <w:pPr>
-              <w:pStyle w:val="SourceCode"/>
-              <w:spacing w:before="0" w:after="0" w:line="200" w:lineRule="auto"/>
-            </w:pPr>
-            <w:r>
-              <w:t xml:space="preserve">&gt;&gt;     Select-Object -First 3 Name, Length</w:t>
+              <w:t xml:space="preserve">Count    : 70</w:t>
+            </w:r>
+          </w:p>
+          <w:p>
+            <w:pPr>
+              <w:pStyle w:val="SourceCode"/>
+              <w:spacing w:before="0" w:after="0" w:line="200" w:lineRule="auto"/>
+            </w:pPr>
+            <w:r>
+              <w:t xml:space="preserve">Sum      : 12648174</w:t>
             </w:r>
           </w:p>
         </w:tc>
@@ -4644,43 +4704,25 @@
               <w:spacing w:before="0" w:after="0" w:line="200" w:lineRule="auto"/>
             </w:pPr>
             <w:r>
-              <w:t xml:space="preserve">Name                       Length</w:t>
-            </w:r>
-          </w:p>
-          <w:p>
-            <w:pPr>
-              <w:pStyle w:val="SourceCode"/>
-              <w:spacing w:before="0" w:after="0" w:line="200" w:lineRule="auto"/>
-            </w:pPr>
-            <w:r>
-              <w:t xml:space="preserve">----                       ------</w:t>
-            </w:r>
-          </w:p>
-          <w:p>
-            <w:pPr>
-              <w:pStyle w:val="SourceCode"/>
-              <w:spacing w:before="0" w:after="0" w:line="200" w:lineRule="auto"/>
-            </w:pPr>
-            <w:r>
-              <w:t xml:space="preserve">Windows Logon.wav         1189836</w:t>
-            </w:r>
-          </w:p>
-          <w:p>
-            <w:pPr>
-              <w:pStyle w:val="SourceCode"/>
-              <w:spacing w:before="0" w:after="0" w:line="200" w:lineRule="auto"/>
-            </w:pPr>
-            <w:r>
-              <w:t xml:space="preserve">Windows Shutdown.wav       729068</w:t>
-            </w:r>
-          </w:p>
-          <w:p>
-            <w:pPr>
-              <w:pStyle w:val="SourceCode"/>
-              <w:spacing w:before="0" w:after="0" w:line="200" w:lineRule="auto"/>
-            </w:pPr>
-            <w:r>
-              <w:t xml:space="preserve">Windows Startup.wav        497908</w:t>
+              <w:t xml:space="preserve">PS C:\...\LAB2&gt; Get-ChildItem src -Recurse -File |</w:t>
+            </w:r>
+          </w:p>
+          <w:p>
+            <w:pPr>
+              <w:pStyle w:val="SourceCode"/>
+              <w:spacing w:before="0" w:after="0" w:line="200" w:lineRule="auto"/>
+            </w:pPr>
+            <w:r>
+              <w:t xml:space="preserve">&gt;&gt;     Sort-Object Length -Descending |</w:t>
+            </w:r>
+          </w:p>
+          <w:p>
+            <w:pPr>
+              <w:pStyle w:val="SourceCode"/>
+              <w:spacing w:before="0" w:after="0" w:line="200" w:lineRule="auto"/>
+            </w:pPr>
+            <w:r>
+              <w:t xml:space="preserve">&gt;&gt;     Select-Object -First 3 Name, Length</w:t>
             </w:r>
           </w:p>
         </w:tc>
@@ -4697,6 +4739,102 @@
     </w:p>
     <w:p>
       <w:pPr>
+        <w:spacing w:before="0" w:after="0" w:line="120" w:lineRule="exact"/>
+        <w:rPr>
+          <w:sz w:val="4"/>
+          <w:szCs w:val="4"/>
+        </w:rPr>
+      </w:pPr>
+    </w:p>
+    <w:tbl>
+      <w:tblPr>
+        <w:tblStyle w:val="SourceCodeTable"/>
+        <w:tblW w:type="dxa" w:w="9637"/>
+        <w:tblInd w:w="0" w:type="dxa"/>
+        <w:tblBorders>
+          <w:top w:color="BFBFBF" w:space="0" w:sz="4" w:val="single"/>
+          <w:left w:color="BFBFBF" w:space="0" w:sz="4" w:val="single"/>
+          <w:bottom w:color="BFBFBF" w:space="0" w:sz="4" w:val="single"/>
+          <w:right w:color="BFBFBF" w:space="0" w:sz="4" w:val="single"/>
+        </w:tblBorders>
+        <w:shd w:color="auto" w:fill="F4F4F4" w:val="clear"/>
+        <w:tblLayout w:type="fixed"/>
+        <w:tblCellMar>
+          <w:top w:type="dxa" w:w="113"/>
+          <w:left w:type="dxa" w:w="113"/>
+          <w:bottom w:type="dxa" w:w="113"/>
+          <w:right w:type="dxa" w:w="113"/>
+        </w:tblCellMar>
+        <w:tblLook w:val="0000" w:firstRow="0" w:lastRow="0" w:firstColumn="0" w:lastColumn="0" w:noHBand="1" w:noVBand="1"/>
+      </w:tblPr>
+      <w:tblGrid>
+        <w:gridCol w:w="9637"/>
+      </w:tblGrid>
+      <w:tr>
+        <w:tc>
+          <w:tcPr>
+            <w:tcW w:type="dxa" w:w="9637"/>
+            <w:shd w:color="auto" w:fill="F4F4F4" w:val="clear"/>
+          </w:tcPr>
+          <w:p>
+            <w:pPr>
+              <w:pStyle w:val="SourceCode"/>
+              <w:spacing w:before="0" w:after="0" w:line="200" w:lineRule="auto"/>
+            </w:pPr>
+            <w:r>
+              <w:t xml:space="preserve">Name                       Length</w:t>
+            </w:r>
+          </w:p>
+          <w:p>
+            <w:pPr>
+              <w:pStyle w:val="SourceCode"/>
+              <w:spacing w:before="0" w:after="0" w:line="200" w:lineRule="auto"/>
+            </w:pPr>
+            <w:r>
+              <w:t xml:space="preserve">----                       ------</w:t>
+            </w:r>
+          </w:p>
+          <w:p>
+            <w:pPr>
+              <w:pStyle w:val="SourceCode"/>
+              <w:spacing w:before="0" w:after="0" w:line="200" w:lineRule="auto"/>
+            </w:pPr>
+            <w:r>
+              <w:t xml:space="preserve">Windows Logon.wav         1189836</w:t>
+            </w:r>
+          </w:p>
+          <w:p>
+            <w:pPr>
+              <w:pStyle w:val="SourceCode"/>
+              <w:spacing w:before="0" w:after="0" w:line="200" w:lineRule="auto"/>
+            </w:pPr>
+            <w:r>
+              <w:t xml:space="preserve">Windows Shutdown.wav       729068</w:t>
+            </w:r>
+          </w:p>
+          <w:p>
+            <w:pPr>
+              <w:pStyle w:val="SourceCode"/>
+              <w:spacing w:before="0" w:after="0" w:line="200" w:lineRule="auto"/>
+            </w:pPr>
+            <w:r>
+              <w:t xml:space="preserve">Windows Startup.wav        497908</w:t>
+            </w:r>
+          </w:p>
+        </w:tc>
+      </w:tr>
+    </w:tbl>
+    <w:p>
+      <w:pPr>
+        <w:spacing w:before="0" w:after="0" w:line="120" w:lineRule="exact"/>
+        <w:rPr>
+          <w:sz w:val="4"/>
+          <w:szCs w:val="4"/>
+        </w:rPr>
+      </w:pPr>
+    </w:p>
+    <w:p>
+      <w:pPr>
         <w:pStyle w:val="FirstParagraph"/>
       </w:pPr>
       <w:r>
@@ -4735,7 +4873,7 @@
         <w:jc w:val="both"/>
       </w:pPr>
       <w:r>
-        <w:t xml:space="preserve">Створити на робочому столі навчальний каталог LAB2 і всередині нього підкаталоги src, docs, bak, а також один каталог, ім’я якого містить пробіл. Перевірити, що перехід у нього без лапок не спрацьовує, і зафіксувати повідомлення системи.</w:t>
+        <w:t xml:space="preserve">Створити на робочому столі навчальний каталог LAB2 і всередині нього підкаталоги src, docs, bak, а також один каталог, ім’я якого містить пробіл. Перевірити, як поводяться з цим ім’ям без лапок команди cd і dir, зафіксувати результат і пояснити різницю.</w:t>
       </w:r>
     </w:p>
     <w:p>

</xml_diff>

<commit_message>
docs: expand OS lecture content and improve formatting (#23)
- Update Windows OS timeline with additional details
- Refine diagrams, including process states and kernel architecture
- Add sections on Master File Table, NTFS internals, and Windows registry
- Enhance real-world applications and career examples
</commit_message>
<xml_diff>
--- a/public/labs/os/kmp-23/ЛР1_ОС_Файли_та_каталоги_в_командному_рядку_Windows.docx
+++ b/public/labs/os/kmp-23/ЛР1_ОС_Файли_та_каталоги_в_командному_рядку_Windows.docx
@@ -135,7 +135,7 @@
         <w:pStyle w:val="BodyText"/>
       </w:pPr>
       <w:r>
-        <w:t xml:space="preserve">Якщо шлях містить пробіли, його беруть у подвійні лапки: cd</w:t>
+        <w:t xml:space="preserve">Якщо шлях містить пробіли, його беруть у подвійні лапки: dir</w:t>
       </w:r>
       <w:r>
         <w:t xml:space="preserve"> </w:t>
@@ -144,7 +144,15 @@
         <w:t xml:space="preserve">“Program Files”</w:t>
       </w:r>
       <w:r>
-        <w:t xml:space="preserve">. Без лапок командний процесор сприйме пробіл як роздільник аргументів і повідомить про помилку синтаксису.</w:t>
+        <w:t xml:space="preserve">. Без лапок командний процесор сприйме пробіл як роздільник аргументів: команда dir Program Files шукатиме два різні об’єкти — Program і Files — і повідомить, що файл не знайдено.</w:t>
+      </w:r>
+    </w:p>
+    <w:p>
+      <w:pPr>
+        <w:pStyle w:val="BodyText"/>
+      </w:pPr>
+      <w:r>
+        <w:t xml:space="preserve">Команда cd — виняток. Вона приймає лише один аргумент, тому весь рядок після cd вважає одним шляхом: cd Program Files спрацює і без лапок. Покладатися на цей виняток не варто: для будь-якої іншої команди пробіл без лапок розріже шлях. Найнебезпечніше це для del — команда del test folder спробує видалити два файли, test і folder, у поточному каталозі, а зовсім не каталог «test folder». Тому шляхи з пробілами беруть у лапки завжди.</w:t>
       </w:r>
     </w:p>
     <w:bookmarkEnd w:id="9"/>
@@ -287,6 +295,14 @@
         <w:pStyle w:val="FirstParagraph"/>
       </w:pPr>
       <w:r>
+        <w:t xml:space="preserve">Пояснення після :: у цьому та наступних переліках — лише для читача, вводити їх не треба: посеред рядка :: не є коментарем, і командний процесор передасть ці символи команді як зайві аргументи.</w:t>
+      </w:r>
+    </w:p>
+    <w:p>
+      <w:pPr>
+        <w:pStyle w:val="BodyText"/>
+      </w:pPr>
+      <w:r>
         <w:t xml:space="preserve">Пара pushd / popd зручна, коли треба ненадовго відлучитися в інший каталог і гарантовано повернутися: вона працює як стек, тому виклики можна вкладати.</w:t>
       </w:r>
     </w:p>
@@ -418,7 +434,15 @@
         <w:pStyle w:val="FirstParagraph"/>
       </w:pPr>
       <w:r>
-        <w:t xml:space="preserve">Маска розкривається не командою, а самою командою-адресатом, тому одна й та сама маска в dir і в del дає однаковий набір файлів. Це властивість, на якій ґрунтується головне правило безпеки: перш ніж виконати del із маскою, виконайте з тією самою маскою dir і подивіться, що саме потрапить під видалення.</w:t>
+        <w:t xml:space="preserve">Маску розкриває не командний процесор, як в оболонках Linux, а сама команда, якій її передали; dir і del роблять це однаково, тож одна й та сама маска дає в них однаковий набір файлів. На цьому ґрунтується головне правило безпеки: перш ніж виконати del із маскою, виконайте з тією самою маскою dir і подивіться, що саме потрапить під видалення.</w:t>
+      </w:r>
+    </w:p>
+    <w:p>
+      <w:pPr>
+        <w:pStyle w:val="BodyText"/>
+      </w:pPr>
+      <w:r>
+        <w:t xml:space="preserve">Перевірка потрібна ще й тому, що маски в Windows мають несподіванки. Для сумісності з MS-DOS файлова система може зберігати для кожного файлу друге, коротке ім’я у форматі 8.3 — наприклад, PRESEN~1.HTM для presentation.html. Маска зіставляється з обома іменами, тож на диску, де короткі імена ввімкнено (зазвичай це системний диск C:), del *.htm видалить і файли з розширенням html.</w:t>
       </w:r>
     </w:p>
     <w:bookmarkEnd w:id="11"/>
@@ -2313,8 +2337,8 @@
       <w:tblPr>
         <w:tblStyle w:val="Table"/>
         <w:tblW w:type="dxa" w:w="9637"/>
+        <w:tblLayout w:type="fixed"/>
         <w:tblLook w:firstRow="1" w:lastRow="0" w:firstColumn="0" w:lastColumn="0" w:noHBand="0" w:noVBand="0" w:val="0020"/>
-        <w:tblLayout w:type="fixed"/>
       </w:tblPr>
       <w:tblGrid>
         <w:gridCol w:w="4819"/>
@@ -2372,7 +2396,7 @@
               <w:rPr>
                 <w:rStyle w:val="VerbatimChar"/>
               </w:rPr>
-              <w:t xml:space="preserve">Get-ChildItem -Recurse -Name</w:t>
+              <w:t xml:space="preserve">(Get-ChildItem -Recurse).FullName</w:t>
             </w:r>
           </w:p>
         </w:tc>
@@ -2492,7 +2516,7 @@
               <w:rPr>
                 <w:rStyle w:val="VerbatimChar"/>
               </w:rPr>
-              <w:t xml:space="preserve">Remove-Item *.tmp -Recurse</w:t>
+              <w:t xml:space="preserve">Get-ChildItem -Recurse -Filter *.tmp \| Remove-Item</w:t>
             </w:r>
           </w:p>
         </w:tc>
@@ -2522,7 +2546,7 @@
               <w:rPr>
                 <w:rStyle w:val="VerbatimChar"/>
               </w:rPr>
-              <w:t xml:space="preserve">Select-String "error" *.log -Recurse</w:t>
+              <w:t xml:space="preserve">Get-ChildItem -Recurse -Filter *.log \| Select-String "error"</w:t>
             </w:r>
           </w:p>
         </w:tc>
@@ -2558,6 +2582,14 @@
         </w:tc>
       </w:tr>
     </w:tbl>
+    <w:p>
+      <w:pPr>
+        <w:pStyle w:val="BodyText"/>
+      </w:pPr>
+      <w:r>
+        <w:t xml:space="preserve">Два останні рядки свідомо записано конвеєром. Очевидний варіант Remove-Item *.tmp -Recurse не шукає файли в підкаталогах: ключ -Recurse стосується лише каталогів, які самі підпали під маску, — поведінка, яку Microsoft описує в документації як відому. А в Select-String параметра -Recurse немає зовсім. Пошук по дереву в PowerShell завжди робить Get-ChildItem -Recurse, а решта команд обробляє те, що вона передала.</w:t>
+      </w:r>
+    </w:p>
     <w:p>
       <w:pPr>
         <w:pStyle w:val="BodyText"/>
@@ -2914,23 +2946,7 @@
         <w:pStyle w:val="FirstParagraph"/>
       </w:pPr>
       <w:r>
-        <w:t xml:space="preserve">Windows CMD дозволяє використовувати пробіли в якості значення аргументу, який приймає cd «test folder» і «</w:t>
-      </w:r>
-      <w:r>
-        <w:t xml:space="preserve">“test folder”</w:t>
-      </w:r>
-      <w:r>
-        <w:t xml:space="preserve">» працюють однаково.</w:t>
-      </w:r>
-    </w:p>
-    <w:bookmarkEnd w:id="20"/>
-    <w:bookmarkStart w:id="21" w:name="крок-2.-наповнення-та-маски"/>
-    <w:p>
-      <w:pPr>
-        <w:pStyle w:val="Heading3"/>
-      </w:pPr>
-      <w:r>
-        <w:t xml:space="preserve">Крок 2. Наповнення та маски</w:t>
+        <w:t xml:space="preserve">Команда cd спрацювала і з лапками, і без них: вона приймає лише один аргумент і вважає шляхом весь рядок. Інші команди так не роблять — порівняйте:</w:t>
       </w:r>
     </w:p>
     <w:p>
@@ -2978,25 +2994,34 @@
               <w:spacing w:before="0" w:after="0" w:line="200" w:lineRule="auto"/>
             </w:pPr>
             <w:r>
-              <w:t xml:space="preserve">C:\...\LAB2&gt; xcopy /s /i %SystemRoot%\Media src</w:t>
-            </w:r>
-          </w:p>
-          <w:p>
-            <w:pPr>
-              <w:pStyle w:val="SourceCode"/>
-              <w:spacing w:before="0" w:after="0" w:line="200" w:lineRule="auto"/>
-            </w:pPr>
-            <w:r>
-              <w:t xml:space="preserve">...</w:t>
-            </w:r>
-          </w:p>
-          <w:p>
-            <w:pPr>
-              <w:pStyle w:val="SourceCode"/>
-              <w:spacing w:before="0" w:after="0" w:line="200" w:lineRule="auto"/>
-            </w:pPr>
-            <w:r>
-              <w:t xml:space="preserve">70 File(s) copied</w:t>
+              <w:t xml:space="preserve">C:\...\LAB2&gt; dir /b test folder</w:t>
+            </w:r>
+          </w:p>
+          <w:p>
+            <w:pPr>
+              <w:pStyle w:val="SourceCode"/>
+              <w:spacing w:before="0" w:after="0" w:line="200" w:lineRule="auto"/>
+            </w:pPr>
+            <w:r>
+              <w:t xml:space="preserve">File Not Found</w:t>
+            </w:r>
+          </w:p>
+          <w:p>
+            <w:pPr>
+              <w:pStyle w:val="SourceCode"/>
+              <w:spacing w:before="0" w:after="0" w:line="200" w:lineRule="auto"/>
+            </w:pPr>
+            <w:r>
+              <w:t xml:space="preserve">C:\...\LAB2&gt; dir /b "test folder"</w:t>
+            </w:r>
+          </w:p>
+          <w:p>
+            <w:pPr>
+              <w:pStyle w:val="SourceCode"/>
+              <w:spacing w:before="0" w:after="0" w:line="200" w:lineRule="auto"/>
+            </w:pPr>
+            <w:r>
+              <w:t xml:space="preserve">C:\...\LAB2&gt;</w:t>
             </w:r>
           </w:p>
         </w:tc>
@@ -3010,6 +3035,24 @@
           <w:szCs w:val="4"/>
         </w:rPr>
       </w:pPr>
+    </w:p>
+    <w:p>
+      <w:pPr>
+        <w:pStyle w:val="FirstParagraph"/>
+      </w:pPr>
+      <w:r>
+        <w:t xml:space="preserve">Без лапок dir шукала два окремі об’єкти, test і folder, і не знайшла жодного. З лапками команда відпрацювала: каталог «test folder» поки порожній, тому вивід порожній.</w:t>
+      </w:r>
+    </w:p>
+    <w:bookmarkEnd w:id="20"/>
+    <w:bookmarkStart w:id="21" w:name="крок-2.-наповнення-та-маски"/>
+    <w:p>
+      <w:pPr>
+        <w:pStyle w:val="Heading3"/>
+      </w:pPr>
+      <w:r>
+        <w:t xml:space="preserve">Крок 2. Наповнення та маски</w:t>
+      </w:r>
     </w:p>
     <w:p>
       <w:pPr>
@@ -3056,43 +3099,7 @@
               <w:spacing w:before="0" w:after="0" w:line="200" w:lineRule="auto"/>
             </w:pPr>
             <w:r>
-              <w:t xml:space="preserve">C:\...\LAB2&gt; dir src /s /b | find /c ":"</w:t>
-            </w:r>
-          </w:p>
-          <w:p>
-            <w:pPr>
-              <w:pStyle w:val="SourceCode"/>
-              <w:spacing w:before="0" w:after="0" w:line="200" w:lineRule="auto"/>
-            </w:pPr>
-            <w:r>
-              <w:t xml:space="preserve">78</w:t>
-            </w:r>
-          </w:p>
-          <w:p>
-            <w:pPr>
-              <w:pStyle w:val="SourceCode"/>
-              <w:spacing w:before="0" w:after="0" w:line="200" w:lineRule="auto"/>
-            </w:pPr>
-            <w:r>
-              <w:t xml:space="preserve">C:\...\LAB2&gt; dir src\*.wav /o:-s /b</w:t>
-            </w:r>
-          </w:p>
-          <w:p>
-            <w:pPr>
-              <w:pStyle w:val="SourceCode"/>
-              <w:spacing w:before="0" w:after="0" w:line="200" w:lineRule="auto"/>
-            </w:pPr>
-            <w:r>
-              <w:t xml:space="preserve">Windows Ringin.wav</w:t>
-            </w:r>
-          </w:p>
-          <w:p>
-            <w:pPr>
-              <w:pStyle w:val="SourceCode"/>
-              <w:spacing w:before="0" w:after="0" w:line="200" w:lineRule="auto"/>
-            </w:pPr>
-            <w:r>
-              <w:t xml:space="preserve">Windows Notify Calendar.wav</w:t>
+              <w:t xml:space="preserve">C:\...\LAB2&gt; xcopy /s /e /i %SystemRoot%\Media src</w:t>
             </w:r>
           </w:p>
           <w:p>
@@ -3110,16 +3117,7 @@
               <w:spacing w:before="0" w:after="0" w:line="200" w:lineRule="auto"/>
             </w:pPr>
             <w:r>
-              <w:t xml:space="preserve">C:\...\LAB2&gt; dir src\??.wav /b</w:t>
-            </w:r>
-          </w:p>
-          <w:p>
-            <w:pPr>
-              <w:pStyle w:val="SourceCode"/>
-              <w:spacing w:before="0" w:after="0" w:line="200" w:lineRule="auto"/>
-            </w:pPr>
-            <w:r>
-              <w:t xml:space="preserve">File Not Found</w:t>
+              <w:t xml:space="preserve">70 File(s) copied</w:t>
             </w:r>
           </w:p>
         </w:tc>
@@ -3133,24 +3131,6 @@
           <w:szCs w:val="4"/>
         </w:rPr>
       </w:pPr>
-    </w:p>
-    <w:p>
-      <w:pPr>
-        <w:pStyle w:val="FirstParagraph"/>
-      </w:pPr>
-      <w:r>
-        <w:t xml:space="preserve">Маска ??.wav не знайшла нічого: серед файлів немає жодного, ім’я якого складається рівно з двох символів. Маска *.wav дала б усі сімдесят.</w:t>
-      </w:r>
-    </w:p>
-    <w:bookmarkEnd w:id="21"/>
-    <w:bookmarkStart w:id="22" w:name="крок-3.-три-способи-копіювання"/>
-    <w:p>
-      <w:pPr>
-        <w:pStyle w:val="Heading3"/>
-      </w:pPr>
-      <w:r>
-        <w:t xml:space="preserve">Крок 3. Три способи копіювання</w:t>
-      </w:r>
     </w:p>
     <w:p>
       <w:pPr>
@@ -3197,7 +3177,79 @@
               <w:spacing w:before="0" w:after="0" w:line="200" w:lineRule="auto"/>
             </w:pPr>
             <w:r>
-              <w:t xml:space="preserve">C:\...\LAB2&gt; md copy1 copy2 copy3</w:t>
+              <w:t xml:space="preserve">C:\...\LAB2&gt; dir src /s /b | find /c ":"</w:t>
+            </w:r>
+          </w:p>
+          <w:p>
+            <w:pPr>
+              <w:pStyle w:val="SourceCode"/>
+              <w:spacing w:before="0" w:after="0" w:line="200" w:lineRule="auto"/>
+            </w:pPr>
+            <w:r>
+              <w:t xml:space="preserve">78</w:t>
+            </w:r>
+          </w:p>
+          <w:p>
+            <w:pPr>
+              <w:pStyle w:val="SourceCode"/>
+              <w:spacing w:before="0" w:after="0" w:line="200" w:lineRule="auto"/>
+            </w:pPr>
+            <w:r>
+              <w:t xml:space="preserve">C:\...\LAB2&gt; dir src\*.wav /o:-s /b</w:t>
+            </w:r>
+          </w:p>
+          <w:p>
+            <w:pPr>
+              <w:pStyle w:val="SourceCode"/>
+              <w:spacing w:before="0" w:after="0" w:line="200" w:lineRule="auto"/>
+            </w:pPr>
+            <w:r>
+              <w:t xml:space="preserve">Windows Logon.wav</w:t>
+            </w:r>
+          </w:p>
+          <w:p>
+            <w:pPr>
+              <w:pStyle w:val="SourceCode"/>
+              <w:spacing w:before="0" w:after="0" w:line="200" w:lineRule="auto"/>
+            </w:pPr>
+            <w:r>
+              <w:t xml:space="preserve">Windows Shutdown.wav</w:t>
+            </w:r>
+          </w:p>
+          <w:p>
+            <w:pPr>
+              <w:pStyle w:val="SourceCode"/>
+              <w:spacing w:before="0" w:after="0" w:line="200" w:lineRule="auto"/>
+            </w:pPr>
+            <w:r>
+              <w:t xml:space="preserve">Windows Startup.wav</w:t>
+            </w:r>
+          </w:p>
+          <w:p>
+            <w:pPr>
+              <w:pStyle w:val="SourceCode"/>
+              <w:spacing w:before="0" w:after="0" w:line="200" w:lineRule="auto"/>
+            </w:pPr>
+            <w:r>
+              <w:t xml:space="preserve">...</w:t>
+            </w:r>
+          </w:p>
+          <w:p>
+            <w:pPr>
+              <w:pStyle w:val="SourceCode"/>
+              <w:spacing w:before="0" w:after="0" w:line="200" w:lineRule="auto"/>
+            </w:pPr>
+            <w:r>
+              <w:t xml:space="preserve">C:\...\LAB2&gt; dir src\??.wav /b</w:t>
+            </w:r>
+          </w:p>
+          <w:p>
+            <w:pPr>
+              <w:pStyle w:val="SourceCode"/>
+              <w:spacing w:before="0" w:after="0" w:line="200" w:lineRule="auto"/>
+            </w:pPr>
+            <w:r>
+              <w:t xml:space="preserve">File Not Found</w:t>
             </w:r>
           </w:p>
         </w:tc>
@@ -3211,6 +3263,32 @@
           <w:szCs w:val="4"/>
         </w:rPr>
       </w:pPr>
+    </w:p>
+    <w:p>
+      <w:pPr>
+        <w:pStyle w:val="FirstParagraph"/>
+      </w:pPr>
+      <w:r>
+        <w:t xml:space="preserve">xcopy повідомила про 70 файлів, а dir нарахувала 78 об’єктів: крім файлів, у src тепер є вісім підкаталогів джерела. У цьому прикладі вони порожні, тож скопіювати їх вдалося лише завдяки ключу /e — з самим /s xcopy пропускає порожні каталоги.</w:t>
+      </w:r>
+    </w:p>
+    <w:p>
+      <w:pPr>
+        <w:pStyle w:val="BodyText"/>
+      </w:pPr>
+      <w:r>
+        <w:t xml:space="preserve">Маска ??.wav не знайшла нічого: серед файлів немає жодного, ім’я якого складається рівно з двох символів. Маска *.wav дала б усі сімдесят.</w:t>
+      </w:r>
+    </w:p>
+    <w:bookmarkEnd w:id="21"/>
+    <w:bookmarkStart w:id="22" w:name="крок-3.-три-способи-копіювання"/>
+    <w:p>
+      <w:pPr>
+        <w:pStyle w:val="Heading3"/>
+      </w:pPr>
+      <w:r>
+        <w:t xml:space="preserve">Крок 3. Три способи копіювання</w:t>
+      </w:r>
     </w:p>
     <w:p>
       <w:pPr>
@@ -3257,43 +3335,7 @@
               <w:spacing w:before="0" w:after="0" w:line="200" w:lineRule="auto"/>
             </w:pPr>
             <w:r>
-              <w:t xml:space="preserve">C:\...\LAB2&gt; echo %time%</w:t>
-            </w:r>
-          </w:p>
-          <w:p>
-            <w:pPr>
-              <w:pStyle w:val="SourceCode"/>
-              <w:spacing w:before="0" w:after="0" w:line="200" w:lineRule="auto"/>
-            </w:pPr>
-            <w:r>
-              <w:t xml:space="preserve">14:22:05,31</w:t>
-            </w:r>
-          </w:p>
-          <w:p>
-            <w:pPr>
-              <w:pStyle w:val="SourceCode"/>
-              <w:spacing w:before="0" w:after="0" w:line="200" w:lineRule="auto"/>
-            </w:pPr>
-            <w:r>
-              <w:t xml:space="preserve">C:\...\LAB2&gt; copy src\*.* copy1\ &gt; nul</w:t>
-            </w:r>
-          </w:p>
-          <w:p>
-            <w:pPr>
-              <w:pStyle w:val="SourceCode"/>
-              <w:spacing w:before="0" w:after="0" w:line="200" w:lineRule="auto"/>
-            </w:pPr>
-            <w:r>
-              <w:t xml:space="preserve">C:\...\LAB2&gt; echo %time%</w:t>
-            </w:r>
-          </w:p>
-          <w:p>
-            <w:pPr>
-              <w:pStyle w:val="SourceCode"/>
-              <w:spacing w:before="0" w:after="0" w:line="200" w:lineRule="auto"/>
-            </w:pPr>
-            <w:r>
-              <w:t xml:space="preserve">14:22:06,08</w:t>
+              <w:t xml:space="preserve">C:\...\LAB2&gt; md copy1 copy2 copy3</w:t>
             </w:r>
           </w:p>
         </w:tc>
@@ -3362,16 +3404,16 @@
               <w:spacing w:before="0" w:after="0" w:line="200" w:lineRule="auto"/>
             </w:pPr>
             <w:r>
-              <w:t xml:space="preserve">14:22:11,44</w:t>
-            </w:r>
-          </w:p>
-          <w:p>
-            <w:pPr>
-              <w:pStyle w:val="SourceCode"/>
-              <w:spacing w:before="0" w:after="0" w:line="200" w:lineRule="auto"/>
-            </w:pPr>
-            <w:r>
-              <w:t xml:space="preserve">C:\...\LAB2&gt; xcopy /s /e /q src copy2\ &gt; nul</w:t>
+              <w:t xml:space="preserve">14:22:05,31</w:t>
+            </w:r>
+          </w:p>
+          <w:p>
+            <w:pPr>
+              <w:pStyle w:val="SourceCode"/>
+              <w:spacing w:before="0" w:after="0" w:line="200" w:lineRule="auto"/>
+            </w:pPr>
+            <w:r>
+              <w:t xml:space="preserve">C:\...\LAB2&gt; copy src\*.* copy1\ &gt; nul</w:t>
             </w:r>
           </w:p>
           <w:p>
@@ -3389,7 +3431,7 @@
               <w:spacing w:before="0" w:after="0" w:line="200" w:lineRule="auto"/>
             </w:pPr>
             <w:r>
-              <w:t xml:space="preserve">14:22:12,97</w:t>
+              <w:t xml:space="preserve">14:22:06,08</w:t>
             </w:r>
           </w:p>
         </w:tc>
@@ -3458,16 +3500,16 @@
               <w:spacing w:before="0" w:after="0" w:line="200" w:lineRule="auto"/>
             </w:pPr>
             <w:r>
-              <w:t xml:space="preserve">14:22:20,12</w:t>
-            </w:r>
-          </w:p>
-          <w:p>
-            <w:pPr>
-              <w:pStyle w:val="SourceCode"/>
-              <w:spacing w:before="0" w:after="0" w:line="200" w:lineRule="auto"/>
-            </w:pPr>
-            <w:r>
-              <w:t xml:space="preserve">C:\...\LAB2&gt; robocopy src copy3 /e /mt:8 /njh /njs /nfl /ndl &gt; nul</w:t>
+              <w:t xml:space="preserve">14:22:11,44</w:t>
+            </w:r>
+          </w:p>
+          <w:p>
+            <w:pPr>
+              <w:pStyle w:val="SourceCode"/>
+              <w:spacing w:before="0" w:after="0" w:line="200" w:lineRule="auto"/>
+            </w:pPr>
+            <w:r>
+              <w:t xml:space="preserve">C:\...\LAB2&gt; xcopy /s /e /q src copy2\ &gt; nul</w:t>
             </w:r>
           </w:p>
           <w:p>
@@ -3485,7 +3527,7 @@
               <w:spacing w:before="0" w:after="0" w:line="200" w:lineRule="auto"/>
             </w:pPr>
             <w:r>
-              <w:t xml:space="preserve">14:22:20,79</w:t>
+              <w:t xml:space="preserve">14:22:12,97</w:t>
             </w:r>
           </w:p>
         </w:tc>
@@ -3545,52 +3587,43 @@
               <w:spacing w:before="0" w:after="0" w:line="200" w:lineRule="auto"/>
             </w:pPr>
             <w:r>
-              <w:t xml:space="preserve">C:\...\LAB2&gt; dir copy1 /s /b | find /c ":"</w:t>
-            </w:r>
-          </w:p>
-          <w:p>
-            <w:pPr>
-              <w:pStyle w:val="SourceCode"/>
-              <w:spacing w:before="0" w:after="0" w:line="200" w:lineRule="auto"/>
-            </w:pPr>
-            <w:r>
-              <w:t xml:space="preserve">70</w:t>
-            </w:r>
-          </w:p>
-          <w:p>
-            <w:pPr>
-              <w:pStyle w:val="SourceCode"/>
-              <w:spacing w:before="0" w:after="0" w:line="200" w:lineRule="auto"/>
-            </w:pPr>
-            <w:r>
-              <w:t xml:space="preserve">C:\...\LAB2&gt; dir copy2 /s /b | find /c ":"</w:t>
-            </w:r>
-          </w:p>
-          <w:p>
-            <w:pPr>
-              <w:pStyle w:val="SourceCode"/>
-              <w:spacing w:before="0" w:after="0" w:line="200" w:lineRule="auto"/>
-            </w:pPr>
-            <w:r>
-              <w:t xml:space="preserve">78</w:t>
-            </w:r>
-          </w:p>
-          <w:p>
-            <w:pPr>
-              <w:pStyle w:val="SourceCode"/>
-              <w:spacing w:before="0" w:after="0" w:line="200" w:lineRule="auto"/>
-            </w:pPr>
-            <w:r>
-              <w:t xml:space="preserve">C:\...\LAB2&gt; dir copy3 /s /b | find /c ":"</w:t>
-            </w:r>
-          </w:p>
-          <w:p>
-            <w:pPr>
-              <w:pStyle w:val="SourceCode"/>
-              <w:spacing w:before="0" w:after="0" w:line="200" w:lineRule="auto"/>
-            </w:pPr>
-            <w:r>
-              <w:t xml:space="preserve">78</w:t>
+              <w:t xml:space="preserve">C:\...\LAB2&gt; echo %time%</w:t>
+            </w:r>
+          </w:p>
+          <w:p>
+            <w:pPr>
+              <w:pStyle w:val="SourceCode"/>
+              <w:spacing w:before="0" w:after="0" w:line="200" w:lineRule="auto"/>
+            </w:pPr>
+            <w:r>
+              <w:t xml:space="preserve">14:22:20,12</w:t>
+            </w:r>
+          </w:p>
+          <w:p>
+            <w:pPr>
+              <w:pStyle w:val="SourceCode"/>
+              <w:spacing w:before="0" w:after="0" w:line="200" w:lineRule="auto"/>
+            </w:pPr>
+            <w:r>
+              <w:t xml:space="preserve">C:\...\LAB2&gt; robocopy src copy3 /e /mt:8 /njh /njs /nfl /ndl &gt; nul</w:t>
+            </w:r>
+          </w:p>
+          <w:p>
+            <w:pPr>
+              <w:pStyle w:val="SourceCode"/>
+              <w:spacing w:before="0" w:after="0" w:line="200" w:lineRule="auto"/>
+            </w:pPr>
+            <w:r>
+              <w:t xml:space="preserve">C:\...\LAB2&gt; echo %time%</w:t>
+            </w:r>
+          </w:p>
+          <w:p>
+            <w:pPr>
+              <w:pStyle w:val="SourceCode"/>
+              <w:spacing w:before="0" w:after="0" w:line="200" w:lineRule="auto"/>
+            </w:pPr>
+            <w:r>
+              <w:t xml:space="preserve">14:22:20,79</w:t>
             </w:r>
           </w:p>
         </w:tc>
@@ -3604,24 +3637,6 @@
           <w:szCs w:val="4"/>
         </w:rPr>
       </w:pPr>
-    </w:p>
-    <w:p>
-      <w:pPr>
-        <w:pStyle w:val="FirstParagraph"/>
-      </w:pPr>
-      <w:r>
-        <w:t xml:space="preserve">У copy1 потрапило сімдесят файлів, у copy2 і copy3 — сімдесят вісім. Різниця у вісім об’єктів — це підкаталоги джерела з їхнім вмістом: команда copy їх просто не бачить, вона працює лише в межах одного каталогу. Це не помилка користувача, а межа можливостей самої команди.</w:t>
-      </w:r>
-    </w:p>
-    <w:bookmarkEnd w:id="22"/>
-    <w:bookmarkStart w:id="23" w:name="X5a4c47d5de03a59b13414b1bfccc68f7b27f2cf"/>
-    <w:p>
-      <w:pPr>
-        <w:pStyle w:val="Heading3"/>
-      </w:pPr>
-      <w:r>
-        <w:t xml:space="preserve">Крок 4. Перейменування, атрибути, видалення</w:t>
-      </w:r>
     </w:p>
     <w:p>
       <w:pPr>
@@ -3668,25 +3683,7 @@
               <w:spacing w:before="0" w:after="0" w:line="200" w:lineRule="auto"/>
             </w:pPr>
             <w:r>
-              <w:t xml:space="preserve">C:\...\LAB2&gt; cd copy1</w:t>
-            </w:r>
-          </w:p>
-          <w:p>
-            <w:pPr>
-              <w:pStyle w:val="SourceCode"/>
-              <w:spacing w:before="0" w:after="0" w:line="200" w:lineRule="auto"/>
-            </w:pPr>
-            <w:r>
-              <w:t xml:space="preserve">C:\...\copy1&gt; ren *.wav *.bak</w:t>
-            </w:r>
-          </w:p>
-          <w:p>
-            <w:pPr>
-              <w:pStyle w:val="SourceCode"/>
-              <w:spacing w:before="0" w:after="0" w:line="200" w:lineRule="auto"/>
-            </w:pPr>
-            <w:r>
-              <w:t xml:space="preserve">C:\...\copy1&gt; dir /b | find /c ".bak"</w:t>
+              <w:t xml:space="preserve">C:\...\LAB2&gt; dir copy1 /s /b | find /c ":"</w:t>
             </w:r>
           </w:p>
           <w:p>
@@ -3696,6 +3693,42 @@
             </w:pPr>
             <w:r>
               <w:t xml:space="preserve">70</w:t>
+            </w:r>
+          </w:p>
+          <w:p>
+            <w:pPr>
+              <w:pStyle w:val="SourceCode"/>
+              <w:spacing w:before="0" w:after="0" w:line="200" w:lineRule="auto"/>
+            </w:pPr>
+            <w:r>
+              <w:t xml:space="preserve">C:\...\LAB2&gt; dir copy2 /s /b | find /c ":"</w:t>
+            </w:r>
+          </w:p>
+          <w:p>
+            <w:pPr>
+              <w:pStyle w:val="SourceCode"/>
+              <w:spacing w:before="0" w:after="0" w:line="200" w:lineRule="auto"/>
+            </w:pPr>
+            <w:r>
+              <w:t xml:space="preserve">78</w:t>
+            </w:r>
+          </w:p>
+          <w:p>
+            <w:pPr>
+              <w:pStyle w:val="SourceCode"/>
+              <w:spacing w:before="0" w:after="0" w:line="200" w:lineRule="auto"/>
+            </w:pPr>
+            <w:r>
+              <w:t xml:space="preserve">C:\...\LAB2&gt; dir copy3 /s /b | find /c ":"</w:t>
+            </w:r>
+          </w:p>
+          <w:p>
+            <w:pPr>
+              <w:pStyle w:val="SourceCode"/>
+              <w:spacing w:before="0" w:after="0" w:line="200" w:lineRule="auto"/>
+            </w:pPr>
+            <w:r>
+              <w:t xml:space="preserve">78</w:t>
             </w:r>
           </w:p>
         </w:tc>
@@ -3709,6 +3742,24 @@
           <w:szCs w:val="4"/>
         </w:rPr>
       </w:pPr>
+    </w:p>
+    <w:p>
+      <w:pPr>
+        <w:pStyle w:val="FirstParagraph"/>
+      </w:pPr>
+      <w:r>
+        <w:t xml:space="preserve">У copy1 потрапило сімдесят файлів, у copy2 і copy3 — сімдесят вісім об’єктів. Різниця у вісім — це підкаталоги джерела: команда copy їх просто не бачить, вона працює лише в межах одного каталогу. Якби в підкаталогах лежали файли, copy пропустила б і їх. Це не помилка користувача, а межа можливостей самої команди.</w:t>
+      </w:r>
+    </w:p>
+    <w:bookmarkEnd w:id="22"/>
+    <w:bookmarkStart w:id="23" w:name="X5a4c47d5de03a59b13414b1bfccc68f7b27f2cf"/>
+    <w:p>
+      <w:pPr>
+        <w:pStyle w:val="Heading3"/>
+      </w:pPr>
+      <w:r>
+        <w:t xml:space="preserve">Крок 4. Перейменування, атрибути, видалення</w:t>
+      </w:r>
     </w:p>
     <w:p>
       <w:pPr>
@@ -3755,25 +3806,34 @@
               <w:spacing w:before="0" w:after="0" w:line="200" w:lineRule="auto"/>
             </w:pPr>
             <w:r>
-              <w:t xml:space="preserve">C:\...\copy1&gt; attrib +r "Windows Ringin.bak"</w:t>
-            </w:r>
-          </w:p>
-          <w:p>
-            <w:pPr>
-              <w:pStyle w:val="SourceCode"/>
-              <w:spacing w:before="0" w:after="0" w:line="200" w:lineRule="auto"/>
-            </w:pPr>
-            <w:r>
-              <w:t xml:space="preserve">C:\...\copy1&gt; attrib "Windows Ringin.bak"</w:t>
-            </w:r>
-          </w:p>
-          <w:p>
-            <w:pPr>
-              <w:pStyle w:val="SourceCode"/>
-              <w:spacing w:before="0" w:after="0" w:line="200" w:lineRule="auto"/>
-            </w:pPr>
-            <w:r>
-              <w:t xml:space="preserve">A  R     C:\Users\Student\Desktop\LAB2\copy1\Windows Ringin.bak</w:t>
+              <w:t xml:space="preserve">C:\...\LAB2&gt; cd copy1</w:t>
+            </w:r>
+          </w:p>
+          <w:p>
+            <w:pPr>
+              <w:pStyle w:val="SourceCode"/>
+              <w:spacing w:before="0" w:after="0" w:line="200" w:lineRule="auto"/>
+            </w:pPr>
+            <w:r>
+              <w:t xml:space="preserve">C:\...\copy1&gt; ren *.wav *.bak</w:t>
+            </w:r>
+          </w:p>
+          <w:p>
+            <w:pPr>
+              <w:pStyle w:val="SourceCode"/>
+              <w:spacing w:before="0" w:after="0" w:line="200" w:lineRule="auto"/>
+            </w:pPr>
+            <w:r>
+              <w:t xml:space="preserve">C:\...\copy1&gt; dir /b | find /c ".bak"</w:t>
+            </w:r>
+          </w:p>
+          <w:p>
+            <w:pPr>
+              <w:pStyle w:val="SourceCode"/>
+              <w:spacing w:before="0" w:after="0" w:line="200" w:lineRule="auto"/>
+            </w:pPr>
+            <w:r>
+              <w:t xml:space="preserve">70</w:t>
             </w:r>
           </w:p>
         </w:tc>
@@ -3833,25 +3893,25 @@
               <w:spacing w:before="0" w:after="0" w:line="200" w:lineRule="auto"/>
             </w:pPr>
             <w:r>
-              <w:t xml:space="preserve">C:\...\copy1&gt; del "Windows Ringin.bak"</w:t>
-            </w:r>
-          </w:p>
-          <w:p>
-            <w:pPr>
-              <w:pStyle w:val="SourceCode"/>
-              <w:spacing w:before="0" w:after="0" w:line="200" w:lineRule="auto"/>
-            </w:pPr>
-            <w:r>
-              <w:t xml:space="preserve">C:\...\copy1\Windows Ringin.bak</w:t>
-            </w:r>
-          </w:p>
-          <w:p>
-            <w:pPr>
-              <w:pStyle w:val="SourceCode"/>
-              <w:spacing w:before="0" w:after="0" w:line="200" w:lineRule="auto"/>
-            </w:pPr>
-            <w:r>
-              <w:t xml:space="preserve">Access is denied.</w:t>
+              <w:t xml:space="preserve">C:\...\copy1&gt; attrib +r "Windows Ringin.bak"</w:t>
+            </w:r>
+          </w:p>
+          <w:p>
+            <w:pPr>
+              <w:pStyle w:val="SourceCode"/>
+              <w:spacing w:before="0" w:after="0" w:line="200" w:lineRule="auto"/>
+            </w:pPr>
+            <w:r>
+              <w:t xml:space="preserve">C:\...\copy1&gt; attrib "Windows Ringin.bak"</w:t>
+            </w:r>
+          </w:p>
+          <w:p>
+            <w:pPr>
+              <w:pStyle w:val="SourceCode"/>
+              <w:spacing w:before="0" w:after="0" w:line="200" w:lineRule="auto"/>
+            </w:pPr>
+            <w:r>
+              <w:t xml:space="preserve">A  R     C:\Users\Student\Desktop\LAB2\copy1\Windows Ringin.bak</w:t>
             </w:r>
           </w:p>
         </w:tc>
@@ -3911,88 +3971,25 @@
               <w:spacing w:before="0" w:after="0" w:line="200" w:lineRule="auto"/>
             </w:pPr>
             <w:r>
-              <w:t xml:space="preserve">C:\...\copy1&gt; del /f "Windows Ringin.bak"</w:t>
-            </w:r>
-          </w:p>
-          <w:p>
-            <w:pPr>
-              <w:pStyle w:val="SourceCode"/>
-              <w:spacing w:before="0" w:after="0" w:line="200" w:lineRule="auto"/>
-            </w:pPr>
-            <w:r>
-              <w:t xml:space="preserve">C:\...\copy1&gt; cd ..</w:t>
-            </w:r>
-          </w:p>
-          <w:p>
-            <w:pPr>
-              <w:pStyle w:val="SourceCode"/>
-              <w:spacing w:before="0" w:after="0" w:line="200" w:lineRule="auto"/>
-            </w:pPr>
-            <w:r>
-              <w:t xml:space="preserve">C:\...\LAB2&gt; rd /s /q copy1</w:t>
-            </w:r>
-          </w:p>
-          <w:p>
-            <w:pPr>
-              <w:pStyle w:val="SourceCode"/>
-              <w:spacing w:before="0" w:after="0" w:line="200" w:lineRule="auto"/>
-            </w:pPr>
-            <w:r>
-              <w:t xml:space="preserve">C:\...\LAB2&gt; dir /a:d /b</w:t>
-            </w:r>
-          </w:p>
-          <w:p>
-            <w:pPr>
-              <w:pStyle w:val="SourceCode"/>
-              <w:spacing w:before="0" w:after="0" w:line="200" w:lineRule="auto"/>
-            </w:pPr>
-            <w:r>
-              <w:t xml:space="preserve">bak</w:t>
-            </w:r>
-          </w:p>
-          <w:p>
-            <w:pPr>
-              <w:pStyle w:val="SourceCode"/>
-              <w:spacing w:before="0" w:after="0" w:line="200" w:lineRule="auto"/>
-            </w:pPr>
-            <w:r>
-              <w:t xml:space="preserve">copy2</w:t>
-            </w:r>
-          </w:p>
-          <w:p>
-            <w:pPr>
-              <w:pStyle w:val="SourceCode"/>
-              <w:spacing w:before="0" w:after="0" w:line="200" w:lineRule="auto"/>
-            </w:pPr>
-            <w:r>
-              <w:t xml:space="preserve">copy3</w:t>
-            </w:r>
-          </w:p>
-          <w:p>
-            <w:pPr>
-              <w:pStyle w:val="SourceCode"/>
-              <w:spacing w:before="0" w:after="0" w:line="200" w:lineRule="auto"/>
-            </w:pPr>
-            <w:r>
-              <w:t xml:space="preserve">docs</w:t>
-            </w:r>
-          </w:p>
-          <w:p>
-            <w:pPr>
-              <w:pStyle w:val="SourceCode"/>
-              <w:spacing w:before="0" w:after="0" w:line="200" w:lineRule="auto"/>
-            </w:pPr>
-            <w:r>
-              <w:t xml:space="preserve">src</w:t>
-            </w:r>
-          </w:p>
-          <w:p>
-            <w:pPr>
-              <w:pStyle w:val="SourceCode"/>
-              <w:spacing w:before="0" w:after="0" w:line="200" w:lineRule="auto"/>
-            </w:pPr>
-            <w:r>
-              <w:t xml:space="preserve">test folder</w:t>
+              <w:t xml:space="preserve">C:\...\copy1&gt; del "Windows Ringin.bak"</w:t>
+            </w:r>
+          </w:p>
+          <w:p>
+            <w:pPr>
+              <w:pStyle w:val="SourceCode"/>
+              <w:spacing w:before="0" w:after="0" w:line="200" w:lineRule="auto"/>
+            </w:pPr>
+            <w:r>
+              <w:t xml:space="preserve">C:\...\copy1\Windows Ringin.bak</w:t>
+            </w:r>
+          </w:p>
+          <w:p>
+            <w:pPr>
+              <w:pStyle w:val="SourceCode"/>
+              <w:spacing w:before="0" w:after="0" w:line="200" w:lineRule="auto"/>
+            </w:pPr>
+            <w:r>
+              <w:t xml:space="preserve">Access is denied.</w:t>
             </w:r>
           </w:p>
         </w:tc>
@@ -4006,24 +4003,6 @@
           <w:szCs w:val="4"/>
         </w:rPr>
       </w:pPr>
-    </w:p>
-    <w:p>
-      <w:pPr>
-        <w:pStyle w:val="FirstParagraph"/>
-      </w:pPr>
-      <w:r>
-        <w:t xml:space="preserve">Атрибут R зупинив звичайне видалення: файлова система відмовила в доступі. Ключ /f знімає це обмеження. Зверніть увагу, що rd /s /q знищив увесь каталог із сімдесятьма файлами без жодного запитання і без переміщення в кошик.</w:t>
-      </w:r>
-    </w:p>
-    <w:bookmarkEnd w:id="23"/>
-    <w:bookmarkStart w:id="24" w:name="крок-5.-перенаправлення-конвеєр-пошук"/>
-    <w:p>
-      <w:pPr>
-        <w:pStyle w:val="Heading3"/>
-      </w:pPr>
-      <w:r>
-        <w:t xml:space="preserve">Крок 5. Перенаправлення, конвеєр, пошук</w:t>
-      </w:r>
     </w:p>
     <w:p>
       <w:pPr>
@@ -4070,25 +4049,88 @@
               <w:spacing w:before="0" w:after="0" w:line="200" w:lineRule="auto"/>
             </w:pPr>
             <w:r>
-              <w:t xml:space="preserve">C:\...\LAB2&gt; dir src /s /b &gt; docs\listing.txt</w:t>
-            </w:r>
-          </w:p>
-          <w:p>
-            <w:pPr>
-              <w:pStyle w:val="SourceCode"/>
-              <w:spacing w:before="0" w:after="0" w:line="200" w:lineRule="auto"/>
-            </w:pPr>
-            <w:r>
-              <w:t xml:space="preserve">C:\...\LAB2&gt; find /c ".wav" docs\listing.txt</w:t>
-            </w:r>
-          </w:p>
-          <w:p>
-            <w:pPr>
-              <w:pStyle w:val="SourceCode"/>
-              <w:spacing w:before="0" w:after="0" w:line="200" w:lineRule="auto"/>
-            </w:pPr>
-            <w:r>
-              <w:t xml:space="preserve">---------- DOCS\LISTING.TXT: 70</w:t>
+              <w:t xml:space="preserve">C:\...\copy1&gt; del /f "Windows Ringin.bak"</w:t>
+            </w:r>
+          </w:p>
+          <w:p>
+            <w:pPr>
+              <w:pStyle w:val="SourceCode"/>
+              <w:spacing w:before="0" w:after="0" w:line="200" w:lineRule="auto"/>
+            </w:pPr>
+            <w:r>
+              <w:t xml:space="preserve">C:\...\copy1&gt; cd ..</w:t>
+            </w:r>
+          </w:p>
+          <w:p>
+            <w:pPr>
+              <w:pStyle w:val="SourceCode"/>
+              <w:spacing w:before="0" w:after="0" w:line="200" w:lineRule="auto"/>
+            </w:pPr>
+            <w:r>
+              <w:t xml:space="preserve">C:\...\LAB2&gt; rd /s /q copy1</w:t>
+            </w:r>
+          </w:p>
+          <w:p>
+            <w:pPr>
+              <w:pStyle w:val="SourceCode"/>
+              <w:spacing w:before="0" w:after="0" w:line="200" w:lineRule="auto"/>
+            </w:pPr>
+            <w:r>
+              <w:t xml:space="preserve">C:\...\LAB2&gt; dir /a:d /b</w:t>
+            </w:r>
+          </w:p>
+          <w:p>
+            <w:pPr>
+              <w:pStyle w:val="SourceCode"/>
+              <w:spacing w:before="0" w:after="0" w:line="200" w:lineRule="auto"/>
+            </w:pPr>
+            <w:r>
+              <w:t xml:space="preserve">bak</w:t>
+            </w:r>
+          </w:p>
+          <w:p>
+            <w:pPr>
+              <w:pStyle w:val="SourceCode"/>
+              <w:spacing w:before="0" w:after="0" w:line="200" w:lineRule="auto"/>
+            </w:pPr>
+            <w:r>
+              <w:t xml:space="preserve">copy2</w:t>
+            </w:r>
+          </w:p>
+          <w:p>
+            <w:pPr>
+              <w:pStyle w:val="SourceCode"/>
+              <w:spacing w:before="0" w:after="0" w:line="200" w:lineRule="auto"/>
+            </w:pPr>
+            <w:r>
+              <w:t xml:space="preserve">copy3</w:t>
+            </w:r>
+          </w:p>
+          <w:p>
+            <w:pPr>
+              <w:pStyle w:val="SourceCode"/>
+              <w:spacing w:before="0" w:after="0" w:line="200" w:lineRule="auto"/>
+            </w:pPr>
+            <w:r>
+              <w:t xml:space="preserve">docs</w:t>
+            </w:r>
+          </w:p>
+          <w:p>
+            <w:pPr>
+              <w:pStyle w:val="SourceCode"/>
+              <w:spacing w:before="0" w:after="0" w:line="200" w:lineRule="auto"/>
+            </w:pPr>
+            <w:r>
+              <w:t xml:space="preserve">src</w:t>
+            </w:r>
+          </w:p>
+          <w:p>
+            <w:pPr>
+              <w:pStyle w:val="SourceCode"/>
+              <w:spacing w:before="0" w:after="0" w:line="200" w:lineRule="auto"/>
+            </w:pPr>
+            <w:r>
+              <w:t xml:space="preserve">test folder</w:t>
             </w:r>
           </w:p>
         </w:tc>
@@ -4102,6 +4144,24 @@
           <w:szCs w:val="4"/>
         </w:rPr>
       </w:pPr>
+    </w:p>
+    <w:p>
+      <w:pPr>
+        <w:pStyle w:val="FirstParagraph"/>
+      </w:pPr>
+      <w:r>
+        <w:t xml:space="preserve">Атрибут R зупинив звичайне видалення: файлова система відмовила в доступі. Ключ /f знімає це обмеження. Зверніть увагу, що rd /s /q знищив увесь каталог із сімдесятьма файлами без жодного запитання і без переміщення в кошик.</w:t>
+      </w:r>
+    </w:p>
+    <w:bookmarkEnd w:id="23"/>
+    <w:bookmarkStart w:id="24" w:name="крок-5.-перенаправлення-конвеєр-пошук"/>
+    <w:p>
+      <w:pPr>
+        <w:pStyle w:val="Heading3"/>
+      </w:pPr>
+      <w:r>
+        <w:t xml:space="preserve">Крок 5. Перенаправлення, конвеєр, пошук</w:t>
+      </w:r>
     </w:p>
     <w:p>
       <w:pPr>
@@ -4148,34 +4208,25 @@
               <w:spacing w:before="0" w:after="0" w:line="200" w:lineRule="auto"/>
             </w:pPr>
             <w:r>
-              <w:t xml:space="preserve">C:\...\LAB2&gt; findstr /i /n "alarm" docs\listing.txt</w:t>
-            </w:r>
-          </w:p>
-          <w:p>
-            <w:pPr>
-              <w:pStyle w:val="SourceCode"/>
-              <w:spacing w:before="0" w:after="0" w:line="200" w:lineRule="auto"/>
-            </w:pPr>
-            <w:r>
-              <w:t xml:space="preserve">3:C:\Users\Student\Desktop\LAB2\src\Alarm01.wav</w:t>
-            </w:r>
-          </w:p>
-          <w:p>
-            <w:pPr>
-              <w:pStyle w:val="SourceCode"/>
-              <w:spacing w:before="0" w:after="0" w:line="200" w:lineRule="auto"/>
-            </w:pPr>
-            <w:r>
-              <w:t xml:space="preserve">4:C:\Users\Student\Desktop\LAB2\src\Alarm02.wav</w:t>
-            </w:r>
-          </w:p>
-          <w:p>
-            <w:pPr>
-              <w:pStyle w:val="SourceCode"/>
-              <w:spacing w:before="0" w:after="0" w:line="200" w:lineRule="auto"/>
-            </w:pPr>
-            <w:r>
-              <w:t xml:space="preserve">...</w:t>
+              <w:t xml:space="preserve">C:\...\LAB2&gt; dir src /s /b &gt; docs\listing.txt</w:t>
+            </w:r>
+          </w:p>
+          <w:p>
+            <w:pPr>
+              <w:pStyle w:val="SourceCode"/>
+              <w:spacing w:before="0" w:after="0" w:line="200" w:lineRule="auto"/>
+            </w:pPr>
+            <w:r>
+              <w:t xml:space="preserve">C:\...\LAB2&gt; find /c ".wav" docs\listing.txt</w:t>
+            </w:r>
+          </w:p>
+          <w:p>
+            <w:pPr>
+              <w:pStyle w:val="SourceCode"/>
+              <w:spacing w:before="0" w:after="0" w:line="200" w:lineRule="auto"/>
+            </w:pPr>
+            <w:r>
+              <w:t xml:space="preserve">---------- DOCS\LISTING.TXT: 70</w:t>
             </w:r>
           </w:p>
         </w:tc>
@@ -4235,34 +4286,34 @@
               <w:spacing w:before="0" w:after="0" w:line="200" w:lineRule="auto"/>
             </w:pPr>
             <w:r>
-              <w:t xml:space="preserve">C:\...\LAB2&gt; echo Звіт сформовано &gt;&gt; docs\listing.txt</w:t>
-            </w:r>
-          </w:p>
-          <w:p>
-            <w:pPr>
-              <w:pStyle w:val="SourceCode"/>
-              <w:spacing w:before="0" w:after="0" w:line="200" w:lineRule="auto"/>
-            </w:pPr>
-            <w:r>
-              <w:t xml:space="preserve">C:\...\LAB2&gt; dir nosuchfile.txt 2&gt; docs\errors.txt</w:t>
-            </w:r>
-          </w:p>
-          <w:p>
-            <w:pPr>
-              <w:pStyle w:val="SourceCode"/>
-              <w:spacing w:before="0" w:after="0" w:line="200" w:lineRule="auto"/>
-            </w:pPr>
-            <w:r>
-              <w:t xml:space="preserve">C:\...\LAB2&gt; type docs\errors.txt</w:t>
-            </w:r>
-          </w:p>
-          <w:p>
-            <w:pPr>
-              <w:pStyle w:val="SourceCode"/>
-              <w:spacing w:before="0" w:after="0" w:line="200" w:lineRule="auto"/>
-            </w:pPr>
-            <w:r>
-              <w:t xml:space="preserve">File Not Found</w:t>
+              <w:t xml:space="preserve">C:\...\LAB2&gt; findstr /i /n "alarm" docs\listing.txt</w:t>
+            </w:r>
+          </w:p>
+          <w:p>
+            <w:pPr>
+              <w:pStyle w:val="SourceCode"/>
+              <w:spacing w:before="0" w:after="0" w:line="200" w:lineRule="auto"/>
+            </w:pPr>
+            <w:r>
+              <w:t xml:space="preserve">3:C:\Users\Student\Desktop\LAB2\src\Alarm01.wav</w:t>
+            </w:r>
+          </w:p>
+          <w:p>
+            <w:pPr>
+              <w:pStyle w:val="SourceCode"/>
+              <w:spacing w:before="0" w:after="0" w:line="200" w:lineRule="auto"/>
+            </w:pPr>
+            <w:r>
+              <w:t xml:space="preserve">4:C:\Users\Student\Desktop\LAB2\src\Alarm02.wav</w:t>
+            </w:r>
+          </w:p>
+          <w:p>
+            <w:pPr>
+              <w:pStyle w:val="SourceCode"/>
+              <w:spacing w:before="0" w:after="0" w:line="200" w:lineRule="auto"/>
+            </w:pPr>
+            <w:r>
+              <w:t xml:space="preserve">...</w:t>
             </w:r>
           </w:p>
         </w:tc>
@@ -4322,43 +4373,34 @@
               <w:spacing w:before="0" w:after="0" w:line="200" w:lineRule="auto"/>
             </w:pPr>
             <w:r>
-              <w:t xml:space="preserve">C:\...\LAB2&gt; type nul &gt; docs\empty.txt</w:t>
-            </w:r>
-          </w:p>
-          <w:p>
-            <w:pPr>
-              <w:pStyle w:val="SourceCode"/>
-              <w:spacing w:before="0" w:after="0" w:line="200" w:lineRule="auto"/>
-            </w:pPr>
-            <w:r>
-              <w:t xml:space="preserve">C:\...\LAB2&gt; dir docs /b</w:t>
-            </w:r>
-          </w:p>
-          <w:p>
-            <w:pPr>
-              <w:pStyle w:val="SourceCode"/>
-              <w:spacing w:before="0" w:after="0" w:line="200" w:lineRule="auto"/>
-            </w:pPr>
-            <w:r>
-              <w:t xml:space="preserve">empty.txt</w:t>
-            </w:r>
-          </w:p>
-          <w:p>
-            <w:pPr>
-              <w:pStyle w:val="SourceCode"/>
-              <w:spacing w:before="0" w:after="0" w:line="200" w:lineRule="auto"/>
-            </w:pPr>
-            <w:r>
-              <w:t xml:space="preserve">errors.txt</w:t>
-            </w:r>
-          </w:p>
-          <w:p>
-            <w:pPr>
-              <w:pStyle w:val="SourceCode"/>
-              <w:spacing w:before="0" w:after="0" w:line="200" w:lineRule="auto"/>
-            </w:pPr>
-            <w:r>
-              <w:t xml:space="preserve">listing.txt</w:t>
+              <w:t xml:space="preserve">C:\...\LAB2&gt; echo Звіт сформовано &gt;&gt; docs\listing.txt</w:t>
+            </w:r>
+          </w:p>
+          <w:p>
+            <w:pPr>
+              <w:pStyle w:val="SourceCode"/>
+              <w:spacing w:before="0" w:after="0" w:line="200" w:lineRule="auto"/>
+            </w:pPr>
+            <w:r>
+              <w:t xml:space="preserve">C:\...\LAB2&gt; dir nosuchfile.txt 2&gt; docs\errors.txt</w:t>
+            </w:r>
+          </w:p>
+          <w:p>
+            <w:pPr>
+              <w:pStyle w:val="SourceCode"/>
+              <w:spacing w:before="0" w:after="0" w:line="200" w:lineRule="auto"/>
+            </w:pPr>
+            <w:r>
+              <w:t xml:space="preserve">C:\...\LAB2&gt; type docs\errors.txt</w:t>
+            </w:r>
+          </w:p>
+          <w:p>
+            <w:pPr>
+              <w:pStyle w:val="SourceCode"/>
+              <w:spacing w:before="0" w:after="0" w:line="200" w:lineRule="auto"/>
+            </w:pPr>
+            <w:r>
+              <w:t xml:space="preserve">File Not Found</w:t>
             </w:r>
           </w:p>
         </w:tc>
@@ -4372,16 +4414,6 @@
           <w:szCs w:val="4"/>
         </w:rPr>
       </w:pPr>
-    </w:p>
-    <w:bookmarkEnd w:id="24"/>
-    <w:bookmarkStart w:id="25" w:name="крок-6.-те-саме-в-powershell"/>
-    <w:p>
-      <w:pPr>
-        <w:pStyle w:val="Heading3"/>
-      </w:pPr>
-      <w:r>
-        <w:t xml:space="preserve">Крок 6. Те саме в PowerShell</w:t>
-      </w:r>
     </w:p>
     <w:p>
       <w:pPr>
@@ -4428,16 +4460,43 @@
               <w:spacing w:before="0" w:after="0" w:line="200" w:lineRule="auto"/>
             </w:pPr>
             <w:r>
-              <w:t xml:space="preserve">PS C:\...\LAB2&gt; Get-ChildItem src -Recurse -File |</w:t>
-            </w:r>
-          </w:p>
-          <w:p>
-            <w:pPr>
-              <w:pStyle w:val="SourceCode"/>
-              <w:spacing w:before="0" w:after="0" w:line="200" w:lineRule="auto"/>
-            </w:pPr>
-            <w:r>
-              <w:t xml:space="preserve">&gt;&gt;     Measure-Object -Property Length -Sum</w:t>
+              <w:t xml:space="preserve">C:\...\LAB2&gt; type nul &gt; docs\empty.txt</w:t>
+            </w:r>
+          </w:p>
+          <w:p>
+            <w:pPr>
+              <w:pStyle w:val="SourceCode"/>
+              <w:spacing w:before="0" w:after="0" w:line="200" w:lineRule="auto"/>
+            </w:pPr>
+            <w:r>
+              <w:t xml:space="preserve">C:\...\LAB2&gt; dir docs /b</w:t>
+            </w:r>
+          </w:p>
+          <w:p>
+            <w:pPr>
+              <w:pStyle w:val="SourceCode"/>
+              <w:spacing w:before="0" w:after="0" w:line="200" w:lineRule="auto"/>
+            </w:pPr>
+            <w:r>
+              <w:t xml:space="preserve">empty.txt</w:t>
+            </w:r>
+          </w:p>
+          <w:p>
+            <w:pPr>
+              <w:pStyle w:val="SourceCode"/>
+              <w:spacing w:before="0" w:after="0" w:line="200" w:lineRule="auto"/>
+            </w:pPr>
+            <w:r>
+              <w:t xml:space="preserve">errors.txt</w:t>
+            </w:r>
+          </w:p>
+          <w:p>
+            <w:pPr>
+              <w:pStyle w:val="SourceCode"/>
+              <w:spacing w:before="0" w:after="0" w:line="200" w:lineRule="auto"/>
+            </w:pPr>
+            <w:r>
+              <w:t xml:space="preserve">listing.txt</w:t>
             </w:r>
           </w:p>
         </w:tc>
@@ -4451,6 +4510,16 @@
           <w:szCs w:val="4"/>
         </w:rPr>
       </w:pPr>
+    </w:p>
+    <w:bookmarkEnd w:id="24"/>
+    <w:bookmarkStart w:id="25" w:name="крок-6.-те-саме-в-powershell"/>
+    <w:p>
+      <w:pPr>
+        <w:pStyle w:val="Heading3"/>
+      </w:pPr>
+      <w:r>
+        <w:t xml:space="preserve">Крок 6. Те саме в PowerShell</w:t>
+      </w:r>
     </w:p>
     <w:p>
       <w:pPr>
@@ -4497,16 +4566,16 @@
               <w:spacing w:before="0" w:after="0" w:line="200" w:lineRule="auto"/>
             </w:pPr>
             <w:r>
-              <w:t xml:space="preserve">Count    : 70</w:t>
-            </w:r>
-          </w:p>
-          <w:p>
-            <w:pPr>
-              <w:pStyle w:val="SourceCode"/>
-              <w:spacing w:before="0" w:after="0" w:line="200" w:lineRule="auto"/>
-            </w:pPr>
-            <w:r>
-              <w:t xml:space="preserve">Sum      : 12648174</w:t>
+              <w:t xml:space="preserve">PS C:\...\LAB2&gt; Get-ChildItem src -Recurse -File |</w:t>
+            </w:r>
+          </w:p>
+          <w:p>
+            <w:pPr>
+              <w:pStyle w:val="SourceCode"/>
+              <w:spacing w:before="0" w:after="0" w:line="200" w:lineRule="auto"/>
+            </w:pPr>
+            <w:r>
+              <w:t xml:space="preserve">&gt;&gt;     Measure-Object -Property Length -Sum</w:t>
             </w:r>
           </w:p>
         </w:tc>
@@ -4566,25 +4635,16 @@
               <w:spacing w:before="0" w:after="0" w:line="200" w:lineRule="auto"/>
             </w:pPr>
             <w:r>
-              <w:t xml:space="preserve">PS C:\...\LAB2&gt; Get-ChildItem src -Recurse -File |</w:t>
-            </w:r>
-          </w:p>
-          <w:p>
-            <w:pPr>
-              <w:pStyle w:val="SourceCode"/>
-              <w:spacing w:before="0" w:after="0" w:line="200" w:lineRule="auto"/>
-            </w:pPr>
-            <w:r>
-              <w:t xml:space="preserve">&gt;&gt;     Sort-Object Length -Descending |</w:t>
-            </w:r>
-          </w:p>
-          <w:p>
-            <w:pPr>
-              <w:pStyle w:val="SourceCode"/>
-              <w:spacing w:before="0" w:after="0" w:line="200" w:lineRule="auto"/>
-            </w:pPr>
-            <w:r>
-              <w:t xml:space="preserve">&gt;&gt;     Select-Object -First 3 Name, Length</w:t>
+              <w:t xml:space="preserve">Count    : 70</w:t>
+            </w:r>
+          </w:p>
+          <w:p>
+            <w:pPr>
+              <w:pStyle w:val="SourceCode"/>
+              <w:spacing w:before="0" w:after="0" w:line="200" w:lineRule="auto"/>
+            </w:pPr>
+            <w:r>
+              <w:t xml:space="preserve">Sum      : 12648174</w:t>
             </w:r>
           </w:p>
         </w:tc>
@@ -4644,43 +4704,25 @@
               <w:spacing w:before="0" w:after="0" w:line="200" w:lineRule="auto"/>
             </w:pPr>
             <w:r>
-              <w:t xml:space="preserve">Name                       Length</w:t>
-            </w:r>
-          </w:p>
-          <w:p>
-            <w:pPr>
-              <w:pStyle w:val="SourceCode"/>
-              <w:spacing w:before="0" w:after="0" w:line="200" w:lineRule="auto"/>
-            </w:pPr>
-            <w:r>
-              <w:t xml:space="preserve">----                       ------</w:t>
-            </w:r>
-          </w:p>
-          <w:p>
-            <w:pPr>
-              <w:pStyle w:val="SourceCode"/>
-              <w:spacing w:before="0" w:after="0" w:line="200" w:lineRule="auto"/>
-            </w:pPr>
-            <w:r>
-              <w:t xml:space="preserve">Windows Logon.wav         1189836</w:t>
-            </w:r>
-          </w:p>
-          <w:p>
-            <w:pPr>
-              <w:pStyle w:val="SourceCode"/>
-              <w:spacing w:before="0" w:after="0" w:line="200" w:lineRule="auto"/>
-            </w:pPr>
-            <w:r>
-              <w:t xml:space="preserve">Windows Shutdown.wav       729068</w:t>
-            </w:r>
-          </w:p>
-          <w:p>
-            <w:pPr>
-              <w:pStyle w:val="SourceCode"/>
-              <w:spacing w:before="0" w:after="0" w:line="200" w:lineRule="auto"/>
-            </w:pPr>
-            <w:r>
-              <w:t xml:space="preserve">Windows Startup.wav        497908</w:t>
+              <w:t xml:space="preserve">PS C:\...\LAB2&gt; Get-ChildItem src -Recurse -File |</w:t>
+            </w:r>
+          </w:p>
+          <w:p>
+            <w:pPr>
+              <w:pStyle w:val="SourceCode"/>
+              <w:spacing w:before="0" w:after="0" w:line="200" w:lineRule="auto"/>
+            </w:pPr>
+            <w:r>
+              <w:t xml:space="preserve">&gt;&gt;     Sort-Object Length -Descending |</w:t>
+            </w:r>
+          </w:p>
+          <w:p>
+            <w:pPr>
+              <w:pStyle w:val="SourceCode"/>
+              <w:spacing w:before="0" w:after="0" w:line="200" w:lineRule="auto"/>
+            </w:pPr>
+            <w:r>
+              <w:t xml:space="preserve">&gt;&gt;     Select-Object -First 3 Name, Length</w:t>
             </w:r>
           </w:p>
         </w:tc>
@@ -4697,6 +4739,102 @@
     </w:p>
     <w:p>
       <w:pPr>
+        <w:spacing w:before="0" w:after="0" w:line="120" w:lineRule="exact"/>
+        <w:rPr>
+          <w:sz w:val="4"/>
+          <w:szCs w:val="4"/>
+        </w:rPr>
+      </w:pPr>
+    </w:p>
+    <w:tbl>
+      <w:tblPr>
+        <w:tblStyle w:val="SourceCodeTable"/>
+        <w:tblW w:type="dxa" w:w="9637"/>
+        <w:tblInd w:w="0" w:type="dxa"/>
+        <w:tblBorders>
+          <w:top w:color="BFBFBF" w:space="0" w:sz="4" w:val="single"/>
+          <w:left w:color="BFBFBF" w:space="0" w:sz="4" w:val="single"/>
+          <w:bottom w:color="BFBFBF" w:space="0" w:sz="4" w:val="single"/>
+          <w:right w:color="BFBFBF" w:space="0" w:sz="4" w:val="single"/>
+        </w:tblBorders>
+        <w:shd w:color="auto" w:fill="F4F4F4" w:val="clear"/>
+        <w:tblLayout w:type="fixed"/>
+        <w:tblCellMar>
+          <w:top w:type="dxa" w:w="113"/>
+          <w:left w:type="dxa" w:w="113"/>
+          <w:bottom w:type="dxa" w:w="113"/>
+          <w:right w:type="dxa" w:w="113"/>
+        </w:tblCellMar>
+        <w:tblLook w:val="0000" w:firstRow="0" w:lastRow="0" w:firstColumn="0" w:lastColumn="0" w:noHBand="1" w:noVBand="1"/>
+      </w:tblPr>
+      <w:tblGrid>
+        <w:gridCol w:w="9637"/>
+      </w:tblGrid>
+      <w:tr>
+        <w:tc>
+          <w:tcPr>
+            <w:tcW w:type="dxa" w:w="9637"/>
+            <w:shd w:color="auto" w:fill="F4F4F4" w:val="clear"/>
+          </w:tcPr>
+          <w:p>
+            <w:pPr>
+              <w:pStyle w:val="SourceCode"/>
+              <w:spacing w:before="0" w:after="0" w:line="200" w:lineRule="auto"/>
+            </w:pPr>
+            <w:r>
+              <w:t xml:space="preserve">Name                       Length</w:t>
+            </w:r>
+          </w:p>
+          <w:p>
+            <w:pPr>
+              <w:pStyle w:val="SourceCode"/>
+              <w:spacing w:before="0" w:after="0" w:line="200" w:lineRule="auto"/>
+            </w:pPr>
+            <w:r>
+              <w:t xml:space="preserve">----                       ------</w:t>
+            </w:r>
+          </w:p>
+          <w:p>
+            <w:pPr>
+              <w:pStyle w:val="SourceCode"/>
+              <w:spacing w:before="0" w:after="0" w:line="200" w:lineRule="auto"/>
+            </w:pPr>
+            <w:r>
+              <w:t xml:space="preserve">Windows Logon.wav         1189836</w:t>
+            </w:r>
+          </w:p>
+          <w:p>
+            <w:pPr>
+              <w:pStyle w:val="SourceCode"/>
+              <w:spacing w:before="0" w:after="0" w:line="200" w:lineRule="auto"/>
+            </w:pPr>
+            <w:r>
+              <w:t xml:space="preserve">Windows Shutdown.wav       729068</w:t>
+            </w:r>
+          </w:p>
+          <w:p>
+            <w:pPr>
+              <w:pStyle w:val="SourceCode"/>
+              <w:spacing w:before="0" w:after="0" w:line="200" w:lineRule="auto"/>
+            </w:pPr>
+            <w:r>
+              <w:t xml:space="preserve">Windows Startup.wav        497908</w:t>
+            </w:r>
+          </w:p>
+        </w:tc>
+      </w:tr>
+    </w:tbl>
+    <w:p>
+      <w:pPr>
+        <w:spacing w:before="0" w:after="0" w:line="120" w:lineRule="exact"/>
+        <w:rPr>
+          <w:sz w:val="4"/>
+          <w:szCs w:val="4"/>
+        </w:rPr>
+      </w:pPr>
+    </w:p>
+    <w:p>
+      <w:pPr>
         <w:pStyle w:val="FirstParagraph"/>
       </w:pPr>
       <w:r>
@@ -4735,7 +4873,7 @@
         <w:jc w:val="both"/>
       </w:pPr>
       <w:r>
-        <w:t xml:space="preserve">Створити на робочому столі навчальний каталог LAB2 і всередині нього підкаталоги src, docs, bak, а також один каталог, ім’я якого містить пробіл. Перевірити, що перехід у нього без лапок не спрацьовує, і зафіксувати повідомлення системи.</w:t>
+        <w:t xml:space="preserve">Створити на робочому столі навчальний каталог LAB2 і всередині нього підкаталоги src, docs, bak, а також один каталог, ім’я якого містить пробіл. Перевірити, як поводяться з цим ім’ям без лапок команди cd і dir, зафіксувати результат і пояснити різницю.</w:t>
       </w:r>
     </w:p>
     <w:p>

</xml_diff>

<commit_message>
chore: rebuild the lab guides after the formatting fixes
Single spacing in table cells, «ялинки», no dash on paragraphs that
continue a list item.

Co-Authored-By: Claude Opus 5.5 <noreply@anthropic.com>
</commit_message>
<xml_diff>
--- a/public/labs/os/kmp-23/ЛР1_ОС_Файли_та_каталоги_в_командному_рядку_Windows.docx
+++ b/public/labs/os/kmp-23/ЛР1_ОС_Файли_та_каталоги_в_командному_рядку_Windows.docx
@@ -135,16 +135,7 @@
         <w:pStyle w:val="BodyText"/>
       </w:pPr>
       <w:r>
-        <w:t xml:space="preserve">Якщо шлях містить пробіли, його беруть у подвійні лапки: dir</w:t>
-      </w:r>
-      <w:r>
-        <w:t xml:space="preserve"> </w:t>
-      </w:r>
-      <w:r>
-        <w:t xml:space="preserve">“Program Files”</w:t>
-      </w:r>
-      <w:r>
-        <w:t xml:space="preserve">. Без лапок командний процесор сприйме пробіл як роздільник аргументів: команда dir Program Files шукатиме два різні об’єкти — Program і Files — і повідомить, що файл не знайдено.</w:t>
+        <w:t xml:space="preserve">Якщо шлях містить пробіли, його беруть у подвійні лапки: dir «Program Files». Без лапок командний процесор сприйме пробіл як роздільник аргументів: команда dir Program Files шукатиме два різні об’єкти — Program і Files — і повідомить, що файл не знайдено.</w:t>
       </w:r>
     </w:p>
     <w:p>
@@ -467,8 +458,8 @@
       <w:tblPr>
         <w:tblStyle w:val="Table"/>
         <w:tblW w:type="dxa" w:w="9637"/>
+        <w:tblLayout w:type="fixed"/>
         <w:tblLook w:firstRow="1" w:lastRow="0" w:firstColumn="0" w:lastColumn="0" w:noHBand="0" w:noVBand="0" w:val="0020"/>
-        <w:tblLayout w:type="fixed"/>
       </w:tblPr>
       <w:tblGrid>
         <w:gridCol w:w="3212"/>
@@ -484,6 +475,7 @@
           <w:p>
             <w:pPr>
               <w:pStyle w:val="Compact"/>
+              <w:spacing w:before="0" w:after="0" w:line="240" w:lineRule="auto"/>
             </w:pPr>
             <w:r>
               <w:t xml:space="preserve">Ключ</w:t>
@@ -495,6 +487,7 @@
           <w:p>
             <w:pPr>
               <w:pStyle w:val="Compact"/>
+              <w:spacing w:before="0" w:after="0" w:line="240" w:lineRule="auto"/>
             </w:pPr>
             <w:r>
               <w:t xml:space="preserve">Дія</w:t>
@@ -506,6 +499,7 @@
           <w:p>
             <w:pPr>
               <w:pStyle w:val="Compact"/>
+              <w:spacing w:before="0" w:after="0" w:line="240" w:lineRule="auto"/>
             </w:pPr>
             <w:r>
               <w:t xml:space="preserve">Приклад</w:t>
@@ -519,6 +513,7 @@
           <w:p>
             <w:pPr>
               <w:pStyle w:val="Compact"/>
+              <w:spacing w:before="0" w:after="0" w:line="240" w:lineRule="auto"/>
             </w:pPr>
             <w:r>
               <w:rPr>
@@ -533,6 +528,7 @@
           <w:p>
             <w:pPr>
               <w:pStyle w:val="Compact"/>
+              <w:spacing w:before="0" w:after="0" w:line="240" w:lineRule="auto"/>
             </w:pPr>
             <w:r>
               <w:t xml:space="preserve">Тільки імена, без заголовків і підсумків</w:t>
@@ -544,6 +540,7 @@
           <w:p>
             <w:pPr>
               <w:pStyle w:val="Compact"/>
+              <w:spacing w:before="0" w:after="0" w:line="240" w:lineRule="auto"/>
             </w:pPr>
             <w:r>
               <w:rPr>
@@ -560,6 +557,7 @@
           <w:p>
             <w:pPr>
               <w:pStyle w:val="Compact"/>
+              <w:spacing w:before="0" w:after="0" w:line="240" w:lineRule="auto"/>
             </w:pPr>
             <w:r>
               <w:rPr>
@@ -574,6 +572,7 @@
           <w:p>
             <w:pPr>
               <w:pStyle w:val="Compact"/>
+              <w:spacing w:before="0" w:after="0" w:line="240" w:lineRule="auto"/>
             </w:pPr>
             <w:r>
               <w:t xml:space="preserve">Рекурсивно, включно з підкаталогами</w:t>
@@ -585,6 +584,7 @@
           <w:p>
             <w:pPr>
               <w:pStyle w:val="Compact"/>
+              <w:spacing w:before="0" w:after="0" w:line="240" w:lineRule="auto"/>
             </w:pPr>
             <w:r>
               <w:rPr>
@@ -601,6 +601,7 @@
           <w:p>
             <w:pPr>
               <w:pStyle w:val="Compact"/>
+              <w:spacing w:before="0" w:after="0" w:line="240" w:lineRule="auto"/>
             </w:pPr>
             <w:r>
               <w:rPr>
@@ -615,6 +616,7 @@
           <w:p>
             <w:pPr>
               <w:pStyle w:val="Compact"/>
+              <w:spacing w:before="0" w:after="0" w:line="240" w:lineRule="auto"/>
             </w:pPr>
             <w:r>
               <w:t xml:space="preserve">Показати всі файли, зокрема приховані й системні</w:t>
@@ -626,6 +628,7 @@
           <w:p>
             <w:pPr>
               <w:pStyle w:val="Compact"/>
+              <w:spacing w:before="0" w:after="0" w:line="240" w:lineRule="auto"/>
             </w:pPr>
             <w:r>
               <w:rPr>
@@ -642,6 +645,7 @@
           <w:p>
             <w:pPr>
               <w:pStyle w:val="Compact"/>
+              <w:spacing w:before="0" w:after="0" w:line="240" w:lineRule="auto"/>
             </w:pPr>
             <w:r>
               <w:rPr>
@@ -656,6 +660,7 @@
           <w:p>
             <w:pPr>
               <w:pStyle w:val="Compact"/>
+              <w:spacing w:before="0" w:after="0" w:line="240" w:lineRule="auto"/>
             </w:pPr>
             <w:r>
               <w:t xml:space="preserve">Тільки приховані</w:t>
@@ -667,6 +672,7 @@
           <w:p>
             <w:pPr>
               <w:pStyle w:val="Compact"/>
+              <w:spacing w:before="0" w:after="0" w:line="240" w:lineRule="auto"/>
             </w:pPr>
             <w:r>
               <w:rPr>
@@ -683,6 +689,7 @@
           <w:p>
             <w:pPr>
               <w:pStyle w:val="Compact"/>
+              <w:spacing w:before="0" w:after="0" w:line="240" w:lineRule="auto"/>
             </w:pPr>
             <w:r>
               <w:rPr>
@@ -697,6 +704,7 @@
           <w:p>
             <w:pPr>
               <w:pStyle w:val="Compact"/>
+              <w:spacing w:before="0" w:after="0" w:line="240" w:lineRule="auto"/>
             </w:pPr>
             <w:r>
               <w:t xml:space="preserve">Тільки каталоги</w:t>
@@ -708,6 +716,7 @@
           <w:p>
             <w:pPr>
               <w:pStyle w:val="Compact"/>
+              <w:spacing w:before="0" w:after="0" w:line="240" w:lineRule="auto"/>
             </w:pPr>
             <w:r>
               <w:rPr>
@@ -724,6 +733,7 @@
           <w:p>
             <w:pPr>
               <w:pStyle w:val="Compact"/>
+              <w:spacing w:before="0" w:after="0" w:line="240" w:lineRule="auto"/>
             </w:pPr>
             <w:r>
               <w:rPr>
@@ -738,6 +748,7 @@
           <w:p>
             <w:pPr>
               <w:pStyle w:val="Compact"/>
+              <w:spacing w:before="0" w:after="0" w:line="240" w:lineRule="auto"/>
             </w:pPr>
             <w:r>
               <w:t xml:space="preserve">Сортувати за іменем</w:t>
@@ -749,6 +760,7 @@
           <w:p>
             <w:pPr>
               <w:pStyle w:val="Compact"/>
+              <w:spacing w:before="0" w:after="0" w:line="240" w:lineRule="auto"/>
             </w:pPr>
             <w:r>
               <w:rPr>
@@ -765,6 +777,7 @@
           <w:p>
             <w:pPr>
               <w:pStyle w:val="Compact"/>
+              <w:spacing w:before="0" w:after="0" w:line="240" w:lineRule="auto"/>
             </w:pPr>
             <w:r>
               <w:rPr>
@@ -779,6 +792,7 @@
           <w:p>
             <w:pPr>
               <w:pStyle w:val="Compact"/>
+              <w:spacing w:before="0" w:after="0" w:line="240" w:lineRule="auto"/>
             </w:pPr>
             <w:r>
               <w:t xml:space="preserve">Сортувати за розміром, від більшого</w:t>
@@ -790,6 +804,7 @@
           <w:p>
             <w:pPr>
               <w:pStyle w:val="Compact"/>
+              <w:spacing w:before="0" w:after="0" w:line="240" w:lineRule="auto"/>
             </w:pPr>
             <w:r>
               <w:rPr>
@@ -806,6 +821,7 @@
           <w:p>
             <w:pPr>
               <w:pStyle w:val="Compact"/>
+              <w:spacing w:before="0" w:after="0" w:line="240" w:lineRule="auto"/>
             </w:pPr>
             <w:r>
               <w:rPr>
@@ -820,6 +836,7 @@
           <w:p>
             <w:pPr>
               <w:pStyle w:val="Compact"/>
+              <w:spacing w:before="0" w:after="0" w:line="240" w:lineRule="auto"/>
             </w:pPr>
             <w:r>
               <w:t xml:space="preserve">Сортувати за датою зміни</w:t>
@@ -831,6 +848,7 @@
           <w:p>
             <w:pPr>
               <w:pStyle w:val="Compact"/>
+              <w:spacing w:before="0" w:after="0" w:line="240" w:lineRule="auto"/>
             </w:pPr>
             <w:r>
               <w:rPr>
@@ -847,6 +865,7 @@
           <w:p>
             <w:pPr>
               <w:pStyle w:val="Compact"/>
+              <w:spacing w:before="0" w:after="0" w:line="240" w:lineRule="auto"/>
             </w:pPr>
             <w:r>
               <w:rPr>
@@ -861,6 +880,7 @@
           <w:p>
             <w:pPr>
               <w:pStyle w:val="Compact"/>
+              <w:spacing w:before="0" w:after="0" w:line="240" w:lineRule="auto"/>
             </w:pPr>
             <w:r>
               <w:t xml:space="preserve">Широкий формат, у кілька колонок</w:t>
@@ -872,6 +892,7 @@
           <w:p>
             <w:pPr>
               <w:pStyle w:val="Compact"/>
+              <w:spacing w:before="0" w:after="0" w:line="240" w:lineRule="auto"/>
             </w:pPr>
             <w:r>
               <w:rPr>
@@ -939,6 +960,7 @@
           <w:p>
             <w:pPr>
               <w:pStyle w:val="Compact"/>
+              <w:spacing w:before="0" w:after="0" w:line="240" w:lineRule="auto"/>
             </w:pPr>
             <w:r>
               <w:t xml:space="preserve">Команда</w:t>
@@ -950,6 +972,7 @@
           <w:p>
             <w:pPr>
               <w:pStyle w:val="Compact"/>
+              <w:spacing w:before="0" w:after="0" w:line="240" w:lineRule="auto"/>
             </w:pPr>
             <w:r>
               <w:t xml:space="preserve">Що вміє</w:t>
@@ -961,6 +984,7 @@
           <w:p>
             <w:pPr>
               <w:pStyle w:val="Compact"/>
+              <w:spacing w:before="0" w:after="0" w:line="240" w:lineRule="auto"/>
             </w:pPr>
             <w:r>
               <w:t xml:space="preserve">Чого не вміє</w:t>
@@ -972,6 +996,7 @@
           <w:p>
             <w:pPr>
               <w:pStyle w:val="Compact"/>
+              <w:spacing w:before="0" w:after="0" w:line="240" w:lineRule="auto"/>
             </w:pPr>
             <w:r>
               <w:t xml:space="preserve">Коли застосовувати</w:t>
@@ -985,6 +1010,7 @@
           <w:p>
             <w:pPr>
               <w:pStyle w:val="Compact"/>
+              <w:spacing w:before="0" w:after="0" w:line="240" w:lineRule="auto"/>
             </w:pPr>
             <w:r>
               <w:rPr>
@@ -999,6 +1025,7 @@
           <w:p>
             <w:pPr>
               <w:pStyle w:val="Compact"/>
+              <w:spacing w:before="0" w:after="0" w:line="240" w:lineRule="auto"/>
             </w:pPr>
             <w:r>
               <w:t xml:space="preserve">Копіює файли одного каталогу; вміє об’єднувати файли</w:t>
@@ -1010,6 +1037,7 @@
           <w:p>
             <w:pPr>
               <w:pStyle w:val="Compact"/>
+              <w:spacing w:before="0" w:after="0" w:line="240" w:lineRule="auto"/>
             </w:pPr>
             <w:r>
               <w:t xml:space="preserve">Не бачить підкаталогів</w:t>
@@ -1021,6 +1049,7 @@
           <w:p>
             <w:pPr>
               <w:pStyle w:val="Compact"/>
+              <w:spacing w:before="0" w:after="0" w:line="240" w:lineRule="auto"/>
             </w:pPr>
             <w:r>
               <w:t xml:space="preserve">Один файл або кілька файлів за маскою</w:t>
@@ -1034,6 +1063,7 @@
           <w:p>
             <w:pPr>
               <w:pStyle w:val="Compact"/>
+              <w:spacing w:before="0" w:after="0" w:line="240" w:lineRule="auto"/>
             </w:pPr>
             <w:r>
               <w:rPr>
@@ -1048,6 +1078,7 @@
           <w:p>
             <w:pPr>
               <w:pStyle w:val="Compact"/>
+              <w:spacing w:before="0" w:after="0" w:line="240" w:lineRule="auto"/>
             </w:pPr>
             <w:r>
               <w:t xml:space="preserve">Копіює дерево каталогів, приховані файли, атрибути</w:t>
@@ -1059,6 +1090,7 @@
           <w:p>
             <w:pPr>
               <w:pStyle w:val="Compact"/>
+              <w:spacing w:before="0" w:after="0" w:line="240" w:lineRule="auto"/>
             </w:pPr>
             <w:r>
               <w:t xml:space="preserve">Не відновлюється після обриву, повільна на великих обсягах</w:t>
@@ -1070,6 +1102,7 @@
           <w:p>
             <w:pPr>
               <w:pStyle w:val="Compact"/>
+              <w:spacing w:before="0" w:after="0" w:line="240" w:lineRule="auto"/>
             </w:pPr>
             <w:r>
               <w:t xml:space="preserve">Разове копіювання структури</w:t>
@@ -1083,6 +1116,7 @@
           <w:p>
             <w:pPr>
               <w:pStyle w:val="Compact"/>
+              <w:spacing w:before="0" w:after="0" w:line="240" w:lineRule="auto"/>
             </w:pPr>
             <w:r>
               <w:rPr>
@@ -1097,6 +1131,7 @@
           <w:p>
             <w:pPr>
               <w:pStyle w:val="Compact"/>
+              <w:spacing w:before="0" w:after="0" w:line="240" w:lineRule="auto"/>
             </w:pPr>
             <w:r>
               <w:t xml:space="preserve">Багатопотокове копіювання, журнал, продовження після обриву, синхронізація</w:t>
@@ -1108,6 +1143,7 @@
           <w:p>
             <w:pPr>
               <w:pStyle w:val="Compact"/>
+              <w:spacing w:before="0" w:after="0" w:line="240" w:lineRule="auto"/>
             </w:pPr>
             <w:r>
               <w:t xml:space="preserve">Складніший синтаксис, надлишкова для одного файлу</w:t>
@@ -1119,6 +1155,7 @@
           <w:p>
             <w:pPr>
               <w:pStyle w:val="Compact"/>
+              <w:spacing w:before="0" w:after="0" w:line="240" w:lineRule="auto"/>
             </w:pPr>
             <w:r>
               <w:t xml:space="preserve">Резервне копіювання, великі обсяги</w:t>
@@ -1839,6 +1876,7 @@
           <w:p>
             <w:pPr>
               <w:pStyle w:val="Compact"/>
+              <w:spacing w:before="0" w:after="0" w:line="240" w:lineRule="auto"/>
             </w:pPr>
             <w:r>
               <w:t xml:space="preserve">Символ</w:t>
@@ -1850,6 +1888,7 @@
           <w:p>
             <w:pPr>
               <w:pStyle w:val="Compact"/>
+              <w:spacing w:before="0" w:after="0" w:line="240" w:lineRule="auto"/>
             </w:pPr>
             <w:r>
               <w:t xml:space="preserve">Дія</w:t>
@@ -1861,6 +1900,7 @@
           <w:p>
             <w:pPr>
               <w:pStyle w:val="Compact"/>
+              <w:spacing w:before="0" w:after="0" w:line="240" w:lineRule="auto"/>
             </w:pPr>
             <w:r>
               <w:t xml:space="preserve">Приклад</w:t>
@@ -1874,6 +1914,7 @@
           <w:p>
             <w:pPr>
               <w:pStyle w:val="Compact"/>
+              <w:spacing w:before="0" w:after="0" w:line="240" w:lineRule="auto"/>
             </w:pPr>
             <w:r>
               <w:rPr>
@@ -1888,6 +1929,7 @@
           <w:p>
             <w:pPr>
               <w:pStyle w:val="Compact"/>
+              <w:spacing w:before="0" w:after="0" w:line="240" w:lineRule="auto"/>
             </w:pPr>
             <w:r>
               <w:t xml:space="preserve">Записати вивід у файл, перезаписавши його</w:t>
@@ -1899,6 +1941,7 @@
           <w:p>
             <w:pPr>
               <w:pStyle w:val="Compact"/>
+              <w:spacing w:before="0" w:after="0" w:line="240" w:lineRule="auto"/>
             </w:pPr>
             <w:r>
               <w:rPr>
@@ -1915,6 +1958,7 @@
           <w:p>
             <w:pPr>
               <w:pStyle w:val="Compact"/>
+              <w:spacing w:before="0" w:after="0" w:line="240" w:lineRule="auto"/>
             </w:pPr>
             <w:r>
               <w:rPr>
@@ -1929,6 +1973,7 @@
           <w:p>
             <w:pPr>
               <w:pStyle w:val="Compact"/>
+              <w:spacing w:before="0" w:after="0" w:line="240" w:lineRule="auto"/>
             </w:pPr>
             <w:r>
               <w:t xml:space="preserve">Дописати вивід у кінець файлу</w:t>
@@ -1940,6 +1985,7 @@
           <w:p>
             <w:pPr>
               <w:pStyle w:val="Compact"/>
+              <w:spacing w:before="0" w:after="0" w:line="240" w:lineRule="auto"/>
             </w:pPr>
             <w:r>
               <w:rPr>
@@ -1956,6 +2002,7 @@
           <w:p>
             <w:pPr>
               <w:pStyle w:val="Compact"/>
+              <w:spacing w:before="0" w:after="0" w:line="240" w:lineRule="auto"/>
             </w:pPr>
             <w:r>
               <w:rPr>
@@ -1970,6 +2017,7 @@
           <w:p>
             <w:pPr>
               <w:pStyle w:val="Compact"/>
+              <w:spacing w:before="0" w:after="0" w:line="240" w:lineRule="auto"/>
             </w:pPr>
             <w:r>
               <w:t xml:space="preserve">Перенаправити тільки повідомлення про помилки</w:t>
@@ -1981,6 +2029,7 @@
           <w:p>
             <w:pPr>
               <w:pStyle w:val="Compact"/>
+              <w:spacing w:before="0" w:after="0" w:line="240" w:lineRule="auto"/>
             </w:pPr>
             <w:r>
               <w:rPr>
@@ -1997,6 +2046,7 @@
           <w:p>
             <w:pPr>
               <w:pStyle w:val="Compact"/>
+              <w:spacing w:before="0" w:after="0" w:line="240" w:lineRule="auto"/>
             </w:pPr>
             <w:r>
               <w:rPr>
@@ -2011,6 +2061,7 @@
           <w:p>
             <w:pPr>
               <w:pStyle w:val="Compact"/>
+              <w:spacing w:before="0" w:after="0" w:line="240" w:lineRule="auto"/>
             </w:pPr>
             <w:r>
               <w:t xml:space="preserve">Об’єднати помилки зі звичайним виводом</w:t>
@@ -2022,6 +2073,7 @@
           <w:p>
             <w:pPr>
               <w:pStyle w:val="Compact"/>
+              <w:spacing w:before="0" w:after="0" w:line="240" w:lineRule="auto"/>
             </w:pPr>
             <w:r>
               <w:rPr>
@@ -2038,6 +2090,7 @@
           <w:p>
             <w:pPr>
               <w:pStyle w:val="Compact"/>
+              <w:spacing w:before="0" w:after="0" w:line="240" w:lineRule="auto"/>
             </w:pPr>
             <w:r>
               <w:rPr>
@@ -2052,6 +2105,7 @@
           <w:p>
             <w:pPr>
               <w:pStyle w:val="Compact"/>
+              <w:spacing w:before="0" w:after="0" w:line="240" w:lineRule="auto"/>
             </w:pPr>
             <w:r>
               <w:t xml:space="preserve">Передати вивід однієї команди на вхід іншої</w:t>
@@ -2063,6 +2117,7 @@
           <w:p>
             <w:pPr>
               <w:pStyle w:val="Compact"/>
+              <w:spacing w:before="0" w:after="0" w:line="240" w:lineRule="auto"/>
             </w:pPr>
             <w:r>
               <w:rPr>
@@ -2079,6 +2134,7 @@
           <w:p>
             <w:pPr>
               <w:pStyle w:val="Compact"/>
+              <w:spacing w:before="0" w:after="0" w:line="240" w:lineRule="auto"/>
             </w:pPr>
             <w:r>
               <w:rPr>
@@ -2093,6 +2149,7 @@
           <w:p>
             <w:pPr>
               <w:pStyle w:val="Compact"/>
+              <w:spacing w:before="0" w:after="0" w:line="240" w:lineRule="auto"/>
             </w:pPr>
             <w:r>
               <w:t xml:space="preserve">Взяти вхідні дані з файлу</w:t>
@@ -2104,6 +2161,7 @@
           <w:p>
             <w:pPr>
               <w:pStyle w:val="Compact"/>
+              <w:spacing w:before="0" w:after="0" w:line="240" w:lineRule="auto"/>
             </w:pPr>
             <w:r>
               <w:rPr>
@@ -2353,6 +2411,7 @@
           <w:p>
             <w:pPr>
               <w:pStyle w:val="Compact"/>
+              <w:spacing w:before="0" w:after="0" w:line="240" w:lineRule="auto"/>
             </w:pPr>
             <w:r>
               <w:t xml:space="preserve">CMD</w:t>
@@ -2364,6 +2423,7 @@
           <w:p>
             <w:pPr>
               <w:pStyle w:val="Compact"/>
+              <w:spacing w:before="0" w:after="0" w:line="240" w:lineRule="auto"/>
             </w:pPr>
             <w:r>
               <w:t xml:space="preserve">PowerShell</w:t>
@@ -2377,6 +2437,7 @@
           <w:p>
             <w:pPr>
               <w:pStyle w:val="Compact"/>
+              <w:spacing w:before="0" w:after="0" w:line="240" w:lineRule="auto"/>
             </w:pPr>
             <w:r>
               <w:rPr>
@@ -2391,6 +2452,7 @@
           <w:p>
             <w:pPr>
               <w:pStyle w:val="Compact"/>
+              <w:spacing w:before="0" w:after="0" w:line="240" w:lineRule="auto"/>
             </w:pPr>
             <w:r>
               <w:rPr>
@@ -2407,6 +2469,7 @@
           <w:p>
             <w:pPr>
               <w:pStyle w:val="Compact"/>
+              <w:spacing w:before="0" w:after="0" w:line="240" w:lineRule="auto"/>
             </w:pPr>
             <w:r>
               <w:rPr>
@@ -2421,6 +2484,7 @@
           <w:p>
             <w:pPr>
               <w:pStyle w:val="Compact"/>
+              <w:spacing w:before="0" w:after="0" w:line="240" w:lineRule="auto"/>
             </w:pPr>
             <w:r>
               <w:rPr>
@@ -2437,6 +2501,7 @@
           <w:p>
             <w:pPr>
               <w:pStyle w:val="Compact"/>
+              <w:spacing w:before="0" w:after="0" w:line="240" w:lineRule="auto"/>
             </w:pPr>
             <w:r>
               <w:rPr>
@@ -2451,6 +2516,7 @@
           <w:p>
             <w:pPr>
               <w:pStyle w:val="Compact"/>
+              <w:spacing w:before="0" w:after="0" w:line="240" w:lineRule="auto"/>
             </w:pPr>
             <w:r>
               <w:rPr>
@@ -2467,6 +2533,7 @@
           <w:p>
             <w:pPr>
               <w:pStyle w:val="Compact"/>
+              <w:spacing w:before="0" w:after="0" w:line="240" w:lineRule="auto"/>
             </w:pPr>
             <w:r>
               <w:rPr>
@@ -2481,6 +2548,7 @@
           <w:p>
             <w:pPr>
               <w:pStyle w:val="Compact"/>
+              <w:spacing w:before="0" w:after="0" w:line="240" w:lineRule="auto"/>
             </w:pPr>
             <w:r>
               <w:rPr>
@@ -2497,6 +2565,7 @@
           <w:p>
             <w:pPr>
               <w:pStyle w:val="Compact"/>
+              <w:spacing w:before="0" w:after="0" w:line="240" w:lineRule="auto"/>
             </w:pPr>
             <w:r>
               <w:rPr>
@@ -2511,6 +2580,7 @@
           <w:p>
             <w:pPr>
               <w:pStyle w:val="Compact"/>
+              <w:spacing w:before="0" w:after="0" w:line="240" w:lineRule="auto"/>
             </w:pPr>
             <w:r>
               <w:rPr>
@@ -2527,6 +2597,7 @@
           <w:p>
             <w:pPr>
               <w:pStyle w:val="Compact"/>
+              <w:spacing w:before="0" w:after="0" w:line="240" w:lineRule="auto"/>
             </w:pPr>
             <w:r>
               <w:rPr>
@@ -2541,6 +2612,7 @@
           <w:p>
             <w:pPr>
               <w:pStyle w:val="Compact"/>
+              <w:spacing w:before="0" w:after="0" w:line="240" w:lineRule="auto"/>
             </w:pPr>
             <w:r>
               <w:rPr>
@@ -2557,6 +2629,7 @@
           <w:p>
             <w:pPr>
               <w:pStyle w:val="Compact"/>
+              <w:spacing w:before="0" w:after="0" w:line="240" w:lineRule="auto"/>
             </w:pPr>
             <w:r>
               <w:rPr>
@@ -2571,6 +2644,7 @@
           <w:p>
             <w:pPr>
               <w:pStyle w:val="Compact"/>
+              <w:spacing w:before="0" w:after="0" w:line="240" w:lineRule="auto"/>
             </w:pPr>
             <w:r>
               <w:rPr>
@@ -5134,6 +5208,7 @@
           <w:p>
             <w:pPr>
               <w:pStyle w:val="Compact"/>
+              <w:spacing w:before="0" w:after="0" w:line="240" w:lineRule="auto"/>
             </w:pPr>
             <w:r>
               <w:t xml:space="preserve">№</w:t>
@@ -5145,6 +5220,7 @@
           <w:p>
             <w:pPr>
               <w:pStyle w:val="Compact"/>
+              <w:spacing w:before="0" w:after="0" w:line="240" w:lineRule="auto"/>
             </w:pPr>
             <w:r>
               <w:t xml:space="preserve">Вихідний каталог</w:t>
@@ -5156,6 +5232,7 @@
           <w:p>
             <w:pPr>
               <w:pStyle w:val="Compact"/>
+              <w:spacing w:before="0" w:after="0" w:line="240" w:lineRule="auto"/>
             </w:pPr>
             <w:r>
               <w:t xml:space="preserve">Маска</w:t>
@@ -5167,6 +5244,7 @@
           <w:p>
             <w:pPr>
               <w:pStyle w:val="Compact"/>
+              <w:spacing w:before="0" w:after="0" w:line="240" w:lineRule="auto"/>
             </w:pPr>
             <w:r>
               <w:t xml:space="preserve">Атрибут</w:t>
@@ -5178,6 +5256,7 @@
           <w:p>
             <w:pPr>
               <w:pStyle w:val="Compact"/>
+              <w:spacing w:before="0" w:after="0" w:line="240" w:lineRule="auto"/>
             </w:pPr>
             <w:r>
               <w:t xml:space="preserve">Додаткове завдання</w:t>
@@ -5191,6 +5270,7 @@
           <w:p>
             <w:pPr>
               <w:pStyle w:val="Compact"/>
+              <w:spacing w:before="0" w:after="0" w:line="240" w:lineRule="auto"/>
             </w:pPr>
             <w:r>
               <w:t xml:space="preserve">1</w:t>
@@ -5202,6 +5282,7 @@
           <w:p>
             <w:pPr>
               <w:pStyle w:val="Compact"/>
+              <w:spacing w:before="0" w:after="0" w:line="240" w:lineRule="auto"/>
             </w:pPr>
             <w:r>
               <w:rPr>
@@ -5216,6 +5297,7 @@
           <w:p>
             <w:pPr>
               <w:pStyle w:val="Compact"/>
+              <w:spacing w:before="0" w:after="0" w:line="240" w:lineRule="auto"/>
             </w:pPr>
             <w:r>
               <w:rPr>
@@ -5241,6 +5323,7 @@
           <w:p>
             <w:pPr>
               <w:pStyle w:val="Compact"/>
+              <w:spacing w:before="0" w:after="0" w:line="240" w:lineRule="auto"/>
             </w:pPr>
             <w:r>
               <w:rPr>
@@ -5255,6 +5338,7 @@
           <w:p>
             <w:pPr>
               <w:pStyle w:val="Compact"/>
+              <w:spacing w:before="0" w:after="0" w:line="240" w:lineRule="auto"/>
             </w:pPr>
             <w:r>
               <w:t xml:space="preserve">Пояснити, чому copy не скопіювала підкаталоги, і назвати ключ xcopy, який додає порожні каталоги.</w:t>
@@ -5268,6 +5352,7 @@
           <w:p>
             <w:pPr>
               <w:pStyle w:val="Compact"/>
+              <w:spacing w:before="0" w:after="0" w:line="240" w:lineRule="auto"/>
             </w:pPr>
             <w:r>
               <w:t xml:space="preserve">2</w:t>
@@ -5279,6 +5364,7 @@
           <w:p>
             <w:pPr>
               <w:pStyle w:val="Compact"/>
+              <w:spacing w:before="0" w:after="0" w:line="240" w:lineRule="auto"/>
             </w:pPr>
             <w:r>
               <w:rPr>
@@ -5293,6 +5379,7 @@
           <w:p>
             <w:pPr>
               <w:pStyle w:val="Compact"/>
+              <w:spacing w:before="0" w:after="0" w:line="240" w:lineRule="auto"/>
             </w:pPr>
             <w:r>
               <w:rPr>
@@ -5318,6 +5405,7 @@
           <w:p>
             <w:pPr>
               <w:pStyle w:val="Compact"/>
+              <w:spacing w:before="0" w:after="0" w:line="240" w:lineRule="auto"/>
             </w:pPr>
             <w:r>
               <w:rPr>
@@ -5332,6 +5420,7 @@
           <w:p>
             <w:pPr>
               <w:pStyle w:val="Compact"/>
+              <w:spacing w:before="0" w:after="0" w:line="240" w:lineRule="auto"/>
             </w:pPr>
             <w:r>
               <w:t xml:space="preserve">Знайти три найбільші файли дерева двома способами: ключами dir і конвеєром PowerShell.</w:t>
@@ -5345,6 +5434,7 @@
           <w:p>
             <w:pPr>
               <w:pStyle w:val="Compact"/>
+              <w:spacing w:before="0" w:after="0" w:line="240" w:lineRule="auto"/>
             </w:pPr>
             <w:r>
               <w:t xml:space="preserve">3</w:t>
@@ -5356,6 +5446,7 @@
           <w:p>
             <w:pPr>
               <w:pStyle w:val="Compact"/>
+              <w:spacing w:before="0" w:after="0" w:line="240" w:lineRule="auto"/>
             </w:pPr>
             <w:r>
               <w:rPr>
@@ -5370,6 +5461,7 @@
           <w:p>
             <w:pPr>
               <w:pStyle w:val="Compact"/>
+              <w:spacing w:before="0" w:after="0" w:line="240" w:lineRule="auto"/>
             </w:pPr>
             <w:r>
               <w:rPr>
@@ -5395,6 +5487,7 @@
           <w:p>
             <w:pPr>
               <w:pStyle w:val="Compact"/>
+              <w:spacing w:before="0" w:after="0" w:line="240" w:lineRule="auto"/>
             </w:pPr>
             <w:r>
               <w:rPr>
@@ -5409,6 +5502,7 @@
           <w:p>
             <w:pPr>
               <w:pStyle w:val="Compact"/>
+              <w:spacing w:before="0" w:after="0" w:line="240" w:lineRule="auto"/>
             </w:pPr>
             <w:r>
               <w:t xml:space="preserve">Показати, що robocopy з ключем /l нічого не змінює, і пояснити, навіщо потрібен такий режим.</w:t>
@@ -5422,6 +5516,7 @@
           <w:p>
             <w:pPr>
               <w:pStyle w:val="Compact"/>
+              <w:spacing w:before="0" w:after="0" w:line="240" w:lineRule="auto"/>
             </w:pPr>
             <w:r>
               <w:t xml:space="preserve">4</w:t>
@@ -5433,6 +5528,7 @@
           <w:p>
             <w:pPr>
               <w:pStyle w:val="Compact"/>
+              <w:spacing w:before="0" w:after="0" w:line="240" w:lineRule="auto"/>
             </w:pPr>
             <w:r>
               <w:rPr>
@@ -5447,6 +5543,7 @@
           <w:p>
             <w:pPr>
               <w:pStyle w:val="Compact"/>
+              <w:spacing w:before="0" w:after="0" w:line="240" w:lineRule="auto"/>
             </w:pPr>
             <w:r>
               <w:rPr>
@@ -5472,6 +5569,7 @@
           <w:p>
             <w:pPr>
               <w:pStyle w:val="Compact"/>
+              <w:spacing w:before="0" w:after="0" w:line="240" w:lineRule="auto"/>
             </w:pPr>
             <w:r>
               <w:rPr>
@@ -5486,6 +5584,7 @@
           <w:p>
             <w:pPr>
               <w:pStyle w:val="Compact"/>
+              <w:spacing w:before="0" w:after="0" w:line="240" w:lineRule="auto"/>
             </w:pPr>
             <w:r>
               <w:t xml:space="preserve">Створити порожній файл трьома різними способами й порівняти їх.</w:t>
@@ -5499,6 +5598,7 @@
           <w:p>
             <w:pPr>
               <w:pStyle w:val="Compact"/>
+              <w:spacing w:before="0" w:after="0" w:line="240" w:lineRule="auto"/>
             </w:pPr>
             <w:r>
               <w:t xml:space="preserve">5</w:t>
@@ -5510,6 +5610,7 @@
           <w:p>
             <w:pPr>
               <w:pStyle w:val="Compact"/>
+              <w:spacing w:before="0" w:after="0" w:line="240" w:lineRule="auto"/>
             </w:pPr>
             <w:r>
               <w:rPr>
@@ -5524,6 +5625,7 @@
           <w:p>
             <w:pPr>
               <w:pStyle w:val="Compact"/>
+              <w:spacing w:before="0" w:after="0" w:line="240" w:lineRule="auto"/>
             </w:pPr>
             <w:r>
               <w:rPr>
@@ -5545,6 +5647,7 @@
           <w:p>
             <w:pPr>
               <w:pStyle w:val="Compact"/>
+              <w:spacing w:before="0" w:after="0" w:line="240" w:lineRule="auto"/>
             </w:pPr>
             <w:r>
               <w:rPr>
@@ -5559,6 +5662,7 @@
           <w:p>
             <w:pPr>
               <w:pStyle w:val="Compact"/>
+              <w:spacing w:before="0" w:after="0" w:line="240" w:lineRule="auto"/>
             </w:pPr>
             <w:r>
               <w:t xml:space="preserve">Пояснити різницю між dir /a:h і dir /a та навести приклад, коли вони дають різний результат.</w:t>
@@ -5572,6 +5676,7 @@
           <w:p>
             <w:pPr>
               <w:pStyle w:val="Compact"/>
+              <w:spacing w:before="0" w:after="0" w:line="240" w:lineRule="auto"/>
             </w:pPr>
             <w:r>
               <w:t xml:space="preserve">6</w:t>
@@ -5583,6 +5688,7 @@
           <w:p>
             <w:pPr>
               <w:pStyle w:val="Compact"/>
+              <w:spacing w:before="0" w:after="0" w:line="240" w:lineRule="auto"/>
             </w:pPr>
             <w:r>
               <w:rPr>
@@ -5597,6 +5703,7 @@
           <w:p>
             <w:pPr>
               <w:pStyle w:val="Compact"/>
+              <w:spacing w:before="0" w:after="0" w:line="240" w:lineRule="auto"/>
             </w:pPr>
             <w:r>
               <w:rPr>
@@ -5622,6 +5729,7 @@
           <w:p>
             <w:pPr>
               <w:pStyle w:val="Compact"/>
+              <w:spacing w:before="0" w:after="0" w:line="240" w:lineRule="auto"/>
             </w:pPr>
             <w:r>
               <w:rPr>
@@ -5636,6 +5744,7 @@
           <w:p>
             <w:pPr>
               <w:pStyle w:val="Compact"/>
+              <w:spacing w:before="0" w:after="0" w:line="240" w:lineRule="auto"/>
             </w:pPr>
             <w:r>
               <w:t xml:space="preserve">Знайти всі файли, у назві яких рівно вісім символів, і записати використану маску.</w:t>
@@ -5649,6 +5758,7 @@
           <w:p>
             <w:pPr>
               <w:pStyle w:val="Compact"/>
+              <w:spacing w:before="0" w:after="0" w:line="240" w:lineRule="auto"/>
             </w:pPr>
             <w:r>
               <w:t xml:space="preserve">7</w:t>
@@ -5660,6 +5770,7 @@
           <w:p>
             <w:pPr>
               <w:pStyle w:val="Compact"/>
+              <w:spacing w:before="0" w:after="0" w:line="240" w:lineRule="auto"/>
             </w:pPr>
             <w:r>
               <w:rPr>
@@ -5674,6 +5785,7 @@
           <w:p>
             <w:pPr>
               <w:pStyle w:val="Compact"/>
+              <w:spacing w:before="0" w:after="0" w:line="240" w:lineRule="auto"/>
             </w:pPr>
             <w:r>
               <w:t xml:space="preserve">Alarm</w:t>
@@ -5695,6 +5807,7 @@
           <w:p>
             <w:pPr>
               <w:pStyle w:val="Compact"/>
+              <w:spacing w:before="0" w:after="0" w:line="240" w:lineRule="auto"/>
             </w:pPr>
             <w:r>
               <w:rPr>
@@ -5709,6 +5822,7 @@
           <w:p>
             <w:pPr>
               <w:pStyle w:val="Compact"/>
+              <w:spacing w:before="0" w:after="0" w:line="240" w:lineRule="auto"/>
             </w:pPr>
             <w:r>
               <w:t xml:space="preserve">Об’єднати три текстові файли в один командою copy і перевірити результат.</w:t>
@@ -5722,6 +5836,7 @@
           <w:p>
             <w:pPr>
               <w:pStyle w:val="Compact"/>
+              <w:spacing w:before="0" w:after="0" w:line="240" w:lineRule="auto"/>
             </w:pPr>
             <w:r>
               <w:t xml:space="preserve">8</w:t>
@@ -5733,6 +5848,7 @@
           <w:p>
             <w:pPr>
               <w:pStyle w:val="Compact"/>
+              <w:spacing w:before="0" w:after="0" w:line="240" w:lineRule="auto"/>
             </w:pPr>
             <w:r>
               <w:rPr>
@@ -5747,6 +5863,7 @@
           <w:p>
             <w:pPr>
               <w:pStyle w:val="Compact"/>
+              <w:spacing w:before="0" w:after="0" w:line="240" w:lineRule="auto"/>
             </w:pPr>
             <w:r>
               <w:rPr>
@@ -5772,6 +5889,7 @@
           <w:p>
             <w:pPr>
               <w:pStyle w:val="Compact"/>
+              <w:spacing w:before="0" w:after="0" w:line="240" w:lineRule="auto"/>
             </w:pPr>
             <w:r>
               <w:rPr>
@@ -5786,6 +5904,7 @@
           <w:p>
             <w:pPr>
               <w:pStyle w:val="Compact"/>
+              <w:spacing w:before="0" w:after="0" w:line="240" w:lineRule="auto"/>
             </w:pPr>
             <w:r>
               <w:t xml:space="preserve">Порівняти вивід find /c і findstr /c: на одному файлі; пояснити розбіжність, якщо вона є.</w:t>
@@ -5799,6 +5918,7 @@
           <w:p>
             <w:pPr>
               <w:pStyle w:val="Compact"/>
+              <w:spacing w:before="0" w:after="0" w:line="240" w:lineRule="auto"/>
             </w:pPr>
             <w:r>
               <w:t xml:space="preserve">9</w:t>
@@ -5810,6 +5930,7 @@
           <w:p>
             <w:pPr>
               <w:pStyle w:val="Compact"/>
+              <w:spacing w:before="0" w:after="0" w:line="240" w:lineRule="auto"/>
             </w:pPr>
             <w:r>
               <w:rPr>
@@ -5824,6 +5945,7 @@
           <w:p>
             <w:pPr>
               <w:pStyle w:val="Compact"/>
+              <w:spacing w:before="0" w:after="0" w:line="240" w:lineRule="auto"/>
             </w:pPr>
             <w:r>
               <w:t xml:space="preserve">Windows</w:t>
@@ -5845,6 +5967,7 @@
           <w:p>
             <w:pPr>
               <w:pStyle w:val="Compact"/>
+              <w:spacing w:before="0" w:after="0" w:line="240" w:lineRule="auto"/>
             </w:pPr>
             <w:r>
               <w:rPr>
@@ -5859,6 +5982,7 @@
           <w:p>
             <w:pPr>
               <w:pStyle w:val="Compact"/>
+              <w:spacing w:before="0" w:after="0" w:line="240" w:lineRule="auto"/>
             </w:pPr>
             <w:r>
               <w:t xml:space="preserve">Виміряти, скільки часу займає dir /s по каталогу C:</w:t>
@@ -5875,6 +5999,7 @@
           <w:p>
             <w:pPr>
               <w:pStyle w:val="Compact"/>
+              <w:spacing w:before="0" w:after="0" w:line="240" w:lineRule="auto"/>
             </w:pPr>
             <w:r>
               <w:t xml:space="preserve">10</w:t>
@@ -5886,6 +6011,7 @@
           <w:p>
             <w:pPr>
               <w:pStyle w:val="Compact"/>
+              <w:spacing w:before="0" w:after="0" w:line="240" w:lineRule="auto"/>
             </w:pPr>
             <w:r>
               <w:rPr>
@@ -5900,6 +6026,7 @@
           <w:p>
             <w:pPr>
               <w:pStyle w:val="Compact"/>
+              <w:spacing w:before="0" w:after="0" w:line="240" w:lineRule="auto"/>
             </w:pPr>
             <w:r>
               <w:rPr>
@@ -5925,6 +6052,7 @@
           <w:p>
             <w:pPr>
               <w:pStyle w:val="Compact"/>
+              <w:spacing w:before="0" w:after="0" w:line="240" w:lineRule="auto"/>
             </w:pPr>
             <w:r>
               <w:rPr>
@@ -5939,6 +6067,7 @@
           <w:p>
             <w:pPr>
               <w:pStyle w:val="Compact"/>
+              <w:spacing w:before="0" w:after="0" w:line="240" w:lineRule="auto"/>
             </w:pPr>
             <w:r>
               <w:t xml:space="preserve">Показати роботу пари pushd/popd з трьома вкладеними переходами.</w:t>
@@ -5952,6 +6081,7 @@
           <w:p>
             <w:pPr>
               <w:pStyle w:val="Compact"/>
+              <w:spacing w:before="0" w:after="0" w:line="240" w:lineRule="auto"/>
             </w:pPr>
             <w:r>
               <w:t xml:space="preserve">11</w:t>
@@ -5963,6 +6093,7 @@
           <w:p>
             <w:pPr>
               <w:pStyle w:val="Compact"/>
+              <w:spacing w:before="0" w:after="0" w:line="240" w:lineRule="auto"/>
             </w:pPr>
             <w:r>
               <w:rPr>
@@ -5977,6 +6108,7 @@
           <w:p>
             <w:pPr>
               <w:pStyle w:val="Compact"/>
+              <w:spacing w:before="0" w:after="0" w:line="240" w:lineRule="auto"/>
             </w:pPr>
             <w:r>
               <w:rPr>
@@ -6002,6 +6134,7 @@
           <w:p>
             <w:pPr>
               <w:pStyle w:val="Compact"/>
+              <w:spacing w:before="0" w:after="0" w:line="240" w:lineRule="auto"/>
             </w:pPr>
             <w:r>
               <w:rPr>
@@ -6016,6 +6149,7 @@
           <w:p>
             <w:pPr>
               <w:pStyle w:val="Compact"/>
+              <w:spacing w:before="0" w:after="0" w:line="240" w:lineRule="auto"/>
             </w:pPr>
             <w:r>
               <w:t xml:space="preserve">Пояснити, чому ren не приймає шлях у другому аргументі, і навести команду, яка розв’язує цю задачу.</w:t>
@@ -6029,6 +6163,7 @@
           <w:p>
             <w:pPr>
               <w:pStyle w:val="Compact"/>
+              <w:spacing w:before="0" w:after="0" w:line="240" w:lineRule="auto"/>
             </w:pPr>
             <w:r>
               <w:t xml:space="preserve">12</w:t>
@@ -6040,6 +6175,7 @@
           <w:p>
             <w:pPr>
               <w:pStyle w:val="Compact"/>
+              <w:spacing w:before="0" w:after="0" w:line="240" w:lineRule="auto"/>
             </w:pPr>
             <w:r>
               <w:rPr>
@@ -6054,6 +6190,7 @@
           <w:p>
             <w:pPr>
               <w:pStyle w:val="Compact"/>
+              <w:spacing w:before="0" w:after="0" w:line="240" w:lineRule="auto"/>
             </w:pPr>
             <w:r>
               <w:rPr>
@@ -6079,6 +6216,7 @@
           <w:p>
             <w:pPr>
               <w:pStyle w:val="Compact"/>
+              <w:spacing w:before="0" w:after="0" w:line="240" w:lineRule="auto"/>
             </w:pPr>
             <w:r>
               <w:rPr>
@@ -6093,6 +6231,7 @@
           <w:p>
             <w:pPr>
               <w:pStyle w:val="Compact"/>
+              <w:spacing w:before="0" w:after="0" w:line="240" w:lineRule="auto"/>
             </w:pPr>
             <w:r>
               <w:t xml:space="preserve">Знайти у переліку файлів усі рядки, що НЕ містять заданого слова, і назвати використаний ключ.</w:t>
@@ -6106,6 +6245,7 @@
           <w:p>
             <w:pPr>
               <w:pStyle w:val="Compact"/>
+              <w:spacing w:before="0" w:after="0" w:line="240" w:lineRule="auto"/>
             </w:pPr>
             <w:r>
               <w:t xml:space="preserve">13</w:t>
@@ -6117,6 +6257,7 @@
           <w:p>
             <w:pPr>
               <w:pStyle w:val="Compact"/>
+              <w:spacing w:before="0" w:after="0" w:line="240" w:lineRule="auto"/>
             </w:pPr>
             <w:r>
               <w:rPr>
@@ -6131,6 +6272,7 @@
           <w:p>
             <w:pPr>
               <w:pStyle w:val="Compact"/>
+              <w:spacing w:before="0" w:after="0" w:line="240" w:lineRule="auto"/>
             </w:pPr>
             <w:r>
               <w:t xml:space="preserve">hosts* → hosts*.bak</w:t>
@@ -6142,6 +6284,7 @@
           <w:p>
             <w:pPr>
               <w:pStyle w:val="Compact"/>
+              <w:spacing w:before="0" w:after="0" w:line="240" w:lineRule="auto"/>
             </w:pPr>
             <w:r>
               <w:rPr>
@@ -6156,6 +6299,7 @@
           <w:p>
             <w:pPr>
               <w:pStyle w:val="Compact"/>
+              <w:spacing w:before="0" w:after="0" w:line="240" w:lineRule="auto"/>
             </w:pPr>
             <w:r>
               <w:t xml:space="preserve">Пояснити, що станеться при виконанні del</w:t>
@@ -6185,6 +6329,7 @@
           <w:p>
             <w:pPr>
               <w:pStyle w:val="Compact"/>
+              <w:spacing w:before="0" w:after="0" w:line="240" w:lineRule="auto"/>
             </w:pPr>
             <w:r>
               <w:t xml:space="preserve">14</w:t>
@@ -6196,6 +6341,7 @@
           <w:p>
             <w:pPr>
               <w:pStyle w:val="Compact"/>
+              <w:spacing w:before="0" w:after="0" w:line="240" w:lineRule="auto"/>
             </w:pPr>
             <w:r>
               <w:rPr>
@@ -6210,6 +6356,7 @@
           <w:p>
             <w:pPr>
               <w:pStyle w:val="Compact"/>
+              <w:spacing w:before="0" w:after="0" w:line="240" w:lineRule="auto"/>
             </w:pPr>
             <w:r>
               <w:rPr>
@@ -6235,6 +6382,7 @@
           <w:p>
             <w:pPr>
               <w:pStyle w:val="Compact"/>
+              <w:spacing w:before="0" w:after="0" w:line="240" w:lineRule="auto"/>
             </w:pPr>
             <w:r>
               <w:rPr>
@@ -6249,6 +6397,7 @@
           <w:p>
             <w:pPr>
               <w:pStyle w:val="Compact"/>
+              <w:spacing w:before="0" w:after="0" w:line="240" w:lineRule="auto"/>
             </w:pPr>
             <w:r>
               <w:t xml:space="preserve">Порівняти розмір каталогу, отриманий через dir і через PowerShell; пояснити, який спосіб точніший.</w:t>
@@ -6262,6 +6411,7 @@
           <w:p>
             <w:pPr>
               <w:pStyle w:val="Compact"/>
+              <w:spacing w:before="0" w:after="0" w:line="240" w:lineRule="auto"/>
             </w:pPr>
             <w:r>
               <w:t xml:space="preserve">15</w:t>
@@ -6273,6 +6423,7 @@
           <w:p>
             <w:pPr>
               <w:pStyle w:val="Compact"/>
+              <w:spacing w:before="0" w:after="0" w:line="240" w:lineRule="auto"/>
             </w:pPr>
             <w:r>
               <w:rPr>
@@ -6287,6 +6438,7 @@
           <w:p>
             <w:pPr>
               <w:pStyle w:val="Compact"/>
+              <w:spacing w:before="0" w:after="0" w:line="240" w:lineRule="auto"/>
             </w:pPr>
             <w:r>
               <w:rPr>
@@ -6312,6 +6464,7 @@
           <w:p>
             <w:pPr>
               <w:pStyle w:val="Compact"/>
+              <w:spacing w:before="0" w:after="0" w:line="240" w:lineRule="auto"/>
             </w:pPr>
             <w:r>
               <w:rPr>
@@ -6326,6 +6479,7 @@
           <w:p>
             <w:pPr>
               <w:pStyle w:val="Compact"/>
+              <w:spacing w:before="0" w:after="0" w:line="240" w:lineRule="auto"/>
             </w:pPr>
             <w:r>
               <w:t xml:space="preserve">Створити файл командою copy con і пояснити, як завершується введення.</w:t>
@@ -6339,6 +6493,7 @@
           <w:p>
             <w:pPr>
               <w:pStyle w:val="Compact"/>
+              <w:spacing w:before="0" w:after="0" w:line="240" w:lineRule="auto"/>
             </w:pPr>
             <w:r>
               <w:t xml:space="preserve">16</w:t>
@@ -6350,6 +6505,7 @@
           <w:p>
             <w:pPr>
               <w:pStyle w:val="Compact"/>
+              <w:spacing w:before="0" w:after="0" w:line="240" w:lineRule="auto"/>
             </w:pPr>
             <w:r>
               <w:rPr>
@@ -6364,6 +6520,7 @@
           <w:p>
             <w:pPr>
               <w:pStyle w:val="Compact"/>
+              <w:spacing w:before="0" w:after="0" w:line="240" w:lineRule="auto"/>
             </w:pPr>
             <w:r>
               <w:rPr>
@@ -6389,6 +6546,7 @@
           <w:p>
             <w:pPr>
               <w:pStyle w:val="Compact"/>
+              <w:spacing w:before="0" w:after="0" w:line="240" w:lineRule="auto"/>
             </w:pPr>
             <w:r>
               <w:rPr>
@@ -6403,6 +6561,7 @@
           <w:p>
             <w:pPr>
               <w:pStyle w:val="Compact"/>
+              <w:spacing w:before="0" w:after="0" w:line="240" w:lineRule="auto"/>
             </w:pPr>
             <w:r>
               <w:t xml:space="preserve">Записати команду, яка за один прохід перенаправить звичайний вивід в один файл, а помилки — в інший.</w:t>
@@ -6416,6 +6575,7 @@
           <w:p>
             <w:pPr>
               <w:pStyle w:val="Compact"/>
+              <w:spacing w:before="0" w:after="0" w:line="240" w:lineRule="auto"/>
             </w:pPr>
             <w:r>
               <w:t xml:space="preserve">17</w:t>
@@ -6427,6 +6587,7 @@
           <w:p>
             <w:pPr>
               <w:pStyle w:val="Compact"/>
+              <w:spacing w:before="0" w:after="0" w:line="240" w:lineRule="auto"/>
             </w:pPr>
             <w:r>
               <w:rPr>
@@ -6441,6 +6602,7 @@
           <w:p>
             <w:pPr>
               <w:pStyle w:val="Compact"/>
+              <w:spacing w:before="0" w:after="0" w:line="240" w:lineRule="auto"/>
             </w:pPr>
             <w:r>
               <w:rPr>
@@ -6466,6 +6628,7 @@
           <w:p>
             <w:pPr>
               <w:pStyle w:val="Compact"/>
+              <w:spacing w:before="0" w:after="0" w:line="240" w:lineRule="auto"/>
             </w:pPr>
             <w:r>
               <w:rPr>
@@ -6480,6 +6643,7 @@
           <w:p>
             <w:pPr>
               <w:pStyle w:val="Compact"/>
+              <w:spacing w:before="0" w:after="0" w:line="240" w:lineRule="auto"/>
             </w:pPr>
             <w:r>
               <w:t xml:space="preserve">Дослідити ключ /o команди dir: навести приклади для всіх п’яти варіантів сортування.</w:t>
@@ -6493,6 +6657,7 @@
           <w:p>
             <w:pPr>
               <w:pStyle w:val="Compact"/>
+              <w:spacing w:before="0" w:after="0" w:line="240" w:lineRule="auto"/>
             </w:pPr>
             <w:r>
               <w:t xml:space="preserve">18</w:t>
@@ -6504,6 +6669,7 @@
           <w:p>
             <w:pPr>
               <w:pStyle w:val="Compact"/>
+              <w:spacing w:before="0" w:after="0" w:line="240" w:lineRule="auto"/>
             </w:pPr>
             <w:r>
               <w:rPr>
@@ -6518,6 +6684,7 @@
           <w:p>
             <w:pPr>
               <w:pStyle w:val="Compact"/>
+              <w:spacing w:before="0" w:after="0" w:line="240" w:lineRule="auto"/>
             </w:pPr>
             <w:r>
               <w:t xml:space="preserve">Ring</w:t>
@@ -6539,6 +6706,7 @@
           <w:p>
             <w:pPr>
               <w:pStyle w:val="Compact"/>
+              <w:spacing w:before="0" w:after="0" w:line="240" w:lineRule="auto"/>
             </w:pPr>
             <w:r>
               <w:rPr>
@@ -6553,6 +6721,7 @@
           <w:p>
             <w:pPr>
               <w:pStyle w:val="Compact"/>
+              <w:spacing w:before="0" w:after="0" w:line="240" w:lineRule="auto"/>
             </w:pPr>
             <w:r>
               <w:t xml:space="preserve">Пояснити, чому маска data?.txt не збігається з data10.txt, і підібрати маску, яка збігається.</w:t>
@@ -6566,6 +6735,7 @@
           <w:p>
             <w:pPr>
               <w:pStyle w:val="Compact"/>
+              <w:spacing w:before="0" w:after="0" w:line="240" w:lineRule="auto"/>
             </w:pPr>
             <w:r>
               <w:t xml:space="preserve">19</w:t>
@@ -6577,6 +6747,7 @@
           <w:p>
             <w:pPr>
               <w:pStyle w:val="Compact"/>
+              <w:spacing w:before="0" w:after="0" w:line="240" w:lineRule="auto"/>
             </w:pPr>
             <w:r>
               <w:rPr>
@@ -6591,6 +6762,7 @@
           <w:p>
             <w:pPr>
               <w:pStyle w:val="Compact"/>
+              <w:spacing w:before="0" w:after="0" w:line="240" w:lineRule="auto"/>
             </w:pPr>
             <w:r>
               <w:rPr>
@@ -6612,6 +6784,7 @@
           <w:p>
             <w:pPr>
               <w:pStyle w:val="Compact"/>
+              <w:spacing w:before="0" w:after="0" w:line="240" w:lineRule="auto"/>
             </w:pPr>
             <w:r>
               <w:rPr>
@@ -6626,6 +6799,7 @@
           <w:p>
             <w:pPr>
               <w:pStyle w:val="Compact"/>
+              <w:spacing w:before="0" w:after="0" w:line="240" w:lineRule="auto"/>
             </w:pPr>
             <w:r>
               <w:t xml:space="preserve">Показати на власному прикладі, чому перед del із маскою слід виконати dir із тією самою маскою.</w:t>
@@ -6639,6 +6813,7 @@
           <w:p>
             <w:pPr>
               <w:pStyle w:val="Compact"/>
+              <w:spacing w:before="0" w:after="0" w:line="240" w:lineRule="auto"/>
             </w:pPr>
             <w:r>
               <w:t xml:space="preserve">20</w:t>
@@ -6650,6 +6825,7 @@
           <w:p>
             <w:pPr>
               <w:pStyle w:val="Compact"/>
+              <w:spacing w:before="0" w:after="0" w:line="240" w:lineRule="auto"/>
             </w:pPr>
             <w:r>
               <w:rPr>
@@ -6664,6 +6840,7 @@
           <w:p>
             <w:pPr>
               <w:pStyle w:val="Compact"/>
+              <w:spacing w:before="0" w:after="0" w:line="240" w:lineRule="auto"/>
             </w:pPr>
             <w:r>
               <w:rPr>
@@ -6689,6 +6866,7 @@
           <w:p>
             <w:pPr>
               <w:pStyle w:val="Compact"/>
+              <w:spacing w:before="0" w:after="0" w:line="240" w:lineRule="auto"/>
             </w:pPr>
             <w:r>
               <w:rPr>
@@ -6703,6 +6881,7 @@
           <w:p>
             <w:pPr>
               <w:pStyle w:val="Compact"/>
+              <w:spacing w:before="0" w:after="0" w:line="240" w:lineRule="auto"/>
             </w:pPr>
             <w:r>
               <w:t xml:space="preserve">Побудувати конвеєр, який підрахує, скільки файлів дерева містять у назві задане слово.</w:t>
@@ -7095,7 +7274,7 @@
     <w:multiLevelType w:val="multilevel"/>
     <w:lvl w:ilvl="0">
       <w:numFmt w:val="bullet"/>
-      <w:lvlText w:val="–"/>
+      <w:lvlText w:val=" "/>
       <w:lvlJc w:val="left"/>
       <w:pPr>
         <w:ind w:left="1134" w:hanging="425"/>
@@ -7103,7 +7282,7 @@
     </w:lvl>
     <w:lvl w:ilvl="1">
       <w:numFmt w:val="bullet"/>
-      <w:lvlText w:val="–"/>
+      <w:lvlText w:val=" "/>
       <w:lvlJc w:val="left"/>
       <w:pPr>
         <w:ind w:left="1701" w:hanging="425"/>
@@ -7111,7 +7290,7 @@
     </w:lvl>
     <w:lvl w:ilvl="2">
       <w:numFmt w:val="bullet"/>
-      <w:lvlText w:val="–"/>
+      <w:lvlText w:val=" "/>
       <w:lvlJc w:val="left"/>
       <w:pPr>
         <w:ind w:left="2268" w:hanging="425"/>
@@ -7119,7 +7298,7 @@
     </w:lvl>
     <w:lvl w:ilvl="3">
       <w:numFmt w:val="bullet"/>
-      <w:lvlText w:val="–"/>
+      <w:lvlText w:val=" "/>
       <w:lvlJc w:val="left"/>
       <w:pPr>
         <w:ind w:left="2835" w:hanging="425"/>
@@ -7127,7 +7306,7 @@
     </w:lvl>
     <w:lvl w:ilvl="4">
       <w:numFmt w:val="bullet"/>
-      <w:lvlText w:val="–"/>
+      <w:lvlText w:val=" "/>
       <w:lvlJc w:val="left"/>
       <w:pPr>
         <w:ind w:left="3402" w:hanging="425"/>
@@ -7135,7 +7314,7 @@
     </w:lvl>
     <w:lvl w:ilvl="5">
       <w:numFmt w:val="bullet"/>
-      <w:lvlText w:val="–"/>
+      <w:lvlText w:val=" "/>
       <w:lvlJc w:val="left"/>
       <w:pPr>
         <w:ind w:left="3969" w:hanging="425"/>
@@ -7143,7 +7322,7 @@
     </w:lvl>
     <w:lvl w:ilvl="6">
       <w:numFmt w:val="bullet"/>
-      <w:lvlText w:val="–"/>
+      <w:lvlText w:val=" "/>
       <w:lvlJc w:val="left"/>
       <w:pPr>
         <w:ind w:left="4536" w:hanging="425"/>
@@ -7151,7 +7330,7 @@
     </w:lvl>
     <w:lvl w:ilvl="7">
       <w:numFmt w:val="bullet"/>
-      <w:lvlText w:val="–"/>
+      <w:lvlText w:val=" "/>
       <w:lvlJc w:val="left"/>
       <w:pPr>
         <w:ind w:left="5103" w:hanging="425"/>
@@ -7159,7 +7338,7 @@
     </w:lvl>
     <w:lvl w:ilvl="8">
       <w:numFmt w:val="bullet"/>
-      <w:lvlText w:val="–"/>
+      <w:lvlText w:val=" "/>
       <w:lvlJc w:val="left"/>
       <w:pPr>
         <w:ind w:left="5670" w:hanging="425"/>
@@ -8192,6 +8371,31 @@
       </w:tblCellMar>
     </w:tblPr>
   </w:style>
+  <w:style w:customStyle="1" w:styleId="Conclusion" w:type="paragraph">
+    <w:name w:val="Conclusion"/>
+    <w:basedOn w:val="BodyText"/>
+    <w:next w:val="BodyText"/>
+    <w:qFormat/>
+    <w:pPr>
+      <w:keepNext/>
+      <w:spacing w:after="0" w:before="240" w:line="312" w:lineRule="auto"/>
+    </w:pPr>
+  </w:style>
+  <w:style w:styleId="Header" w:type="paragraph">
+    <w:name w:val="header"/>
+    <w:basedOn w:val="Normal"/>
+    <w:qFormat/>
+    <w:pPr>
+      <w:spacing w:after="0" w:before="0" w:line="240" w:lineRule="auto"/>
+      <w:ind w:firstLine="0"/>
+      <w:jc w:val="right"/>
+    </w:pPr>
+    <w:rPr>
+      <w:rFonts w:ascii="Times New Roman" w:cs="Times New Roman" w:eastAsia="Times New Roman" w:hAnsi="Times New Roman"/>
+      <w:sz w:val="28"/>
+      <w:szCs w:val="28"/>
+    </w:rPr>
+  </w:style>
   <w:style w:type="paragraph" w:customStyle="1" w:styleId="TableCaption">
     <w:name w:val="TableCaption"/>
     <w:basedOn w:val="BodyText"/>

</xml_diff>